<commit_message>
Adia o registro diário com foto e o painel da equipe
Retira do app o envio de foto diária, o motor de triagem e a demonstração
do painel, para que a primeira versão chegue às lojas mais leve.

Sem câmera e sem foto, o app não pede nenhuma permissão sensível e nada sai
do aparelho da paciente: a revisão da App Store é mais curta, a declaração
de privacidade das duas lojas é mais simples e não há tratamento de dado
pessoal sensível (LGPD, art. 11).

O adaptador de armazenamento continua assíncrono de propósito — é a costura
por onde um backend entra depois sem reescrever as telas.

Para trazer tudo de volta: git revert --no-commit 3851039

Co-Authored-By: Claude Opus 5 <noreply@anthropic.com>
Claude-Session: https://claude.ai/code/session_01RXsuhQQ6qNiyuBJF5nJZKq
</commit_message>
<xml_diff>
--- a/docs/conteudo-clinico-para-revisao.docx
+++ b/docs/conteudo-clinico-para-revisao.docx
@@ -62,7 +62,7 @@
           <w:sz w:val="19"/>
           <w:szCs w:val="19"/>
         </w:rPr>
-        <w:t xml:space="preserve">Gerado a partir do aplicativo em 03/08/2026</w:t>
+        <w:t xml:space="preserve">Gerado a partir do aplicativo em 04/08/2026</w:t>
       </w:r>
     </w:p>
     <w:p>
@@ -22899,52 +22899,6 @@
           <w:szCs w:val="21"/>
         </w:rPr>
         <w:t xml:space="preserve">Ao procurar um pronto-socorro, informe qual procedimento você realizou, a data e as medicações em uso. Leve o contato da nossa equipe com você.</w:t>
-      </w:r>
-    </w:p>
-    <w:p>
-      <w:pPr>
-        <w:pBdr>
-          <w:bottom w:val="dotted" w:color="C8C8C8" w:sz="4" w:space="4"/>
-        </w:pBdr>
-        <w:spacing w:after="240" w:before="100"/>
-      </w:pPr>
-      <w:r>
-        <w:rPr>
-          <w:i/>
-          <w:iCs/>
-          <w:color w:val="AAAAAA"/>
-          <w:sz w:val="17"/>
-          <w:szCs w:val="17"/>
-        </w:rPr>
-        <w:t xml:space="preserve">Correção: </w:t>
-      </w:r>
-    </w:p>
-    <w:p>
-      <w:pPr>
-        <w:pStyle w:val="Heading3"/>
-        <w:spacing w:after="100" w:before="280"/>
-      </w:pPr>
-      <w:r>
-        <w:rPr>
-          <w:b/>
-          <w:bCs/>
-          <w:color w:val="111111"/>
-          <w:sz w:val="23"/>
-          <w:szCs w:val="23"/>
-        </w:rPr>
-        <w:t xml:space="preserve">No registro diário</w:t>
-      </w:r>
-    </w:p>
-    <w:p>
-      <w:pPr>
-        <w:spacing w:after="100"/>
-      </w:pPr>
-      <w:r>
-        <w:rPr>
-          <w:sz w:val="21"/>
-          <w:szCs w:val="21"/>
-        </w:rPr>
-        <w:t xml:space="preserve">Este registro fica no seu aparelho. Se algo estiver preocupando você, não espere o retorno — fale com a equipe.</w:t>
       </w:r>
     </w:p>
     <w:p>

</xml_diff>

<commit_message>
Usa a marca oficial da Lipo HD e separa as duas lipos na seleção
A marca derivada foi descartada: entrou o lockup oficial da clínica, e o
script que a construía saiu do repositório.

O arquivo veio achatado sobre preto, diferente dos outros dois, que têm fundo
transparente. submarcas.py passa a reconhecer os dois formatos — sobre preto,
o quanto cada pixel tem de branco é o quanto ele tem de opacidade, e é assim
que o "HR" volta a ficar recortado.

Na seleção, o risco é a paciente de lipo convencional marcar Lipo HD e passar
a receber orientação de um procedimento que não fez. As duas ficam lado a
lado, a convencional primeiro, com descrições que dizem qual é qual, e a Lipo
HD ganha um aviso — o primeiro `note` do app — pedindo que só a marque quem
combinou esse planejamento na consulta.

Co-Authored-By: Claude Opus 5 <noreply@anthropic.com>
Claude-Session: https://claude.ai/code/session_01RXsuhQQ6qNiyuBJF5nJZKq
</commit_message>
<xml_diff>
--- a/docs/conteudo-clinico-para-revisao.docx
+++ b/docs/conteudo-clinico-para-revisao.docx
@@ -945,7 +945,7 @@
           <w:sz w:val="19"/>
           <w:szCs w:val="19"/>
         </w:rPr>
-        <w:t xml:space="preserve">Descrição na seleção: "Lipoaspiração e enxertia de gordura"</w:t>
+        <w:t xml:space="preserve">Descrição na seleção: "Lipoaspiração convencional, com ou sem enxertia de gordura"</w:t>
       </w:r>
     </w:p>
     <w:p>
@@ -1072,7 +1072,7 @@
           <w:sz w:val="19"/>
           <w:szCs w:val="19"/>
         </w:rPr>
-        <w:t xml:space="preserve">Descrição na seleção: "Lipoaspiração de alta definição, com ou sem enxertia"</w:t>
+        <w:t xml:space="preserve">Descrição na seleção: "Lipoaspiração de alta definição, com ou sem GRAFT"</w:t>
       </w:r>
     </w:p>
     <w:p>

</xml_diff>

<commit_message>
Inclui os vídeos no documento de revisão
Os títulos e as descrições dos vídeos são texto que a paciente lê, e vários
foram escritos por mim sem que a clínica visse — alguns são explicitamente
provisórios. Não fazia sentido deixá-los de fora do único documento que existe
para ser revisado.

Cada vídeo aparece com o texto exibido, o link e em que tela ele surge, para
que dê para conferir também o posicionamento, e não só a redação.

Co-Authored-By: Claude Opus 5 <noreply@anthropic.com>
Claude-Session: https://claude.ai/code/session_01RXsuhQQ6qNiyuBJF5nJZKq
</commit_message>
<xml_diff>
--- a/docs/conteudo-clinico-para-revisao.docx
+++ b/docs/conteudo-clinico-para-revisao.docx
@@ -24779,7 +24779,2560 @@
           <w:sz w:val="34"/>
           <w:szCs w:val="34"/>
         </w:rPr>
-        <w:t xml:space="preserve">6. Avisos exibidos no aplicativo</w:t>
+        <w:t xml:space="preserve">6. Vídeos do canal</w:t>
+      </w:r>
+    </w:p>
+    <w:p>
+      <w:pPr>
+        <w:shd w:fill="F2F2F2" w:val="clear"/>
+        <w:spacing w:after="200" w:before="100"/>
+      </w:pPr>
+      <w:r>
+        <w:rPr>
+          <w:i/>
+          <w:iCs/>
+          <w:color w:val="6B6B6B"/>
+          <w:sz w:val="19"/>
+          <w:szCs w:val="19"/>
+        </w:rPr>
+        <w:t xml:space="preserve">Cada vídeo aparece só para quem se encaixa. O título e a descrição abaixo são o que a paciente lê no aplicativo — não são os títulos do YouTube.</w:t>
+      </w:r>
+    </w:p>
+    <w:p>
+      <w:pPr>
+        <w:pStyle w:val="Heading3"/>
+        <w:spacing w:after="100" w:before="280"/>
+      </w:pPr>
+      <w:r>
+        <w:rPr>
+          <w:b/>
+          <w:bCs/>
+          <w:color w:val="111111"/>
+          <w:sz w:val="23"/>
+          <w:szCs w:val="23"/>
+        </w:rPr>
+        <w:t xml:space="preserve">Trajetória e formação</w:t>
+      </w:r>
+    </w:p>
+    <w:p>
+      <w:pPr>
+        <w:spacing w:after="100"/>
+      </w:pPr>
+      <w:r>
+        <w:rPr>
+          <w:color w:val="6B6B6B"/>
+          <w:sz w:val="19"/>
+          <w:szCs w:val="19"/>
+        </w:rPr>
+        <w:t xml:space="preserve">A história e a formação do Dr. Henrique Reis</w:t>
+      </w:r>
+    </w:p>
+    <w:p>
+      <w:pPr>
+        <w:spacing w:after="100"/>
+      </w:pPr>
+      <w:r>
+        <w:rPr>
+          <w:sz w:val="19"/>
+          <w:szCs w:val="19"/>
+        </w:rPr>
+        <w:t xml:space="preserve">Cartão "Sobre o cirurgião e a equipe", na tela de contato</w:t>
+      </w:r>
+    </w:p>
+    <w:p>
+      <w:pPr>
+        <w:spacing w:after="100"/>
+      </w:pPr>
+      <w:r>
+        <w:rPr>
+          <w:color w:val="6B6B6B"/>
+          <w:sz w:val="17"/>
+          <w:szCs w:val="17"/>
+        </w:rPr>
+        <w:t xml:space="preserve">https://youtu.be/0mpbFyMmWis</w:t>
+      </w:r>
+    </w:p>
+    <w:p>
+      <w:pPr>
+        <w:pBdr>
+          <w:bottom w:val="dotted" w:color="C8C8C8" w:sz="4" w:space="4"/>
+        </w:pBdr>
+        <w:spacing w:after="240" w:before="100"/>
+      </w:pPr>
+      <w:r>
+        <w:rPr>
+          <w:i/>
+          <w:iCs/>
+          <w:color w:val="AAAAAA"/>
+          <w:sz w:val="17"/>
+          <w:szCs w:val="17"/>
+        </w:rPr>
+        <w:t xml:space="preserve">Correção: </w:t>
+      </w:r>
+    </w:p>
+    <w:p>
+      <w:pPr>
+        <w:pStyle w:val="Heading3"/>
+        <w:spacing w:after="100" w:before="280"/>
+      </w:pPr>
+      <w:r>
+        <w:rPr>
+          <w:b/>
+          <w:bCs/>
+          <w:color w:val="111111"/>
+          <w:sz w:val="23"/>
+          <w:szCs w:val="23"/>
+        </w:rPr>
+        <w:t xml:space="preserve">Nossa equipe cirúrgica</w:t>
+      </w:r>
+    </w:p>
+    <w:p>
+      <w:pPr>
+        <w:spacing w:after="100"/>
+      </w:pPr>
+      <w:r>
+        <w:rPr>
+          <w:color w:val="6B6B6B"/>
+          <w:sz w:val="19"/>
+          <w:szCs w:val="19"/>
+        </w:rPr>
+        <w:t xml:space="preserve">Quem está com você no centro cirúrgico</w:t>
+      </w:r>
+    </w:p>
+    <w:p>
+      <w:pPr>
+        <w:spacing w:after="100"/>
+      </w:pPr>
+      <w:r>
+        <w:rPr>
+          <w:sz w:val="19"/>
+          <w:szCs w:val="19"/>
+        </w:rPr>
+        <w:t xml:space="preserve">Cartão "Sobre o cirurgião e a equipe", na tela de contato</w:t>
+      </w:r>
+    </w:p>
+    <w:p>
+      <w:pPr>
+        <w:spacing w:after="100"/>
+      </w:pPr>
+      <w:r>
+        <w:rPr>
+          <w:color w:val="6B6B6B"/>
+          <w:sz w:val="17"/>
+          <w:szCs w:val="17"/>
+        </w:rPr>
+        <w:t xml:space="preserve">https://youtu.be/ogH2sXFSd3E</w:t>
+      </w:r>
+    </w:p>
+    <w:p>
+      <w:pPr>
+        <w:pBdr>
+          <w:bottom w:val="dotted" w:color="C8C8C8" w:sz="4" w:space="4"/>
+        </w:pBdr>
+        <w:spacing w:after="240" w:before="100"/>
+      </w:pPr>
+      <w:r>
+        <w:rPr>
+          <w:i/>
+          <w:iCs/>
+          <w:color w:val="AAAAAA"/>
+          <w:sz w:val="17"/>
+          <w:szCs w:val="17"/>
+        </w:rPr>
+        <w:t xml:space="preserve">Correção: </w:t>
+      </w:r>
+    </w:p>
+    <w:p>
+      <w:pPr>
+        <w:pStyle w:val="Heading3"/>
+        <w:spacing w:after="100" w:before="280"/>
+      </w:pPr>
+      <w:r>
+        <w:rPr>
+          <w:b/>
+          <w:bCs/>
+          <w:color w:val="111111"/>
+          <w:sz w:val="23"/>
+          <w:szCs w:val="23"/>
+        </w:rPr>
+        <w:t xml:space="preserve">Tudo sobre a cirurgia plástica</w:t>
+      </w:r>
+    </w:p>
+    <w:p>
+      <w:pPr>
+        <w:spacing w:after="100"/>
+      </w:pPr>
+      <w:r>
+        <w:rPr>
+          <w:color w:val="6B6B6B"/>
+          <w:sz w:val="19"/>
+          <w:szCs w:val="19"/>
+        </w:rPr>
+        <w:t xml:space="preserve">Uma visão geral — bom de assistir antes de operar</w:t>
+      </w:r>
+    </w:p>
+    <w:p>
+      <w:pPr>
+        <w:spacing w:after="100"/>
+      </w:pPr>
+      <w:r>
+        <w:rPr>
+          <w:sz w:val="19"/>
+          <w:szCs w:val="19"/>
+        </w:rPr>
+        <w:t xml:space="preserve">Aba Cuidados — todas as cirurgias · e na tela Hoje, antes do procedimento</w:t>
+      </w:r>
+    </w:p>
+    <w:p>
+      <w:pPr>
+        <w:spacing w:after="100"/>
+      </w:pPr>
+      <w:r>
+        <w:rPr>
+          <w:color w:val="6B6B6B"/>
+          <w:sz w:val="17"/>
+          <w:szCs w:val="17"/>
+        </w:rPr>
+        <w:t xml:space="preserve">https://youtu.be/pB5Qkz9VQho</w:t>
+      </w:r>
+    </w:p>
+    <w:p>
+      <w:pPr>
+        <w:pBdr>
+          <w:bottom w:val="dotted" w:color="C8C8C8" w:sz="4" w:space="4"/>
+        </w:pBdr>
+        <w:spacing w:after="240" w:before="100"/>
+      </w:pPr>
+      <w:r>
+        <w:rPr>
+          <w:i/>
+          <w:iCs/>
+          <w:color w:val="AAAAAA"/>
+          <w:sz w:val="17"/>
+          <w:szCs w:val="17"/>
+        </w:rPr>
+        <w:t xml:space="preserve">Correção: </w:t>
+      </w:r>
+    </w:p>
+    <w:p>
+      <w:pPr>
+        <w:pStyle w:val="Heading3"/>
+        <w:spacing w:after="100" w:before="280"/>
+      </w:pPr>
+      <w:r>
+        <w:rPr>
+          <w:b/>
+          <w:bCs/>
+          <w:color w:val="111111"/>
+          <w:sz w:val="23"/>
+          <w:szCs w:val="23"/>
+        </w:rPr>
+        <w:t xml:space="preserve">Pós-operatório de plástica</w:t>
+      </w:r>
+    </w:p>
+    <w:p>
+      <w:pPr>
+        <w:spacing w:after="100"/>
+      </w:pPr>
+      <w:r>
+        <w:rPr>
+          <w:color w:val="6B6B6B"/>
+          <w:sz w:val="19"/>
+          <w:szCs w:val="19"/>
+        </w:rPr>
+        <w:t xml:space="preserve">Como conduzimos a sua recuperação</w:t>
+      </w:r>
+    </w:p>
+    <w:p>
+      <w:pPr>
+        <w:spacing w:after="100"/>
+      </w:pPr>
+      <w:r>
+        <w:rPr>
+          <w:sz w:val="19"/>
+          <w:szCs w:val="19"/>
+        </w:rPr>
+        <w:t xml:space="preserve">Dentro do guia "HR Recovery Protocol"</w:t>
+      </w:r>
+    </w:p>
+    <w:p>
+      <w:pPr>
+        <w:spacing w:after="100"/>
+      </w:pPr>
+      <w:r>
+        <w:rPr>
+          <w:color w:val="6B6B6B"/>
+          <w:sz w:val="17"/>
+          <w:szCs w:val="17"/>
+        </w:rPr>
+        <w:t xml:space="preserve">https://youtu.be/xE_qYgZT8e0</w:t>
+      </w:r>
+    </w:p>
+    <w:p>
+      <w:pPr>
+        <w:pBdr>
+          <w:bottom w:val="dotted" w:color="C8C8C8" w:sz="4" w:space="4"/>
+        </w:pBdr>
+        <w:spacing w:after="240" w:before="100"/>
+      </w:pPr>
+      <w:r>
+        <w:rPr>
+          <w:i/>
+          <w:iCs/>
+          <w:color w:val="AAAAAA"/>
+          <w:sz w:val="17"/>
+          <w:szCs w:val="17"/>
+        </w:rPr>
+        <w:t xml:space="preserve">Correção: </w:t>
+      </w:r>
+    </w:p>
+    <w:p>
+      <w:pPr>
+        <w:pStyle w:val="Heading3"/>
+        <w:spacing w:after="100" w:before="280"/>
+      </w:pPr>
+      <w:r>
+        <w:rPr>
+          <w:b/>
+          <w:bCs/>
+          <w:color w:val="111111"/>
+          <w:sz w:val="23"/>
+          <w:szCs w:val="23"/>
+        </w:rPr>
+        <w:t xml:space="preserve">O que eu preciso saber para fazer cirurgia plástica</w:t>
+      </w:r>
+    </w:p>
+    <w:p>
+      <w:pPr>
+        <w:spacing w:after="100"/>
+      </w:pPr>
+      <w:r>
+        <w:rPr>
+          <w:color w:val="6B6B6B"/>
+          <w:sz w:val="19"/>
+          <w:szCs w:val="19"/>
+        </w:rPr>
+        <w:t xml:space="preserve">O que considerar antes de decidir e de marcar</w:t>
+      </w:r>
+    </w:p>
+    <w:p>
+      <w:pPr>
+        <w:spacing w:after="100"/>
+      </w:pPr>
+      <w:r>
+        <w:rPr>
+          <w:sz w:val="19"/>
+          <w:szCs w:val="19"/>
+        </w:rPr>
+        <w:t xml:space="preserve">Aba Cuidados — todas as cirurgias · e na tela Hoje, antes do procedimento</w:t>
+      </w:r>
+    </w:p>
+    <w:p>
+      <w:pPr>
+        <w:spacing w:after="100"/>
+      </w:pPr>
+      <w:r>
+        <w:rPr>
+          <w:color w:val="6B6B6B"/>
+          <w:sz w:val="17"/>
+          <w:szCs w:val="17"/>
+        </w:rPr>
+        <w:t xml:space="preserve">https://youtu.be/PVj7A3YBv98</w:t>
+      </w:r>
+    </w:p>
+    <w:p>
+      <w:pPr>
+        <w:pBdr>
+          <w:bottom w:val="dotted" w:color="C8C8C8" w:sz="4" w:space="4"/>
+        </w:pBdr>
+        <w:spacing w:after="240" w:before="100"/>
+      </w:pPr>
+      <w:r>
+        <w:rPr>
+          <w:i/>
+          <w:iCs/>
+          <w:color w:val="AAAAAA"/>
+          <w:sz w:val="17"/>
+          <w:szCs w:val="17"/>
+        </w:rPr>
+        <w:t xml:space="preserve">Correção: </w:t>
+      </w:r>
+    </w:p>
+    <w:p>
+      <w:pPr>
+        <w:pStyle w:val="Heading3"/>
+        <w:spacing w:after="100" w:before="280"/>
+      </w:pPr>
+      <w:r>
+        <w:rPr>
+          <w:b/>
+          <w:bCs/>
+          <w:color w:val="111111"/>
+          <w:sz w:val="23"/>
+          <w:szCs w:val="23"/>
+        </w:rPr>
+        <w:t xml:space="preserve">Como é por dentro do centro cirúrgico</w:t>
+      </w:r>
+    </w:p>
+    <w:p>
+      <w:pPr>
+        <w:spacing w:after="100"/>
+      </w:pPr>
+      <w:r>
+        <w:rPr>
+          <w:color w:val="6B6B6B"/>
+          <w:sz w:val="19"/>
+          <w:szCs w:val="19"/>
+        </w:rPr>
+        <w:t xml:space="preserve">Onde a sua cirurgia acontece, por dentro</w:t>
+      </w:r>
+    </w:p>
+    <w:p>
+      <w:pPr>
+        <w:spacing w:after="100"/>
+      </w:pPr>
+      <w:r>
+        <w:rPr>
+          <w:sz w:val="19"/>
+          <w:szCs w:val="19"/>
+        </w:rPr>
+        <w:t xml:space="preserve">Aba Cuidados — todas as cirurgias · e na tela Hoje, antes do procedimento</w:t>
+      </w:r>
+    </w:p>
+    <w:p>
+      <w:pPr>
+        <w:spacing w:after="100"/>
+      </w:pPr>
+      <w:r>
+        <w:rPr>
+          <w:color w:val="6B6B6B"/>
+          <w:sz w:val="17"/>
+          <w:szCs w:val="17"/>
+        </w:rPr>
+        <w:t xml:space="preserve">https://youtu.be/Jhb_WlXkHfw</w:t>
+      </w:r>
+    </w:p>
+    <w:p>
+      <w:pPr>
+        <w:pBdr>
+          <w:bottom w:val="dotted" w:color="C8C8C8" w:sz="4" w:space="4"/>
+        </w:pBdr>
+        <w:spacing w:after="240" w:before="100"/>
+      </w:pPr>
+      <w:r>
+        <w:rPr>
+          <w:i/>
+          <w:iCs/>
+          <w:color w:val="AAAAAA"/>
+          <w:sz w:val="17"/>
+          <w:szCs w:val="17"/>
+        </w:rPr>
+        <w:t xml:space="preserve">Correção: </w:t>
+      </w:r>
+    </w:p>
+    <w:p>
+      <w:pPr>
+        <w:pStyle w:val="Heading3"/>
+        <w:spacing w:after="100" w:before="280"/>
+      </w:pPr>
+      <w:r>
+        <w:rPr>
+          <w:b/>
+          <w:bCs/>
+          <w:color w:val="111111"/>
+          <w:sz w:val="23"/>
+          <w:szCs w:val="23"/>
+        </w:rPr>
+        <w:t xml:space="preserve">Cirurgias combinadas</w:t>
+      </w:r>
+    </w:p>
+    <w:p>
+      <w:pPr>
+        <w:spacing w:after="100"/>
+      </w:pPr>
+      <w:r>
+        <w:rPr>
+          <w:color w:val="6B6B6B"/>
+          <w:sz w:val="19"/>
+          <w:szCs w:val="19"/>
+        </w:rPr>
+        <w:t xml:space="preserve">Quando faz sentido reunir mais de um procedimento</w:t>
+      </w:r>
+    </w:p>
+    <w:p>
+      <w:pPr>
+        <w:spacing w:after="100"/>
+      </w:pPr>
+      <w:r>
+        <w:rPr>
+          <w:sz w:val="19"/>
+          <w:szCs w:val="19"/>
+        </w:rPr>
+        <w:t xml:space="preserve">Aba Cuidados — todas as cirurgias</w:t>
+      </w:r>
+    </w:p>
+    <w:p>
+      <w:pPr>
+        <w:spacing w:after="100"/>
+      </w:pPr>
+      <w:r>
+        <w:rPr>
+          <w:color w:val="6B6B6B"/>
+          <w:sz w:val="17"/>
+          <w:szCs w:val="17"/>
+        </w:rPr>
+        <w:t xml:space="preserve">https://youtu.be/EpP4ETweqy8</w:t>
+      </w:r>
+    </w:p>
+    <w:p>
+      <w:pPr>
+        <w:pBdr>
+          <w:bottom w:val="dotted" w:color="C8C8C8" w:sz="4" w:space="4"/>
+        </w:pBdr>
+        <w:spacing w:after="240" w:before="100"/>
+      </w:pPr>
+      <w:r>
+        <w:rPr>
+          <w:i/>
+          <w:iCs/>
+          <w:color w:val="AAAAAA"/>
+          <w:sz w:val="17"/>
+          <w:szCs w:val="17"/>
+        </w:rPr>
+        <w:t xml:space="preserve">Correção: </w:t>
+      </w:r>
+    </w:p>
+    <w:p>
+      <w:pPr>
+        <w:pStyle w:val="Heading3"/>
+        <w:spacing w:after="100" w:before="280"/>
+      </w:pPr>
+      <w:r>
+        <w:rPr>
+          <w:b/>
+          <w:bCs/>
+          <w:color w:val="111111"/>
+          <w:sz w:val="23"/>
+          <w:szCs w:val="23"/>
+        </w:rPr>
+        <w:t xml:space="preserve">Cirurgia plástica no inverno</w:t>
+      </w:r>
+    </w:p>
+    <w:p>
+      <w:pPr>
+        <w:spacing w:after="100"/>
+      </w:pPr>
+      <w:r>
+        <w:rPr>
+          <w:color w:val="6B6B6B"/>
+          <w:sz w:val="19"/>
+          <w:szCs w:val="19"/>
+        </w:rPr>
+        <w:t xml:space="preserve">Por que a estação influencia na escolha da data</w:t>
+      </w:r>
+    </w:p>
+    <w:p>
+      <w:pPr>
+        <w:spacing w:after="100"/>
+      </w:pPr>
+      <w:r>
+        <w:rPr>
+          <w:sz w:val="19"/>
+          <w:szCs w:val="19"/>
+        </w:rPr>
+        <w:t xml:space="preserve">Aba Cuidados — todas as cirurgias · e na tela Hoje, antes do procedimento</w:t>
+      </w:r>
+    </w:p>
+    <w:p>
+      <w:pPr>
+        <w:spacing w:after="100"/>
+      </w:pPr>
+      <w:r>
+        <w:rPr>
+          <w:color w:val="6B6B6B"/>
+          <w:sz w:val="17"/>
+          <w:szCs w:val="17"/>
+        </w:rPr>
+        <w:t xml:space="preserve">https://youtu.be/g6My7N-sXXs</w:t>
+      </w:r>
+    </w:p>
+    <w:p>
+      <w:pPr>
+        <w:pBdr>
+          <w:bottom w:val="dotted" w:color="C8C8C8" w:sz="4" w:space="4"/>
+        </w:pBdr>
+        <w:spacing w:after="240" w:before="100"/>
+      </w:pPr>
+      <w:r>
+        <w:rPr>
+          <w:i/>
+          <w:iCs/>
+          <w:color w:val="AAAAAA"/>
+          <w:sz w:val="17"/>
+          <w:szCs w:val="17"/>
+        </w:rPr>
+        <w:t xml:space="preserve">Correção: </w:t>
+      </w:r>
+    </w:p>
+    <w:p>
+      <w:pPr>
+        <w:pStyle w:val="Heading3"/>
+        <w:spacing w:after="100" w:before="280"/>
+      </w:pPr>
+      <w:r>
+        <w:rPr>
+          <w:b/>
+          <w:bCs/>
+          <w:color w:val="111111"/>
+          <w:sz w:val="23"/>
+          <w:szCs w:val="23"/>
+        </w:rPr>
+        <w:t xml:space="preserve">Mitos e verdades da cirurgia plástica</w:t>
+      </w:r>
+    </w:p>
+    <w:p>
+      <w:pPr>
+        <w:spacing w:after="100"/>
+      </w:pPr>
+      <w:r>
+        <w:rPr>
+          <w:color w:val="6B6B6B"/>
+          <w:sz w:val="19"/>
+          <w:szCs w:val="19"/>
+        </w:rPr>
+        <w:t xml:space="preserve">O que se fala por aí e o que a prática mostra</w:t>
+      </w:r>
+    </w:p>
+    <w:p>
+      <w:pPr>
+        <w:spacing w:after="100"/>
+      </w:pPr>
+      <w:r>
+        <w:rPr>
+          <w:sz w:val="19"/>
+          <w:szCs w:val="19"/>
+        </w:rPr>
+        <w:t xml:space="preserve">Aba Cuidados — todas as cirurgias</w:t>
+      </w:r>
+    </w:p>
+    <w:p>
+      <w:pPr>
+        <w:spacing w:after="100"/>
+      </w:pPr>
+      <w:r>
+        <w:rPr>
+          <w:color w:val="6B6B6B"/>
+          <w:sz w:val="17"/>
+          <w:szCs w:val="17"/>
+        </w:rPr>
+        <w:t xml:space="preserve">https://youtu.be/CJyWBW8CyHs</w:t>
+      </w:r>
+    </w:p>
+    <w:p>
+      <w:pPr>
+        <w:pBdr>
+          <w:bottom w:val="dotted" w:color="C8C8C8" w:sz="4" w:space="4"/>
+        </w:pBdr>
+        <w:spacing w:after="240" w:before="100"/>
+      </w:pPr>
+      <w:r>
+        <w:rPr>
+          <w:i/>
+          <w:iCs/>
+          <w:color w:val="AAAAAA"/>
+          <w:sz w:val="17"/>
+          <w:szCs w:val="17"/>
+        </w:rPr>
+        <w:t xml:space="preserve">Correção: </w:t>
+      </w:r>
+    </w:p>
+    <w:p>
+      <w:pPr>
+        <w:pStyle w:val="Heading3"/>
+        <w:spacing w:after="100" w:before="280"/>
+      </w:pPr>
+      <w:r>
+        <w:rPr>
+          <w:b/>
+          <w:bCs/>
+          <w:color w:val="111111"/>
+          <w:sz w:val="23"/>
+          <w:szCs w:val="23"/>
+        </w:rPr>
+        <w:t xml:space="preserve">Harmonização facial</w:t>
+      </w:r>
+    </w:p>
+    <w:p>
+      <w:pPr>
+        <w:spacing w:after="100"/>
+      </w:pPr>
+      <w:r>
+        <w:rPr>
+          <w:color w:val="6B6B6B"/>
+          <w:sz w:val="19"/>
+          <w:szCs w:val="19"/>
+        </w:rPr>
+        <w:t xml:space="preserve">Toxina, preenchimento e o que cada um faz</w:t>
+      </w:r>
+    </w:p>
+    <w:p>
+      <w:pPr>
+        <w:spacing w:after="100"/>
+      </w:pPr>
+      <w:r>
+        <w:rPr>
+          <w:sz w:val="19"/>
+          <w:szCs w:val="19"/>
+        </w:rPr>
+        <w:t xml:space="preserve">Aba Cuidados — Toxina botulínica, Preenchimento, Bioestimulador de colágeno</w:t>
+      </w:r>
+    </w:p>
+    <w:p>
+      <w:pPr>
+        <w:spacing w:after="100"/>
+      </w:pPr>
+      <w:r>
+        <w:rPr>
+          <w:color w:val="6B6B6B"/>
+          <w:sz w:val="17"/>
+          <w:szCs w:val="17"/>
+        </w:rPr>
+        <w:t xml:space="preserve">https://youtu.be/Pn71kYdBkP4</w:t>
+      </w:r>
+    </w:p>
+    <w:p>
+      <w:pPr>
+        <w:pBdr>
+          <w:bottom w:val="dotted" w:color="C8C8C8" w:sz="4" w:space="4"/>
+        </w:pBdr>
+        <w:spacing w:after="240" w:before="100"/>
+      </w:pPr>
+      <w:r>
+        <w:rPr>
+          <w:i/>
+          <w:iCs/>
+          <w:color w:val="AAAAAA"/>
+          <w:sz w:val="17"/>
+          <w:szCs w:val="17"/>
+        </w:rPr>
+        <w:t xml:space="preserve">Correção: </w:t>
+      </w:r>
+    </w:p>
+    <w:p>
+      <w:pPr>
+        <w:pStyle w:val="Heading3"/>
+        <w:spacing w:after="100" w:before="280"/>
+      </w:pPr>
+      <w:r>
+        <w:rPr>
+          <w:b/>
+          <w:bCs/>
+          <w:color w:val="111111"/>
+          <w:sz w:val="23"/>
+          <w:szCs w:val="23"/>
+        </w:rPr>
+        <w:t xml:space="preserve">Botox</w:t>
+      </w:r>
+    </w:p>
+    <w:p>
+      <w:pPr>
+        <w:spacing w:after="100"/>
+      </w:pPr>
+      <w:r>
+        <w:rPr>
+          <w:color w:val="6B6B6B"/>
+          <w:sz w:val="19"/>
+          <w:szCs w:val="19"/>
+        </w:rPr>
+        <w:t xml:space="preserve">Como age a toxina botulínica e o que esperar dela</w:t>
+      </w:r>
+    </w:p>
+    <w:p>
+      <w:pPr>
+        <w:spacing w:after="100"/>
+      </w:pPr>
+      <w:r>
+        <w:rPr>
+          <w:sz w:val="19"/>
+          <w:szCs w:val="19"/>
+        </w:rPr>
+        <w:t xml:space="preserve">Aba Cuidados — Toxina botulínica</w:t>
+      </w:r>
+    </w:p>
+    <w:p>
+      <w:pPr>
+        <w:spacing w:after="100"/>
+      </w:pPr>
+      <w:r>
+        <w:rPr>
+          <w:color w:val="6B6B6B"/>
+          <w:sz w:val="17"/>
+          <w:szCs w:val="17"/>
+        </w:rPr>
+        <w:t xml:space="preserve">https://youtu.be/iAkeneffGpg</w:t>
+      </w:r>
+    </w:p>
+    <w:p>
+      <w:pPr>
+        <w:pBdr>
+          <w:bottom w:val="dotted" w:color="C8C8C8" w:sz="4" w:space="4"/>
+        </w:pBdr>
+        <w:spacing w:after="240" w:before="100"/>
+      </w:pPr>
+      <w:r>
+        <w:rPr>
+          <w:i/>
+          <w:iCs/>
+          <w:color w:val="AAAAAA"/>
+          <w:sz w:val="17"/>
+          <w:szCs w:val="17"/>
+        </w:rPr>
+        <w:t xml:space="preserve">Correção: </w:t>
+      </w:r>
+    </w:p>
+    <w:p>
+      <w:pPr>
+        <w:pStyle w:val="Heading3"/>
+        <w:spacing w:after="100" w:before="280"/>
+      </w:pPr>
+      <w:r>
+        <w:rPr>
+          <w:b/>
+          <w:bCs/>
+          <w:color w:val="111111"/>
+          <w:sz w:val="23"/>
+          <w:szCs w:val="23"/>
+        </w:rPr>
+        <w:t xml:space="preserve">Morpheus — vídeo 1</w:t>
+      </w:r>
+    </w:p>
+    <w:p>
+      <w:pPr>
+        <w:spacing w:after="100"/>
+      </w:pPr>
+      <w:r>
+        <w:rPr>
+          <w:color w:val="6B6B6B"/>
+          <w:sz w:val="19"/>
+          <w:szCs w:val="19"/>
+        </w:rPr>
+        <w:t xml:space="preserve">Como funciona o tratamento e o que esperar dele</w:t>
+      </w:r>
+    </w:p>
+    <w:p>
+      <w:pPr>
+        <w:spacing w:after="100"/>
+      </w:pPr>
+      <w:r>
+        <w:rPr>
+          <w:sz w:val="19"/>
+          <w:szCs w:val="19"/>
+        </w:rPr>
+        <w:t xml:space="preserve">Aba Cuidados — Morpheus</w:t>
+      </w:r>
+    </w:p>
+    <w:p>
+      <w:pPr>
+        <w:spacing w:after="100"/>
+      </w:pPr>
+      <w:r>
+        <w:rPr>
+          <w:color w:val="6B6B6B"/>
+          <w:sz w:val="17"/>
+          <w:szCs w:val="17"/>
+        </w:rPr>
+        <w:t xml:space="preserve">https://youtu.be/I2-r8eElMF8</w:t>
+      </w:r>
+    </w:p>
+    <w:p>
+      <w:pPr>
+        <w:pBdr>
+          <w:bottom w:val="dotted" w:color="C8C8C8" w:sz="4" w:space="4"/>
+        </w:pBdr>
+        <w:spacing w:after="240" w:before="100"/>
+      </w:pPr>
+      <w:r>
+        <w:rPr>
+          <w:i/>
+          <w:iCs/>
+          <w:color w:val="AAAAAA"/>
+          <w:sz w:val="17"/>
+          <w:szCs w:val="17"/>
+        </w:rPr>
+        <w:t xml:space="preserve">Correção: </w:t>
+      </w:r>
+    </w:p>
+    <w:p>
+      <w:pPr>
+        <w:pStyle w:val="Heading3"/>
+        <w:spacing w:after="100" w:before="280"/>
+      </w:pPr>
+      <w:r>
+        <w:rPr>
+          <w:b/>
+          <w:bCs/>
+          <w:color w:val="111111"/>
+          <w:sz w:val="23"/>
+          <w:szCs w:val="23"/>
+        </w:rPr>
+        <w:t xml:space="preserve">Morpheus — vídeo 2</w:t>
+      </w:r>
+    </w:p>
+    <w:p>
+      <w:pPr>
+        <w:spacing w:after="100"/>
+      </w:pPr>
+      <w:r>
+        <w:rPr>
+          <w:color w:val="6B6B6B"/>
+          <w:sz w:val="19"/>
+          <w:szCs w:val="19"/>
+        </w:rPr>
+        <w:t xml:space="preserve">Dr. Henrique Reis fala sobre o tratamento</w:t>
+      </w:r>
+    </w:p>
+    <w:p>
+      <w:pPr>
+        <w:spacing w:after="100"/>
+      </w:pPr>
+      <w:r>
+        <w:rPr>
+          <w:sz w:val="19"/>
+          <w:szCs w:val="19"/>
+        </w:rPr>
+        <w:t xml:space="preserve">Aba Cuidados — Morpheus</w:t>
+      </w:r>
+    </w:p>
+    <w:p>
+      <w:pPr>
+        <w:spacing w:after="100"/>
+      </w:pPr>
+      <w:r>
+        <w:rPr>
+          <w:color w:val="6B6B6B"/>
+          <w:sz w:val="17"/>
+          <w:szCs w:val="17"/>
+        </w:rPr>
+        <w:t xml:space="preserve">https://youtu.be/MOqbQayLHBM</w:t>
+      </w:r>
+    </w:p>
+    <w:p>
+      <w:pPr>
+        <w:pBdr>
+          <w:bottom w:val="dotted" w:color="C8C8C8" w:sz="4" w:space="4"/>
+        </w:pBdr>
+        <w:spacing w:after="240" w:before="100"/>
+      </w:pPr>
+      <w:r>
+        <w:rPr>
+          <w:i/>
+          <w:iCs/>
+          <w:color w:val="AAAAAA"/>
+          <w:sz w:val="17"/>
+          <w:szCs w:val="17"/>
+        </w:rPr>
+        <w:t xml:space="preserve">Correção: </w:t>
+      </w:r>
+    </w:p>
+    <w:p>
+      <w:pPr>
+        <w:pStyle w:val="Heading3"/>
+        <w:spacing w:after="100" w:before="280"/>
+      </w:pPr>
+      <w:r>
+        <w:rPr>
+          <w:b/>
+          <w:bCs/>
+          <w:color w:val="111111"/>
+          <w:sz w:val="23"/>
+          <w:szCs w:val="23"/>
+        </w:rPr>
+        <w:t xml:space="preserve">Fibrose e seroma</w:t>
+      </w:r>
+    </w:p>
+    <w:p>
+      <w:pPr>
+        <w:spacing w:after="100"/>
+      </w:pPr>
+      <w:r>
+        <w:rPr>
+          <w:color w:val="6B6B6B"/>
+          <w:sz w:val="19"/>
+          <w:szCs w:val="19"/>
+        </w:rPr>
+        <w:t xml:space="preserve">Por que acontecem e como são tratados</w:t>
+      </w:r>
+    </w:p>
+    <w:p>
+      <w:pPr>
+        <w:spacing w:after="100"/>
+      </w:pPr>
+      <w:r>
+        <w:rPr>
+          <w:sz w:val="19"/>
+          <w:szCs w:val="19"/>
+        </w:rPr>
+        <w:t xml:space="preserve">Dentro das orientações: Endurecimento e nódulos sob a pele, Inchaço mole que "balança" ao toque</w:t>
+      </w:r>
+    </w:p>
+    <w:p>
+      <w:pPr>
+        <w:spacing w:after="100"/>
+      </w:pPr>
+      <w:r>
+        <w:rPr>
+          <w:color w:val="6B6B6B"/>
+          <w:sz w:val="17"/>
+          <w:szCs w:val="17"/>
+        </w:rPr>
+        <w:t xml:space="preserve">https://youtu.be/FVNBljo2oPM</w:t>
+      </w:r>
+    </w:p>
+    <w:p>
+      <w:pPr>
+        <w:pBdr>
+          <w:bottom w:val="dotted" w:color="C8C8C8" w:sz="4" w:space="4"/>
+        </w:pBdr>
+        <w:spacing w:after="240" w:before="100"/>
+      </w:pPr>
+      <w:r>
+        <w:rPr>
+          <w:i/>
+          <w:iCs/>
+          <w:color w:val="AAAAAA"/>
+          <w:sz w:val="17"/>
+          <w:szCs w:val="17"/>
+        </w:rPr>
+        <w:t xml:space="preserve">Correção: </w:t>
+      </w:r>
+    </w:p>
+    <w:p>
+      <w:pPr>
+        <w:pStyle w:val="Heading3"/>
+        <w:spacing w:after="100" w:before="280"/>
+      </w:pPr>
+      <w:r>
+        <w:rPr>
+          <w:b/>
+          <w:bCs/>
+          <w:color w:val="111111"/>
+          <w:sz w:val="23"/>
+          <w:szCs w:val="23"/>
+        </w:rPr>
+        <w:t xml:space="preserve">Cirurgia plástica e exercício físico</w:t>
+      </w:r>
+    </w:p>
+    <w:p>
+      <w:pPr>
+        <w:spacing w:after="100"/>
+      </w:pPr>
+      <w:r>
+        <w:rPr>
+          <w:color w:val="6B6B6B"/>
+          <w:sz w:val="19"/>
+          <w:szCs w:val="19"/>
+        </w:rPr>
+        <w:t xml:space="preserve">Quando voltar e por que a pressa atrapalha</w:t>
+      </w:r>
+    </w:p>
+    <w:p>
+      <w:pPr>
+        <w:spacing w:after="100"/>
+      </w:pPr>
+      <w:r>
+        <w:rPr>
+          <w:sz w:val="19"/>
+          <w:szCs w:val="19"/>
+        </w:rPr>
+        <w:t xml:space="preserve">Dentro do guia "Volta à rotina e exercícios"</w:t>
+      </w:r>
+    </w:p>
+    <w:p>
+      <w:pPr>
+        <w:spacing w:after="100"/>
+      </w:pPr>
+      <w:r>
+        <w:rPr>
+          <w:color w:val="6B6B6B"/>
+          <w:sz w:val="17"/>
+          <w:szCs w:val="17"/>
+        </w:rPr>
+        <w:t xml:space="preserve">https://youtu.be/mQEhepALp30</w:t>
+      </w:r>
+    </w:p>
+    <w:p>
+      <w:pPr>
+        <w:pBdr>
+          <w:bottom w:val="dotted" w:color="C8C8C8" w:sz="4" w:space="4"/>
+        </w:pBdr>
+        <w:spacing w:after="240" w:before="100"/>
+      </w:pPr>
+      <w:r>
+        <w:rPr>
+          <w:i/>
+          <w:iCs/>
+          <w:color w:val="AAAAAA"/>
+          <w:sz w:val="17"/>
+          <w:szCs w:val="17"/>
+        </w:rPr>
+        <w:t xml:space="preserve">Correção: </w:t>
+      </w:r>
+    </w:p>
+    <w:p>
+      <w:pPr>
+        <w:pStyle w:val="Heading3"/>
+        <w:spacing w:after="100" w:before="280"/>
+      </w:pPr>
+      <w:r>
+        <w:rPr>
+          <w:b/>
+          <w:bCs/>
+          <w:color w:val="111111"/>
+          <w:sz w:val="23"/>
+          <w:szCs w:val="23"/>
+        </w:rPr>
+        <w:t xml:space="preserve">Nossas malhas personalizadas</w:t>
+      </w:r>
+    </w:p>
+    <w:p>
+      <w:pPr>
+        <w:spacing w:after="100"/>
+      </w:pPr>
+      <w:r>
+        <w:rPr>
+          <w:color w:val="6B6B6B"/>
+          <w:sz w:val="19"/>
+          <w:szCs w:val="19"/>
+        </w:rPr>
+        <w:t xml:space="preserve">Como a malha é feita para você e como usá-la</w:t>
+      </w:r>
+    </w:p>
+    <w:p>
+      <w:pPr>
+        <w:spacing w:after="100"/>
+      </w:pPr>
+      <w:r>
+        <w:rPr>
+          <w:sz w:val="19"/>
+          <w:szCs w:val="19"/>
+        </w:rPr>
+        <w:t xml:space="preserve">Dentro do guia "Cinta, malha e sutiã cirúrgico"</w:t>
+      </w:r>
+    </w:p>
+    <w:p>
+      <w:pPr>
+        <w:spacing w:after="100"/>
+      </w:pPr>
+      <w:r>
+        <w:rPr>
+          <w:color w:val="6B6B6B"/>
+          <w:sz w:val="17"/>
+          <w:szCs w:val="17"/>
+        </w:rPr>
+        <w:t xml:space="preserve">https://youtu.be/RzUG5nskTKg</w:t>
+      </w:r>
+    </w:p>
+    <w:p>
+      <w:pPr>
+        <w:pBdr>
+          <w:bottom w:val="dotted" w:color="C8C8C8" w:sz="4" w:space="4"/>
+        </w:pBdr>
+        <w:spacing w:after="240" w:before="100"/>
+      </w:pPr>
+      <w:r>
+        <w:rPr>
+          <w:i/>
+          <w:iCs/>
+          <w:color w:val="AAAAAA"/>
+          <w:sz w:val="17"/>
+          <w:szCs w:val="17"/>
+        </w:rPr>
+        <w:t xml:space="preserve">Correção: </w:t>
+      </w:r>
+    </w:p>
+    <w:p>
+      <w:pPr>
+        <w:pStyle w:val="Heading3"/>
+        <w:spacing w:after="100" w:before="280"/>
+      </w:pPr>
+      <w:r>
+        <w:rPr>
+          <w:b/>
+          <w:bCs/>
+          <w:color w:val="111111"/>
+          <w:sz w:val="23"/>
+          <w:szCs w:val="23"/>
+        </w:rPr>
+        <w:t xml:space="preserve">A cicatriz da cirurgia plástica</w:t>
+      </w:r>
+    </w:p>
+    <w:p>
+      <w:pPr>
+        <w:spacing w:after="100"/>
+      </w:pPr>
+      <w:r>
+        <w:rPr>
+          <w:color w:val="6B6B6B"/>
+          <w:sz w:val="19"/>
+          <w:szCs w:val="19"/>
+        </w:rPr>
+        <w:t xml:space="preserve">Como ela evolui e o que realmente ajuda</w:t>
+      </w:r>
+    </w:p>
+    <w:p>
+      <w:pPr>
+        <w:spacing w:after="100"/>
+      </w:pPr>
+      <w:r>
+        <w:rPr>
+          <w:sz w:val="19"/>
+          <w:szCs w:val="19"/>
+        </w:rPr>
+        <w:t xml:space="preserve">Dentro do guia "Cuidados com a cicatriz"</w:t>
+      </w:r>
+    </w:p>
+    <w:p>
+      <w:pPr>
+        <w:spacing w:after="100"/>
+      </w:pPr>
+      <w:r>
+        <w:rPr>
+          <w:color w:val="6B6B6B"/>
+          <w:sz w:val="17"/>
+          <w:szCs w:val="17"/>
+        </w:rPr>
+        <w:t xml:space="preserve">https://youtu.be/WCwsu0EgoTM</w:t>
+      </w:r>
+    </w:p>
+    <w:p>
+      <w:pPr>
+        <w:pBdr>
+          <w:bottom w:val="dotted" w:color="C8C8C8" w:sz="4" w:space="4"/>
+        </w:pBdr>
+        <w:spacing w:after="240" w:before="100"/>
+      </w:pPr>
+      <w:r>
+        <w:rPr>
+          <w:i/>
+          <w:iCs/>
+          <w:color w:val="AAAAAA"/>
+          <w:sz w:val="17"/>
+          <w:szCs w:val="17"/>
+        </w:rPr>
+        <w:t xml:space="preserve">Correção: </w:t>
+      </w:r>
+    </w:p>
+    <w:p>
+      <w:pPr>
+        <w:pStyle w:val="Heading3"/>
+        <w:spacing w:after="100" w:before="280"/>
+      </w:pPr>
+      <w:r>
+        <w:rPr>
+          <w:b/>
+          <w:bCs/>
+          <w:color w:val="111111"/>
+          <w:sz w:val="23"/>
+          <w:szCs w:val="23"/>
+        </w:rPr>
+        <w:t xml:space="preserve">Prótese de silicone</w:t>
+      </w:r>
+    </w:p>
+    <w:p>
+      <w:pPr>
+        <w:spacing w:after="100"/>
+      </w:pPr>
+      <w:r>
+        <w:rPr>
+          <w:color w:val="6B6B6B"/>
+          <w:sz w:val="19"/>
+          <w:szCs w:val="19"/>
+        </w:rPr>
+        <w:t xml:space="preserve">A mamoplastia de aumento, do planejamento ao resultado</w:t>
+      </w:r>
+    </w:p>
+    <w:p>
+      <w:pPr>
+        <w:spacing w:after="100"/>
+      </w:pPr>
+      <w:r>
+        <w:rPr>
+          <w:sz w:val="19"/>
+          <w:szCs w:val="19"/>
+        </w:rPr>
+        <w:t xml:space="preserve">Aba Cuidados — Mamoplastia de aumento</w:t>
+      </w:r>
+    </w:p>
+    <w:p>
+      <w:pPr>
+        <w:spacing w:after="100"/>
+      </w:pPr>
+      <w:r>
+        <w:rPr>
+          <w:color w:val="6B6B6B"/>
+          <w:sz w:val="17"/>
+          <w:szCs w:val="17"/>
+        </w:rPr>
+        <w:t xml:space="preserve">https://youtu.be/P8LSqgT_LW8</w:t>
+      </w:r>
+    </w:p>
+    <w:p>
+      <w:pPr>
+        <w:pBdr>
+          <w:bottom w:val="dotted" w:color="C8C8C8" w:sz="4" w:space="4"/>
+        </w:pBdr>
+        <w:spacing w:after="240" w:before="100"/>
+      </w:pPr>
+      <w:r>
+        <w:rPr>
+          <w:i/>
+          <w:iCs/>
+          <w:color w:val="AAAAAA"/>
+          <w:sz w:val="17"/>
+          <w:szCs w:val="17"/>
+        </w:rPr>
+        <w:t xml:space="preserve">Correção: </w:t>
+      </w:r>
+    </w:p>
+    <w:p>
+      <w:pPr>
+        <w:pStyle w:val="Heading3"/>
+        <w:spacing w:after="100" w:before="280"/>
+      </w:pPr>
+      <w:r>
+        <w:rPr>
+          <w:b/>
+          <w:bCs/>
+          <w:color w:val="111111"/>
+          <w:sz w:val="23"/>
+          <w:szCs w:val="23"/>
+        </w:rPr>
+        <w:t xml:space="preserve">Mastopexia com prótese</w:t>
+      </w:r>
+    </w:p>
+    <w:p>
+      <w:pPr>
+        <w:spacing w:after="100"/>
+      </w:pPr>
+      <w:r>
+        <w:rPr>
+          <w:color w:val="6B6B6B"/>
+          <w:sz w:val="19"/>
+          <w:szCs w:val="19"/>
+        </w:rPr>
+        <w:t xml:space="preserve">Como é a cirurgia, do planejamento ao resultado</w:t>
+      </w:r>
+    </w:p>
+    <w:p>
+      <w:pPr>
+        <w:spacing w:after="100"/>
+      </w:pPr>
+      <w:r>
+        <w:rPr>
+          <w:sz w:val="19"/>
+          <w:szCs w:val="19"/>
+        </w:rPr>
+        <w:t xml:space="preserve">Aba Cuidados — Mastopexia</w:t>
+      </w:r>
+    </w:p>
+    <w:p>
+      <w:pPr>
+        <w:spacing w:after="100"/>
+      </w:pPr>
+      <w:r>
+        <w:rPr>
+          <w:color w:val="6B6B6B"/>
+          <w:sz w:val="17"/>
+          <w:szCs w:val="17"/>
+        </w:rPr>
+        <w:t xml:space="preserve">https://youtu.be/5RLtz_8A-bU</w:t>
+      </w:r>
+    </w:p>
+    <w:p>
+      <w:pPr>
+        <w:pBdr>
+          <w:bottom w:val="dotted" w:color="C8C8C8" w:sz="4" w:space="4"/>
+        </w:pBdr>
+        <w:spacing w:after="240" w:before="100"/>
+      </w:pPr>
+      <w:r>
+        <w:rPr>
+          <w:i/>
+          <w:iCs/>
+          <w:color w:val="AAAAAA"/>
+          <w:sz w:val="17"/>
+          <w:szCs w:val="17"/>
+        </w:rPr>
+        <w:t xml:space="preserve">Correção: </w:t>
+      </w:r>
+    </w:p>
+    <w:p>
+      <w:pPr>
+        <w:pStyle w:val="Heading3"/>
+        <w:spacing w:after="100" w:before="280"/>
+      </w:pPr>
+      <w:r>
+        <w:rPr>
+          <w:b/>
+          <w:bCs/>
+          <w:color w:val="111111"/>
+          <w:sz w:val="23"/>
+          <w:szCs w:val="23"/>
+        </w:rPr>
+        <w:t xml:space="preserve">Mastopexia sem prótese</w:t>
+      </w:r>
+    </w:p>
+    <w:p>
+      <w:pPr>
+        <w:spacing w:after="100"/>
+      </w:pPr>
+      <w:r>
+        <w:rPr>
+          <w:color w:val="6B6B6B"/>
+          <w:sz w:val="19"/>
+          <w:szCs w:val="19"/>
+        </w:rPr>
+        <w:t xml:space="preserve">O levantamento das mamas sem uso de implante</w:t>
+      </w:r>
+    </w:p>
+    <w:p>
+      <w:pPr>
+        <w:spacing w:after="100"/>
+      </w:pPr>
+      <w:r>
+        <w:rPr>
+          <w:sz w:val="19"/>
+          <w:szCs w:val="19"/>
+        </w:rPr>
+        <w:t xml:space="preserve">Aba Cuidados — Mastopexia</w:t>
+      </w:r>
+    </w:p>
+    <w:p>
+      <w:pPr>
+        <w:spacing w:after="100"/>
+      </w:pPr>
+      <w:r>
+        <w:rPr>
+          <w:color w:val="6B6B6B"/>
+          <w:sz w:val="17"/>
+          <w:szCs w:val="17"/>
+        </w:rPr>
+        <w:t xml:space="preserve">https://youtu.be/u2nFFnwiXBk</w:t>
+      </w:r>
+    </w:p>
+    <w:p>
+      <w:pPr>
+        <w:pBdr>
+          <w:bottom w:val="dotted" w:color="C8C8C8" w:sz="4" w:space="4"/>
+        </w:pBdr>
+        <w:spacing w:after="240" w:before="100"/>
+      </w:pPr>
+      <w:r>
+        <w:rPr>
+          <w:i/>
+          <w:iCs/>
+          <w:color w:val="AAAAAA"/>
+          <w:sz w:val="17"/>
+          <w:szCs w:val="17"/>
+        </w:rPr>
+        <w:t xml:space="preserve">Correção: </w:t>
+      </w:r>
+    </w:p>
+    <w:p>
+      <w:pPr>
+        <w:pStyle w:val="Heading3"/>
+        <w:spacing w:after="100" w:before="280"/>
+      </w:pPr>
+      <w:r>
+        <w:rPr>
+          <w:b/>
+          <w:bCs/>
+          <w:color w:val="111111"/>
+          <w:sz w:val="23"/>
+          <w:szCs w:val="23"/>
+        </w:rPr>
+        <w:t xml:space="preserve">Mamoplastia redutora</w:t>
+      </w:r>
+    </w:p>
+    <w:p>
+      <w:pPr>
+        <w:spacing w:after="100"/>
+      </w:pPr>
+      <w:r>
+        <w:rPr>
+          <w:color w:val="6B6B6B"/>
+          <w:sz w:val="19"/>
+          <w:szCs w:val="19"/>
+        </w:rPr>
+        <w:t xml:space="preserve">A redução das mamas, do planejamento ao resultado</w:t>
+      </w:r>
+    </w:p>
+    <w:p>
+      <w:pPr>
+        <w:spacing w:after="100"/>
+      </w:pPr>
+      <w:r>
+        <w:rPr>
+          <w:sz w:val="19"/>
+          <w:szCs w:val="19"/>
+        </w:rPr>
+        <w:t xml:space="preserve">Aba Cuidados — Mamoplastia redutora</w:t>
+      </w:r>
+    </w:p>
+    <w:p>
+      <w:pPr>
+        <w:spacing w:after="100"/>
+      </w:pPr>
+      <w:r>
+        <w:rPr>
+          <w:color w:val="6B6B6B"/>
+          <w:sz w:val="17"/>
+          <w:szCs w:val="17"/>
+        </w:rPr>
+        <w:t xml:space="preserve">https://youtu.be/g-BBGZph6xQ</w:t>
+      </w:r>
+    </w:p>
+    <w:p>
+      <w:pPr>
+        <w:pBdr>
+          <w:bottom w:val="dotted" w:color="C8C8C8" w:sz="4" w:space="4"/>
+        </w:pBdr>
+        <w:spacing w:after="240" w:before="100"/>
+      </w:pPr>
+      <w:r>
+        <w:rPr>
+          <w:i/>
+          <w:iCs/>
+          <w:color w:val="AAAAAA"/>
+          <w:sz w:val="17"/>
+          <w:szCs w:val="17"/>
+        </w:rPr>
+        <w:t xml:space="preserve">Correção: </w:t>
+      </w:r>
+    </w:p>
+    <w:p>
+      <w:pPr>
+        <w:pStyle w:val="Heading3"/>
+        <w:spacing w:after="100" w:before="280"/>
+      </w:pPr>
+      <w:r>
+        <w:rPr>
+          <w:b/>
+          <w:bCs/>
+          <w:color w:val="111111"/>
+          <w:sz w:val="23"/>
+          <w:szCs w:val="23"/>
+        </w:rPr>
+        <w:t xml:space="preserve">Cirurgia pós-bariátrica</w:t>
+      </w:r>
+    </w:p>
+    <w:p>
+      <w:pPr>
+        <w:spacing w:after="100"/>
+      </w:pPr>
+      <w:r>
+        <w:rPr>
+          <w:color w:val="6B6B6B"/>
+          <w:sz w:val="19"/>
+          <w:szCs w:val="19"/>
+        </w:rPr>
+        <w:t xml:space="preserve">A retirada do excesso de pele depois da grande perda de peso</w:t>
+      </w:r>
+    </w:p>
+    <w:p>
+      <w:pPr>
+        <w:spacing w:after="100"/>
+      </w:pPr>
+      <w:r>
+        <w:rPr>
+          <w:sz w:val="19"/>
+          <w:szCs w:val="19"/>
+        </w:rPr>
+        <w:t xml:space="preserve">Aba Cuidados — Cirurgia pós-bariátrica</w:t>
+      </w:r>
+    </w:p>
+    <w:p>
+      <w:pPr>
+        <w:spacing w:after="100"/>
+      </w:pPr>
+      <w:r>
+        <w:rPr>
+          <w:color w:val="6B6B6B"/>
+          <w:sz w:val="17"/>
+          <w:szCs w:val="17"/>
+        </w:rPr>
+        <w:t xml:space="preserve">https://youtu.be/Eh__d2vjhK4</w:t>
+      </w:r>
+    </w:p>
+    <w:p>
+      <w:pPr>
+        <w:pBdr>
+          <w:bottom w:val="dotted" w:color="C8C8C8" w:sz="4" w:space="4"/>
+        </w:pBdr>
+        <w:spacing w:after="240" w:before="100"/>
+      </w:pPr>
+      <w:r>
+        <w:rPr>
+          <w:i/>
+          <w:iCs/>
+          <w:color w:val="AAAAAA"/>
+          <w:sz w:val="17"/>
+          <w:szCs w:val="17"/>
+        </w:rPr>
+        <w:t xml:space="preserve">Correção: </w:t>
+      </w:r>
+    </w:p>
+    <w:p>
+      <w:pPr>
+        <w:pStyle w:val="Heading3"/>
+        <w:spacing w:after="100" w:before="280"/>
+      </w:pPr>
+      <w:r>
+        <w:rPr>
+          <w:b/>
+          <w:bCs/>
+          <w:color w:val="111111"/>
+          <w:sz w:val="23"/>
+          <w:szCs w:val="23"/>
+        </w:rPr>
+        <w:t xml:space="preserve">Ginecomastia</w:t>
+      </w:r>
+    </w:p>
+    <w:p>
+      <w:pPr>
+        <w:spacing w:after="100"/>
+      </w:pPr>
+      <w:r>
+        <w:rPr>
+          <w:color w:val="6B6B6B"/>
+          <w:sz w:val="19"/>
+          <w:szCs w:val="19"/>
+        </w:rPr>
+        <w:t xml:space="preserve">A cirurgia da mama masculina, do planejamento ao resultado</w:t>
+      </w:r>
+    </w:p>
+    <w:p>
+      <w:pPr>
+        <w:spacing w:after="100"/>
+      </w:pPr>
+      <w:r>
+        <w:rPr>
+          <w:sz w:val="19"/>
+          <w:szCs w:val="19"/>
+        </w:rPr>
+        <w:t xml:space="preserve">Aba Cuidados — Correção de ginecomastia</w:t>
+      </w:r>
+    </w:p>
+    <w:p>
+      <w:pPr>
+        <w:spacing w:after="100"/>
+      </w:pPr>
+      <w:r>
+        <w:rPr>
+          <w:color w:val="6B6B6B"/>
+          <w:sz w:val="17"/>
+          <w:szCs w:val="17"/>
+        </w:rPr>
+        <w:t xml:space="preserve">https://youtu.be/aBmEN_YV8_g</w:t>
+      </w:r>
+    </w:p>
+    <w:p>
+      <w:pPr>
+        <w:pBdr>
+          <w:bottom w:val="dotted" w:color="C8C8C8" w:sz="4" w:space="4"/>
+        </w:pBdr>
+        <w:spacing w:after="240" w:before="100"/>
+      </w:pPr>
+      <w:r>
+        <w:rPr>
+          <w:i/>
+          <w:iCs/>
+          <w:color w:val="AAAAAA"/>
+          <w:sz w:val="17"/>
+          <w:szCs w:val="17"/>
+        </w:rPr>
+        <w:t xml:space="preserve">Correção: </w:t>
+      </w:r>
+    </w:p>
+    <w:p>
+      <w:pPr>
+        <w:pStyle w:val="Heading3"/>
+        <w:spacing w:after="100" w:before="280"/>
+      </w:pPr>
+      <w:r>
+        <w:rPr>
+          <w:b/>
+          <w:bCs/>
+          <w:color w:val="111111"/>
+          <w:sz w:val="23"/>
+          <w:szCs w:val="23"/>
+        </w:rPr>
+        <w:t xml:space="preserve">Otoplastia</w:t>
+      </w:r>
+    </w:p>
+    <w:p>
+      <w:pPr>
+        <w:spacing w:after="100"/>
+      </w:pPr>
+      <w:r>
+        <w:rPr>
+          <w:color w:val="6B6B6B"/>
+          <w:sz w:val="19"/>
+          <w:szCs w:val="19"/>
+        </w:rPr>
+        <w:t xml:space="preserve">A cirurgia das orelhas, do planejamento ao resultado</w:t>
+      </w:r>
+    </w:p>
+    <w:p>
+      <w:pPr>
+        <w:spacing w:after="100"/>
+      </w:pPr>
+      <w:r>
+        <w:rPr>
+          <w:sz w:val="19"/>
+          <w:szCs w:val="19"/>
+        </w:rPr>
+        <w:t xml:space="preserve">Aba Cuidados — Otoplastia</w:t>
+      </w:r>
+    </w:p>
+    <w:p>
+      <w:pPr>
+        <w:spacing w:after="100"/>
+      </w:pPr>
+      <w:r>
+        <w:rPr>
+          <w:color w:val="6B6B6B"/>
+          <w:sz w:val="17"/>
+          <w:szCs w:val="17"/>
+        </w:rPr>
+        <w:t xml:space="preserve">https://youtu.be/RDSSnaRloEE</w:t>
+      </w:r>
+    </w:p>
+    <w:p>
+      <w:pPr>
+        <w:pBdr>
+          <w:bottom w:val="dotted" w:color="C8C8C8" w:sz="4" w:space="4"/>
+        </w:pBdr>
+        <w:spacing w:after="240" w:before="100"/>
+      </w:pPr>
+      <w:r>
+        <w:rPr>
+          <w:i/>
+          <w:iCs/>
+          <w:color w:val="AAAAAA"/>
+          <w:sz w:val="17"/>
+          <w:szCs w:val="17"/>
+        </w:rPr>
+        <w:t xml:space="preserve">Correção: </w:t>
+      </w:r>
+    </w:p>
+    <w:p>
+      <w:pPr>
+        <w:pStyle w:val="Heading3"/>
+        <w:spacing w:after="100" w:before="280"/>
+      </w:pPr>
+      <w:r>
+        <w:rPr>
+          <w:b/>
+          <w:bCs/>
+          <w:color w:val="111111"/>
+          <w:sz w:val="23"/>
+          <w:szCs w:val="23"/>
+        </w:rPr>
+        <w:t xml:space="preserve">Blefaroplastia</w:t>
+      </w:r>
+    </w:p>
+    <w:p>
+      <w:pPr>
+        <w:spacing w:after="100"/>
+      </w:pPr>
+      <w:r>
+        <w:rPr>
+          <w:color w:val="6B6B6B"/>
+          <w:sz w:val="19"/>
+          <w:szCs w:val="19"/>
+        </w:rPr>
+        <w:t xml:space="preserve">A cirurgia das pálpebras, do planejamento ao resultado</w:t>
+      </w:r>
+    </w:p>
+    <w:p>
+      <w:pPr>
+        <w:spacing w:after="100"/>
+      </w:pPr>
+      <w:r>
+        <w:rPr>
+          <w:sz w:val="19"/>
+          <w:szCs w:val="19"/>
+        </w:rPr>
+        <w:t xml:space="preserve">Aba Cuidados — Blefaroplastia</w:t>
+      </w:r>
+    </w:p>
+    <w:p>
+      <w:pPr>
+        <w:spacing w:after="100"/>
+      </w:pPr>
+      <w:r>
+        <w:rPr>
+          <w:color w:val="6B6B6B"/>
+          <w:sz w:val="17"/>
+          <w:szCs w:val="17"/>
+        </w:rPr>
+        <w:t xml:space="preserve">https://youtu.be/n-bvGxN_O0M</w:t>
+      </w:r>
+    </w:p>
+    <w:p>
+      <w:pPr>
+        <w:pBdr>
+          <w:bottom w:val="dotted" w:color="C8C8C8" w:sz="4" w:space="4"/>
+        </w:pBdr>
+        <w:spacing w:after="240" w:before="100"/>
+      </w:pPr>
+      <w:r>
+        <w:rPr>
+          <w:i/>
+          <w:iCs/>
+          <w:color w:val="AAAAAA"/>
+          <w:sz w:val="17"/>
+          <w:szCs w:val="17"/>
+        </w:rPr>
+        <w:t xml:space="preserve">Correção: </w:t>
+      </w:r>
+    </w:p>
+    <w:p>
+      <w:pPr>
+        <w:pStyle w:val="Heading3"/>
+        <w:spacing w:after="100" w:before="280"/>
+      </w:pPr>
+      <w:r>
+        <w:rPr>
+          <w:b/>
+          <w:bCs/>
+          <w:color w:val="111111"/>
+          <w:sz w:val="23"/>
+          <w:szCs w:val="23"/>
+        </w:rPr>
+        <w:t xml:space="preserve">Abdominoplastia</w:t>
+      </w:r>
+    </w:p>
+    <w:p>
+      <w:pPr>
+        <w:spacing w:after="100"/>
+      </w:pPr>
+      <w:r>
+        <w:rPr>
+          <w:color w:val="6B6B6B"/>
+          <w:sz w:val="19"/>
+          <w:szCs w:val="19"/>
+        </w:rPr>
+        <w:t xml:space="preserve">Como é a cirurgia, do planejamento ao resultado</w:t>
+      </w:r>
+    </w:p>
+    <w:p>
+      <w:pPr>
+        <w:spacing w:after="100"/>
+      </w:pPr>
+      <w:r>
+        <w:rPr>
+          <w:sz w:val="19"/>
+          <w:szCs w:val="19"/>
+        </w:rPr>
+        <w:t xml:space="preserve">Aba Cuidados — Abdominoplastia</w:t>
+      </w:r>
+    </w:p>
+    <w:p>
+      <w:pPr>
+        <w:spacing w:after="100"/>
+      </w:pPr>
+      <w:r>
+        <w:rPr>
+          <w:color w:val="6B6B6B"/>
+          <w:sz w:val="17"/>
+          <w:szCs w:val="17"/>
+        </w:rPr>
+        <w:t xml:space="preserve">https://youtu.be/dPUpOOxFRr8</w:t>
+      </w:r>
+    </w:p>
+    <w:p>
+      <w:pPr>
+        <w:pBdr>
+          <w:bottom w:val="dotted" w:color="C8C8C8" w:sz="4" w:space="4"/>
+        </w:pBdr>
+        <w:spacing w:after="240" w:before="100"/>
+      </w:pPr>
+      <w:r>
+        <w:rPr>
+          <w:i/>
+          <w:iCs/>
+          <w:color w:val="AAAAAA"/>
+          <w:sz w:val="17"/>
+          <w:szCs w:val="17"/>
+        </w:rPr>
+        <w:t xml:space="preserve">Correção: </w:t>
+      </w:r>
+    </w:p>
+    <w:p>
+      <w:pPr>
+        <w:pStyle w:val="Heading3"/>
+        <w:spacing w:after="100" w:before="280"/>
+      </w:pPr>
+      <w:r>
+        <w:rPr>
+          <w:b/>
+          <w:bCs/>
+          <w:color w:val="111111"/>
+          <w:sz w:val="23"/>
+          <w:szCs w:val="23"/>
+        </w:rPr>
+        <w:t xml:space="preserve">Rinoplastia — vídeo 1</w:t>
+      </w:r>
+    </w:p>
+    <w:p>
+      <w:pPr>
+        <w:spacing w:after="100"/>
+      </w:pPr>
+      <w:r>
+        <w:rPr>
+          <w:color w:val="6B6B6B"/>
+          <w:sz w:val="19"/>
+          <w:szCs w:val="19"/>
+        </w:rPr>
+        <w:t xml:space="preserve">Dr. Henrique Reis fala sobre a cirurgia do nariz</w:t>
+      </w:r>
+    </w:p>
+    <w:p>
+      <w:pPr>
+        <w:spacing w:after="100"/>
+      </w:pPr>
+      <w:r>
+        <w:rPr>
+          <w:sz w:val="19"/>
+          <w:szCs w:val="19"/>
+        </w:rPr>
+        <w:t xml:space="preserve">Aba Cuidados — Rinoplastia</w:t>
+      </w:r>
+    </w:p>
+    <w:p>
+      <w:pPr>
+        <w:spacing w:after="100"/>
+      </w:pPr>
+      <w:r>
+        <w:rPr>
+          <w:color w:val="6B6B6B"/>
+          <w:sz w:val="17"/>
+          <w:szCs w:val="17"/>
+        </w:rPr>
+        <w:t xml:space="preserve">https://youtu.be/9CLobhNmmvE</w:t>
+      </w:r>
+    </w:p>
+    <w:p>
+      <w:pPr>
+        <w:pBdr>
+          <w:bottom w:val="dotted" w:color="C8C8C8" w:sz="4" w:space="4"/>
+        </w:pBdr>
+        <w:spacing w:after="240" w:before="100"/>
+      </w:pPr>
+      <w:r>
+        <w:rPr>
+          <w:i/>
+          <w:iCs/>
+          <w:color w:val="AAAAAA"/>
+          <w:sz w:val="17"/>
+          <w:szCs w:val="17"/>
+        </w:rPr>
+        <w:t xml:space="preserve">Correção: </w:t>
+      </w:r>
+    </w:p>
+    <w:p>
+      <w:pPr>
+        <w:pStyle w:val="Heading3"/>
+        <w:spacing w:after="100" w:before="280"/>
+      </w:pPr>
+      <w:r>
+        <w:rPr>
+          <w:b/>
+          <w:bCs/>
+          <w:color w:val="111111"/>
+          <w:sz w:val="23"/>
+          <w:szCs w:val="23"/>
+        </w:rPr>
+        <w:t xml:space="preserve">Rinoplastia — vídeo 2</w:t>
+      </w:r>
+    </w:p>
+    <w:p>
+      <w:pPr>
+        <w:spacing w:after="100"/>
+      </w:pPr>
+      <w:r>
+        <w:rPr>
+          <w:color w:val="6B6B6B"/>
+          <w:sz w:val="19"/>
+          <w:szCs w:val="19"/>
+        </w:rPr>
+        <w:t xml:space="preserve">Dr. Henrique Reis fala sobre a cirurgia do nariz</w:t>
+      </w:r>
+    </w:p>
+    <w:p>
+      <w:pPr>
+        <w:spacing w:after="100"/>
+      </w:pPr>
+      <w:r>
+        <w:rPr>
+          <w:sz w:val="19"/>
+          <w:szCs w:val="19"/>
+        </w:rPr>
+        <w:t xml:space="preserve">Aba Cuidados — Rinoplastia</w:t>
+      </w:r>
+    </w:p>
+    <w:p>
+      <w:pPr>
+        <w:spacing w:after="100"/>
+      </w:pPr>
+      <w:r>
+        <w:rPr>
+          <w:color w:val="6B6B6B"/>
+          <w:sz w:val="17"/>
+          <w:szCs w:val="17"/>
+        </w:rPr>
+        <w:t xml:space="preserve">https://youtu.be/2ncYLc1kOdg</w:t>
+      </w:r>
+    </w:p>
+    <w:p>
+      <w:pPr>
+        <w:pBdr>
+          <w:bottom w:val="dotted" w:color="C8C8C8" w:sz="4" w:space="4"/>
+        </w:pBdr>
+        <w:spacing w:after="240" w:before="100"/>
+      </w:pPr>
+      <w:r>
+        <w:rPr>
+          <w:i/>
+          <w:iCs/>
+          <w:color w:val="AAAAAA"/>
+          <w:sz w:val="17"/>
+          <w:szCs w:val="17"/>
+        </w:rPr>
+        <w:t xml:space="preserve">Correção: </w:t>
+      </w:r>
+    </w:p>
+    <w:p>
+      <w:pPr>
+        <w:pStyle w:val="Heading3"/>
+        <w:spacing w:after="100" w:before="280"/>
+      </w:pPr>
+      <w:r>
+        <w:rPr>
+          <w:b/>
+          <w:bCs/>
+          <w:color w:val="111111"/>
+          <w:sz w:val="23"/>
+          <w:szCs w:val="23"/>
+        </w:rPr>
+        <w:t xml:space="preserve">Rinoplastia — vídeo 3</w:t>
+      </w:r>
+    </w:p>
+    <w:p>
+      <w:pPr>
+        <w:spacing w:after="100"/>
+      </w:pPr>
+      <w:r>
+        <w:rPr>
+          <w:color w:val="6B6B6B"/>
+          <w:sz w:val="19"/>
+          <w:szCs w:val="19"/>
+        </w:rPr>
+        <w:t xml:space="preserve">Dr. Henrique Reis fala sobre a cirurgia do nariz</w:t>
+      </w:r>
+    </w:p>
+    <w:p>
+      <w:pPr>
+        <w:spacing w:after="100"/>
+      </w:pPr>
+      <w:r>
+        <w:rPr>
+          <w:sz w:val="19"/>
+          <w:szCs w:val="19"/>
+        </w:rPr>
+        <w:t xml:space="preserve">Aba Cuidados — Rinoplastia</w:t>
+      </w:r>
+    </w:p>
+    <w:p>
+      <w:pPr>
+        <w:spacing w:after="100"/>
+      </w:pPr>
+      <w:r>
+        <w:rPr>
+          <w:color w:val="6B6B6B"/>
+          <w:sz w:val="17"/>
+          <w:szCs w:val="17"/>
+        </w:rPr>
+        <w:t xml:space="preserve">https://youtu.be/KQmuGYKhaH8</w:t>
+      </w:r>
+    </w:p>
+    <w:p>
+      <w:pPr>
+        <w:pBdr>
+          <w:bottom w:val="dotted" w:color="C8C8C8" w:sz="4" w:space="4"/>
+        </w:pBdr>
+        <w:spacing w:after="240" w:before="100"/>
+      </w:pPr>
+      <w:r>
+        <w:rPr>
+          <w:i/>
+          <w:iCs/>
+          <w:color w:val="AAAAAA"/>
+          <w:sz w:val="17"/>
+          <w:szCs w:val="17"/>
+        </w:rPr>
+        <w:t xml:space="preserve">Correção: </w:t>
+      </w:r>
+    </w:p>
+    <w:p>
+      <w:pPr>
+        <w:pStyle w:val="Heading3"/>
+        <w:spacing w:after="100" w:before="280"/>
+      </w:pPr>
+      <w:r>
+        <w:rPr>
+          <w:b/>
+          <w:bCs/>
+          <w:color w:val="111111"/>
+          <w:sz w:val="23"/>
+          <w:szCs w:val="23"/>
+        </w:rPr>
+        <w:t xml:space="preserve">Facelift — parte 1</w:t>
+      </w:r>
+    </w:p>
+    <w:p>
+      <w:pPr>
+        <w:spacing w:after="100"/>
+      </w:pPr>
+      <w:r>
+        <w:rPr>
+          <w:color w:val="6B6B6B"/>
+          <w:sz w:val="19"/>
+          <w:szCs w:val="19"/>
+        </w:rPr>
+        <w:t xml:space="preserve">Dr. Henrique Reis explica o rejuvenescimento facial cirúrgico</w:t>
+      </w:r>
+    </w:p>
+    <w:p>
+      <w:pPr>
+        <w:spacing w:after="100"/>
+      </w:pPr>
+      <w:r>
+        <w:rPr>
+          <w:sz w:val="19"/>
+          <w:szCs w:val="19"/>
+        </w:rPr>
+        <w:t xml:space="preserve">Aba Cuidados — Face HD Concept</w:t>
+      </w:r>
+    </w:p>
+    <w:p>
+      <w:pPr>
+        <w:spacing w:after="100"/>
+      </w:pPr>
+      <w:r>
+        <w:rPr>
+          <w:color w:val="6B6B6B"/>
+          <w:sz w:val="17"/>
+          <w:szCs w:val="17"/>
+        </w:rPr>
+        <w:t xml:space="preserve">https://youtu.be/8ZIfYre0uKU</w:t>
+      </w:r>
+    </w:p>
+    <w:p>
+      <w:pPr>
+        <w:pBdr>
+          <w:bottom w:val="dotted" w:color="C8C8C8" w:sz="4" w:space="4"/>
+        </w:pBdr>
+        <w:spacing w:after="240" w:before="100"/>
+      </w:pPr>
+      <w:r>
+        <w:rPr>
+          <w:i/>
+          <w:iCs/>
+          <w:color w:val="AAAAAA"/>
+          <w:sz w:val="17"/>
+          <w:szCs w:val="17"/>
+        </w:rPr>
+        <w:t xml:space="preserve">Correção: </w:t>
+      </w:r>
+    </w:p>
+    <w:p>
+      <w:pPr>
+        <w:pStyle w:val="Heading3"/>
+        <w:spacing w:after="100" w:before="280"/>
+      </w:pPr>
+      <w:r>
+        <w:rPr>
+          <w:b/>
+          <w:bCs/>
+          <w:color w:val="111111"/>
+          <w:sz w:val="23"/>
+          <w:szCs w:val="23"/>
+        </w:rPr>
+        <w:t xml:space="preserve">Facelift — parte 2</w:t>
+      </w:r>
+    </w:p>
+    <w:p>
+      <w:pPr>
+        <w:spacing w:after="100"/>
+      </w:pPr>
+      <w:r>
+        <w:rPr>
+          <w:color w:val="6B6B6B"/>
+          <w:sz w:val="19"/>
+          <w:szCs w:val="19"/>
+        </w:rPr>
+        <w:t xml:space="preserve">Continuação, com o que esperar da recuperação</w:t>
+      </w:r>
+    </w:p>
+    <w:p>
+      <w:pPr>
+        <w:spacing w:after="100"/>
+      </w:pPr>
+      <w:r>
+        <w:rPr>
+          <w:sz w:val="19"/>
+          <w:szCs w:val="19"/>
+        </w:rPr>
+        <w:t xml:space="preserve">Aba Cuidados — Face HD Concept</w:t>
+      </w:r>
+    </w:p>
+    <w:p>
+      <w:pPr>
+        <w:spacing w:after="100"/>
+      </w:pPr>
+      <w:r>
+        <w:rPr>
+          <w:color w:val="6B6B6B"/>
+          <w:sz w:val="17"/>
+          <w:szCs w:val="17"/>
+        </w:rPr>
+        <w:t xml:space="preserve">https://youtu.be/5OwJWMBMo20</w:t>
+      </w:r>
+    </w:p>
+    <w:p>
+      <w:pPr>
+        <w:pBdr>
+          <w:bottom w:val="dotted" w:color="C8C8C8" w:sz="4" w:space="4"/>
+        </w:pBdr>
+        <w:spacing w:after="240" w:before="100"/>
+      </w:pPr>
+      <w:r>
+        <w:rPr>
+          <w:i/>
+          <w:iCs/>
+          <w:color w:val="AAAAAA"/>
+          <w:sz w:val="17"/>
+          <w:szCs w:val="17"/>
+        </w:rPr>
+        <w:t xml:space="preserve">Correção: </w:t>
+      </w:r>
+    </w:p>
+    <w:p>
+      <w:pPr>
+        <w:pStyle w:val="Heading3"/>
+        <w:spacing w:after="100" w:before="280"/>
+      </w:pPr>
+      <w:r>
+        <w:rPr>
+          <w:b/>
+          <w:bCs/>
+          <w:color w:val="111111"/>
+          <w:sz w:val="23"/>
+          <w:szCs w:val="23"/>
+        </w:rPr>
+        <w:t xml:space="preserve">BodyTite na prática, no centro cirúrgico</w:t>
+      </w:r>
+    </w:p>
+    <w:p>
+      <w:pPr>
+        <w:spacing w:after="100"/>
+      </w:pPr>
+      <w:r>
+        <w:rPr>
+          <w:color w:val="6B6B6B"/>
+          <w:sz w:val="19"/>
+          <w:szCs w:val="19"/>
+        </w:rPr>
+        <w:t xml:space="preserve">A tecnologia em uso durante a cirurgia</w:t>
+      </w:r>
+    </w:p>
+    <w:p>
+      <w:pPr>
+        <w:spacing w:after="100"/>
+      </w:pPr>
+      <w:r>
+        <w:rPr>
+          <w:sz w:val="19"/>
+          <w:szCs w:val="19"/>
+        </w:rPr>
+        <w:t xml:space="preserve">Aba Cuidados — Lipo HD Concept</w:t>
+      </w:r>
+    </w:p>
+    <w:p>
+      <w:pPr>
+        <w:spacing w:after="100"/>
+      </w:pPr>
+      <w:r>
+        <w:rPr>
+          <w:color w:val="6B6B6B"/>
+          <w:sz w:val="17"/>
+          <w:szCs w:val="17"/>
+        </w:rPr>
+        <w:t xml:space="preserve">https://youtu.be/fgwiOcY0YUQ</w:t>
+      </w:r>
+    </w:p>
+    <w:p>
+      <w:pPr>
+        <w:pBdr>
+          <w:bottom w:val="dotted" w:color="C8C8C8" w:sz="4" w:space="4"/>
+        </w:pBdr>
+        <w:spacing w:after="240" w:before="100"/>
+      </w:pPr>
+      <w:r>
+        <w:rPr>
+          <w:i/>
+          <w:iCs/>
+          <w:color w:val="AAAAAA"/>
+          <w:sz w:val="17"/>
+          <w:szCs w:val="17"/>
+        </w:rPr>
+        <w:t xml:space="preserve">Correção: </w:t>
+      </w:r>
+    </w:p>
+    <w:p>
+      <w:pPr>
+        <w:pStyle w:val="Heading3"/>
+        <w:spacing w:after="100" w:before="280"/>
+      </w:pPr>
+      <w:r>
+        <w:rPr>
+          <w:b/>
+          <w:bCs/>
+          <w:color w:val="111111"/>
+          <w:sz w:val="23"/>
+          <w:szCs w:val="23"/>
+        </w:rPr>
+        <w:t xml:space="preserve">O que é o BodyTite</w:t>
+      </w:r>
+    </w:p>
+    <w:p>
+      <w:pPr>
+        <w:spacing w:after="100"/>
+      </w:pPr>
+      <w:r>
+        <w:rPr>
+          <w:color w:val="6B6B6B"/>
+          <w:sz w:val="19"/>
+          <w:szCs w:val="19"/>
+        </w:rPr>
+        <w:t xml:space="preserve">Como ele age na retração da pele</w:t>
+      </w:r>
+    </w:p>
+    <w:p>
+      <w:pPr>
+        <w:spacing w:after="100"/>
+      </w:pPr>
+      <w:r>
+        <w:rPr>
+          <w:sz w:val="19"/>
+          <w:szCs w:val="19"/>
+        </w:rPr>
+        <w:t xml:space="preserve">Aba Cuidados — Lipo HD Concept</w:t>
+      </w:r>
+    </w:p>
+    <w:p>
+      <w:pPr>
+        <w:spacing w:after="100"/>
+      </w:pPr>
+      <w:r>
+        <w:rPr>
+          <w:color w:val="6B6B6B"/>
+          <w:sz w:val="17"/>
+          <w:szCs w:val="17"/>
+        </w:rPr>
+        <w:t xml:space="preserve">https://youtu.be/Cd4TBH1Bwy4</w:t>
+      </w:r>
+    </w:p>
+    <w:p>
+      <w:pPr>
+        <w:pBdr>
+          <w:bottom w:val="dotted" w:color="C8C8C8" w:sz="4" w:space="4"/>
+        </w:pBdr>
+        <w:spacing w:after="240" w:before="100"/>
+      </w:pPr>
+      <w:r>
+        <w:rPr>
+          <w:i/>
+          <w:iCs/>
+          <w:color w:val="AAAAAA"/>
+          <w:sz w:val="17"/>
+          <w:szCs w:val="17"/>
+        </w:rPr>
+        <w:t xml:space="preserve">Correção: </w:t>
+      </w:r>
+    </w:p>
+    <w:p>
+      <w:pPr>
+        <w:pStyle w:val="Heading3"/>
+        <w:spacing w:after="100" w:before="280"/>
+      </w:pPr>
+      <w:r>
+        <w:rPr>
+          <w:b/>
+          <w:bCs/>
+          <w:color w:val="111111"/>
+          <w:sz w:val="23"/>
+          <w:szCs w:val="23"/>
+        </w:rPr>
+        <w:t xml:space="preserve">Lipoaspiração e lipoenxertia — parte 1</w:t>
+      </w:r>
+    </w:p>
+    <w:p>
+      <w:pPr>
+        <w:spacing w:after="100"/>
+      </w:pPr>
+      <w:r>
+        <w:rPr>
+          <w:color w:val="6B6B6B"/>
+          <w:sz w:val="19"/>
+          <w:szCs w:val="19"/>
+        </w:rPr>
+        <w:t xml:space="preserve">Dr. Henrique Reis explica como a cirurgia é planejada e feita</w:t>
+      </w:r>
+    </w:p>
+    <w:p>
+      <w:pPr>
+        <w:spacing w:after="100"/>
+      </w:pPr>
+      <w:r>
+        <w:rPr>
+          <w:sz w:val="19"/>
+          <w:szCs w:val="19"/>
+        </w:rPr>
+        <w:t xml:space="preserve">Aba Cuidados — Lipo HD Concept, Lipoescultura</w:t>
+      </w:r>
+    </w:p>
+    <w:p>
+      <w:pPr>
+        <w:spacing w:after="100"/>
+      </w:pPr>
+      <w:r>
+        <w:rPr>
+          <w:color w:val="6B6B6B"/>
+          <w:sz w:val="17"/>
+          <w:szCs w:val="17"/>
+        </w:rPr>
+        <w:t xml:space="preserve">https://youtu.be/YUS3MWIf75w</w:t>
+      </w:r>
+    </w:p>
+    <w:p>
+      <w:pPr>
+        <w:pBdr>
+          <w:bottom w:val="dotted" w:color="C8C8C8" w:sz="4" w:space="4"/>
+        </w:pBdr>
+        <w:spacing w:after="240" w:before="100"/>
+      </w:pPr>
+      <w:r>
+        <w:rPr>
+          <w:i/>
+          <w:iCs/>
+          <w:color w:val="AAAAAA"/>
+          <w:sz w:val="17"/>
+          <w:szCs w:val="17"/>
+        </w:rPr>
+        <w:t xml:space="preserve">Correção: </w:t>
+      </w:r>
+    </w:p>
+    <w:p>
+      <w:pPr>
+        <w:pStyle w:val="Heading3"/>
+        <w:spacing w:after="100" w:before="280"/>
+      </w:pPr>
+      <w:r>
+        <w:rPr>
+          <w:b/>
+          <w:bCs/>
+          <w:color w:val="111111"/>
+          <w:sz w:val="23"/>
+          <w:szCs w:val="23"/>
+        </w:rPr>
+        <w:t xml:space="preserve">Lipoaspiração e lipoenxertia — parte 2</w:t>
+      </w:r>
+    </w:p>
+    <w:p>
+      <w:pPr>
+        <w:spacing w:after="100"/>
+      </w:pPr>
+      <w:r>
+        <w:rPr>
+          <w:color w:val="6B6B6B"/>
+          <w:sz w:val="19"/>
+          <w:szCs w:val="19"/>
+        </w:rPr>
+        <w:t xml:space="preserve">Continuação, com o que esperar do resultado e da recuperação</w:t>
+      </w:r>
+    </w:p>
+    <w:p>
+      <w:pPr>
+        <w:spacing w:after="100"/>
+      </w:pPr>
+      <w:r>
+        <w:rPr>
+          <w:sz w:val="19"/>
+          <w:szCs w:val="19"/>
+        </w:rPr>
+        <w:t xml:space="preserve">Aba Cuidados — Lipo HD Concept, Lipoescultura</w:t>
+      </w:r>
+    </w:p>
+    <w:p>
+      <w:pPr>
+        <w:spacing w:after="100"/>
+      </w:pPr>
+      <w:r>
+        <w:rPr>
+          <w:color w:val="6B6B6B"/>
+          <w:sz w:val="17"/>
+          <w:szCs w:val="17"/>
+        </w:rPr>
+        <w:t xml:space="preserve">https://youtu.be/JR4c_UespyI</w:t>
+      </w:r>
+    </w:p>
+    <w:p>
+      <w:pPr>
+        <w:pBdr>
+          <w:bottom w:val="dotted" w:color="C8C8C8" w:sz="4" w:space="4"/>
+        </w:pBdr>
+        <w:spacing w:after="240" w:before="100"/>
+      </w:pPr>
+      <w:r>
+        <w:rPr>
+          <w:i/>
+          <w:iCs/>
+          <w:color w:val="AAAAAA"/>
+          <w:sz w:val="17"/>
+          <w:szCs w:val="17"/>
+        </w:rPr>
+        <w:t xml:space="preserve">Correção: </w:t>
+      </w:r>
+    </w:p>
+    <w:p>
+      <w:pPr>
+        <w:pStyle w:val="Heading1"/>
+        <w:pageBreakBefore/>
+        <w:spacing w:after="240"/>
+      </w:pPr>
+      <w:r>
+        <w:rPr>
+          <w:b/>
+          <w:bCs/>
+          <w:color w:val="111111"/>
+          <w:sz w:val="34"/>
+          <w:szCs w:val="34"/>
+        </w:rPr>
+        <w:t xml:space="preserve">7. Avisos exibidos no aplicativo</w:t>
       </w:r>
     </w:p>
     <w:p>

</xml_diff>

<commit_message>
Acrescenta o BodyTite ao texto do guia da Lipo HD
Os dois vídeos de BodyTite já estavam no app, mas nenhuma linha de texto
mencionava a tecnologia — nem no guia, nem nos sintomas, nem nos marcos. A
paciente que fez retração de pele lia sobre lipo e enxertia, e nada sobre o
que foi feito na pele dela.

A seção segue o mesmo padrão condicional das outras: "se o BodyTite fez
parte", porque nem toda cirurgia inclui. Explica o que é, que a retração é
progressiva ao longo de meses, e que calor e endurecimento iniciais são
esperados — que é o que mais gera dúvida nas primeiras semanas.

Conteúdo escrito por mim, a partir do que a tecnologia faz. Precisa da
conferência do Dr. Henrique Reis, como o resto.

Co-Authored-By: Claude Opus 5 <noreply@anthropic.com>
Claude-Session: https://claude.ai/code/session_01RXsuhQQ6qNiyuBJF5nJZKq
</commit_message>
<xml_diff>
--- a/docs/conteudo-clinico-para-revisao.docx
+++ b/docs/conteudo-clinico-para-revisao.docx
@@ -21128,75 +21128,92 @@
           <w:sz w:val="17"/>
           <w:szCs w:val="17"/>
         </w:rPr>
-        <w:t xml:space="preserve">SE HOUVE ENXERTIA DE GORDURA</w:t>
-      </w:r>
-    </w:p>
-    <w:p>
-      <w:pPr>
-        <w:pStyle w:val="ListParagraph"/>
-        <w:numPr>
-          <w:ilvl w:val="0"/>
-          <w:numId w:val="2"/>
-        </w:numPr>
-        <w:spacing w:after="60"/>
-      </w:pPr>
-      <w:r>
-        <w:rPr>
-          <w:sz w:val="21"/>
-          <w:szCs w:val="21"/>
-        </w:rPr>
-        <w:t xml:space="preserve">Evite pressão sobre a área enxertada nas primeiras semanas</w:t>
-      </w:r>
-    </w:p>
-    <w:p>
-      <w:pPr>
-        <w:pStyle w:val="ListParagraph"/>
-        <w:numPr>
-          <w:ilvl w:val="0"/>
-          <w:numId w:val="2"/>
-        </w:numPr>
-        <w:spacing w:after="60"/>
-      </w:pPr>
-      <w:r>
-        <w:rPr>
-          <w:sz w:val="21"/>
-          <w:szCs w:val="21"/>
-        </w:rPr>
-        <w:t xml:space="preserve">Siga com rigor as orientações de posição para dormir e para sentar</w:t>
-      </w:r>
-    </w:p>
-    <w:p>
-      <w:pPr>
-        <w:pStyle w:val="ListParagraph"/>
-        <w:numPr>
-          <w:ilvl w:val="0"/>
-          <w:numId w:val="2"/>
-        </w:numPr>
-        <w:spacing w:after="60"/>
-      </w:pPr>
-      <w:r>
-        <w:rPr>
-          <w:sz w:val="21"/>
-          <w:szCs w:val="21"/>
-        </w:rPr>
-        <w:t xml:space="preserve">Não massageie a região enxertada sem orientação da equipe</w:t>
-      </w:r>
-    </w:p>
-    <w:p>
-      <w:pPr>
-        <w:pStyle w:val="ListParagraph"/>
-        <w:numPr>
-          <w:ilvl w:val="0"/>
-          <w:numId w:val="2"/>
-        </w:numPr>
-        <w:spacing w:after="60"/>
-      </w:pPr>
-      <w:r>
-        <w:rPr>
-          <w:sz w:val="21"/>
-          <w:szCs w:val="21"/>
-        </w:rPr>
-        <w:t xml:space="preserve">Mantenha boa hidratação e alimentação ao longo de toda a recuperação</w:t>
+        <w:t xml:space="preserve">SE O BODYTITE FEZ PARTE</w:t>
+      </w:r>
+    </w:p>
+    <w:p>
+      <w:pPr>
+        <w:pStyle w:val="ListParagraph"/>
+        <w:numPr>
+          <w:ilvl w:val="0"/>
+          <w:numId w:val="2"/>
+        </w:numPr>
+        <w:spacing w:after="60"/>
+      </w:pPr>
+      <w:r>
+        <w:rPr>
+          <w:sz w:val="21"/>
+          <w:szCs w:val="21"/>
+        </w:rPr>
+        <w:t xml:space="preserve">O BodyTite usa radiofrequência para aquecer a camada profunda da pele durante a cirurgia, estimulando a retração</w:t>
+      </w:r>
+    </w:p>
+    <w:p>
+      <w:pPr>
+        <w:pStyle w:val="ListParagraph"/>
+        <w:numPr>
+          <w:ilvl w:val="0"/>
+          <w:numId w:val="2"/>
+        </w:numPr>
+        <w:spacing w:after="60"/>
+      </w:pPr>
+      <w:r>
+        <w:rPr>
+          <w:sz w:val="21"/>
+          <w:szCs w:val="21"/>
+        </w:rPr>
+        <w:t xml:space="preserve">É indicado quando há flacidez de pele, e nem toda cirurgia inclui — vale o que foi combinado na sua consulta</w:t>
+      </w:r>
+    </w:p>
+    <w:p>
+      <w:pPr>
+        <w:pStyle w:val="ListParagraph"/>
+        <w:numPr>
+          <w:ilvl w:val="0"/>
+          <w:numId w:val="2"/>
+        </w:numPr>
+        <w:spacing w:after="60"/>
+      </w:pPr>
+      <w:r>
+        <w:rPr>
+          <w:sz w:val="21"/>
+          <w:szCs w:val="21"/>
+        </w:rPr>
+        <w:t xml:space="preserve">A retração é progressiva: parte aparece nas primeiras semanas e segue evoluindo ao longo de alguns meses</w:t>
+      </w:r>
+    </w:p>
+    <w:p>
+      <w:pPr>
+        <w:pStyle w:val="ListParagraph"/>
+        <w:numPr>
+          <w:ilvl w:val="0"/>
+          <w:numId w:val="2"/>
+        </w:numPr>
+        <w:spacing w:after="60"/>
+      </w:pPr>
+      <w:r>
+        <w:rPr>
+          <w:sz w:val="21"/>
+          <w:szCs w:val="21"/>
+        </w:rPr>
+        <w:t xml:space="preserve">Calor, sensibilidade e endurecimento na área tratada são esperados no início</w:t>
+      </w:r>
+    </w:p>
+    <w:p>
+      <w:pPr>
+        <w:pStyle w:val="ListParagraph"/>
+        <w:numPr>
+          <w:ilvl w:val="0"/>
+          <w:numId w:val="2"/>
+        </w:numPr>
+        <w:spacing w:after="60"/>
+      </w:pPr>
+      <w:r>
+        <w:rPr>
+          <w:sz w:val="21"/>
+          <w:szCs w:val="21"/>
+        </w:rPr>
+        <w:t xml:space="preserve">A compressão e o acompanhamento ajudam a pele a se acomodar — siga o que foi orientado para você</w:t>
       </w:r>
     </w:p>
     <w:p>
@@ -21212,126 +21229,75 @@
           <w:sz w:val="17"/>
           <w:szCs w:val="17"/>
         </w:rPr>
-        <w:t xml:space="preserve">POR QUE OS CUIDADOS PESAM MAIS AQUI</w:t>
-      </w:r>
-    </w:p>
-    <w:p>
-      <w:pPr>
-        <w:pStyle w:val="ListParagraph"/>
-        <w:numPr>
-          <w:ilvl w:val="0"/>
-          <w:numId w:val="2"/>
-        </w:numPr>
-        <w:spacing w:after="60"/>
-      </w:pPr>
-      <w:r>
-        <w:rPr>
-          <w:sz w:val="21"/>
-          <w:szCs w:val="21"/>
-        </w:rPr>
-        <w:t xml:space="preserve">São os mesmos da lipoaspiração convencional, mas é o que preserva a definição obtida na cirurgia</w:t>
-      </w:r>
-    </w:p>
-    <w:p>
-      <w:pPr>
-        <w:pStyle w:val="ListParagraph"/>
-        <w:numPr>
-          <w:ilvl w:val="0"/>
-          <w:numId w:val="2"/>
-        </w:numPr>
-        <w:spacing w:after="60"/>
-      </w:pPr>
-      <w:r>
-        <w:rPr>
-          <w:sz w:val="21"/>
-          <w:szCs w:val="21"/>
-        </w:rPr>
-        <w:t xml:space="preserve">Cinta conforme a orientação — sem apertar nem ajustar por conta própria</w:t>
-      </w:r>
-    </w:p>
-    <w:p>
-      <w:pPr>
-        <w:pStyle w:val="ListParagraph"/>
-        <w:numPr>
-          <w:ilvl w:val="0"/>
-          <w:numId w:val="2"/>
-        </w:numPr>
-        <w:spacing w:after="60"/>
-      </w:pPr>
-      <w:r>
-        <w:rPr>
-          <w:sz w:val="21"/>
-          <w:szCs w:val="21"/>
-        </w:rPr>
-        <w:t xml:space="preserve">Drenagem linfática e fisioterapia no cronograma indicado</w:t>
-      </w:r>
-    </w:p>
-    <w:p>
-      <w:pPr>
-        <w:pStyle w:val="ListParagraph"/>
-        <w:numPr>
-          <w:ilvl w:val="0"/>
-          <w:numId w:val="2"/>
-        </w:numPr>
-        <w:spacing w:after="60"/>
-      </w:pPr>
-      <w:r>
-        <w:rPr>
-          <w:sz w:val="21"/>
-          <w:szCs w:val="21"/>
-        </w:rPr>
-        <w:t xml:space="preserve">Caminhadas curtas e frequentes desde cedo, que também previnem trombose</w:t>
-      </w:r>
-    </w:p>
-    <w:p>
-      <w:pPr>
-        <w:pStyle w:val="ListParagraph"/>
-        <w:numPr>
-          <w:ilvl w:val="0"/>
-          <w:numId w:val="2"/>
-        </w:numPr>
-        <w:spacing w:after="60"/>
-      </w:pPr>
-      <w:r>
-        <w:rPr>
-          <w:sz w:val="21"/>
-          <w:szCs w:val="21"/>
-        </w:rPr>
-        <w:t xml:space="preserve">Alimentação rica em proteína e boa hidratação</w:t>
-      </w:r>
-    </w:p>
-    <w:p>
-      <w:pPr>
-        <w:pStyle w:val="ListParagraph"/>
-        <w:numPr>
-          <w:ilvl w:val="0"/>
-          <w:numId w:val="2"/>
-        </w:numPr>
-        <w:spacing w:after="60"/>
-      </w:pPr>
-      <w:r>
-        <w:rPr>
-          <w:sz w:val="21"/>
-          <w:szCs w:val="21"/>
-        </w:rPr>
-        <w:t xml:space="preserve">Volta aos exercícios de forma gradual, respeitando os prazos da equipe</w:t>
-      </w:r>
-    </w:p>
-    <w:p>
-      <w:pPr>
-        <w:pStyle w:val="ListParagraph"/>
-        <w:numPr>
-          <w:ilvl w:val="0"/>
-          <w:numId w:val="2"/>
-        </w:numPr>
-        <w:spacing w:after="60"/>
-      </w:pPr>
-      <w:r>
-        <w:rPr>
-          <w:sz w:val="21"/>
-          <w:szCs w:val="21"/>
-        </w:rPr>
-        <w:t xml:space="preserve">Sem sol direto enquanto houver roxos ou cicatriz recente</w:t>
+        <w:t xml:space="preserve">SE HOUVE ENXERTIA DE GORDURA</w:t>
+      </w:r>
+    </w:p>
+    <w:p>
+      <w:pPr>
+        <w:pStyle w:val="ListParagraph"/>
+        <w:numPr>
+          <w:ilvl w:val="0"/>
+          <w:numId w:val="2"/>
+        </w:numPr>
+        <w:spacing w:after="60"/>
+      </w:pPr>
+      <w:r>
+        <w:rPr>
+          <w:sz w:val="21"/>
+          <w:szCs w:val="21"/>
+        </w:rPr>
+        <w:t xml:space="preserve">Evite pressão sobre a área enxertada nas primeiras semanas</w:t>
+      </w:r>
+    </w:p>
+    <w:p>
+      <w:pPr>
+        <w:pStyle w:val="ListParagraph"/>
+        <w:numPr>
+          <w:ilvl w:val="0"/>
+          <w:numId w:val="2"/>
+        </w:numPr>
+        <w:spacing w:after="60"/>
+      </w:pPr>
+      <w:r>
+        <w:rPr>
+          <w:sz w:val="21"/>
+          <w:szCs w:val="21"/>
+        </w:rPr>
+        <w:t xml:space="preserve">Siga com rigor as orientações de posição para dormir e para sentar</w:t>
+      </w:r>
+    </w:p>
+    <w:p>
+      <w:pPr>
+        <w:pStyle w:val="ListParagraph"/>
+        <w:numPr>
+          <w:ilvl w:val="0"/>
+          <w:numId w:val="2"/>
+        </w:numPr>
+        <w:spacing w:after="60"/>
+      </w:pPr>
+      <w:r>
+        <w:rPr>
+          <w:sz w:val="21"/>
+          <w:szCs w:val="21"/>
+        </w:rPr>
+        <w:t xml:space="preserve">Não massageie a região enxertada sem orientação da equipe</w:t>
+      </w:r>
+    </w:p>
+    <w:p>
+      <w:pPr>
+        <w:pStyle w:val="ListParagraph"/>
+        <w:numPr>
+          <w:ilvl w:val="0"/>
+          <w:numId w:val="2"/>
+        </w:numPr>
+        <w:spacing w:after="60"/>
+      </w:pPr>
+      <w:r>
+        <w:rPr>
+          <w:sz w:val="21"/>
+          <w:szCs w:val="21"/>
+        </w:rPr>
+        <w:t xml:space="preserve">Mantenha boa hidratação e alimentação ao longo de toda a recuperação</w:t>
       </w:r>
     </w:p>
     <w:p>
@@ -21347,6 +21313,141 @@
           <w:sz w:val="17"/>
           <w:szCs w:val="17"/>
         </w:rPr>
+        <w:t xml:space="preserve">POR QUE OS CUIDADOS PESAM MAIS AQUI</w:t>
+      </w:r>
+    </w:p>
+    <w:p>
+      <w:pPr>
+        <w:pStyle w:val="ListParagraph"/>
+        <w:numPr>
+          <w:ilvl w:val="0"/>
+          <w:numId w:val="2"/>
+        </w:numPr>
+        <w:spacing w:after="60"/>
+      </w:pPr>
+      <w:r>
+        <w:rPr>
+          <w:sz w:val="21"/>
+          <w:szCs w:val="21"/>
+        </w:rPr>
+        <w:t xml:space="preserve">São os mesmos da lipoaspiração convencional, mas é o que preserva a definição obtida na cirurgia</w:t>
+      </w:r>
+    </w:p>
+    <w:p>
+      <w:pPr>
+        <w:pStyle w:val="ListParagraph"/>
+        <w:numPr>
+          <w:ilvl w:val="0"/>
+          <w:numId w:val="2"/>
+        </w:numPr>
+        <w:spacing w:after="60"/>
+      </w:pPr>
+      <w:r>
+        <w:rPr>
+          <w:sz w:val="21"/>
+          <w:szCs w:val="21"/>
+        </w:rPr>
+        <w:t xml:space="preserve">Cinta conforme a orientação — sem apertar nem ajustar por conta própria</w:t>
+      </w:r>
+    </w:p>
+    <w:p>
+      <w:pPr>
+        <w:pStyle w:val="ListParagraph"/>
+        <w:numPr>
+          <w:ilvl w:val="0"/>
+          <w:numId w:val="2"/>
+        </w:numPr>
+        <w:spacing w:after="60"/>
+      </w:pPr>
+      <w:r>
+        <w:rPr>
+          <w:sz w:val="21"/>
+          <w:szCs w:val="21"/>
+        </w:rPr>
+        <w:t xml:space="preserve">Drenagem linfática e fisioterapia no cronograma indicado</w:t>
+      </w:r>
+    </w:p>
+    <w:p>
+      <w:pPr>
+        <w:pStyle w:val="ListParagraph"/>
+        <w:numPr>
+          <w:ilvl w:val="0"/>
+          <w:numId w:val="2"/>
+        </w:numPr>
+        <w:spacing w:after="60"/>
+      </w:pPr>
+      <w:r>
+        <w:rPr>
+          <w:sz w:val="21"/>
+          <w:szCs w:val="21"/>
+        </w:rPr>
+        <w:t xml:space="preserve">Caminhadas curtas e frequentes desde cedo, que também previnem trombose</w:t>
+      </w:r>
+    </w:p>
+    <w:p>
+      <w:pPr>
+        <w:pStyle w:val="ListParagraph"/>
+        <w:numPr>
+          <w:ilvl w:val="0"/>
+          <w:numId w:val="2"/>
+        </w:numPr>
+        <w:spacing w:after="60"/>
+      </w:pPr>
+      <w:r>
+        <w:rPr>
+          <w:sz w:val="21"/>
+          <w:szCs w:val="21"/>
+        </w:rPr>
+        <w:t xml:space="preserve">Alimentação rica em proteína e boa hidratação</w:t>
+      </w:r>
+    </w:p>
+    <w:p>
+      <w:pPr>
+        <w:pStyle w:val="ListParagraph"/>
+        <w:numPr>
+          <w:ilvl w:val="0"/>
+          <w:numId w:val="2"/>
+        </w:numPr>
+        <w:spacing w:after="60"/>
+      </w:pPr>
+      <w:r>
+        <w:rPr>
+          <w:sz w:val="21"/>
+          <w:szCs w:val="21"/>
+        </w:rPr>
+        <w:t xml:space="preserve">Volta aos exercícios de forma gradual, respeitando os prazos da equipe</w:t>
+      </w:r>
+    </w:p>
+    <w:p>
+      <w:pPr>
+        <w:pStyle w:val="ListParagraph"/>
+        <w:numPr>
+          <w:ilvl w:val="0"/>
+          <w:numId w:val="2"/>
+        </w:numPr>
+        <w:spacing w:after="60"/>
+      </w:pPr>
+      <w:r>
+        <w:rPr>
+          <w:sz w:val="21"/>
+          <w:szCs w:val="21"/>
+        </w:rPr>
+        <w:t xml:space="preserve">Sem sol direto enquanto houver roxos ou cicatriz recente</w:t>
+      </w:r>
+    </w:p>
+    <w:p>
+      <w:pPr>
+        <w:spacing w:after="80" w:before="240"/>
+      </w:pPr>
+      <w:r>
+        <w:rPr>
+          <w:b/>
+          <w:bCs/>
+          <w:color w:val="067F7B"/>
+          <w:spacing w:val="30"/>
+          <w:sz w:val="17"/>
+          <w:szCs w:val="17"/>
+        </w:rPr>
         <w:t xml:space="preserve">O RESULTADO LEVA TEMPO</w:t>
       </w:r>
     </w:p>
@@ -21416,6 +21517,23 @@
           <w:szCs w:val="21"/>
         </w:rPr>
         <w:t xml:space="preserve">Quando houve enxertia, o resultado do enxerto se define entre 3 e 6 meses</w:t>
+      </w:r>
+    </w:p>
+    <w:p>
+      <w:pPr>
+        <w:pStyle w:val="ListParagraph"/>
+        <w:numPr>
+          <w:ilvl w:val="0"/>
+          <w:numId w:val="2"/>
+        </w:numPr>
+        <w:spacing w:after="60"/>
+      </w:pPr>
+      <w:r>
+        <w:rPr>
+          <w:sz w:val="21"/>
+          <w:szCs w:val="21"/>
+        </w:rPr>
+        <w:t xml:space="preserve">Quando o BodyTite fez parte, a retração da pele continua evoluindo por alguns meses</w:t>
       </w:r>
     </w:p>
     <w:p>

</xml_diff>

<commit_message>
Adiciona guia de BodyTite e Morpheus8
Texto escrito pelo cirurgião, publicado como guia próprio em Cuidados, com
o cuidado que ele pediu: descreve o que as tecnologias fazem sem prometer
grau de retração de pele.

- guia "tecnologias", visível para Lipo HD Concept e Lipoescultura;
- seção "O tempo da retração": o processo é gradual e pode seguir até
  cerca de nove meses, então o contorno dos primeiros meses não é o final;
- CareSection ganha "paragraphs" — este conteúdo é texto corrido, não
  lista de ações, e forçá-lo em bullets distorceria a leitura;
- os dois vídeos de BodyTite passam a morar dentro do guia;
- geradores do documento de revisão acompanham o novo campo.

Co-Authored-By: Claude Opus 5 <noreply@anthropic.com>
Claude-Session: https://claude.ai/code/session_01RXsuhQQ6qNiyuBJF5nJZKq
</commit_message>
<xml_diff>
--- a/docs/conteudo-clinico-para-revisao.docx
+++ b/docs/conteudo-clinico-para-revisao.docx
@@ -76,7 +76,7 @@
           <w:sz w:val="19"/>
           <w:szCs w:val="19"/>
         </w:rPr>
-        <w:t xml:space="preserve">18 procedimentos · 63 orientações de sintomas · 16 guias de cuidados</w:t>
+        <w:t xml:space="preserve">18 procedimentos · 63 orientações de sintomas · 17 guias de cuidados</w:t>
       </w:r>
     </w:p>
     <w:p>
@@ -21128,92 +21128,75 @@
           <w:sz w:val="17"/>
           <w:szCs w:val="17"/>
         </w:rPr>
-        <w:t xml:space="preserve">SE O BODYTITE FEZ PARTE</w:t>
-      </w:r>
-    </w:p>
-    <w:p>
-      <w:pPr>
-        <w:pStyle w:val="ListParagraph"/>
-        <w:numPr>
-          <w:ilvl w:val="0"/>
-          <w:numId w:val="2"/>
-        </w:numPr>
-        <w:spacing w:after="60"/>
-      </w:pPr>
-      <w:r>
-        <w:rPr>
-          <w:sz w:val="21"/>
-          <w:szCs w:val="21"/>
-        </w:rPr>
-        <w:t xml:space="preserve">O BodyTite usa radiofrequência para aquecer a camada profunda da pele durante a cirurgia, estimulando a retração</w:t>
-      </w:r>
-    </w:p>
-    <w:p>
-      <w:pPr>
-        <w:pStyle w:val="ListParagraph"/>
-        <w:numPr>
-          <w:ilvl w:val="0"/>
-          <w:numId w:val="2"/>
-        </w:numPr>
-        <w:spacing w:after="60"/>
-      </w:pPr>
-      <w:r>
-        <w:rPr>
-          <w:sz w:val="21"/>
-          <w:szCs w:val="21"/>
-        </w:rPr>
-        <w:t xml:space="preserve">É indicado quando há flacidez de pele, e nem toda cirurgia inclui — vale o que foi combinado na sua consulta</w:t>
-      </w:r>
-    </w:p>
-    <w:p>
-      <w:pPr>
-        <w:pStyle w:val="ListParagraph"/>
-        <w:numPr>
-          <w:ilvl w:val="0"/>
-          <w:numId w:val="2"/>
-        </w:numPr>
-        <w:spacing w:after="60"/>
-      </w:pPr>
-      <w:r>
-        <w:rPr>
-          <w:sz w:val="21"/>
-          <w:szCs w:val="21"/>
-        </w:rPr>
-        <w:t xml:space="preserve">A retração é progressiva: parte aparece nas primeiras semanas e segue evoluindo ao longo de alguns meses</w:t>
-      </w:r>
-    </w:p>
-    <w:p>
-      <w:pPr>
-        <w:pStyle w:val="ListParagraph"/>
-        <w:numPr>
-          <w:ilvl w:val="0"/>
-          <w:numId w:val="2"/>
-        </w:numPr>
-        <w:spacing w:after="60"/>
-      </w:pPr>
-      <w:r>
-        <w:rPr>
-          <w:sz w:val="21"/>
-          <w:szCs w:val="21"/>
-        </w:rPr>
-        <w:t xml:space="preserve">Calor, sensibilidade e endurecimento na área tratada são esperados no início</w:t>
-      </w:r>
-    </w:p>
-    <w:p>
-      <w:pPr>
-        <w:pStyle w:val="ListParagraph"/>
-        <w:numPr>
-          <w:ilvl w:val="0"/>
-          <w:numId w:val="2"/>
-        </w:numPr>
-        <w:spacing w:after="60"/>
-      </w:pPr>
-      <w:r>
-        <w:rPr>
-          <w:sz w:val="21"/>
-          <w:szCs w:val="21"/>
-        </w:rPr>
-        <w:t xml:space="preserve">A compressão e o acompanhamento ajudam a pele a se acomodar — siga o que foi orientado para você</w:t>
+        <w:t xml:space="preserve">SE HOUVE ENXERTIA DE GORDURA</w:t>
+      </w:r>
+    </w:p>
+    <w:p>
+      <w:pPr>
+        <w:pStyle w:val="ListParagraph"/>
+        <w:numPr>
+          <w:ilvl w:val="0"/>
+          <w:numId w:val="2"/>
+        </w:numPr>
+        <w:spacing w:after="60"/>
+      </w:pPr>
+      <w:r>
+        <w:rPr>
+          <w:sz w:val="21"/>
+          <w:szCs w:val="21"/>
+        </w:rPr>
+        <w:t xml:space="preserve">Evite pressão sobre a área enxertada nas primeiras semanas</w:t>
+      </w:r>
+    </w:p>
+    <w:p>
+      <w:pPr>
+        <w:pStyle w:val="ListParagraph"/>
+        <w:numPr>
+          <w:ilvl w:val="0"/>
+          <w:numId w:val="2"/>
+        </w:numPr>
+        <w:spacing w:after="60"/>
+      </w:pPr>
+      <w:r>
+        <w:rPr>
+          <w:sz w:val="21"/>
+          <w:szCs w:val="21"/>
+        </w:rPr>
+        <w:t xml:space="preserve">Siga com rigor as orientações de posição para dormir e para sentar</w:t>
+      </w:r>
+    </w:p>
+    <w:p>
+      <w:pPr>
+        <w:pStyle w:val="ListParagraph"/>
+        <w:numPr>
+          <w:ilvl w:val="0"/>
+          <w:numId w:val="2"/>
+        </w:numPr>
+        <w:spacing w:after="60"/>
+      </w:pPr>
+      <w:r>
+        <w:rPr>
+          <w:sz w:val="21"/>
+          <w:szCs w:val="21"/>
+        </w:rPr>
+        <w:t xml:space="preserve">Não massageie a região enxertada sem orientação da equipe</w:t>
+      </w:r>
+    </w:p>
+    <w:p>
+      <w:pPr>
+        <w:pStyle w:val="ListParagraph"/>
+        <w:numPr>
+          <w:ilvl w:val="0"/>
+          <w:numId w:val="2"/>
+        </w:numPr>
+        <w:spacing w:after="60"/>
+      </w:pPr>
+      <w:r>
+        <w:rPr>
+          <w:sz w:val="21"/>
+          <w:szCs w:val="21"/>
+        </w:rPr>
+        <w:t xml:space="preserve">Mantenha boa hidratação e alimentação ao longo de toda a recuperação</w:t>
       </w:r>
     </w:p>
     <w:p>
@@ -21229,75 +21212,126 @@
           <w:sz w:val="17"/>
           <w:szCs w:val="17"/>
         </w:rPr>
-        <w:t xml:space="preserve">SE HOUVE ENXERTIA DE GORDURA</w:t>
-      </w:r>
-    </w:p>
-    <w:p>
-      <w:pPr>
-        <w:pStyle w:val="ListParagraph"/>
-        <w:numPr>
-          <w:ilvl w:val="0"/>
-          <w:numId w:val="2"/>
-        </w:numPr>
-        <w:spacing w:after="60"/>
-      </w:pPr>
-      <w:r>
-        <w:rPr>
-          <w:sz w:val="21"/>
-          <w:szCs w:val="21"/>
-        </w:rPr>
-        <w:t xml:space="preserve">Evite pressão sobre a área enxertada nas primeiras semanas</w:t>
-      </w:r>
-    </w:p>
-    <w:p>
-      <w:pPr>
-        <w:pStyle w:val="ListParagraph"/>
-        <w:numPr>
-          <w:ilvl w:val="0"/>
-          <w:numId w:val="2"/>
-        </w:numPr>
-        <w:spacing w:after="60"/>
-      </w:pPr>
-      <w:r>
-        <w:rPr>
-          <w:sz w:val="21"/>
-          <w:szCs w:val="21"/>
-        </w:rPr>
-        <w:t xml:space="preserve">Siga com rigor as orientações de posição para dormir e para sentar</w:t>
-      </w:r>
-    </w:p>
-    <w:p>
-      <w:pPr>
-        <w:pStyle w:val="ListParagraph"/>
-        <w:numPr>
-          <w:ilvl w:val="0"/>
-          <w:numId w:val="2"/>
-        </w:numPr>
-        <w:spacing w:after="60"/>
-      </w:pPr>
-      <w:r>
-        <w:rPr>
-          <w:sz w:val="21"/>
-          <w:szCs w:val="21"/>
-        </w:rPr>
-        <w:t xml:space="preserve">Não massageie a região enxertada sem orientação da equipe</w:t>
-      </w:r>
-    </w:p>
-    <w:p>
-      <w:pPr>
-        <w:pStyle w:val="ListParagraph"/>
-        <w:numPr>
-          <w:ilvl w:val="0"/>
-          <w:numId w:val="2"/>
-        </w:numPr>
-        <w:spacing w:after="60"/>
-      </w:pPr>
-      <w:r>
-        <w:rPr>
-          <w:sz w:val="21"/>
-          <w:szCs w:val="21"/>
-        </w:rPr>
-        <w:t xml:space="preserve">Mantenha boa hidratação e alimentação ao longo de toda a recuperação</w:t>
+        <w:t xml:space="preserve">POR QUE OS CUIDADOS PESAM MAIS AQUI</w:t>
+      </w:r>
+    </w:p>
+    <w:p>
+      <w:pPr>
+        <w:pStyle w:val="ListParagraph"/>
+        <w:numPr>
+          <w:ilvl w:val="0"/>
+          <w:numId w:val="2"/>
+        </w:numPr>
+        <w:spacing w:after="60"/>
+      </w:pPr>
+      <w:r>
+        <w:rPr>
+          <w:sz w:val="21"/>
+          <w:szCs w:val="21"/>
+        </w:rPr>
+        <w:t xml:space="preserve">São os mesmos da lipoaspiração convencional, mas é o que preserva a definição obtida na cirurgia</w:t>
+      </w:r>
+    </w:p>
+    <w:p>
+      <w:pPr>
+        <w:pStyle w:val="ListParagraph"/>
+        <w:numPr>
+          <w:ilvl w:val="0"/>
+          <w:numId w:val="2"/>
+        </w:numPr>
+        <w:spacing w:after="60"/>
+      </w:pPr>
+      <w:r>
+        <w:rPr>
+          <w:sz w:val="21"/>
+          <w:szCs w:val="21"/>
+        </w:rPr>
+        <w:t xml:space="preserve">Cinta conforme a orientação — sem apertar nem ajustar por conta própria</w:t>
+      </w:r>
+    </w:p>
+    <w:p>
+      <w:pPr>
+        <w:pStyle w:val="ListParagraph"/>
+        <w:numPr>
+          <w:ilvl w:val="0"/>
+          <w:numId w:val="2"/>
+        </w:numPr>
+        <w:spacing w:after="60"/>
+      </w:pPr>
+      <w:r>
+        <w:rPr>
+          <w:sz w:val="21"/>
+          <w:szCs w:val="21"/>
+        </w:rPr>
+        <w:t xml:space="preserve">Drenagem linfática e fisioterapia no cronograma indicado</w:t>
+      </w:r>
+    </w:p>
+    <w:p>
+      <w:pPr>
+        <w:pStyle w:val="ListParagraph"/>
+        <w:numPr>
+          <w:ilvl w:val="0"/>
+          <w:numId w:val="2"/>
+        </w:numPr>
+        <w:spacing w:after="60"/>
+      </w:pPr>
+      <w:r>
+        <w:rPr>
+          <w:sz w:val="21"/>
+          <w:szCs w:val="21"/>
+        </w:rPr>
+        <w:t xml:space="preserve">Caminhadas curtas e frequentes desde cedo, que também previnem trombose</w:t>
+      </w:r>
+    </w:p>
+    <w:p>
+      <w:pPr>
+        <w:pStyle w:val="ListParagraph"/>
+        <w:numPr>
+          <w:ilvl w:val="0"/>
+          <w:numId w:val="2"/>
+        </w:numPr>
+        <w:spacing w:after="60"/>
+      </w:pPr>
+      <w:r>
+        <w:rPr>
+          <w:sz w:val="21"/>
+          <w:szCs w:val="21"/>
+        </w:rPr>
+        <w:t xml:space="preserve">Alimentação rica em proteína e boa hidratação</w:t>
+      </w:r>
+    </w:p>
+    <w:p>
+      <w:pPr>
+        <w:pStyle w:val="ListParagraph"/>
+        <w:numPr>
+          <w:ilvl w:val="0"/>
+          <w:numId w:val="2"/>
+        </w:numPr>
+        <w:spacing w:after="60"/>
+      </w:pPr>
+      <w:r>
+        <w:rPr>
+          <w:sz w:val="21"/>
+          <w:szCs w:val="21"/>
+        </w:rPr>
+        <w:t xml:space="preserve">Volta aos exercícios de forma gradual, respeitando os prazos da equipe</w:t>
+      </w:r>
+    </w:p>
+    <w:p>
+      <w:pPr>
+        <w:pStyle w:val="ListParagraph"/>
+        <w:numPr>
+          <w:ilvl w:val="0"/>
+          <w:numId w:val="2"/>
+        </w:numPr>
+        <w:spacing w:after="60"/>
+      </w:pPr>
+      <w:r>
+        <w:rPr>
+          <w:sz w:val="21"/>
+          <w:szCs w:val="21"/>
+        </w:rPr>
+        <w:t xml:space="preserve">Sem sol direto enquanto houver roxos ou cicatriz recente</w:t>
       </w:r>
     </w:p>
     <w:p>
@@ -21313,126 +21347,139 @@
           <w:sz w:val="17"/>
           <w:szCs w:val="17"/>
         </w:rPr>
-        <w:t xml:space="preserve">POR QUE OS CUIDADOS PESAM MAIS AQUI</w:t>
-      </w:r>
-    </w:p>
-    <w:p>
-      <w:pPr>
-        <w:pStyle w:val="ListParagraph"/>
-        <w:numPr>
-          <w:ilvl w:val="0"/>
-          <w:numId w:val="2"/>
-        </w:numPr>
-        <w:spacing w:after="60"/>
-      </w:pPr>
-      <w:r>
-        <w:rPr>
-          <w:sz w:val="21"/>
-          <w:szCs w:val="21"/>
-        </w:rPr>
-        <w:t xml:space="preserve">São os mesmos da lipoaspiração convencional, mas é o que preserva a definição obtida na cirurgia</w:t>
-      </w:r>
-    </w:p>
-    <w:p>
-      <w:pPr>
-        <w:pStyle w:val="ListParagraph"/>
-        <w:numPr>
-          <w:ilvl w:val="0"/>
-          <w:numId w:val="2"/>
-        </w:numPr>
-        <w:spacing w:after="60"/>
-      </w:pPr>
-      <w:r>
-        <w:rPr>
-          <w:sz w:val="21"/>
-          <w:szCs w:val="21"/>
-        </w:rPr>
-        <w:t xml:space="preserve">Cinta conforme a orientação — sem apertar nem ajustar por conta própria</w:t>
-      </w:r>
-    </w:p>
-    <w:p>
-      <w:pPr>
-        <w:pStyle w:val="ListParagraph"/>
-        <w:numPr>
-          <w:ilvl w:val="0"/>
-          <w:numId w:val="2"/>
-        </w:numPr>
-        <w:spacing w:after="60"/>
-      </w:pPr>
-      <w:r>
-        <w:rPr>
-          <w:sz w:val="21"/>
-          <w:szCs w:val="21"/>
-        </w:rPr>
-        <w:t xml:space="preserve">Drenagem linfática e fisioterapia no cronograma indicado</w:t>
-      </w:r>
-    </w:p>
-    <w:p>
-      <w:pPr>
-        <w:pStyle w:val="ListParagraph"/>
-        <w:numPr>
-          <w:ilvl w:val="0"/>
-          <w:numId w:val="2"/>
-        </w:numPr>
-        <w:spacing w:after="60"/>
-      </w:pPr>
-      <w:r>
-        <w:rPr>
-          <w:sz w:val="21"/>
-          <w:szCs w:val="21"/>
-        </w:rPr>
-        <w:t xml:space="preserve">Caminhadas curtas e frequentes desde cedo, que também previnem trombose</w:t>
-      </w:r>
-    </w:p>
-    <w:p>
-      <w:pPr>
-        <w:pStyle w:val="ListParagraph"/>
-        <w:numPr>
-          <w:ilvl w:val="0"/>
-          <w:numId w:val="2"/>
-        </w:numPr>
-        <w:spacing w:after="60"/>
-      </w:pPr>
-      <w:r>
-        <w:rPr>
-          <w:sz w:val="21"/>
-          <w:szCs w:val="21"/>
-        </w:rPr>
-        <w:t xml:space="preserve">Alimentação rica em proteína e boa hidratação</w:t>
-      </w:r>
-    </w:p>
-    <w:p>
-      <w:pPr>
-        <w:pStyle w:val="ListParagraph"/>
-        <w:numPr>
-          <w:ilvl w:val="0"/>
-          <w:numId w:val="2"/>
-        </w:numPr>
-        <w:spacing w:after="60"/>
-      </w:pPr>
-      <w:r>
-        <w:rPr>
-          <w:sz w:val="21"/>
-          <w:szCs w:val="21"/>
-        </w:rPr>
-        <w:t xml:space="preserve">Volta aos exercícios de forma gradual, respeitando os prazos da equipe</w:t>
-      </w:r>
-    </w:p>
-    <w:p>
-      <w:pPr>
-        <w:pStyle w:val="ListParagraph"/>
-        <w:numPr>
-          <w:ilvl w:val="0"/>
-          <w:numId w:val="2"/>
-        </w:numPr>
-        <w:spacing w:after="60"/>
-      </w:pPr>
-      <w:r>
-        <w:rPr>
-          <w:sz w:val="21"/>
-          <w:szCs w:val="21"/>
-        </w:rPr>
-        <w:t xml:space="preserve">Sem sol direto enquanto houver roxos ou cicatriz recente</w:t>
+        <w:t xml:space="preserve">O RESULTADO LEVA TEMPO</w:t>
+      </w:r>
+    </w:p>
+    <w:p>
+      <w:pPr>
+        <w:pStyle w:val="ListParagraph"/>
+        <w:numPr>
+          <w:ilvl w:val="0"/>
+          <w:numId w:val="2"/>
+        </w:numPr>
+        <w:spacing w:after="60"/>
+      </w:pPr>
+      <w:r>
+        <w:rPr>
+          <w:sz w:val="21"/>
+          <w:szCs w:val="21"/>
+        </w:rPr>
+        <w:t xml:space="preserve">Nas primeiras semanas há inchaço, endurecimento e assimetrias temporárias — tudo esperado</w:t>
+      </w:r>
+    </w:p>
+    <w:p>
+      <w:pPr>
+        <w:pStyle w:val="ListParagraph"/>
+        <w:numPr>
+          <w:ilvl w:val="0"/>
+          <w:numId w:val="2"/>
+        </w:numPr>
+        <w:spacing w:after="60"/>
+      </w:pPr>
+      <w:r>
+        <w:rPr>
+          <w:sz w:val="21"/>
+          <w:szCs w:val="21"/>
+        </w:rPr>
+        <w:t xml:space="preserve">A definição melhora progressivamente conforme o inchaço cede</w:t>
+      </w:r>
+    </w:p>
+    <w:p>
+      <w:pPr>
+        <w:pStyle w:val="ListParagraph"/>
+        <w:numPr>
+          <w:ilvl w:val="0"/>
+          <w:numId w:val="2"/>
+        </w:numPr>
+        <w:spacing w:after="60"/>
+      </w:pPr>
+      <w:r>
+        <w:rPr>
+          <w:sz w:val="21"/>
+          <w:szCs w:val="21"/>
+        </w:rPr>
+        <w:t xml:space="preserve">A maior parte da recuperação acontece nos primeiros 3 meses</w:t>
+      </w:r>
+    </w:p>
+    <w:p>
+      <w:pPr>
+        <w:pStyle w:val="ListParagraph"/>
+        <w:numPr>
+          <w:ilvl w:val="0"/>
+          <w:numId w:val="2"/>
+        </w:numPr>
+        <w:spacing w:after="60"/>
+      </w:pPr>
+      <w:r>
+        <w:rPr>
+          <w:sz w:val="21"/>
+          <w:szCs w:val="21"/>
+        </w:rPr>
+        <w:t xml:space="preserve">Quando houve enxertia, o resultado do enxerto se define entre 3 e 6 meses</w:t>
+      </w:r>
+    </w:p>
+    <w:p>
+      <w:pPr>
+        <w:pStyle w:val="ListParagraph"/>
+        <w:numPr>
+          <w:ilvl w:val="0"/>
+          <w:numId w:val="2"/>
+        </w:numPr>
+        <w:spacing w:after="60"/>
+      </w:pPr>
+      <w:r>
+        <w:rPr>
+          <w:sz w:val="21"/>
+          <w:szCs w:val="21"/>
+        </w:rPr>
+        <w:t xml:space="preserve">O resultado final costuma ser observado entre 6 e 12 meses, conforme cada paciente</w:t>
+      </w:r>
+    </w:p>
+    <w:p>
+      <w:pPr>
+        <w:pBdr>
+          <w:bottom w:val="dotted" w:color="C8C8C8" w:sz="4" w:space="4"/>
+        </w:pBdr>
+        <w:spacing w:after="240" w:before="100"/>
+      </w:pPr>
+      <w:r>
+        <w:rPr>
+          <w:i/>
+          <w:iCs/>
+          <w:color w:val="AAAAAA"/>
+          <w:sz w:val="17"/>
+          <w:szCs w:val="17"/>
+        </w:rPr>
+        <w:t xml:space="preserve">Correção: </w:t>
+      </w:r>
+    </w:p>
+    <w:p>
+      <w:pPr>
+        <w:pStyle w:val="Heading3"/>
+        <w:spacing w:after="100" w:before="280"/>
+      </w:pPr>
+      <w:r>
+        <w:rPr>
+          <w:b/>
+          <w:bCs/>
+          <w:color w:val="111111"/>
+          <w:sz w:val="23"/>
+          <w:szCs w:val="23"/>
+        </w:rPr>
+        <w:t xml:space="preserve">BodyTite® e Morpheus8®</w:t>
+      </w:r>
+    </w:p>
+    <w:p>
+      <w:pPr>
+        <w:spacing w:after="100"/>
+      </w:pPr>
+      <w:r>
+        <w:rPr>
+          <w:color w:val="6B6B6B"/>
+          <w:sz w:val="19"/>
+          <w:szCs w:val="19"/>
+        </w:rPr>
+        <w:t xml:space="preserve">"Tecnologia para potencializar o contorno corporal e o tratamento da flacidez"  |  Aplica-se a: somente cirurgias · apenas: Lipo HD Concept, Lipoescultura</w:t>
       </w:r>
     </w:p>
     <w:p>
@@ -21448,109 +21495,379 @@
           <w:sz w:val="17"/>
           <w:szCs w:val="17"/>
         </w:rPr>
-        <w:t xml:space="preserve">O RESULTADO LEVA TEMPO</w:t>
-      </w:r>
-    </w:p>
-    <w:p>
-      <w:pPr>
-        <w:pStyle w:val="ListParagraph"/>
-        <w:numPr>
-          <w:ilvl w:val="0"/>
-          <w:numId w:val="2"/>
-        </w:numPr>
-        <w:spacing w:after="60"/>
-      </w:pPr>
-      <w:r>
-        <w:rPr>
-          <w:sz w:val="21"/>
-          <w:szCs w:val="21"/>
-        </w:rPr>
-        <w:t xml:space="preserve">Nas primeiras semanas há inchaço, endurecimento e assimetrias temporárias — tudo esperado</w:t>
-      </w:r>
-    </w:p>
-    <w:p>
-      <w:pPr>
-        <w:pStyle w:val="ListParagraph"/>
-        <w:numPr>
-          <w:ilvl w:val="0"/>
-          <w:numId w:val="2"/>
-        </w:numPr>
-        <w:spacing w:after="60"/>
-      </w:pPr>
-      <w:r>
-        <w:rPr>
-          <w:sz w:val="21"/>
-          <w:szCs w:val="21"/>
-        </w:rPr>
-        <w:t xml:space="preserve">A definição melhora progressivamente conforme o inchaço cede</w:t>
-      </w:r>
-    </w:p>
-    <w:p>
-      <w:pPr>
-        <w:pStyle w:val="ListParagraph"/>
-        <w:numPr>
-          <w:ilvl w:val="0"/>
-          <w:numId w:val="2"/>
-        </w:numPr>
-        <w:spacing w:after="60"/>
-      </w:pPr>
-      <w:r>
-        <w:rPr>
-          <w:sz w:val="21"/>
-          <w:szCs w:val="21"/>
-        </w:rPr>
-        <w:t xml:space="preserve">A maior parte da recuperação acontece nos primeiros 3 meses</w:t>
-      </w:r>
-    </w:p>
-    <w:p>
-      <w:pPr>
-        <w:pStyle w:val="ListParagraph"/>
-        <w:numPr>
-          <w:ilvl w:val="0"/>
-          <w:numId w:val="2"/>
-        </w:numPr>
-        <w:spacing w:after="60"/>
-      </w:pPr>
-      <w:r>
-        <w:rPr>
-          <w:sz w:val="21"/>
-          <w:szCs w:val="21"/>
-        </w:rPr>
-        <w:t xml:space="preserve">Quando houve enxertia, o resultado do enxerto se define entre 3 e 6 meses</w:t>
-      </w:r>
-    </w:p>
-    <w:p>
-      <w:pPr>
-        <w:pStyle w:val="ListParagraph"/>
-        <w:numPr>
-          <w:ilvl w:val="0"/>
-          <w:numId w:val="2"/>
-        </w:numPr>
-        <w:spacing w:after="60"/>
-      </w:pPr>
-      <w:r>
-        <w:rPr>
-          <w:sz w:val="21"/>
-          <w:szCs w:val="21"/>
-        </w:rPr>
-        <w:t xml:space="preserve">Quando o BodyTite fez parte, a retração da pele continua evoluindo por alguns meses</w:t>
-      </w:r>
-    </w:p>
-    <w:p>
-      <w:pPr>
-        <w:pStyle w:val="ListParagraph"/>
-        <w:numPr>
-          <w:ilvl w:val="0"/>
-          <w:numId w:val="2"/>
-        </w:numPr>
-        <w:spacing w:after="60"/>
-      </w:pPr>
-      <w:r>
-        <w:rPr>
-          <w:sz w:val="21"/>
-          <w:szCs w:val="21"/>
-        </w:rPr>
-        <w:t xml:space="preserve">O resultado final costuma ser observado entre 6 e 12 meses, conforme cada paciente</w:t>
+        <w:t xml:space="preserve">O QUE SÃO</w:t>
+      </w:r>
+    </w:p>
+    <w:p>
+      <w:pPr>
+        <w:spacing w:after="100"/>
+      </w:pPr>
+      <w:r>
+        <w:rPr>
+          <w:sz w:val="21"/>
+          <w:szCs w:val="21"/>
+        </w:rPr>
+        <w:t xml:space="preserve">O BodyTite® e o Morpheus8® são tecnologias que utilizam radiofrequência para complementar o tratamento do contorno corporal e da flacidez.</w:t>
+      </w:r>
+    </w:p>
+    <w:p>
+      <w:pPr>
+        <w:spacing w:after="100"/>
+      </w:pPr>
+      <w:r>
+        <w:rPr>
+          <w:sz w:val="21"/>
+          <w:szCs w:val="21"/>
+        </w:rPr>
+        <w:t xml:space="preserve">Na cirurgia plástica, podem ser utilizados isoladamente em casos selecionados, mas são frequentemente associados à lipoaspiração ou lipoescultura, de acordo com a indicação de cada paciente.</w:t>
+      </w:r>
+    </w:p>
+    <w:p>
+      <w:pPr>
+        <w:spacing w:after="80" w:before="240"/>
+      </w:pPr>
+      <w:r>
+        <w:rPr>
+          <w:b/>
+          <w:bCs/>
+          <w:color w:val="067F7B"/>
+          <w:spacing w:val="30"/>
+          <w:sz w:val="17"/>
+          <w:szCs w:val="17"/>
+        </w:rPr>
+        <w:t xml:space="preserve">O QUE É O BODYTITE®</w:t>
+      </w:r>
+    </w:p>
+    <w:p>
+      <w:pPr>
+        <w:spacing w:after="100"/>
+      </w:pPr>
+      <w:r>
+        <w:rPr>
+          <w:sz w:val="21"/>
+          <w:szCs w:val="21"/>
+        </w:rPr>
+        <w:t xml:space="preserve">O BodyTite® utiliza radiofrequência assistida aplicada nos tecidos abaixo da pele. Durante o procedimento, a energia é administrada de forma controlada, promovendo aquecimento dos tecidos e contração das fibras de colágeno.</w:t>
+      </w:r>
+    </w:p>
+    <w:p>
+      <w:pPr>
+        <w:spacing w:after="100"/>
+      </w:pPr>
+      <w:r>
+        <w:rPr>
+          <w:sz w:val="21"/>
+          <w:szCs w:val="21"/>
+        </w:rPr>
+        <w:t xml:space="preserve">Quando associado à lipoaspiração, pode contribuir para uma melhor acomodação da pele ao novo contorno corporal, especialmente em regiões que apresentam algum grau de flacidez.</w:t>
+      </w:r>
+    </w:p>
+    <w:p>
+      <w:pPr>
+        <w:spacing w:after="100"/>
+      </w:pPr>
+      <w:r>
+        <w:rPr>
+          <w:sz w:val="21"/>
+          <w:szCs w:val="21"/>
+        </w:rPr>
+        <w:t xml:space="preserve">Pode ser utilizado em áreas como abdômen, braços, coxas, costas, flancos e região submentoniana (papada), sempre conforme avaliação médica individual.</w:t>
+      </w:r>
+    </w:p>
+    <w:p>
+      <w:pPr>
+        <w:spacing w:after="80" w:before="240"/>
+      </w:pPr>
+      <w:r>
+        <w:rPr>
+          <w:b/>
+          <w:bCs/>
+          <w:color w:val="067F7B"/>
+          <w:spacing w:val="30"/>
+          <w:sz w:val="17"/>
+          <w:szCs w:val="17"/>
+        </w:rPr>
+        <w:t xml:space="preserve">E O MORPHEUS8®</w:t>
+      </w:r>
+    </w:p>
+    <w:p>
+      <w:pPr>
+        <w:spacing w:after="100"/>
+      </w:pPr>
+      <w:r>
+        <w:rPr>
+          <w:sz w:val="21"/>
+          <w:szCs w:val="21"/>
+        </w:rPr>
+        <w:t xml:space="preserve">O Morpheus8® atua de maneira diferente e complementar. A tecnologia combina microagulhamento com radiofrequência, levando energia a diferentes profundidades da pele e dos tecidos.</w:t>
+      </w:r>
+    </w:p>
+    <w:p>
+      <w:pPr>
+        <w:spacing w:after="100"/>
+      </w:pPr>
+      <w:r>
+        <w:rPr>
+          <w:sz w:val="21"/>
+          <w:szCs w:val="21"/>
+        </w:rPr>
+        <w:t xml:space="preserve">O objetivo é estimular a remodelação do colágeno e melhorar progressivamente características como firmeza, textura e qualidade da pele.</w:t>
+      </w:r>
+    </w:p>
+    <w:p>
+      <w:pPr>
+        <w:spacing w:after="100"/>
+      </w:pPr>
+      <w:r>
+        <w:rPr>
+          <w:sz w:val="21"/>
+          <w:szCs w:val="21"/>
+        </w:rPr>
+        <w:t xml:space="preserve">Em alguns planejamentos cirúrgicos, BodyTite® e Morpheus8® podem ser associados à lipoaspiração na mesma cirurgia, permitindo tratar não apenas o excesso de gordura e o contorno, mas também aspectos relacionados à flacidez e à qualidade da pele.</w:t>
+      </w:r>
+    </w:p>
+    <w:p>
+      <w:pPr>
+        <w:spacing w:after="80" w:before="240"/>
+      </w:pPr>
+      <w:r>
+        <w:rPr>
+          <w:b/>
+          <w:bCs/>
+          <w:color w:val="067F7B"/>
+          <w:spacing w:val="30"/>
+          <w:sz w:val="17"/>
+          <w:szCs w:val="17"/>
+        </w:rPr>
+        <w:t xml:space="preserve">COMO É A RECUPERAÇÃO</w:t>
+      </w:r>
+    </w:p>
+    <w:p>
+      <w:pPr>
+        <w:spacing w:after="100"/>
+      </w:pPr>
+      <w:r>
+        <w:rPr>
+          <w:sz w:val="21"/>
+          <w:szCs w:val="21"/>
+        </w:rPr>
+        <w:t xml:space="preserve">Nos primeiros dias é esperado apresentar inchaço, sensibilidade e áreas arroxeadas, especialmente quando o tratamento é realizado junto à lipoaspiração. A intensidade e a duração desses sintomas variam conforme a região tratada, a extensão do procedimento e as características individuais.</w:t>
+      </w:r>
+    </w:p>
+    <w:p>
+      <w:pPr>
+        <w:pStyle w:val="ListParagraph"/>
+        <w:numPr>
+          <w:ilvl w:val="0"/>
+          <w:numId w:val="2"/>
+        </w:numPr>
+        <w:spacing w:after="60"/>
+      </w:pPr>
+      <w:r>
+        <w:rPr>
+          <w:sz w:val="21"/>
+          <w:szCs w:val="21"/>
+        </w:rPr>
+        <w:t xml:space="preserve">Utilizar a malha ou cinta compressiva pelo período orientado pela equipe</w:t>
+      </w:r>
+    </w:p>
+    <w:p>
+      <w:pPr>
+        <w:pStyle w:val="ListParagraph"/>
+        <w:numPr>
+          <w:ilvl w:val="0"/>
+          <w:numId w:val="2"/>
+        </w:numPr>
+        <w:spacing w:after="60"/>
+      </w:pPr>
+      <w:r>
+        <w:rPr>
+          <w:sz w:val="21"/>
+          <w:szCs w:val="21"/>
+        </w:rPr>
+        <w:t xml:space="preserve">Manter os curativos conforme orientação</w:t>
+      </w:r>
+    </w:p>
+    <w:p>
+      <w:pPr>
+        <w:pStyle w:val="ListParagraph"/>
+        <w:numPr>
+          <w:ilvl w:val="0"/>
+          <w:numId w:val="2"/>
+        </w:numPr>
+        <w:spacing w:after="60"/>
+      </w:pPr>
+      <w:r>
+        <w:rPr>
+          <w:sz w:val="21"/>
+          <w:szCs w:val="21"/>
+        </w:rPr>
+        <w:t xml:space="preserve">Realizar fisioterapia pós-operatória e/ou drenagem linfática quando indicadas</w:t>
+      </w:r>
+    </w:p>
+    <w:p>
+      <w:pPr>
+        <w:pStyle w:val="ListParagraph"/>
+        <w:numPr>
+          <w:ilvl w:val="0"/>
+          <w:numId w:val="2"/>
+        </w:numPr>
+        <w:spacing w:after="60"/>
+      </w:pPr>
+      <w:r>
+        <w:rPr>
+          <w:sz w:val="21"/>
+          <w:szCs w:val="21"/>
+        </w:rPr>
+        <w:t xml:space="preserve">Evitar esforço físico e exercícios até a liberação médica</w:t>
+      </w:r>
+    </w:p>
+    <w:p>
+      <w:pPr>
+        <w:pStyle w:val="ListParagraph"/>
+        <w:numPr>
+          <w:ilvl w:val="0"/>
+          <w:numId w:val="2"/>
+        </w:numPr>
+        <w:spacing w:after="60"/>
+      </w:pPr>
+      <w:r>
+        <w:rPr>
+          <w:sz w:val="21"/>
+          <w:szCs w:val="21"/>
+        </w:rPr>
+        <w:t xml:space="preserve">Evitar exposição solar direta nas áreas com equimoses ou marcas do tratamento</w:t>
+      </w:r>
+    </w:p>
+    <w:p>
+      <w:pPr>
+        <w:pStyle w:val="ListParagraph"/>
+        <w:numPr>
+          <w:ilvl w:val="0"/>
+          <w:numId w:val="2"/>
+        </w:numPr>
+        <w:spacing w:after="60"/>
+      </w:pPr>
+      <w:r>
+        <w:rPr>
+          <w:sz w:val="21"/>
+          <w:szCs w:val="21"/>
+        </w:rPr>
+        <w:t xml:space="preserve">Manter boa hidratação e alimentação adequada</w:t>
+      </w:r>
+    </w:p>
+    <w:p>
+      <w:pPr>
+        <w:pStyle w:val="ListParagraph"/>
+        <w:numPr>
+          <w:ilvl w:val="0"/>
+          <w:numId w:val="2"/>
+        </w:numPr>
+        <w:spacing w:after="60"/>
+      </w:pPr>
+      <w:r>
+        <w:rPr>
+          <w:sz w:val="21"/>
+          <w:szCs w:val="21"/>
+        </w:rPr>
+        <w:t xml:space="preserve">Não aplicar cremes, medicamentos ou realizar outros tratamentos na região sem orientação</w:t>
+      </w:r>
+    </w:p>
+    <w:p>
+      <w:pPr>
+        <w:pStyle w:val="ListParagraph"/>
+        <w:numPr>
+          <w:ilvl w:val="0"/>
+          <w:numId w:val="2"/>
+        </w:numPr>
+        <w:spacing w:after="60"/>
+      </w:pPr>
+      <w:r>
+        <w:rPr>
+          <w:sz w:val="21"/>
+          <w:szCs w:val="21"/>
+        </w:rPr>
+        <w:t xml:space="preserve">Comparecer às consultas de acompanhamento programadas</w:t>
+      </w:r>
+    </w:p>
+    <w:p>
+      <w:pPr>
+        <w:spacing w:after="80" w:before="240"/>
+      </w:pPr>
+      <w:r>
+        <w:rPr>
+          <w:b/>
+          <w:bCs/>
+          <w:color w:val="067F7B"/>
+          <w:spacing w:val="30"/>
+          <w:sz w:val="17"/>
+          <w:szCs w:val="17"/>
+        </w:rPr>
+        <w:t xml:space="preserve">QUANDO O MORPHEUS8® É UTILIZADO</w:t>
+      </w:r>
+    </w:p>
+    <w:p>
+      <w:pPr>
+        <w:spacing w:after="100"/>
+      </w:pPr>
+      <w:r>
+        <w:rPr>
+          <w:sz w:val="21"/>
+          <w:szCs w:val="21"/>
+        </w:rPr>
+        <w:t xml:space="preserve">Podem permanecer por alguns dias vermelhidão, edema, sensibilidade e pequenos pontos ou crostas superficiais nas áreas tratadas. É importante não manipular essas regiões e seguir as orientações de cuidados com a pele.</w:t>
+      </w:r>
+    </w:p>
+    <w:p>
+      <w:pPr>
+        <w:spacing w:after="80" w:before="240"/>
+      </w:pPr>
+      <w:r>
+        <w:rPr>
+          <w:b/>
+          <w:bCs/>
+          <w:color w:val="067F7B"/>
+          <w:spacing w:val="30"/>
+          <w:sz w:val="17"/>
+          <w:szCs w:val="17"/>
+        </w:rPr>
+        <w:t xml:space="preserve">IMPORTANTE</w:t>
+      </w:r>
+    </w:p>
+    <w:p>
+      <w:pPr>
+        <w:spacing w:after="100"/>
+      </w:pPr>
+      <w:r>
+        <w:rPr>
+          <w:sz w:val="21"/>
+          <w:szCs w:val="21"/>
+        </w:rPr>
+        <w:t xml:space="preserve">BodyTite® e Morpheus8® não substituem a retirada cirúrgica de pele quando existe flacidez importante. A escolha entre lipoaspiração isolada, associação de tecnologias ou uma cirurgia com retirada de pele depende da anatomia, do grau de flacidez e dos objetivos de cada paciente.</w:t>
+      </w:r>
+    </w:p>
+    <w:p>
+      <w:pPr>
+        <w:spacing w:after="100"/>
+      </w:pPr>
+      <w:r>
+        <w:rPr>
+          <w:sz w:val="21"/>
+          <w:szCs w:val="21"/>
+        </w:rPr>
+        <w:t xml:space="preserve">Assim como qualquer procedimento médico, essas tecnologias apresentam possíveis riscos e intercorrências, incluindo alterações de sensibilidade, irregularidades, alterações de pigmentação, seromas e, mais raramente, lesões térmicas da pele e dos tecidos.</w:t>
+      </w:r>
+    </w:p>
+    <w:p>
+      <w:pPr>
+        <w:spacing w:after="100"/>
+      </w:pPr>
+      <w:r>
+        <w:rPr>
+          <w:sz w:val="21"/>
+          <w:szCs w:val="21"/>
+        </w:rPr>
+        <w:t xml:space="preserve">A indicação deve ser sempre individualizada, após avaliação médica, considerando benefícios, limitações e riscos de cada opção.</w:t>
       </w:r>
     </w:p>
     <w:p>
@@ -27203,7 +27520,7 @@
           <w:sz w:val="19"/>
           <w:szCs w:val="19"/>
         </w:rPr>
-        <w:t xml:space="preserve">Aba Cuidados — Lipo HD Concept</w:t>
+        <w:t xml:space="preserve">Dentro do guia "BodyTite® e Morpheus8®"</w:t>
       </w:r>
     </w:p>
     <w:p>
@@ -27275,7 +27592,7 @@
           <w:sz w:val="19"/>
           <w:szCs w:val="19"/>
         </w:rPr>
-        <w:t xml:space="preserve">Aba Cuidados — Lipo HD Concept</w:t>
+        <w:t xml:space="preserve">Dentro do guia "BodyTite® e Morpheus8®"</w:t>
       </w:r>
     </w:p>
     <w:p>

</xml_diff>

<commit_message>
Adiciona o guia de taping pós-operatório
Texto escrito pelo cirurgião. O taping só aparecia de passagem — uma linha no
HR Recovery Protocol e outra no Face HD — e nenhuma delas dizia o que a
paciente precisa saber: quanto tempo fica, o que fazer se descolar, quando
avisar a equipe.

Aparece para quem sai do centro cirúrgico com bandagem: Face HD Concept e as
cirurgias de contorno corporal (lipoescultura, Lipo HD, abdominoplastia,
ginecomastia e pós-bariátrica). Quem não usa tape não precisa ler sobre não
molhar uma coisa que não tem.

Registra também o `docx` como dependência de desenvolvimento. Ele estava
instalado à mão e sumiu na primeira vez que o npm podou a árvore, quebrando o
gerador do documento de revisão.

Co-Authored-By: Claude Opus 5 <noreply@anthropic.com>
Claude-Session: https://claude.ai/code/session_01RXsuhQQ6qNiyuBJF5nJZKq
</commit_message>
<xml_diff>
--- a/docs/conteudo-clinico-para-revisao.docx
+++ b/docs/conteudo-clinico-para-revisao.docx
@@ -76,7 +76,7 @@
           <w:sz w:val="19"/>
           <w:szCs w:val="19"/>
         </w:rPr>
-        <w:t xml:space="preserve">18 procedimentos · 63 orientações de sintomas · 17 guias de cuidados</w:t>
+        <w:t xml:space="preserve">18 procedimentos · 63 orientações de sintomas · 18 guias de cuidados</w:t>
       </w:r>
     </w:p>
     <w:p>
@@ -22431,6 +22431,505 @@
           <w:sz w:val="23"/>
           <w:szCs w:val="23"/>
         </w:rPr>
+        <w:t xml:space="preserve">Taping pós-operatório</w:t>
+      </w:r>
+    </w:p>
+    <w:p>
+      <w:pPr>
+        <w:spacing w:after="100"/>
+      </w:pPr>
+      <w:r>
+        <w:rPr>
+          <w:color w:val="6B6B6B"/>
+          <w:sz w:val="19"/>
+          <w:szCs w:val="19"/>
+        </w:rPr>
+        <w:t xml:space="preserve">"A bandagem elástica aplicada pela fisioterapeuta, e como cuidar dela"  |  Aplica-se a: somente cirurgias · apenas: Face HD Concept, Lipoescultura, Lipo HD Concept, Abdominoplastia, Correção de ginecomastia, Cirurgia pós-bariátrica</w:t>
+      </w:r>
+    </w:p>
+    <w:p>
+      <w:pPr>
+        <w:spacing w:after="80" w:before="240"/>
+      </w:pPr>
+      <w:r>
+        <w:rPr>
+          <w:b/>
+          <w:bCs/>
+          <w:color w:val="067F7B"/>
+          <w:spacing w:val="30"/>
+          <w:sz w:val="17"/>
+          <w:szCs w:val="17"/>
+        </w:rPr>
+        <w:t xml:space="preserve">O QUE É</w:t>
+      </w:r>
+    </w:p>
+    <w:p>
+      <w:pPr>
+        <w:spacing w:after="100"/>
+      </w:pPr>
+      <w:r>
+        <w:rPr>
+          <w:sz w:val="21"/>
+          <w:szCs w:val="21"/>
+        </w:rPr>
+        <w:t xml:space="preserve">O taping é uma bandagem elástica aplicada pela fisioterapeuta ainda no momento da cirurgia ou logo após o procedimento. Ele faz parte dos cuidados iniciais e pode auxiliar na recuperação, sempre de acordo com a indicação da equipe.</w:t>
+      </w:r>
+    </w:p>
+    <w:p>
+      <w:pPr>
+        <w:spacing w:after="80" w:before="240"/>
+      </w:pPr>
+      <w:r>
+        <w:rPr>
+          <w:b/>
+          <w:bCs/>
+          <w:color w:val="067F7B"/>
+          <w:spacing w:val="30"/>
+          <w:sz w:val="17"/>
+          <w:szCs w:val="17"/>
+        </w:rPr>
+        <w:t xml:space="preserve">QUAIS SÃO OS BENEFÍCIOS</w:t>
+      </w:r>
+    </w:p>
+    <w:p>
+      <w:pPr>
+        <w:spacing w:after="100"/>
+      </w:pPr>
+      <w:r>
+        <w:rPr>
+          <w:sz w:val="21"/>
+          <w:szCs w:val="21"/>
+        </w:rPr>
+        <w:t xml:space="preserve">Quando bem indicado, o taping pode contribuir para:</w:t>
+      </w:r>
+    </w:p>
+    <w:p>
+      <w:pPr>
+        <w:pStyle w:val="ListParagraph"/>
+        <w:numPr>
+          <w:ilvl w:val="0"/>
+          <w:numId w:val="2"/>
+        </w:numPr>
+        <w:spacing w:after="60"/>
+      </w:pPr>
+      <w:r>
+        <w:rPr>
+          <w:sz w:val="21"/>
+          <w:szCs w:val="21"/>
+        </w:rPr>
+        <w:t xml:space="preserve">Auxiliar no controle do inchaço</w:t>
+      </w:r>
+    </w:p>
+    <w:p>
+      <w:pPr>
+        <w:pStyle w:val="ListParagraph"/>
+        <w:numPr>
+          <w:ilvl w:val="0"/>
+          <w:numId w:val="2"/>
+        </w:numPr>
+        <w:spacing w:after="60"/>
+      </w:pPr>
+      <w:r>
+        <w:rPr>
+          <w:sz w:val="21"/>
+          <w:szCs w:val="21"/>
+        </w:rPr>
+        <w:t xml:space="preserve">Favorecer a drenagem dos líquidos</w:t>
+      </w:r>
+    </w:p>
+    <w:p>
+      <w:pPr>
+        <w:pStyle w:val="ListParagraph"/>
+        <w:numPr>
+          <w:ilvl w:val="0"/>
+          <w:numId w:val="2"/>
+        </w:numPr>
+        <w:spacing w:after="60"/>
+      </w:pPr>
+      <w:r>
+        <w:rPr>
+          <w:sz w:val="21"/>
+          <w:szCs w:val="21"/>
+        </w:rPr>
+        <w:t xml:space="preserve">Reduzir áreas de maior tensão</w:t>
+      </w:r>
+    </w:p>
+    <w:p>
+      <w:pPr>
+        <w:pStyle w:val="ListParagraph"/>
+        <w:numPr>
+          <w:ilvl w:val="0"/>
+          <w:numId w:val="2"/>
+        </w:numPr>
+        <w:spacing w:after="60"/>
+      </w:pPr>
+      <w:r>
+        <w:rPr>
+          <w:sz w:val="21"/>
+          <w:szCs w:val="21"/>
+        </w:rPr>
+        <w:t xml:space="preserve">Proporcionar mais conforto durante os primeiros dias</w:t>
+      </w:r>
+    </w:p>
+    <w:p>
+      <w:pPr>
+        <w:pStyle w:val="ListParagraph"/>
+        <w:numPr>
+          <w:ilvl w:val="0"/>
+          <w:numId w:val="2"/>
+        </w:numPr>
+        <w:spacing w:after="60"/>
+      </w:pPr>
+      <w:r>
+        <w:rPr>
+          <w:sz w:val="21"/>
+          <w:szCs w:val="21"/>
+        </w:rPr>
+        <w:t xml:space="preserve">Ajudar na adaptação dos tecidos no período inicial da recuperação</w:t>
+      </w:r>
+    </w:p>
+    <w:p>
+      <w:pPr>
+        <w:spacing w:after="80" w:before="240"/>
+      </w:pPr>
+      <w:r>
+        <w:rPr>
+          <w:b/>
+          <w:bCs/>
+          <w:color w:val="067F7B"/>
+          <w:spacing w:val="30"/>
+          <w:sz w:val="17"/>
+          <w:szCs w:val="17"/>
+        </w:rPr>
+        <w:t xml:space="preserve">QUANTO TEMPO ELE PERMANECE</w:t>
+      </w:r>
+    </w:p>
+    <w:p>
+      <w:pPr>
+        <w:spacing w:after="100"/>
+      </w:pPr>
+      <w:r>
+        <w:rPr>
+          <w:sz w:val="21"/>
+          <w:szCs w:val="21"/>
+        </w:rPr>
+        <w:t xml:space="preserve">Em geral, a bandagem permanece por aproximadamente 6 a 7 dias. Esse período pode variar conforme a cirurgia, a evolução do inchaço e a resposta da pele.</w:t>
+      </w:r>
+    </w:p>
+    <w:p>
+      <w:pPr>
+        <w:spacing w:after="100"/>
+      </w:pPr>
+      <w:r>
+        <w:rPr>
+          <w:sz w:val="21"/>
+          <w:szCs w:val="21"/>
+        </w:rPr>
+        <w:t xml:space="preserve">Em algumas situações, poderá ser retirada antes pela fisioterapeuta ou pela equipe. Dependendo da necessidade, uma nova aplicação poderá ser realizada durante o acompanhamento pós-operatório.</w:t>
+      </w:r>
+    </w:p>
+    <w:p>
+      <w:pPr>
+        <w:spacing w:after="80" w:before="240"/>
+      </w:pPr>
+      <w:r>
+        <w:rPr>
+          <w:b/>
+          <w:bCs/>
+          <w:color w:val="067F7B"/>
+          <w:spacing w:val="30"/>
+          <w:sz w:val="17"/>
+          <w:szCs w:val="17"/>
+        </w:rPr>
+        <w:t xml:space="preserve">CUIDADOS IMPORTANTES</w:t>
+      </w:r>
+    </w:p>
+    <w:p>
+      <w:pPr>
+        <w:pStyle w:val="ListParagraph"/>
+        <w:numPr>
+          <w:ilvl w:val="0"/>
+          <w:numId w:val="2"/>
+        </w:numPr>
+        <w:spacing w:after="60"/>
+      </w:pPr>
+      <w:r>
+        <w:rPr>
+          <w:sz w:val="21"/>
+          <w:szCs w:val="21"/>
+        </w:rPr>
+        <w:t xml:space="preserve">Não molhe o taping durante o banho — a umidade diminui a aderência e favorece irritações na pele</w:t>
+      </w:r>
+    </w:p>
+    <w:p>
+      <w:pPr>
+        <w:pStyle w:val="ListParagraph"/>
+        <w:numPr>
+          <w:ilvl w:val="0"/>
+          <w:numId w:val="2"/>
+        </w:numPr>
+        <w:spacing w:after="60"/>
+      </w:pPr>
+      <w:r>
+        <w:rPr>
+          <w:sz w:val="21"/>
+          <w:szCs w:val="21"/>
+        </w:rPr>
+        <w:t xml:space="preserve">Não utilize secador, cremes, óleos ou pomadas sobre a bandagem</w:t>
+      </w:r>
+    </w:p>
+    <w:p>
+      <w:pPr>
+        <w:pStyle w:val="ListParagraph"/>
+        <w:numPr>
+          <w:ilvl w:val="0"/>
+          <w:numId w:val="2"/>
+        </w:numPr>
+        <w:spacing w:after="60"/>
+      </w:pPr>
+      <w:r>
+        <w:rPr>
+          <w:sz w:val="21"/>
+          <w:szCs w:val="21"/>
+        </w:rPr>
+        <w:t xml:space="preserve">Não puxe, recorte, reposicione ou retire o taping por conta própria</w:t>
+      </w:r>
+    </w:p>
+    <w:p>
+      <w:pPr>
+        <w:pStyle w:val="ListParagraph"/>
+        <w:numPr>
+          <w:ilvl w:val="0"/>
+          <w:numId w:val="2"/>
+        </w:numPr>
+        <w:spacing w:after="60"/>
+      </w:pPr>
+      <w:r>
+        <w:rPr>
+          <w:sz w:val="21"/>
+          <w:szCs w:val="21"/>
+        </w:rPr>
+        <w:t xml:space="preserve">Use roupas confortáveis e tenha cuidado para não prender ou tracionar as pontas da bandagem</w:t>
+      </w:r>
+    </w:p>
+    <w:p>
+      <w:pPr>
+        <w:pStyle w:val="ListParagraph"/>
+        <w:numPr>
+          <w:ilvl w:val="0"/>
+          <w:numId w:val="2"/>
+        </w:numPr>
+        <w:spacing w:after="60"/>
+      </w:pPr>
+      <w:r>
+        <w:rPr>
+          <w:sz w:val="21"/>
+          <w:szCs w:val="21"/>
+        </w:rPr>
+        <w:t xml:space="preserve">Se alguma extremidade começar a descolar, não tente colá-la novamente — entre em contato com a equipe para receber orientação</w:t>
+      </w:r>
+    </w:p>
+    <w:p>
+      <w:pPr>
+        <w:pStyle w:val="ListParagraph"/>
+        <w:numPr>
+          <w:ilvl w:val="0"/>
+          <w:numId w:val="2"/>
+        </w:numPr>
+        <w:spacing w:after="60"/>
+      </w:pPr>
+      <w:r>
+        <w:rPr>
+          <w:sz w:val="21"/>
+          <w:szCs w:val="21"/>
+        </w:rPr>
+        <w:t xml:space="preserve">A retirada deve ser feita conforme a orientação da fisioterapeuta ou da equipe responsável</w:t>
+      </w:r>
+    </w:p>
+    <w:p>
+      <w:pPr>
+        <w:spacing w:after="80" w:before="240"/>
+      </w:pPr>
+      <w:r>
+        <w:rPr>
+          <w:b/>
+          <w:bCs/>
+          <w:color w:val="067F7B"/>
+          <w:spacing w:val="30"/>
+          <w:sz w:val="17"/>
+          <w:szCs w:val="17"/>
+        </w:rPr>
+        <w:t xml:space="preserve">QUANDO ENTRAR EM CONTATO</w:t>
+      </w:r>
+    </w:p>
+    <w:p>
+      <w:pPr>
+        <w:spacing w:after="100"/>
+      </w:pPr>
+      <w:r>
+        <w:rPr>
+          <w:sz w:val="21"/>
+          <w:szCs w:val="21"/>
+        </w:rPr>
+        <w:t xml:space="preserve">Avise a equipe se perceber:</w:t>
+      </w:r>
+    </w:p>
+    <w:p>
+      <w:pPr>
+        <w:pStyle w:val="ListParagraph"/>
+        <w:numPr>
+          <w:ilvl w:val="0"/>
+          <w:numId w:val="2"/>
+        </w:numPr>
+        <w:spacing w:after="60"/>
+      </w:pPr>
+      <w:r>
+        <w:rPr>
+          <w:sz w:val="21"/>
+          <w:szCs w:val="21"/>
+        </w:rPr>
+        <w:t xml:space="preserve">Coceira intensa ou persistente</w:t>
+      </w:r>
+    </w:p>
+    <w:p>
+      <w:pPr>
+        <w:pStyle w:val="ListParagraph"/>
+        <w:numPr>
+          <w:ilvl w:val="0"/>
+          <w:numId w:val="2"/>
+        </w:numPr>
+        <w:spacing w:after="60"/>
+      </w:pPr>
+      <w:r>
+        <w:rPr>
+          <w:sz w:val="21"/>
+          <w:szCs w:val="21"/>
+        </w:rPr>
+        <w:t xml:space="preserve">Ardência, dor ou desconforto importante</w:t>
+      </w:r>
+    </w:p>
+    <w:p>
+      <w:pPr>
+        <w:pStyle w:val="ListParagraph"/>
+        <w:numPr>
+          <w:ilvl w:val="0"/>
+          <w:numId w:val="2"/>
+        </w:numPr>
+        <w:spacing w:after="60"/>
+      </w:pPr>
+      <w:r>
+        <w:rPr>
+          <w:sz w:val="21"/>
+          <w:szCs w:val="21"/>
+        </w:rPr>
+        <w:t xml:space="preserve">Vermelhidão que se estende além da bandagem</w:t>
+      </w:r>
+    </w:p>
+    <w:p>
+      <w:pPr>
+        <w:pStyle w:val="ListParagraph"/>
+        <w:numPr>
+          <w:ilvl w:val="0"/>
+          <w:numId w:val="2"/>
+        </w:numPr>
+        <w:spacing w:after="60"/>
+      </w:pPr>
+      <w:r>
+        <w:rPr>
+          <w:sz w:val="21"/>
+          <w:szCs w:val="21"/>
+        </w:rPr>
+        <w:t xml:space="preserve">Pele muito sensível, irritada ou machucada</w:t>
+      </w:r>
+    </w:p>
+    <w:p>
+      <w:pPr>
+        <w:pStyle w:val="ListParagraph"/>
+        <w:numPr>
+          <w:ilvl w:val="0"/>
+          <w:numId w:val="2"/>
+        </w:numPr>
+        <w:spacing w:after="60"/>
+      </w:pPr>
+      <w:r>
+        <w:rPr>
+          <w:sz w:val="21"/>
+          <w:szCs w:val="21"/>
+        </w:rPr>
+        <w:t xml:space="preserve">Bandagem molhada, muito solta ou completamente descolada</w:t>
+      </w:r>
+    </w:p>
+    <w:p>
+      <w:pPr>
+        <w:spacing w:after="80" w:before="240"/>
+      </w:pPr>
+      <w:r>
+        <w:rPr>
+          <w:b/>
+          <w:bCs/>
+          <w:color w:val="067F7B"/>
+          <w:spacing w:val="30"/>
+          <w:sz w:val="17"/>
+          <w:szCs w:val="17"/>
+        </w:rPr>
+        <w:t xml:space="preserve">CADA RECUPERAÇÃO É ÚNICA</w:t>
+      </w:r>
+    </w:p>
+    <w:p>
+      <w:pPr>
+        <w:spacing w:after="100"/>
+      </w:pPr>
+      <w:r>
+        <w:rPr>
+          <w:sz w:val="21"/>
+          <w:szCs w:val="21"/>
+        </w:rPr>
+        <w:t xml:space="preserve">O taping é um cuidado complementar e não substitui as demais orientações pós-operatórias.</w:t>
+      </w:r>
+    </w:p>
+    <w:p>
+      <w:pPr>
+        <w:spacing w:after="100"/>
+      </w:pPr>
+      <w:r>
+        <w:rPr>
+          <w:sz w:val="21"/>
+          <w:szCs w:val="21"/>
+        </w:rPr>
+        <w:t xml:space="preserve">O tempo de permanência, a retirada e a eventual reaplicação serão definidos individualmente durante o acompanhamento.</w:t>
+      </w:r>
+    </w:p>
+    <w:p>
+      <w:pPr>
+        <w:pBdr>
+          <w:bottom w:val="dotted" w:color="C8C8C8" w:sz="4" w:space="4"/>
+        </w:pBdr>
+        <w:spacing w:after="240" w:before="100"/>
+      </w:pPr>
+      <w:r>
+        <w:rPr>
+          <w:i/>
+          <w:iCs/>
+          <w:color w:val="AAAAAA"/>
+          <w:sz w:val="17"/>
+          <w:szCs w:val="17"/>
+        </w:rPr>
+        <w:t xml:space="preserve">Correção: </w:t>
+      </w:r>
+    </w:p>
+    <w:p>
+      <w:pPr>
+        <w:pStyle w:val="Heading3"/>
+        <w:spacing w:after="100" w:before="280"/>
+      </w:pPr>
+      <w:r>
+        <w:rPr>
+          <w:b/>
+          <w:bCs/>
+          <w:color w:val="111111"/>
+          <w:sz w:val="23"/>
+          <w:szCs w:val="23"/>
+        </w:rPr>
         <w:t xml:space="preserve">Curativos, banho e higiene</w:t>
       </w:r>
     </w:p>

</xml_diff>

<commit_message>
Corrige o prazo da postura ereta na abdominoplastia
O marco dizia que a postura ereta era retomada no 7º dia, mas o cirurgião pede
que a paciente ande curvada até o 14º. Ler no app que já pode endireitar uma
semana antes tensiona justamente a cicatriz que a postura curvada protege.

O ponto de atenção do procedimento acompanha: "primeiros dias" vira "duas
primeiras semanas", que é o prazo real.

Co-Authored-By: Claude Opus 5 <noreply@anthropic.com>
Claude-Session: https://claude.ai/code/session_01RXsuhQQ6qNiyuBJF5nJZKq
</commit_message>
<xml_diff>
--- a/docs/conteudo-clinico-para-revisao.docx
+++ b/docs/conteudo-clinico-para-revisao.docx
@@ -62,7 +62,7 @@
           <w:sz w:val="19"/>
           <w:szCs w:val="19"/>
         </w:rPr>
-        <w:t xml:space="preserve">Gerado a partir do aplicativo em 18/08/2026</w:t>
+        <w:t xml:space="preserve">Gerado a partir do aplicativo em 19/08/2026</w:t>
       </w:r>
     </w:p>
     <w:p>
@@ -864,7 +864,7 @@
           <w:sz w:val="21"/>
           <w:szCs w:val="21"/>
         </w:rPr>
-        <w:t xml:space="preserve">Andar levemente curvada nos primeiros dias protege a cicatriz</w:t>
+        <w:t xml:space="preserve">Andar levemente curvada nas duas primeiras semanas protege a cicatriz</w:t>
       </w:r>
     </w:p>
     <w:p>
@@ -6973,7 +6973,7 @@
                 <w:sz w:val="20"/>
                 <w:szCs w:val="20"/>
               </w:rPr>
-              <w:t xml:space="preserve">D7</w:t>
+              <w:t xml:space="preserve">D14</w:t>
             </w:r>
           </w:p>
         </w:tc>
@@ -6987,7 +6987,7 @@
                 <w:sz w:val="20"/>
                 <w:szCs w:val="20"/>
               </w:rPr>
-              <w:t xml:space="preserve">Postura ereta é retomada gradualmente</w:t>
+              <w:t xml:space="preserve">Postura totalmente ereta, conforme a orientação da equipe</w:t>
             </w:r>
           </w:p>
         </w:tc>

</xml_diff>

<commit_message>
Massagem: 30 dias, e um guia próprio para as pálpebras
O cirurgião prefere 30 dias em vez de 21 para começar a massagear, e a
blefaroplastia tem técnica própria: de dentro para fora, pressão um pouco mais
firme, 20 movimentos em cada pálpebra, manhã e noite.

Como é outra técnica, virou guia separado em vez de mais uma seção — e a
blefaroplastia deixa de ver a massagem geral, que descreve movimentos
circulares e pressão progressiva. Ler as duas seria receber instruções
conflitantes sobre a mesma cicatriz.

O Face HD vê os dois: opera as pálpebras e também deixa cicatriz no rosto.

Para isso um guia pode agora declarar de quem ele se exclui, como as linhas de
fase já faziam.

Co-Authored-By: Claude Opus 5 <noreply@anthropic.com>
Claude-Session: https://claude.ai/code/session_01RXsuhQQ6qNiyuBJF5nJZKq
</commit_message>
<xml_diff>
--- a/docs/conteudo-clinico-para-revisao.docx
+++ b/docs/conteudo-clinico-para-revisao.docx
@@ -76,7 +76,7 @@
           <w:sz w:val="19"/>
           <w:szCs w:val="19"/>
         </w:rPr>
-        <w:t xml:space="preserve">18 procedimentos · 63 orientações de sintomas · 20 guias de cuidados</w:t>
+        <w:t xml:space="preserve">18 procedimentos · 63 orientações de sintomas · 21 guias de cuidados</w:t>
       </w:r>
     </w:p>
     <w:p>
@@ -25625,7 +25625,7 @@
           <w:sz w:val="23"/>
           <w:szCs w:val="23"/>
         </w:rPr>
-        <w:t xml:space="preserve">Massagem das cicatrizes</w:t>
+        <w:t xml:space="preserve">Massagem das pálpebras</w:t>
       </w:r>
     </w:p>
     <w:p>
@@ -25638,7 +25638,7 @@
           <w:sz w:val="19"/>
           <w:szCs w:val="19"/>
         </w:rPr>
-        <w:t xml:space="preserve">"A partir do 21º dia, com a cicatriz já fechada"  |  Aplica-se a: somente cirurgias</w:t>
+        <w:t xml:space="preserve">"A partir de 30 dias, manhã e noite"  |  Aplica-se a: somente cirurgias · apenas: Blefaroplastia, Face HD Concept</w:t>
       </w:r>
     </w:p>
     <w:p>
@@ -25654,19 +25654,87 @@
           <w:sz w:val="17"/>
           <w:szCs w:val="17"/>
         </w:rPr>
-        <w:t xml:space="preserve">POR QUE MASSAGEAR</w:t>
-      </w:r>
-    </w:p>
-    <w:p>
-      <w:pPr>
-        <w:spacing w:after="100"/>
-      </w:pPr>
-      <w:r>
-        <w:rPr>
-          <w:sz w:val="21"/>
-          <w:szCs w:val="21"/>
-        </w:rPr>
-        <w:t xml:space="preserve">A cicatriz continua se transformando por vários meses após a cirurgia. A massagem faz parte desse processo de cuidado e ajuda a manter o tecido mais macio, flexível e bem adaptado aos planos profundos.</w:t>
+        <w:t xml:space="preserve">COMO FAZER</w:t>
+      </w:r>
+    </w:p>
+    <w:p>
+      <w:pPr>
+        <w:spacing w:after="100"/>
+      </w:pPr>
+      <w:r>
+        <w:rPr>
+          <w:sz w:val="21"/>
+          <w:szCs w:val="21"/>
+        </w:rPr>
+        <w:t xml:space="preserve">A partir de 30 dias, com as cicatrizes já fechadas, massageie as cicatrizes das pálpebras — as superiores e as inferiores.</w:t>
+      </w:r>
+    </w:p>
+    <w:p>
+      <w:pPr>
+        <w:pStyle w:val="ListParagraph"/>
+        <w:numPr>
+          <w:ilvl w:val="0"/>
+          <w:numId w:val="2"/>
+        </w:numPr>
+        <w:spacing w:after="60"/>
+      </w:pPr>
+      <w:r>
+        <w:rPr>
+          <w:sz w:val="21"/>
+          <w:szCs w:val="21"/>
+        </w:rPr>
+        <w:t xml:space="preserve">Deslize sempre de dentro para fora, no sentido do canto do olho para a lateral</w:t>
+      </w:r>
+    </w:p>
+    <w:p>
+      <w:pPr>
+        <w:pStyle w:val="ListParagraph"/>
+        <w:numPr>
+          <w:ilvl w:val="0"/>
+          <w:numId w:val="2"/>
+        </w:numPr>
+        <w:spacing w:after="60"/>
+      </w:pPr>
+      <w:r>
+        <w:rPr>
+          <w:sz w:val="21"/>
+          <w:szCs w:val="21"/>
+        </w:rPr>
+        <w:t xml:space="preserve">Use uma pressão um pouco mais firme do que a das outras cicatrizes</w:t>
+      </w:r>
+    </w:p>
+    <w:p>
+      <w:pPr>
+        <w:pStyle w:val="ListParagraph"/>
+        <w:numPr>
+          <w:ilvl w:val="0"/>
+          <w:numId w:val="2"/>
+        </w:numPr>
+        <w:spacing w:after="60"/>
+      </w:pPr>
+      <w:r>
+        <w:rPr>
+          <w:sz w:val="21"/>
+          <w:szCs w:val="21"/>
+        </w:rPr>
+        <w:t xml:space="preserve">20 movimentos em cada pálpebra</w:t>
+      </w:r>
+    </w:p>
+    <w:p>
+      <w:pPr>
+        <w:pStyle w:val="ListParagraph"/>
+        <w:numPr>
+          <w:ilvl w:val="0"/>
+          <w:numId w:val="2"/>
+        </w:numPr>
+        <w:spacing w:after="60"/>
+      </w:pPr>
+      <w:r>
+        <w:rPr>
+          <w:sz w:val="21"/>
+          <w:szCs w:val="21"/>
+        </w:rPr>
+        <w:t xml:space="preserve">Duas vezes ao dia: de manhã e à noite</w:t>
       </w:r>
     </w:p>
     <w:p>
@@ -25682,6 +25750,161 @@
           <w:sz w:val="17"/>
           <w:szCs w:val="17"/>
         </w:rPr>
+        <w:t xml:space="preserve">ANTES DE COMEÇAR</w:t>
+      </w:r>
+    </w:p>
+    <w:p>
+      <w:pPr>
+        <w:spacing w:after="100"/>
+      </w:pPr>
+      <w:r>
+        <w:rPr>
+          <w:sz w:val="21"/>
+          <w:szCs w:val="21"/>
+        </w:rPr>
+        <w:t xml:space="preserve">A pele das pálpebras é fina e a cicatriz precisa estar completamente fechada, sem nenhum ponto de abertura. Se ainda houver alguma área cicatrizando, aguarde a liberação da nossa equipe.</w:t>
+      </w:r>
+    </w:p>
+    <w:p>
+      <w:pPr>
+        <w:spacing w:after="100"/>
+      </w:pPr>
+      <w:r>
+        <w:rPr>
+          <w:sz w:val="21"/>
+          <w:szCs w:val="21"/>
+        </w:rPr>
+        <w:t xml:space="preserve">Lave bem as mãos antes de encostar na região.</w:t>
+      </w:r>
+    </w:p>
+    <w:p>
+      <w:pPr>
+        <w:spacing w:after="80" w:before="240"/>
+      </w:pPr>
+      <w:r>
+        <w:rPr>
+          <w:b/>
+          <w:bCs/>
+          <w:color w:val="067F7B"/>
+          <w:spacing w:val="30"/>
+          <w:sz w:val="17"/>
+          <w:szCs w:val="17"/>
+        </w:rPr>
+        <w:t xml:space="preserve">O QUE ESPERAR</w:t>
+      </w:r>
+    </w:p>
+    <w:p>
+      <w:pPr>
+        <w:spacing w:after="100"/>
+      </w:pPr>
+      <w:r>
+        <w:rPr>
+          <w:sz w:val="21"/>
+          <w:szCs w:val="21"/>
+        </w:rPr>
+        <w:t xml:space="preserve">Um leve desconforto no começo é comum e melhora conforme a cicatriz amadurece. Nunca force a ponto de machucar a pele ou de deixar a região irritada.</w:t>
+      </w:r>
+    </w:p>
+    <w:p>
+      <w:pPr>
+        <w:spacing w:after="100"/>
+      </w:pPr>
+      <w:r>
+        <w:rPr>
+          <w:sz w:val="21"/>
+          <w:szCs w:val="21"/>
+        </w:rPr>
+        <w:t xml:space="preserve">Se aparecer vermelhidão que não passa, dor ou qualquer alteração na visão, interrompa e fale com a equipe.</w:t>
+      </w:r>
+    </w:p>
+    <w:p>
+      <w:pPr>
+        <w:pBdr>
+          <w:bottom w:val="dotted" w:color="C8C8C8" w:sz="4" w:space="4"/>
+        </w:pBdr>
+        <w:spacing w:after="240" w:before="100"/>
+      </w:pPr>
+      <w:r>
+        <w:rPr>
+          <w:i/>
+          <w:iCs/>
+          <w:color w:val="AAAAAA"/>
+          <w:sz w:val="17"/>
+          <w:szCs w:val="17"/>
+        </w:rPr>
+        <w:t xml:space="preserve">Correção: </w:t>
+      </w:r>
+    </w:p>
+    <w:p>
+      <w:pPr>
+        <w:pStyle w:val="Heading3"/>
+        <w:spacing w:after="100" w:before="280"/>
+      </w:pPr>
+      <w:r>
+        <w:rPr>
+          <w:b/>
+          <w:bCs/>
+          <w:color w:val="111111"/>
+          <w:sz w:val="23"/>
+          <w:szCs w:val="23"/>
+        </w:rPr>
+        <w:t xml:space="preserve">Massagem das cicatrizes</w:t>
+      </w:r>
+    </w:p>
+    <w:p>
+      <w:pPr>
+        <w:spacing w:after="100"/>
+      </w:pPr>
+      <w:r>
+        <w:rPr>
+          <w:color w:val="6B6B6B"/>
+          <w:sz w:val="19"/>
+          <w:szCs w:val="19"/>
+        </w:rPr>
+        <w:t xml:space="preserve">"A partir de 30 dias, com a cicatriz já fechada"  |  Aplica-se a: somente cirurgias</w:t>
+      </w:r>
+    </w:p>
+    <w:p>
+      <w:pPr>
+        <w:spacing w:after="80" w:before="240"/>
+      </w:pPr>
+      <w:r>
+        <w:rPr>
+          <w:b/>
+          <w:bCs/>
+          <w:color w:val="067F7B"/>
+          <w:spacing w:val="30"/>
+          <w:sz w:val="17"/>
+          <w:szCs w:val="17"/>
+        </w:rPr>
+        <w:t xml:space="preserve">POR QUE MASSAGEAR</w:t>
+      </w:r>
+    </w:p>
+    <w:p>
+      <w:pPr>
+        <w:spacing w:after="100"/>
+      </w:pPr>
+      <w:r>
+        <w:rPr>
+          <w:sz w:val="21"/>
+          <w:szCs w:val="21"/>
+        </w:rPr>
+        <w:t xml:space="preserve">A cicatriz continua se transformando por vários meses após a cirurgia. A massagem faz parte desse processo de cuidado e ajuda a manter o tecido mais macio, flexível e bem adaptado aos planos profundos.</w:t>
+      </w:r>
+    </w:p>
+    <w:p>
+      <w:pPr>
+        <w:spacing w:after="80" w:before="240"/>
+      </w:pPr>
+      <w:r>
+        <w:rPr>
+          <w:b/>
+          <w:bCs/>
+          <w:color w:val="067F7B"/>
+          <w:spacing w:val="30"/>
+          <w:sz w:val="17"/>
+          <w:szCs w:val="17"/>
+        </w:rPr>
         <w:t xml:space="preserve">QUANDO COMEÇAR</w:t>
       </w:r>
     </w:p>
@@ -25694,7 +25917,7 @@
           <w:sz w:val="21"/>
           <w:szCs w:val="21"/>
         </w:rPr>
-        <w:t xml:space="preserve">Em geral, a massagem pode ser iniciada por volta de 21 dias após a cirurgia, desde que a cicatriz esteja completamente fechada, com a pele íntegra e sem nenhum ponto de abertura ou deiscência.</w:t>
+        <w:t xml:space="preserve">Em geral, a massagem pode ser iniciada por volta de 30 dias após a cirurgia, desde que a cicatriz esteja completamente fechada, com a pele íntegra e sem nenhum ponto de abertura ou deiscência.</w:t>
       </w:r>
     </w:p>
     <w:p>

</xml_diff>

<commit_message>
Dá a cada cirurgia o nome do curativo que ela tem
A linha dizia "manter o curativo, o splint ou a faixa" para as quatro cirurgias
sem cinta. Mas splint é do nariz, faixa é da orelha e mentoneira é do rosto —
quem fez blefaroplastia lia as três e procurava no próprio corpo uma coisa que
não estava lá.

Agora cada uma tem a sua: splint nasal na rinoplastia, faixa elástica na
otoplastia, curativos das pálpebras na blefaroplastia, mentoneira e taping no
Face HD. Vale para as duas linhas — a de manter e a de não retirar antes da
hora.

Co-Authored-By: Claude Opus 5 <noreply@anthropic.com>
Claude-Session: https://claude.ai/code/session_01RXsuhQQ6qNiyuBJF5nJZKq
</commit_message>
<xml_diff>
--- a/docs/conteudo-clinico-para-revisao.docx
+++ b/docs/conteudo-clinico-para-revisao.docx
@@ -62,7 +62,7 @@
           <w:sz w:val="19"/>
           <w:szCs w:val="19"/>
         </w:rPr>
-        <w:t xml:space="preserve">Gerado a partir do aplicativo em 19/08/2026</w:t>
+        <w:t xml:space="preserve">Gerado a partir do aplicativo em 20/08/2026</w:t>
       </w:r>
     </w:p>
     <w:p>
@@ -3436,7 +3436,7 @@
           <w:sz w:val="21"/>
           <w:szCs w:val="21"/>
         </w:rPr>
-        <w:t xml:space="preserve">Manter o curativo, o splint ou a faixa exatamente como a equipe orientou</w:t>
+        <w:t xml:space="preserve">Manter o curativo e o splint nasal exatamente como a equipe orientou</w:t>
       </w:r>
       <w:r>
         <w:rPr>
@@ -3446,288 +3446,24 @@
           <w:sz w:val="19"/>
           <w:szCs w:val="19"/>
         </w:rPr>
-        <w:t xml:space="preserve"> — só para: Rinoplastia, Blefaroplastia, Otoplastia, Face HD Concept, face</w:t>
-      </w:r>
-    </w:p>
-    <w:p>
-      <w:pPr>
-        <w:spacing w:after="80" w:before="240"/>
-      </w:pPr>
-      <w:r>
-        <w:rPr>
-          <w:b/>
-          <w:bCs/>
-          <w:color w:val="067F7B"/>
-          <w:spacing w:val="30"/>
-          <w:sz w:val="17"/>
-          <w:szCs w:val="17"/>
-        </w:rPr>
-        <w:t xml:space="preserve">O QUE EVITAR</w:t>
-      </w:r>
-    </w:p>
-    <w:p>
-      <w:pPr>
-        <w:pStyle w:val="ListParagraph"/>
-        <w:numPr>
-          <w:ilvl w:val="0"/>
-          <w:numId w:val="2"/>
-        </w:numPr>
-        <w:spacing w:after="60"/>
-      </w:pPr>
-      <w:r>
-        <w:rPr>
-          <w:sz w:val="21"/>
-          <w:szCs w:val="21"/>
-        </w:rPr>
-        <w:t xml:space="preserve">Ficar totalmente parada na cama por muitas horas</w:t>
-      </w:r>
-    </w:p>
-    <w:p>
-      <w:pPr>
-        <w:pStyle w:val="ListParagraph"/>
-        <w:numPr>
-          <w:ilvl w:val="0"/>
-          <w:numId w:val="2"/>
-        </w:numPr>
-        <w:spacing w:after="60"/>
-      </w:pPr>
-      <w:r>
-        <w:rPr>
-          <w:sz w:val="21"/>
-          <w:szCs w:val="21"/>
-        </w:rPr>
-        <w:t xml:space="preserve">Dirigir ou tomar decisões importantes (efeito da anestesia)</w:t>
-      </w:r>
-    </w:p>
-    <w:p>
-      <w:pPr>
-        <w:pStyle w:val="ListParagraph"/>
-        <w:numPr>
-          <w:ilvl w:val="0"/>
-          <w:numId w:val="2"/>
-        </w:numPr>
-        <w:spacing w:after="60"/>
-      </w:pPr>
-      <w:r>
-        <w:rPr>
-          <w:sz w:val="21"/>
-          <w:szCs w:val="21"/>
-        </w:rPr>
-        <w:t xml:space="preserve">Molhar os curativos</w:t>
-      </w:r>
-    </w:p>
-    <w:p>
-      <w:pPr>
-        <w:pStyle w:val="ListParagraph"/>
-        <w:numPr>
-          <w:ilvl w:val="0"/>
-          <w:numId w:val="2"/>
-        </w:numPr>
-        <w:spacing w:after="60"/>
-      </w:pPr>
-      <w:r>
-        <w:rPr>
-          <w:sz w:val="21"/>
-          <w:szCs w:val="21"/>
-        </w:rPr>
-        <w:t xml:space="preserve">Fumar ou consumir bebida alcoólica</w:t>
-      </w:r>
-    </w:p>
-    <w:p>
-      <w:pPr>
-        <w:pBdr>
-          <w:bottom w:val="dotted" w:color="C8C8C8" w:sz="4" w:space="4"/>
-        </w:pBdr>
-        <w:spacing w:after="240" w:before="100"/>
-      </w:pPr>
-      <w:r>
-        <w:rPr>
-          <w:i/>
-          <w:iCs/>
-          <w:color w:val="AAAAAA"/>
-          <w:sz w:val="17"/>
-          <w:szCs w:val="17"/>
-        </w:rPr>
-        <w:t xml:space="preserve">Correção: </w:t>
-      </w:r>
-    </w:p>
-    <w:p>
-      <w:pPr>
-        <w:pStyle w:val="Heading3"/>
-        <w:spacing w:after="100" w:before="280"/>
-      </w:pPr>
-      <w:r>
-        <w:rPr>
-          <w:b/>
-          <w:bCs/>
-          <w:color w:val="111111"/>
-          <w:sz w:val="23"/>
-          <w:szCs w:val="23"/>
-        </w:rPr>
-        <w:t xml:space="preserve">Dias 3 a 7</w:t>
-      </w:r>
-    </w:p>
-    <w:p>
-      <w:pPr>
-        <w:spacing w:after="100"/>
-      </w:pPr>
-      <w:r>
-        <w:rPr>
-          <w:sz w:val="21"/>
-          <w:szCs w:val="21"/>
-        </w:rPr>
-        <w:t xml:space="preserve">O pico do inchaço e dos roxos acontece agora e começa a ceder. A dor costuma diminuir bastante a partir do 4º dia.</w:t>
-      </w:r>
-    </w:p>
-    <w:p>
-      <w:pPr>
-        <w:spacing w:after="80" w:before="240"/>
-      </w:pPr>
-      <w:r>
-        <w:rPr>
-          <w:b/>
-          <w:bCs/>
-          <w:color w:val="067F7B"/>
-          <w:spacing w:val="30"/>
-          <w:sz w:val="17"/>
-          <w:szCs w:val="17"/>
-        </w:rPr>
-        <w:t xml:space="preserve">O QUE É ESPERADO</w:t>
-      </w:r>
-    </w:p>
-    <w:p>
-      <w:pPr>
-        <w:pStyle w:val="ListParagraph"/>
-        <w:numPr>
-          <w:ilvl w:val="0"/>
-          <w:numId w:val="2"/>
-        </w:numPr>
-        <w:spacing w:after="60"/>
-      </w:pPr>
-      <w:r>
-        <w:rPr>
-          <w:sz w:val="21"/>
-          <w:szCs w:val="21"/>
-        </w:rPr>
-        <w:t xml:space="preserve">Roxos escurecendo antes de clarear — isso é normal</w:t>
-      </w:r>
-    </w:p>
-    <w:p>
-      <w:pPr>
-        <w:pStyle w:val="ListParagraph"/>
-        <w:numPr>
-          <w:ilvl w:val="0"/>
-          <w:numId w:val="2"/>
-        </w:numPr>
-        <w:spacing w:after="60"/>
-      </w:pPr>
-      <w:r>
-        <w:rPr>
-          <w:sz w:val="21"/>
-          <w:szCs w:val="21"/>
-        </w:rPr>
-        <w:t xml:space="preserve">Inchaço assimétrico: um lado pode inchar mais que o outro</w:t>
-      </w:r>
-    </w:p>
-    <w:p>
-      <w:pPr>
-        <w:pStyle w:val="ListParagraph"/>
-        <w:numPr>
-          <w:ilvl w:val="0"/>
-          <w:numId w:val="2"/>
-        </w:numPr>
-        <w:spacing w:after="60"/>
-      </w:pPr>
-      <w:r>
-        <w:rPr>
-          <w:sz w:val="21"/>
-          <w:szCs w:val="21"/>
-        </w:rPr>
-        <w:t xml:space="preserve">Coceira leve e sensação de fisgadas ou choques</w:t>
-      </w:r>
-    </w:p>
-    <w:p>
-      <w:pPr>
-        <w:pStyle w:val="ListParagraph"/>
-        <w:numPr>
-          <w:ilvl w:val="0"/>
-          <w:numId w:val="2"/>
-        </w:numPr>
-        <w:spacing w:after="60"/>
-      </w:pPr>
-      <w:r>
-        <w:rPr>
-          <w:sz w:val="21"/>
-          <w:szCs w:val="21"/>
-        </w:rPr>
-        <w:t xml:space="preserve">Áreas dormentes ao redor das cicatrizes</w:t>
-      </w:r>
-    </w:p>
-    <w:p>
-      <w:pPr>
-        <w:pStyle w:val="ListParagraph"/>
-        <w:numPr>
-          <w:ilvl w:val="0"/>
-          <w:numId w:val="2"/>
-        </w:numPr>
-        <w:spacing w:after="60"/>
-      </w:pPr>
-      <w:r>
-        <w:rPr>
-          <w:sz w:val="21"/>
-          <w:szCs w:val="21"/>
-        </w:rPr>
-        <w:t xml:space="preserve">Intestino preso por causa dos analgésicos</w:t>
-      </w:r>
-    </w:p>
-    <w:p>
-      <w:pPr>
-        <w:spacing w:after="80" w:before="240"/>
-      </w:pPr>
-      <w:r>
-        <w:rPr>
-          <w:b/>
-          <w:bCs/>
-          <w:color w:val="067F7B"/>
-          <w:spacing w:val="30"/>
-          <w:sz w:val="17"/>
-          <w:szCs w:val="17"/>
-        </w:rPr>
-        <w:t xml:space="preserve">O QUE FAZER</w:t>
-      </w:r>
-    </w:p>
-    <w:p>
-      <w:pPr>
-        <w:pStyle w:val="ListParagraph"/>
-        <w:numPr>
-          <w:ilvl w:val="0"/>
-          <w:numId w:val="2"/>
-        </w:numPr>
-        <w:spacing w:after="60"/>
-      </w:pPr>
-      <w:r>
-        <w:rPr>
-          <w:sz w:val="21"/>
-          <w:szCs w:val="21"/>
-        </w:rPr>
-        <w:t xml:space="preserve">Caminhar dentro de casa, várias vezes ao dia e por poucos minutos</w:t>
-      </w:r>
-    </w:p>
-    <w:p>
-      <w:pPr>
-        <w:pStyle w:val="ListParagraph"/>
-        <w:numPr>
-          <w:ilvl w:val="0"/>
-          <w:numId w:val="2"/>
-        </w:numPr>
-        <w:spacing w:after="60"/>
-      </w:pPr>
-      <w:r>
-        <w:rPr>
-          <w:sz w:val="21"/>
-          <w:szCs w:val="21"/>
-        </w:rPr>
-        <w:t xml:space="preserve">Iniciar a drenagem linfática se já liberada pela equipe</w:t>
+        <w:t xml:space="preserve"> — só para: Rinoplastia</w:t>
+      </w:r>
+    </w:p>
+    <w:p>
+      <w:pPr>
+        <w:pStyle w:val="ListParagraph"/>
+        <w:numPr>
+          <w:ilvl w:val="0"/>
+          <w:numId w:val="2"/>
+        </w:numPr>
+        <w:spacing w:after="60"/>
+      </w:pPr>
+      <w:r>
+        <w:rPr>
+          <w:sz w:val="21"/>
+          <w:szCs w:val="21"/>
+        </w:rPr>
+        <w:t xml:space="preserve">Manter a faixa elástica exatamente como a equipe orientou</w:t>
       </w:r>
       <w:r>
         <w:rPr>
@@ -3737,272 +3473,24 @@
           <w:sz w:val="19"/>
           <w:szCs w:val="19"/>
         </w:rPr>
-        <w:t xml:space="preserve"> — só para: Lipoescultura, Lipo HD Concept, Abdominoplastia, Correção de ginecomastia, Cirurgia pós-bariátrica</w:t>
-      </w:r>
-    </w:p>
-    <w:p>
-      <w:pPr>
-        <w:pStyle w:val="ListParagraph"/>
-        <w:numPr>
-          <w:ilvl w:val="0"/>
-          <w:numId w:val="2"/>
-        </w:numPr>
-        <w:spacing w:after="60"/>
-      </w:pPr>
-      <w:r>
-        <w:rPr>
-          <w:sz w:val="21"/>
-          <w:szCs w:val="21"/>
-        </w:rPr>
-        <w:t xml:space="preserve">Comparecer ao primeiro retorno para revisão dos curativos</w:t>
-      </w:r>
-    </w:p>
-    <w:p>
-      <w:pPr>
-        <w:pStyle w:val="ListParagraph"/>
-        <w:numPr>
-          <w:ilvl w:val="0"/>
-          <w:numId w:val="2"/>
-        </w:numPr>
-        <w:spacing w:after="60"/>
-      </w:pPr>
-      <w:r>
-        <w:rPr>
-          <w:sz w:val="21"/>
-          <w:szCs w:val="21"/>
-        </w:rPr>
-        <w:t xml:space="preserve">Manter alimentação rica em proteína e fibras</w:t>
-      </w:r>
-    </w:p>
-    <w:p>
-      <w:pPr>
-        <w:pStyle w:val="ListParagraph"/>
-        <w:numPr>
-          <w:ilvl w:val="0"/>
-          <w:numId w:val="2"/>
-        </w:numPr>
-        <w:spacing w:after="60"/>
-      </w:pPr>
-      <w:r>
-        <w:rPr>
-          <w:sz w:val="21"/>
-          <w:szCs w:val="21"/>
-        </w:rPr>
-        <w:t xml:space="preserve">Dormir na posição orientada para a sua cirurgia</w:t>
-      </w:r>
-    </w:p>
-    <w:p>
-      <w:pPr>
-        <w:spacing w:after="80" w:before="240"/>
-      </w:pPr>
-      <w:r>
-        <w:rPr>
-          <w:b/>
-          <w:bCs/>
-          <w:color w:val="067F7B"/>
-          <w:spacing w:val="30"/>
-          <w:sz w:val="17"/>
-          <w:szCs w:val="17"/>
-        </w:rPr>
-        <w:t xml:space="preserve">O QUE EVITAR</w:t>
-      </w:r>
-    </w:p>
-    <w:p>
-      <w:pPr>
-        <w:pStyle w:val="ListParagraph"/>
-        <w:numPr>
-          <w:ilvl w:val="0"/>
-          <w:numId w:val="2"/>
-        </w:numPr>
-        <w:spacing w:after="60"/>
-      </w:pPr>
-      <w:r>
-        <w:rPr>
-          <w:sz w:val="21"/>
-          <w:szCs w:val="21"/>
-        </w:rPr>
-        <w:t xml:space="preserve">Esforço físico, agachar e pegar peso</w:t>
-      </w:r>
-    </w:p>
-    <w:p>
-      <w:pPr>
-        <w:pStyle w:val="ListParagraph"/>
-        <w:numPr>
-          <w:ilvl w:val="0"/>
-          <w:numId w:val="2"/>
-        </w:numPr>
-        <w:spacing w:after="60"/>
-      </w:pPr>
-      <w:r>
-        <w:rPr>
-          <w:sz w:val="21"/>
-          <w:szCs w:val="21"/>
-        </w:rPr>
-        <w:t xml:space="preserve">Banho de imersão, piscina, mar e sauna</w:t>
-      </w:r>
-    </w:p>
-    <w:p>
-      <w:pPr>
-        <w:pStyle w:val="ListParagraph"/>
-        <w:numPr>
-          <w:ilvl w:val="0"/>
-          <w:numId w:val="2"/>
-        </w:numPr>
-        <w:spacing w:after="60"/>
-      </w:pPr>
-      <w:r>
-        <w:rPr>
-          <w:sz w:val="21"/>
-          <w:szCs w:val="21"/>
-        </w:rPr>
-        <w:t xml:space="preserve">Passar cremes ou pomadas por conta própria na cicatriz</w:t>
-      </w:r>
-    </w:p>
-    <w:p>
-      <w:pPr>
-        <w:pStyle w:val="ListParagraph"/>
-        <w:numPr>
-          <w:ilvl w:val="0"/>
-          <w:numId w:val="2"/>
-        </w:numPr>
-        <w:spacing w:after="60"/>
-      </w:pPr>
-      <w:r>
-        <w:rPr>
-          <w:sz w:val="21"/>
-          <w:szCs w:val="21"/>
-        </w:rPr>
-        <w:t xml:space="preserve">Comparar o resultado com fotos — ainda é muito cedo</w:t>
-      </w:r>
-    </w:p>
-    <w:p>
-      <w:pPr>
-        <w:pBdr>
-          <w:bottom w:val="dotted" w:color="C8C8C8" w:sz="4" w:space="4"/>
-        </w:pBdr>
-        <w:spacing w:after="240" w:before="100"/>
-      </w:pPr>
-      <w:r>
-        <w:rPr>
-          <w:i/>
-          <w:iCs/>
-          <w:color w:val="AAAAAA"/>
-          <w:sz w:val="17"/>
-          <w:szCs w:val="17"/>
-        </w:rPr>
-        <w:t xml:space="preserve">Correção: </w:t>
-      </w:r>
-    </w:p>
-    <w:p>
-      <w:pPr>
-        <w:pStyle w:val="Heading3"/>
-        <w:spacing w:after="100" w:before="280"/>
-      </w:pPr>
-      <w:r>
-        <w:rPr>
-          <w:b/>
-          <w:bCs/>
-          <w:color w:val="111111"/>
-          <w:sz w:val="23"/>
-          <w:szCs w:val="23"/>
-        </w:rPr>
-        <w:t xml:space="preserve">Semanas 2 e 3</w:t>
-      </w:r>
-    </w:p>
-    <w:p>
-      <w:pPr>
-        <w:spacing w:after="100"/>
-      </w:pPr>
-      <w:r>
-        <w:rPr>
-          <w:sz w:val="21"/>
-          <w:szCs w:val="21"/>
-        </w:rPr>
-        <w:t xml:space="preserve">Fase de retomada gradual. A maioria das pacientes já se sente bem em casa e muitas voltam a atividades leves.</w:t>
-      </w:r>
-    </w:p>
-    <w:p>
-      <w:pPr>
-        <w:spacing w:after="80" w:before="240"/>
-      </w:pPr>
-      <w:r>
-        <w:rPr>
-          <w:b/>
-          <w:bCs/>
-          <w:color w:val="067F7B"/>
-          <w:spacing w:val="30"/>
-          <w:sz w:val="17"/>
-          <w:szCs w:val="17"/>
-        </w:rPr>
-        <w:t xml:space="preserve">O QUE É ESPERADO</w:t>
-      </w:r>
-    </w:p>
-    <w:p>
-      <w:pPr>
-        <w:pStyle w:val="ListParagraph"/>
-        <w:numPr>
-          <w:ilvl w:val="0"/>
-          <w:numId w:val="2"/>
-        </w:numPr>
-        <w:spacing w:after="60"/>
-      </w:pPr>
-      <w:r>
-        <w:rPr>
-          <w:sz w:val="21"/>
-          <w:szCs w:val="21"/>
-        </w:rPr>
-        <w:t xml:space="preserve">Melhora clara da dor — desconforto pontual ainda ocorre</w:t>
-      </w:r>
-    </w:p>
-    <w:p>
-      <w:pPr>
-        <w:pStyle w:val="ListParagraph"/>
-        <w:numPr>
-          <w:ilvl w:val="0"/>
-          <w:numId w:val="2"/>
-        </w:numPr>
-        <w:spacing w:after="60"/>
-      </w:pPr>
-      <w:r>
-        <w:rPr>
-          <w:sz w:val="21"/>
-          <w:szCs w:val="21"/>
-        </w:rPr>
-        <w:t xml:space="preserve">Roxos amarelando e desaparecendo</w:t>
-      </w:r>
-    </w:p>
-    <w:p>
-      <w:pPr>
-        <w:pStyle w:val="ListParagraph"/>
-        <w:numPr>
-          <w:ilvl w:val="0"/>
-          <w:numId w:val="2"/>
-        </w:numPr>
-        <w:spacing w:after="60"/>
-      </w:pPr>
-      <w:r>
-        <w:rPr>
-          <w:sz w:val="21"/>
-          <w:szCs w:val="21"/>
-        </w:rPr>
-        <w:t xml:space="preserve">Cicatriz avermelhada e um pouco elevada</w:t>
-      </w:r>
-    </w:p>
-    <w:p>
-      <w:pPr>
-        <w:pStyle w:val="ListParagraph"/>
-        <w:numPr>
-          <w:ilvl w:val="0"/>
-          <w:numId w:val="2"/>
-        </w:numPr>
-        <w:spacing w:after="60"/>
-      </w:pPr>
-      <w:r>
-        <w:rPr>
-          <w:sz w:val="21"/>
-          <w:szCs w:val="21"/>
-        </w:rPr>
-        <w:t xml:space="preserve">Endurecimento e nódulos sob a pele nas áreas lipoaspiradas</w:t>
+        <w:t xml:space="preserve"> — só para: Otoplastia</w:t>
+      </w:r>
+    </w:p>
+    <w:p>
+      <w:pPr>
+        <w:pStyle w:val="ListParagraph"/>
+        <w:numPr>
+          <w:ilvl w:val="0"/>
+          <w:numId w:val="2"/>
+        </w:numPr>
+        <w:spacing w:after="60"/>
+      </w:pPr>
+      <w:r>
+        <w:rPr>
+          <w:sz w:val="21"/>
+          <w:szCs w:val="21"/>
+        </w:rPr>
+        <w:t xml:space="preserve">Manter os curativos das pálpebras exatamente como a equipe orientou</w:t>
       </w:r>
       <w:r>
         <w:rPr>
@@ -4012,74 +3500,24 @@
           <w:sz w:val="19"/>
           <w:szCs w:val="19"/>
         </w:rPr>
-        <w:t xml:space="preserve"> — só para: Lipoescultura, Lipo HD Concept, Abdominoplastia, Correção de ginecomastia, Cirurgia pós-bariátrica</w:t>
-      </w:r>
-    </w:p>
-    <w:p>
-      <w:pPr>
-        <w:pStyle w:val="ListParagraph"/>
-        <w:numPr>
-          <w:ilvl w:val="0"/>
-          <w:numId w:val="2"/>
-        </w:numPr>
-        <w:spacing w:after="60"/>
-      </w:pPr>
-      <w:r>
-        <w:rPr>
-          <w:sz w:val="21"/>
-          <w:szCs w:val="21"/>
-        </w:rPr>
-        <w:t xml:space="preserve">Cansaço no fim do dia</w:t>
-      </w:r>
-    </w:p>
-    <w:p>
-      <w:pPr>
-        <w:spacing w:after="80" w:before="240"/>
-      </w:pPr>
-      <w:r>
-        <w:rPr>
-          <w:b/>
-          <w:bCs/>
-          <w:color w:val="067F7B"/>
-          <w:spacing w:val="30"/>
-          <w:sz w:val="17"/>
-          <w:szCs w:val="17"/>
-        </w:rPr>
-        <w:t xml:space="preserve">O QUE FAZER</w:t>
-      </w:r>
-    </w:p>
-    <w:p>
-      <w:pPr>
-        <w:pStyle w:val="ListParagraph"/>
-        <w:numPr>
-          <w:ilvl w:val="0"/>
-          <w:numId w:val="2"/>
-        </w:numPr>
-        <w:spacing w:after="60"/>
-      </w:pPr>
-      <w:r>
-        <w:rPr>
-          <w:sz w:val="21"/>
-          <w:szCs w:val="21"/>
-        </w:rPr>
-        <w:t xml:space="preserve">Retomar o trabalho leve, se liberada pela equipe</w:t>
-      </w:r>
-    </w:p>
-    <w:p>
-      <w:pPr>
-        <w:pStyle w:val="ListParagraph"/>
-        <w:numPr>
-          <w:ilvl w:val="0"/>
-          <w:numId w:val="2"/>
-        </w:numPr>
-        <w:spacing w:after="60"/>
-      </w:pPr>
-      <w:r>
-        <w:rPr>
-          <w:sz w:val="21"/>
-          <w:szCs w:val="21"/>
-        </w:rPr>
-        <w:t xml:space="preserve">Manter a compressão conforme orientado</w:t>
+        <w:t xml:space="preserve"> — só para: Blefaroplastia</w:t>
+      </w:r>
+    </w:p>
+    <w:p>
+      <w:pPr>
+        <w:pStyle w:val="ListParagraph"/>
+        <w:numPr>
+          <w:ilvl w:val="0"/>
+          <w:numId w:val="2"/>
+        </w:numPr>
+        <w:spacing w:after="60"/>
+      </w:pPr>
+      <w:r>
+        <w:rPr>
+          <w:sz w:val="21"/>
+          <w:szCs w:val="21"/>
+        </w:rPr>
+        <w:t xml:space="preserve">Manter a mentoneira e o taping exatamente como a equipe orientou</w:t>
       </w:r>
       <w:r>
         <w:rPr>
@@ -4089,24 +3527,288 @@
           <w:sz w:val="19"/>
           <w:szCs w:val="19"/>
         </w:rPr>
-        <w:t xml:space="preserve"> — exceto: Rinoplastia, Blefaroplastia, Otoplastia, Face HD Concept, face</w:t>
-      </w:r>
-    </w:p>
-    <w:p>
-      <w:pPr>
-        <w:pStyle w:val="ListParagraph"/>
-        <w:numPr>
-          <w:ilvl w:val="0"/>
-          <w:numId w:val="2"/>
-        </w:numPr>
-        <w:spacing w:after="60"/>
-      </w:pPr>
-      <w:r>
-        <w:rPr>
-          <w:sz w:val="21"/>
-          <w:szCs w:val="21"/>
-        </w:rPr>
-        <w:t xml:space="preserve">Seguir com a drenagem linfática na frequência indicada</w:t>
+        <w:t xml:space="preserve"> — só para: Face HD Concept</w:t>
+      </w:r>
+    </w:p>
+    <w:p>
+      <w:pPr>
+        <w:spacing w:after="80" w:before="240"/>
+      </w:pPr>
+      <w:r>
+        <w:rPr>
+          <w:b/>
+          <w:bCs/>
+          <w:color w:val="067F7B"/>
+          <w:spacing w:val="30"/>
+          <w:sz w:val="17"/>
+          <w:szCs w:val="17"/>
+        </w:rPr>
+        <w:t xml:space="preserve">O QUE EVITAR</w:t>
+      </w:r>
+    </w:p>
+    <w:p>
+      <w:pPr>
+        <w:pStyle w:val="ListParagraph"/>
+        <w:numPr>
+          <w:ilvl w:val="0"/>
+          <w:numId w:val="2"/>
+        </w:numPr>
+        <w:spacing w:after="60"/>
+      </w:pPr>
+      <w:r>
+        <w:rPr>
+          <w:sz w:val="21"/>
+          <w:szCs w:val="21"/>
+        </w:rPr>
+        <w:t xml:space="preserve">Ficar totalmente parada na cama por muitas horas</w:t>
+      </w:r>
+    </w:p>
+    <w:p>
+      <w:pPr>
+        <w:pStyle w:val="ListParagraph"/>
+        <w:numPr>
+          <w:ilvl w:val="0"/>
+          <w:numId w:val="2"/>
+        </w:numPr>
+        <w:spacing w:after="60"/>
+      </w:pPr>
+      <w:r>
+        <w:rPr>
+          <w:sz w:val="21"/>
+          <w:szCs w:val="21"/>
+        </w:rPr>
+        <w:t xml:space="preserve">Dirigir ou tomar decisões importantes (efeito da anestesia)</w:t>
+      </w:r>
+    </w:p>
+    <w:p>
+      <w:pPr>
+        <w:pStyle w:val="ListParagraph"/>
+        <w:numPr>
+          <w:ilvl w:val="0"/>
+          <w:numId w:val="2"/>
+        </w:numPr>
+        <w:spacing w:after="60"/>
+      </w:pPr>
+      <w:r>
+        <w:rPr>
+          <w:sz w:val="21"/>
+          <w:szCs w:val="21"/>
+        </w:rPr>
+        <w:t xml:space="preserve">Molhar os curativos</w:t>
+      </w:r>
+    </w:p>
+    <w:p>
+      <w:pPr>
+        <w:pStyle w:val="ListParagraph"/>
+        <w:numPr>
+          <w:ilvl w:val="0"/>
+          <w:numId w:val="2"/>
+        </w:numPr>
+        <w:spacing w:after="60"/>
+      </w:pPr>
+      <w:r>
+        <w:rPr>
+          <w:sz w:val="21"/>
+          <w:szCs w:val="21"/>
+        </w:rPr>
+        <w:t xml:space="preserve">Fumar ou consumir bebida alcoólica</w:t>
+      </w:r>
+    </w:p>
+    <w:p>
+      <w:pPr>
+        <w:pBdr>
+          <w:bottom w:val="dotted" w:color="C8C8C8" w:sz="4" w:space="4"/>
+        </w:pBdr>
+        <w:spacing w:after="240" w:before="100"/>
+      </w:pPr>
+      <w:r>
+        <w:rPr>
+          <w:i/>
+          <w:iCs/>
+          <w:color w:val="AAAAAA"/>
+          <w:sz w:val="17"/>
+          <w:szCs w:val="17"/>
+        </w:rPr>
+        <w:t xml:space="preserve">Correção: </w:t>
+      </w:r>
+    </w:p>
+    <w:p>
+      <w:pPr>
+        <w:pStyle w:val="Heading3"/>
+        <w:spacing w:after="100" w:before="280"/>
+      </w:pPr>
+      <w:r>
+        <w:rPr>
+          <w:b/>
+          <w:bCs/>
+          <w:color w:val="111111"/>
+          <w:sz w:val="23"/>
+          <w:szCs w:val="23"/>
+        </w:rPr>
+        <w:t xml:space="preserve">Dias 3 a 7</w:t>
+      </w:r>
+    </w:p>
+    <w:p>
+      <w:pPr>
+        <w:spacing w:after="100"/>
+      </w:pPr>
+      <w:r>
+        <w:rPr>
+          <w:sz w:val="21"/>
+          <w:szCs w:val="21"/>
+        </w:rPr>
+        <w:t xml:space="preserve">O pico do inchaço e dos roxos acontece agora e começa a ceder. A dor costuma diminuir bastante a partir do 4º dia.</w:t>
+      </w:r>
+    </w:p>
+    <w:p>
+      <w:pPr>
+        <w:spacing w:after="80" w:before="240"/>
+      </w:pPr>
+      <w:r>
+        <w:rPr>
+          <w:b/>
+          <w:bCs/>
+          <w:color w:val="067F7B"/>
+          <w:spacing w:val="30"/>
+          <w:sz w:val="17"/>
+          <w:szCs w:val="17"/>
+        </w:rPr>
+        <w:t xml:space="preserve">O QUE É ESPERADO</w:t>
+      </w:r>
+    </w:p>
+    <w:p>
+      <w:pPr>
+        <w:pStyle w:val="ListParagraph"/>
+        <w:numPr>
+          <w:ilvl w:val="0"/>
+          <w:numId w:val="2"/>
+        </w:numPr>
+        <w:spacing w:after="60"/>
+      </w:pPr>
+      <w:r>
+        <w:rPr>
+          <w:sz w:val="21"/>
+          <w:szCs w:val="21"/>
+        </w:rPr>
+        <w:t xml:space="preserve">Roxos escurecendo antes de clarear — isso é normal</w:t>
+      </w:r>
+    </w:p>
+    <w:p>
+      <w:pPr>
+        <w:pStyle w:val="ListParagraph"/>
+        <w:numPr>
+          <w:ilvl w:val="0"/>
+          <w:numId w:val="2"/>
+        </w:numPr>
+        <w:spacing w:after="60"/>
+      </w:pPr>
+      <w:r>
+        <w:rPr>
+          <w:sz w:val="21"/>
+          <w:szCs w:val="21"/>
+        </w:rPr>
+        <w:t xml:space="preserve">Inchaço assimétrico: um lado pode inchar mais que o outro</w:t>
+      </w:r>
+    </w:p>
+    <w:p>
+      <w:pPr>
+        <w:pStyle w:val="ListParagraph"/>
+        <w:numPr>
+          <w:ilvl w:val="0"/>
+          <w:numId w:val="2"/>
+        </w:numPr>
+        <w:spacing w:after="60"/>
+      </w:pPr>
+      <w:r>
+        <w:rPr>
+          <w:sz w:val="21"/>
+          <w:szCs w:val="21"/>
+        </w:rPr>
+        <w:t xml:space="preserve">Coceira leve e sensação de fisgadas ou choques</w:t>
+      </w:r>
+    </w:p>
+    <w:p>
+      <w:pPr>
+        <w:pStyle w:val="ListParagraph"/>
+        <w:numPr>
+          <w:ilvl w:val="0"/>
+          <w:numId w:val="2"/>
+        </w:numPr>
+        <w:spacing w:after="60"/>
+      </w:pPr>
+      <w:r>
+        <w:rPr>
+          <w:sz w:val="21"/>
+          <w:szCs w:val="21"/>
+        </w:rPr>
+        <w:t xml:space="preserve">Áreas dormentes ao redor das cicatrizes</w:t>
+      </w:r>
+    </w:p>
+    <w:p>
+      <w:pPr>
+        <w:pStyle w:val="ListParagraph"/>
+        <w:numPr>
+          <w:ilvl w:val="0"/>
+          <w:numId w:val="2"/>
+        </w:numPr>
+        <w:spacing w:after="60"/>
+      </w:pPr>
+      <w:r>
+        <w:rPr>
+          <w:sz w:val="21"/>
+          <w:szCs w:val="21"/>
+        </w:rPr>
+        <w:t xml:space="preserve">Intestino preso por causa dos analgésicos</w:t>
+      </w:r>
+    </w:p>
+    <w:p>
+      <w:pPr>
+        <w:spacing w:after="80" w:before="240"/>
+      </w:pPr>
+      <w:r>
+        <w:rPr>
+          <w:b/>
+          <w:bCs/>
+          <w:color w:val="067F7B"/>
+          <w:spacing w:val="30"/>
+          <w:sz w:val="17"/>
+          <w:szCs w:val="17"/>
+        </w:rPr>
+        <w:t xml:space="preserve">O QUE FAZER</w:t>
+      </w:r>
+    </w:p>
+    <w:p>
+      <w:pPr>
+        <w:pStyle w:val="ListParagraph"/>
+        <w:numPr>
+          <w:ilvl w:val="0"/>
+          <w:numId w:val="2"/>
+        </w:numPr>
+        <w:spacing w:after="60"/>
+      </w:pPr>
+      <w:r>
+        <w:rPr>
+          <w:sz w:val="21"/>
+          <w:szCs w:val="21"/>
+        </w:rPr>
+        <w:t xml:space="preserve">Caminhar dentro de casa, várias vezes ao dia e por poucos minutos</w:t>
+      </w:r>
+    </w:p>
+    <w:p>
+      <w:pPr>
+        <w:pStyle w:val="ListParagraph"/>
+        <w:numPr>
+          <w:ilvl w:val="0"/>
+          <w:numId w:val="2"/>
+        </w:numPr>
+        <w:spacing w:after="60"/>
+      </w:pPr>
+      <w:r>
+        <w:rPr>
+          <w:sz w:val="21"/>
+          <w:szCs w:val="21"/>
+        </w:rPr>
+        <w:t xml:space="preserve">Iniciar a drenagem linfática se já liberada pela equipe</w:t>
       </w:r>
       <w:r>
         <w:rPr>
@@ -4133,7 +3835,41 @@
           <w:sz w:val="21"/>
           <w:szCs w:val="21"/>
         </w:rPr>
-        <w:t xml:space="preserve">Hidratar a pele ao redor da cicatriz (não sobre os pontos)</w:t>
+        <w:t xml:space="preserve">Comparecer ao primeiro retorno para revisão dos curativos</w:t>
+      </w:r>
+    </w:p>
+    <w:p>
+      <w:pPr>
+        <w:pStyle w:val="ListParagraph"/>
+        <w:numPr>
+          <w:ilvl w:val="0"/>
+          <w:numId w:val="2"/>
+        </w:numPr>
+        <w:spacing w:after="60"/>
+      </w:pPr>
+      <w:r>
+        <w:rPr>
+          <w:sz w:val="21"/>
+          <w:szCs w:val="21"/>
+        </w:rPr>
+        <w:t xml:space="preserve">Manter alimentação rica em proteína e fibras</w:t>
+      </w:r>
+    </w:p>
+    <w:p>
+      <w:pPr>
+        <w:pStyle w:val="ListParagraph"/>
+        <w:numPr>
+          <w:ilvl w:val="0"/>
+          <w:numId w:val="2"/>
+        </w:numPr>
+        <w:spacing w:after="60"/>
+      </w:pPr>
+      <w:r>
+        <w:rPr>
+          <w:sz w:val="21"/>
+          <w:szCs w:val="21"/>
+        </w:rPr>
+        <w:t xml:space="preserve">Dormir na posição orientada para a sua cirurgia</w:t>
       </w:r>
     </w:p>
     <w:p>
@@ -4166,58 +3902,188 @@
           <w:sz w:val="21"/>
           <w:szCs w:val="21"/>
         </w:rPr>
-        <w:t xml:space="preserve">Academia, corrida e qualquer exercício de impacto</w:t>
-      </w:r>
-    </w:p>
-    <w:p>
-      <w:pPr>
-        <w:pStyle w:val="ListParagraph"/>
-        <w:numPr>
-          <w:ilvl w:val="0"/>
-          <w:numId w:val="2"/>
-        </w:numPr>
-        <w:spacing w:after="60"/>
-      </w:pPr>
-      <w:r>
-        <w:rPr>
-          <w:sz w:val="21"/>
-          <w:szCs w:val="21"/>
-        </w:rPr>
-        <w:t xml:space="preserve">Sol direto sobre a cicatriz</w:t>
-      </w:r>
-    </w:p>
-    <w:p>
-      <w:pPr>
-        <w:pStyle w:val="ListParagraph"/>
-        <w:numPr>
-          <w:ilvl w:val="0"/>
-          <w:numId w:val="2"/>
-        </w:numPr>
-        <w:spacing w:after="60"/>
-      </w:pPr>
-      <w:r>
-        <w:rPr>
-          <w:sz w:val="21"/>
-          <w:szCs w:val="21"/>
-        </w:rPr>
-        <w:t xml:space="preserve">Relações sexuais e esforços intensos sem liberação</w:t>
-      </w:r>
-    </w:p>
-    <w:p>
-      <w:pPr>
-        <w:pStyle w:val="ListParagraph"/>
-        <w:numPr>
-          <w:ilvl w:val="0"/>
-          <w:numId w:val="2"/>
-        </w:numPr>
-        <w:spacing w:after="60"/>
-      </w:pPr>
-      <w:r>
-        <w:rPr>
-          <w:sz w:val="21"/>
-          <w:szCs w:val="21"/>
-        </w:rPr>
-        <w:t xml:space="preserve">Abandonar a cinta ou o sutiã cirúrgico mais cedo</w:t>
+        <w:t xml:space="preserve">Esforço físico, agachar e pegar peso</w:t>
+      </w:r>
+    </w:p>
+    <w:p>
+      <w:pPr>
+        <w:pStyle w:val="ListParagraph"/>
+        <w:numPr>
+          <w:ilvl w:val="0"/>
+          <w:numId w:val="2"/>
+        </w:numPr>
+        <w:spacing w:after="60"/>
+      </w:pPr>
+      <w:r>
+        <w:rPr>
+          <w:sz w:val="21"/>
+          <w:szCs w:val="21"/>
+        </w:rPr>
+        <w:t xml:space="preserve">Banho de imersão, piscina, mar e sauna</w:t>
+      </w:r>
+    </w:p>
+    <w:p>
+      <w:pPr>
+        <w:pStyle w:val="ListParagraph"/>
+        <w:numPr>
+          <w:ilvl w:val="0"/>
+          <w:numId w:val="2"/>
+        </w:numPr>
+        <w:spacing w:after="60"/>
+      </w:pPr>
+      <w:r>
+        <w:rPr>
+          <w:sz w:val="21"/>
+          <w:szCs w:val="21"/>
+        </w:rPr>
+        <w:t xml:space="preserve">Passar cremes ou pomadas por conta própria na cicatriz</w:t>
+      </w:r>
+    </w:p>
+    <w:p>
+      <w:pPr>
+        <w:pStyle w:val="ListParagraph"/>
+        <w:numPr>
+          <w:ilvl w:val="0"/>
+          <w:numId w:val="2"/>
+        </w:numPr>
+        <w:spacing w:after="60"/>
+      </w:pPr>
+      <w:r>
+        <w:rPr>
+          <w:sz w:val="21"/>
+          <w:szCs w:val="21"/>
+        </w:rPr>
+        <w:t xml:space="preserve">Comparar o resultado com fotos — ainda é muito cedo</w:t>
+      </w:r>
+    </w:p>
+    <w:p>
+      <w:pPr>
+        <w:pBdr>
+          <w:bottom w:val="dotted" w:color="C8C8C8" w:sz="4" w:space="4"/>
+        </w:pBdr>
+        <w:spacing w:after="240" w:before="100"/>
+      </w:pPr>
+      <w:r>
+        <w:rPr>
+          <w:i/>
+          <w:iCs/>
+          <w:color w:val="AAAAAA"/>
+          <w:sz w:val="17"/>
+          <w:szCs w:val="17"/>
+        </w:rPr>
+        <w:t xml:space="preserve">Correção: </w:t>
+      </w:r>
+    </w:p>
+    <w:p>
+      <w:pPr>
+        <w:pStyle w:val="Heading3"/>
+        <w:spacing w:after="100" w:before="280"/>
+      </w:pPr>
+      <w:r>
+        <w:rPr>
+          <w:b/>
+          <w:bCs/>
+          <w:color w:val="111111"/>
+          <w:sz w:val="23"/>
+          <w:szCs w:val="23"/>
+        </w:rPr>
+        <w:t xml:space="preserve">Semanas 2 e 3</w:t>
+      </w:r>
+    </w:p>
+    <w:p>
+      <w:pPr>
+        <w:spacing w:after="100"/>
+      </w:pPr>
+      <w:r>
+        <w:rPr>
+          <w:sz w:val="21"/>
+          <w:szCs w:val="21"/>
+        </w:rPr>
+        <w:t xml:space="preserve">Fase de retomada gradual. A maioria das pacientes já se sente bem em casa e muitas voltam a atividades leves.</w:t>
+      </w:r>
+    </w:p>
+    <w:p>
+      <w:pPr>
+        <w:spacing w:after="80" w:before="240"/>
+      </w:pPr>
+      <w:r>
+        <w:rPr>
+          <w:b/>
+          <w:bCs/>
+          <w:color w:val="067F7B"/>
+          <w:spacing w:val="30"/>
+          <w:sz w:val="17"/>
+          <w:szCs w:val="17"/>
+        </w:rPr>
+        <w:t xml:space="preserve">O QUE É ESPERADO</w:t>
+      </w:r>
+    </w:p>
+    <w:p>
+      <w:pPr>
+        <w:pStyle w:val="ListParagraph"/>
+        <w:numPr>
+          <w:ilvl w:val="0"/>
+          <w:numId w:val="2"/>
+        </w:numPr>
+        <w:spacing w:after="60"/>
+      </w:pPr>
+      <w:r>
+        <w:rPr>
+          <w:sz w:val="21"/>
+          <w:szCs w:val="21"/>
+        </w:rPr>
+        <w:t xml:space="preserve">Melhora clara da dor — desconforto pontual ainda ocorre</w:t>
+      </w:r>
+    </w:p>
+    <w:p>
+      <w:pPr>
+        <w:pStyle w:val="ListParagraph"/>
+        <w:numPr>
+          <w:ilvl w:val="0"/>
+          <w:numId w:val="2"/>
+        </w:numPr>
+        <w:spacing w:after="60"/>
+      </w:pPr>
+      <w:r>
+        <w:rPr>
+          <w:sz w:val="21"/>
+          <w:szCs w:val="21"/>
+        </w:rPr>
+        <w:t xml:space="preserve">Roxos amarelando e desaparecendo</w:t>
+      </w:r>
+    </w:p>
+    <w:p>
+      <w:pPr>
+        <w:pStyle w:val="ListParagraph"/>
+        <w:numPr>
+          <w:ilvl w:val="0"/>
+          <w:numId w:val="2"/>
+        </w:numPr>
+        <w:spacing w:after="60"/>
+      </w:pPr>
+      <w:r>
+        <w:rPr>
+          <w:sz w:val="21"/>
+          <w:szCs w:val="21"/>
+        </w:rPr>
+        <w:t xml:space="preserve">Cicatriz avermelhada e um pouco elevada</w:t>
+      </w:r>
+    </w:p>
+    <w:p>
+      <w:pPr>
+        <w:pStyle w:val="ListParagraph"/>
+        <w:numPr>
+          <w:ilvl w:val="0"/>
+          <w:numId w:val="2"/>
+        </w:numPr>
+        <w:spacing w:after="60"/>
+      </w:pPr>
+      <w:r>
+        <w:rPr>
+          <w:sz w:val="21"/>
+          <w:szCs w:val="21"/>
+        </w:rPr>
+        <w:t xml:space="preserve">Endurecimento e nódulos sob a pele nas áreas lipoaspiradas</w:t>
       </w:r>
       <w:r>
         <w:rPr>
@@ -4227,24 +4093,74 @@
           <w:sz w:val="19"/>
           <w:szCs w:val="19"/>
         </w:rPr>
-        <w:t xml:space="preserve"> — exceto: Rinoplastia, Blefaroplastia, Otoplastia, Face HD Concept, face</w:t>
-      </w:r>
-    </w:p>
-    <w:p>
-      <w:pPr>
-        <w:pStyle w:val="ListParagraph"/>
-        <w:numPr>
-          <w:ilvl w:val="0"/>
-          <w:numId w:val="2"/>
-        </w:numPr>
-        <w:spacing w:after="60"/>
-      </w:pPr>
-      <w:r>
-        <w:rPr>
-          <w:sz w:val="21"/>
-          <w:szCs w:val="21"/>
-        </w:rPr>
-        <w:t xml:space="preserve">Retirar o curativo, o splint ou a faixa antes do tempo orientado</w:t>
+        <w:t xml:space="preserve"> — só para: Lipoescultura, Lipo HD Concept, Abdominoplastia, Correção de ginecomastia, Cirurgia pós-bariátrica</w:t>
+      </w:r>
+    </w:p>
+    <w:p>
+      <w:pPr>
+        <w:pStyle w:val="ListParagraph"/>
+        <w:numPr>
+          <w:ilvl w:val="0"/>
+          <w:numId w:val="2"/>
+        </w:numPr>
+        <w:spacing w:after="60"/>
+      </w:pPr>
+      <w:r>
+        <w:rPr>
+          <w:sz w:val="21"/>
+          <w:szCs w:val="21"/>
+        </w:rPr>
+        <w:t xml:space="preserve">Cansaço no fim do dia</w:t>
+      </w:r>
+    </w:p>
+    <w:p>
+      <w:pPr>
+        <w:spacing w:after="80" w:before="240"/>
+      </w:pPr>
+      <w:r>
+        <w:rPr>
+          <w:b/>
+          <w:bCs/>
+          <w:color w:val="067F7B"/>
+          <w:spacing w:val="30"/>
+          <w:sz w:val="17"/>
+          <w:szCs w:val="17"/>
+        </w:rPr>
+        <w:t xml:space="preserve">O QUE FAZER</w:t>
+      </w:r>
+    </w:p>
+    <w:p>
+      <w:pPr>
+        <w:pStyle w:val="ListParagraph"/>
+        <w:numPr>
+          <w:ilvl w:val="0"/>
+          <w:numId w:val="2"/>
+        </w:numPr>
+        <w:spacing w:after="60"/>
+      </w:pPr>
+      <w:r>
+        <w:rPr>
+          <w:sz w:val="21"/>
+          <w:szCs w:val="21"/>
+        </w:rPr>
+        <w:t xml:space="preserve">Retomar o trabalho leve, se liberada pela equipe</w:t>
+      </w:r>
+    </w:p>
+    <w:p>
+      <w:pPr>
+        <w:pStyle w:val="ListParagraph"/>
+        <w:numPr>
+          <w:ilvl w:val="0"/>
+          <w:numId w:val="2"/>
+        </w:numPr>
+        <w:spacing w:after="60"/>
+      </w:pPr>
+      <w:r>
+        <w:rPr>
+          <w:sz w:val="21"/>
+          <w:szCs w:val="21"/>
+        </w:rPr>
+        <w:t xml:space="preserve">Manter a compressão conforme orientado</w:t>
       </w:r>
       <w:r>
         <w:rPr>
@@ -4254,7 +4170,253 @@
           <w:sz w:val="19"/>
           <w:szCs w:val="19"/>
         </w:rPr>
-        <w:t xml:space="preserve"> — só para: Rinoplastia, Blefaroplastia, Otoplastia, Face HD Concept, face</w:t>
+        <w:t xml:space="preserve"> — exceto: Rinoplastia, Blefaroplastia, Otoplastia, Face HD Concept, face</w:t>
+      </w:r>
+    </w:p>
+    <w:p>
+      <w:pPr>
+        <w:pStyle w:val="ListParagraph"/>
+        <w:numPr>
+          <w:ilvl w:val="0"/>
+          <w:numId w:val="2"/>
+        </w:numPr>
+        <w:spacing w:after="60"/>
+      </w:pPr>
+      <w:r>
+        <w:rPr>
+          <w:sz w:val="21"/>
+          <w:szCs w:val="21"/>
+        </w:rPr>
+        <w:t xml:space="preserve">Seguir com a drenagem linfática na frequência indicada</w:t>
+      </w:r>
+      <w:r>
+        <w:rPr>
+          <w:i/>
+          <w:iCs/>
+          <w:color w:val="888888"/>
+          <w:sz w:val="19"/>
+          <w:szCs w:val="19"/>
+        </w:rPr>
+        <w:t xml:space="preserve"> — só para: Lipoescultura, Lipo HD Concept, Abdominoplastia, Correção de ginecomastia, Cirurgia pós-bariátrica</w:t>
+      </w:r>
+    </w:p>
+    <w:p>
+      <w:pPr>
+        <w:pStyle w:val="ListParagraph"/>
+        <w:numPr>
+          <w:ilvl w:val="0"/>
+          <w:numId w:val="2"/>
+        </w:numPr>
+        <w:spacing w:after="60"/>
+      </w:pPr>
+      <w:r>
+        <w:rPr>
+          <w:sz w:val="21"/>
+          <w:szCs w:val="21"/>
+        </w:rPr>
+        <w:t xml:space="preserve">Hidratar a pele ao redor da cicatriz (não sobre os pontos)</w:t>
+      </w:r>
+    </w:p>
+    <w:p>
+      <w:pPr>
+        <w:spacing w:after="80" w:before="240"/>
+      </w:pPr>
+      <w:r>
+        <w:rPr>
+          <w:b/>
+          <w:bCs/>
+          <w:color w:val="067F7B"/>
+          <w:spacing w:val="30"/>
+          <w:sz w:val="17"/>
+          <w:szCs w:val="17"/>
+        </w:rPr>
+        <w:t xml:space="preserve">O QUE EVITAR</w:t>
+      </w:r>
+    </w:p>
+    <w:p>
+      <w:pPr>
+        <w:pStyle w:val="ListParagraph"/>
+        <w:numPr>
+          <w:ilvl w:val="0"/>
+          <w:numId w:val="2"/>
+        </w:numPr>
+        <w:spacing w:after="60"/>
+      </w:pPr>
+      <w:r>
+        <w:rPr>
+          <w:sz w:val="21"/>
+          <w:szCs w:val="21"/>
+        </w:rPr>
+        <w:t xml:space="preserve">Academia, corrida e qualquer exercício de impacto</w:t>
+      </w:r>
+    </w:p>
+    <w:p>
+      <w:pPr>
+        <w:pStyle w:val="ListParagraph"/>
+        <w:numPr>
+          <w:ilvl w:val="0"/>
+          <w:numId w:val="2"/>
+        </w:numPr>
+        <w:spacing w:after="60"/>
+      </w:pPr>
+      <w:r>
+        <w:rPr>
+          <w:sz w:val="21"/>
+          <w:szCs w:val="21"/>
+        </w:rPr>
+        <w:t xml:space="preserve">Sol direto sobre a cicatriz</w:t>
+      </w:r>
+    </w:p>
+    <w:p>
+      <w:pPr>
+        <w:pStyle w:val="ListParagraph"/>
+        <w:numPr>
+          <w:ilvl w:val="0"/>
+          <w:numId w:val="2"/>
+        </w:numPr>
+        <w:spacing w:after="60"/>
+      </w:pPr>
+      <w:r>
+        <w:rPr>
+          <w:sz w:val="21"/>
+          <w:szCs w:val="21"/>
+        </w:rPr>
+        <w:t xml:space="preserve">Relações sexuais e esforços intensos sem liberação</w:t>
+      </w:r>
+    </w:p>
+    <w:p>
+      <w:pPr>
+        <w:pStyle w:val="ListParagraph"/>
+        <w:numPr>
+          <w:ilvl w:val="0"/>
+          <w:numId w:val="2"/>
+        </w:numPr>
+        <w:spacing w:after="60"/>
+      </w:pPr>
+      <w:r>
+        <w:rPr>
+          <w:sz w:val="21"/>
+          <w:szCs w:val="21"/>
+        </w:rPr>
+        <w:t xml:space="preserve">Abandonar a cinta ou o sutiã cirúrgico mais cedo</w:t>
+      </w:r>
+      <w:r>
+        <w:rPr>
+          <w:i/>
+          <w:iCs/>
+          <w:color w:val="888888"/>
+          <w:sz w:val="19"/>
+          <w:szCs w:val="19"/>
+        </w:rPr>
+        <w:t xml:space="preserve"> — exceto: Rinoplastia, Blefaroplastia, Otoplastia, Face HD Concept, face</w:t>
+      </w:r>
+    </w:p>
+    <w:p>
+      <w:pPr>
+        <w:pStyle w:val="ListParagraph"/>
+        <w:numPr>
+          <w:ilvl w:val="0"/>
+          <w:numId w:val="2"/>
+        </w:numPr>
+        <w:spacing w:after="60"/>
+      </w:pPr>
+      <w:r>
+        <w:rPr>
+          <w:sz w:val="21"/>
+          <w:szCs w:val="21"/>
+        </w:rPr>
+        <w:t xml:space="preserve">Retirar o curativo ou o splint nasal antes do tempo orientado</w:t>
+      </w:r>
+      <w:r>
+        <w:rPr>
+          <w:i/>
+          <w:iCs/>
+          <w:color w:val="888888"/>
+          <w:sz w:val="19"/>
+          <w:szCs w:val="19"/>
+        </w:rPr>
+        <w:t xml:space="preserve"> — só para: Rinoplastia</w:t>
+      </w:r>
+    </w:p>
+    <w:p>
+      <w:pPr>
+        <w:pStyle w:val="ListParagraph"/>
+        <w:numPr>
+          <w:ilvl w:val="0"/>
+          <w:numId w:val="2"/>
+        </w:numPr>
+        <w:spacing w:after="60"/>
+      </w:pPr>
+      <w:r>
+        <w:rPr>
+          <w:sz w:val="21"/>
+          <w:szCs w:val="21"/>
+        </w:rPr>
+        <w:t xml:space="preserve">Retirar a faixa elástica antes do tempo orientado</w:t>
+      </w:r>
+      <w:r>
+        <w:rPr>
+          <w:i/>
+          <w:iCs/>
+          <w:color w:val="888888"/>
+          <w:sz w:val="19"/>
+          <w:szCs w:val="19"/>
+        </w:rPr>
+        <w:t xml:space="preserve"> — só para: Otoplastia</w:t>
+      </w:r>
+    </w:p>
+    <w:p>
+      <w:pPr>
+        <w:pStyle w:val="ListParagraph"/>
+        <w:numPr>
+          <w:ilvl w:val="0"/>
+          <w:numId w:val="2"/>
+        </w:numPr>
+        <w:spacing w:after="60"/>
+      </w:pPr>
+      <w:r>
+        <w:rPr>
+          <w:sz w:val="21"/>
+          <w:szCs w:val="21"/>
+        </w:rPr>
+        <w:t xml:space="preserve">Retirar os curativos das pálpebras antes do tempo orientado</w:t>
+      </w:r>
+      <w:r>
+        <w:rPr>
+          <w:i/>
+          <w:iCs/>
+          <w:color w:val="888888"/>
+          <w:sz w:val="19"/>
+          <w:szCs w:val="19"/>
+        </w:rPr>
+        <w:t xml:space="preserve"> — só para: Blefaroplastia</w:t>
+      </w:r>
+    </w:p>
+    <w:p>
+      <w:pPr>
+        <w:pStyle w:val="ListParagraph"/>
+        <w:numPr>
+          <w:ilvl w:val="0"/>
+          <w:numId w:val="2"/>
+        </w:numPr>
+        <w:spacing w:after="60"/>
+      </w:pPr>
+      <w:r>
+        <w:rPr>
+          <w:sz w:val="21"/>
+          <w:szCs w:val="21"/>
+        </w:rPr>
+        <w:t xml:space="preserve">Retirar a mentoneira ou o taping antes do tempo orientado</w:t>
+      </w:r>
+      <w:r>
+        <w:rPr>
+          <w:i/>
+          <w:iCs/>
+          <w:color w:val="888888"/>
+          <w:sz w:val="19"/>
+          <w:szCs w:val="19"/>
+        </w:rPr>
+        <w:t xml:space="preserve"> — só para: Face HD Concept</w:t>
       </w:r>
     </w:p>
     <w:p>

</xml_diff>

<commit_message>
Nomeia os tratamentos no lembrete de três meses
O aviso falava em cuidar da pele e das cicatrizes, o que soa como continuação
do pós-operatório. A intenção é outra: aos três meses a paciente está livre
para considerar tratamentos que não tinham como ser feitos antes. Nomeá-los —
toxina, bioestimulador, laser de CO₂ — é o que transforma o aviso numa
informação sobre o que existe, em vez de um convite vago a conversar.

Co-Authored-By: Claude Opus 5 <noreply@anthropic.com>
Claude-Session: https://claude.ai/code/session_01RXsuhQQ6qNiyuBJF5nJZKq
</commit_message>
<xml_diff>
--- a/docs/conteudo-clinico-para-revisao.docx
+++ b/docs/conteudo-clinico-para-revisao.docx
@@ -29905,7 +29905,7 @@
           <w:sz w:val="21"/>
           <w:szCs w:val="21"/>
         </w:rPr>
-        <w:t xml:space="preserve">Com a recuperação concluída, é a fase em que dá para cuidar da pele e das cicatrizes. Converse com a equipe sobre o que faz sentido para você.</w:t>
+        <w:t xml:space="preserve">Passada a recuperação, é quando dá para pensar em outros tratamentos — toxina botulínica, bioestimulador de colágeno, laser de CO₂. Converse com a equipe sobre o que faz sentido para você.</w:t>
       </w:r>
     </w:p>
     <w:p>
@@ -29918,7 +29918,7 @@
           <w:sz w:val="19"/>
           <w:szCs w:val="19"/>
         </w:rPr>
-        <w:t xml:space="preserve">Motivo do prazo: Aos três meses a cicatrização já avançou o suficiente para que tratamentos de pele e de cicatriz possam ser considerados — o que não era possível nas primeiras semanas.</w:t>
+        <w:t xml:space="preserve">Motivo do prazo: Aos três meses a recuperação terminou e a cicatrização já avançou o suficiente para que tratamentos estéticos possam ser considerados — o que não era possível nas primeiras semanas.</w:t>
       </w:r>
     </w:p>
     <w:p>

</xml_diff>

<commit_message>
Tira o retoque do lembrete de um ano
O aviso dizia que o resultado estava definido e perguntava se alguma coisa
incomodava. Aos doze meses a paciente não está avaliando o que foi feito — é
a pergunta que planta a ideia, e um retoque pedido por sugestão do aplicativo
não é um retoque de que ela precisava.

Passa a olhar para frente: o que ela ainda pode querer fazer, no rosto, na
pele ou em outra área, agora que não há mais restrição de pós-operatório.

Co-Authored-By: Claude Opus 5 <noreply@anthropic.com>
Claude-Session: https://claude.ai/code/session_01RXsuhQQ6qNiyuBJF5nJZKq
</commit_message>
<xml_diff>
--- a/docs/conteudo-clinico-para-revisao.docx
+++ b/docs/conteudo-clinico-para-revisao.docx
@@ -29977,7 +29977,7 @@
           <w:sz w:val="21"/>
           <w:szCs w:val="21"/>
         </w:rPr>
-        <w:t xml:space="preserve">O resultado já está definido. Se alguma outra coisa te incomoda, o Dr. Henrique está à disposição para conversar.</w:t>
+        <w:t xml:space="preserve">Se você pensa em algum outro tratamento — no rosto, na pele ou em outra área do corpo —, é um bom momento para conversar com a nossa equipe.</w:t>
       </w:r>
     </w:p>
     <w:p>
@@ -29990,7 +29990,7 @@
           <w:sz w:val="19"/>
           <w:szCs w:val="19"/>
         </w:rPr>
-        <w:t xml:space="preserve">Motivo do prazo: Um ano é quando o resultado de uma cirurgia plástica se considera definitivo. É também o intervalo habitual de uma reavaliação de rotina.</w:t>
+        <w:t xml:space="preserve">Motivo do prazo: Com um ano completo de recuperação, um novo procedimento pode ser planejado sem as restrições do pós-operatório.</w:t>
       </w:r>
     </w:p>
     <w:p>

</xml_diff>

<commit_message>
Antecipa para seis meses o convite a um novo procedimento
Uma nova cirurgia é possível bem antes de um ano — mas o prazo do lembrete
não é o de quando se pode operar, é o de quando a paciente consegue decidir.
Aos seis meses a recuperação acabou, o resultado da primeira já se aproxima
do final, e ainda sobra tempo para exames, afastamento do trabalho e escolha
de época. Antes disso o convite chega a alguém ainda inchada, sem como
avaliar nada.

O de um ano sai: dizia a mesma coisa que este, e duas mensagens da clínica no
primeiro ano é o teto antes de a paciente aprender a descartar todas.

Co-Authored-By: Claude Opus 5 <noreply@anthropic.com>
Claude-Session: https://claude.ai/code/session_01RXsuhQQ6qNiyuBJF5nJZKq
</commit_message>
<xml_diff>
--- a/docs/conteudo-clinico-para-revisao.docx
+++ b/docs/conteudo-clinico-para-revisao.docx
@@ -29952,7 +29952,7 @@
           <w:sz w:val="23"/>
           <w:szCs w:val="23"/>
         </w:rPr>
-        <w:t xml:space="preserve">Faz um ano da sua cirurgia</w:t>
+        <w:t xml:space="preserve">Seis meses de cirurgia</w:t>
       </w:r>
     </w:p>
     <w:p>
@@ -29965,19 +29965,19 @@
           <w:sz w:val="19"/>
           <w:szCs w:val="19"/>
         </w:rPr>
-        <w:t xml:space="preserve">Todas as cirurgias · 1 ano depois</w:t>
-      </w:r>
-    </w:p>
-    <w:p>
-      <w:pPr>
-        <w:spacing w:after="100"/>
-      </w:pPr>
-      <w:r>
-        <w:rPr>
-          <w:sz w:val="21"/>
-          <w:szCs w:val="21"/>
-        </w:rPr>
-        <w:t xml:space="preserve">Se você pensa em algum outro tratamento — no rosto, na pele ou em outra área do corpo —, é um bom momento para conversar com a nossa equipe.</w:t>
+        <w:t xml:space="preserve">Todas as cirurgias · 6 meses depois</w:t>
+      </w:r>
+    </w:p>
+    <w:p>
+      <w:pPr>
+        <w:spacing w:after="100"/>
+      </w:pPr>
+      <w:r>
+        <w:rPr>
+          <w:sz w:val="21"/>
+          <w:szCs w:val="21"/>
+        </w:rPr>
+        <w:t xml:space="preserve">Se você pensa em algum outro procedimento — no rosto, na pele ou em outra área do corpo —, já dá para planejar. Converse com a nossa equipe.</w:t>
       </w:r>
     </w:p>
     <w:p>
@@ -29990,7 +29990,7 @@
           <w:sz w:val="19"/>
           <w:szCs w:val="19"/>
         </w:rPr>
-        <w:t xml:space="preserve">Motivo do prazo: Com um ano completo de recuperação, um novo procedimento pode ser planejado sem as restrições do pós-operatório.</w:t>
+        <w:t xml:space="preserve">Motivo do prazo: Aos seis meses a recuperação está completa e um novo procedimento, inclusive uma nova cirurgia, pode ser planejado sem as restrições do pós-operatório.</w:t>
       </w:r>
     </w:p>
     <w:p>

</xml_diff>

<commit_message>
Separa o aperto da prótese da falta de ar que é urgência
Depois de uma prótese, o peito apertado que encurta a respiração é comum: o
músculo ainda não acomodou, o sutiã comprime, e a ansiedade fecha o círculo.
Quem sente isso encontrava só o cartão vermelho mandando chamar o SAMU — um
susto grande para uma sensação esperada, e o tipo de susto que ensina a
paciente a desconfiar dos outros alertas.

Ganha cartão próprio, calmo, com o que fazer e com o que a faria mudar de
conduta. O alerta de falta de ar continua vermelho e continua mandando ao
pronto-socorro, porque as duas coisas se parecem por dentro e quem as separa é
o exame — mas passa a dizer que a causa mais provável é benigna, e que voltar
sem nada é o desfecho esperado.

São dois cartões, e não uma ressalva dentro do alerta: num cartão só, quem
tivesse embolia leria a primeira metade e ficaria em casa.

Co-Authored-By: Claude Opus 5 <noreply@anthropic.com>
Claude-Session: https://claude.ai/code/session_01RXsuhQQ6qNiyuBJF5nJZKq
</commit_message>
<xml_diff>
--- a/docs/conteudo-clinico-para-revisao.docx
+++ b/docs/conteudo-clinico-para-revisao.docx
@@ -76,7 +76,7 @@
           <w:sz w:val="19"/>
           <w:szCs w:val="19"/>
         </w:rPr>
-        <w:t xml:space="preserve">18 procedimentos · 63 orientações de sintomas · 21 guias de cuidados</w:t>
+        <w:t xml:space="preserve">18 procedimentos · 64 orientações de sintomas · 21 guias de cuidados</w:t>
       </w:r>
     </w:p>
     <w:p>
@@ -9728,6 +9728,40 @@
     </w:p>
     <w:p>
       <w:pPr>
+        <w:pStyle w:val="ListParagraph"/>
+        <w:numPr>
+          <w:ilvl w:val="0"/>
+          <w:numId w:val="2"/>
+        </w:numPr>
+        <w:spacing w:after="60"/>
+      </w:pPr>
+      <w:r>
+        <w:rPr>
+          <w:sz w:val="21"/>
+          <w:szCs w:val="21"/>
+        </w:rPr>
+        <w:t xml:space="preserve">A causa mais comum é bem menos grave: o peito apertado pela prótese acomodando, ou a própria ansiedade do pós-operatório, que dá a mesma sensação de ar curto.</w:t>
+      </w:r>
+    </w:p>
+    <w:p>
+      <w:pPr>
+        <w:pStyle w:val="ListParagraph"/>
+        <w:numPr>
+          <w:ilvl w:val="0"/>
+          <w:numId w:val="2"/>
+        </w:numPr>
+        <w:spacing w:after="60"/>
+      </w:pPr>
+      <w:r>
+        <w:rPr>
+          <w:sz w:val="21"/>
+          <w:szCs w:val="21"/>
+        </w:rPr>
+        <w:t xml:space="preserve">Só que as duas se parecem por dentro, e o que separa uma da outra é o exame. Por isso a orientação é a mesma nos dois casos — e voltar do pronto-socorro sem nada é o desfecho esperado, não uma ida perdida.</w:t>
+      </w:r>
+    </w:p>
+    <w:p>
+      <w:pPr>
         <w:spacing w:after="80" w:before="240"/>
       </w:pPr>
       <w:r>
@@ -15154,7 +15188,7 @@
           <w:sz w:val="26"/>
           <w:szCs w:val="26"/>
         </w:rPr>
-        <w:t xml:space="preserve">ESPERADO — 31 orientações</w:t>
+        <w:t xml:space="preserve">ESPERADO — 32 orientações</w:t>
       </w:r>
     </w:p>
     <w:p>
@@ -17866,6 +17900,218 @@
           <w:szCs w:val="21"/>
         </w:rPr>
         <w:t xml:space="preserve">Não julgue o resultado antes de 3 meses</w:t>
+      </w:r>
+    </w:p>
+    <w:p>
+      <w:pPr>
+        <w:pBdr>
+          <w:bottom w:val="dotted" w:color="C8C8C8" w:sz="4" w:space="4"/>
+        </w:pBdr>
+        <w:spacing w:after="240" w:before="100"/>
+      </w:pPr>
+      <w:r>
+        <w:rPr>
+          <w:i/>
+          <w:iCs/>
+          <w:color w:val="AAAAAA"/>
+          <w:sz w:val="17"/>
+          <w:szCs w:val="17"/>
+        </w:rPr>
+        <w:t xml:space="preserve">Correção: </w:t>
+      </w:r>
+    </w:p>
+    <w:p>
+      <w:pPr>
+        <w:pStyle w:val="Heading3"/>
+        <w:spacing w:after="100" w:before="280"/>
+      </w:pPr>
+      <w:r>
+        <w:rPr>
+          <w:b/>
+          <w:bCs/>
+          <w:color w:val="067F7B"/>
+          <w:sz w:val="23"/>
+          <w:szCs w:val="23"/>
+        </w:rPr>
+        <w:t xml:space="preserve">Peito apertado e respiração curta com a prótese</w:t>
+      </w:r>
+    </w:p>
+    <w:p>
+      <w:pPr>
+        <w:spacing w:after="100"/>
+      </w:pPr>
+      <w:r>
+        <w:rPr>
+          <w:color w:val="6B6B6B"/>
+          <w:sz w:val="19"/>
+          <w:szCs w:val="19"/>
+        </w:rPr>
+        <w:t xml:space="preserve">Quando: Primeiras 2 a 4 semanas  |  Aplica-se a: apenas: Mamoplastia de aumento, Mastopexia</w:t>
+      </w:r>
+    </w:p>
+    <w:p>
+      <w:pPr>
+        <w:spacing w:after="100"/>
+      </w:pPr>
+      <w:r>
+        <w:rPr>
+          <w:b/>
+          <w:bCs/>
+          <w:sz w:val="21"/>
+          <w:szCs w:val="21"/>
+        </w:rPr>
+        <w:t xml:space="preserve">A sensação de peso e aperto no peito, que encurta a respiração, é comum nas primeiras semanas e melhora sozinha.</w:t>
+      </w:r>
+    </w:p>
+    <w:p>
+      <w:pPr>
+        <w:spacing w:after="80" w:before="240"/>
+      </w:pPr>
+      <w:r>
+        <w:rPr>
+          <w:b/>
+          <w:bCs/>
+          <w:color w:val="067F7B"/>
+          <w:spacing w:val="30"/>
+          <w:sz w:val="17"/>
+          <w:szCs w:val="17"/>
+        </w:rPr>
+        <w:t xml:space="preserve">POR QUE ACONTECE</w:t>
+      </w:r>
+    </w:p>
+    <w:p>
+      <w:pPr>
+        <w:pStyle w:val="ListParagraph"/>
+        <w:numPr>
+          <w:ilvl w:val="0"/>
+          <w:numId w:val="2"/>
+        </w:numPr>
+        <w:spacing w:after="60"/>
+      </w:pPr>
+      <w:r>
+        <w:rPr>
+          <w:sz w:val="21"/>
+          <w:szCs w:val="21"/>
+        </w:rPr>
+        <w:t xml:space="preserve">A prótese fica sob um músculo que ainda não a acomodou, e o sutiã cirúrgico soma a própria compressão.</w:t>
+      </w:r>
+    </w:p>
+    <w:p>
+      <w:pPr>
+        <w:pStyle w:val="ListParagraph"/>
+        <w:numPr>
+          <w:ilvl w:val="0"/>
+          <w:numId w:val="2"/>
+        </w:numPr>
+        <w:spacing w:after="60"/>
+      </w:pPr>
+      <w:r>
+        <w:rPr>
+          <w:sz w:val="21"/>
+          <w:szCs w:val="21"/>
+        </w:rPr>
+        <w:t xml:space="preserve">Respirar fundo puxa exatamente essa musculatura — daí a sensação de que o ar não entra todo.</w:t>
+      </w:r>
+    </w:p>
+    <w:p>
+      <w:pPr>
+        <w:pStyle w:val="ListParagraph"/>
+        <w:numPr>
+          <w:ilvl w:val="0"/>
+          <w:numId w:val="2"/>
+        </w:numPr>
+        <w:spacing w:after="60"/>
+      </w:pPr>
+      <w:r>
+        <w:rPr>
+          <w:sz w:val="21"/>
+          <w:szCs w:val="21"/>
+        </w:rPr>
+        <w:t xml:space="preserve">A ansiedade do pós-operatório fecha o círculo: sentir o peito apertado assusta, o susto encurta mais a respiração.</w:t>
+      </w:r>
+    </w:p>
+    <w:p>
+      <w:pPr>
+        <w:spacing w:after="80" w:before="240"/>
+      </w:pPr>
+      <w:r>
+        <w:rPr>
+          <w:b/>
+          <w:bCs/>
+          <w:color w:val="067F7B"/>
+          <w:spacing w:val="30"/>
+          <w:sz w:val="17"/>
+          <w:szCs w:val="17"/>
+        </w:rPr>
+        <w:t xml:space="preserve">O QUE FAZER</w:t>
+      </w:r>
+    </w:p>
+    <w:p>
+      <w:pPr>
+        <w:pStyle w:val="ListParagraph"/>
+        <w:numPr>
+          <w:ilvl w:val="0"/>
+          <w:numId w:val="2"/>
+        </w:numPr>
+        <w:spacing w:after="60"/>
+      </w:pPr>
+      <w:r>
+        <w:rPr>
+          <w:sz w:val="21"/>
+          <w:szCs w:val="21"/>
+        </w:rPr>
+        <w:t xml:space="preserve">Respire devagar, inspirando pelo nariz e soltando pela boca, algumas vezes ao dia</w:t>
+      </w:r>
+    </w:p>
+    <w:p>
+      <w:pPr>
+        <w:pStyle w:val="ListParagraph"/>
+        <w:numPr>
+          <w:ilvl w:val="0"/>
+          <w:numId w:val="2"/>
+        </w:numPr>
+        <w:spacing w:after="60"/>
+      </w:pPr>
+      <w:r>
+        <w:rPr>
+          <w:sz w:val="21"/>
+          <w:szCs w:val="21"/>
+        </w:rPr>
+        <w:t xml:space="preserve">Sente-se com as costas apoiadas e os ombros para trás — encolhida, a sensação piora</w:t>
+      </w:r>
+    </w:p>
+    <w:p>
+      <w:pPr>
+        <w:pStyle w:val="ListParagraph"/>
+        <w:numPr>
+          <w:ilvl w:val="0"/>
+          <w:numId w:val="2"/>
+        </w:numPr>
+        <w:spacing w:after="60"/>
+      </w:pPr>
+      <w:r>
+        <w:rPr>
+          <w:sz w:val="21"/>
+          <w:szCs w:val="21"/>
+        </w:rPr>
+        <w:t xml:space="preserve">Mantenha o sutiã cirúrgico, mas confirme com a equipe se ele não está apertado demais</w:t>
+      </w:r>
+    </w:p>
+    <w:p>
+      <w:pPr>
+        <w:pStyle w:val="ListParagraph"/>
+        <w:numPr>
+          <w:ilvl w:val="0"/>
+          <w:numId w:val="2"/>
+        </w:numPr>
+        <w:spacing w:after="60"/>
+      </w:pPr>
+      <w:r>
+        <w:rPr>
+          <w:sz w:val="21"/>
+          <w:szCs w:val="21"/>
+        </w:rPr>
+        <w:t xml:space="preserve">Procure atendimento de emergência se a falta de ar começar de repente, vier com dor no peito ou coração disparado, ou piorar ao andar — isso não é o aperto da prótese</w:t>
       </w:r>
     </w:p>
     <w:p>

</xml_diff>

<commit_message>
Qualifica a falta de ar e estende o aperto a toda cirurgia
O alerta disparava em qualquer falta de ar. Passa a nomear o que a paciente
consegue reconhecer sozinha em casa — súbita, persistente ou diferente do
habitual, com dor no peito, palpitação, tontura, desmaio, lábios arroxeados ou
piora progressiva. Um alerta que dispara sempre é um alerta que se aprende a
ignorar, e é o do coágulo que ela não pode aprender a ignorar.

O cartão do aperto leve deixa de ser só de prótese: a dor, a ansiedade e a
compressão da cinta, da malha ou do sutiã dão a mesma sensação depois de
qualquer cirurgia. Ele pede que a paciente avise a equipe mesmo quando melhora
ao sentar — e diz o que a faria procurar emergência.

Texto clínico do Dr. Henrique Reis.

Co-Authored-By: Claude Opus 5 <noreply@anthropic.com>
Claude-Session: https://claude.ai/code/session_01RXsuhQQ6qNiyuBJF5nJZKq
</commit_message>
<xml_diff>
--- a/docs/conteudo-clinico-para-revisao.docx
+++ b/docs/conteudo-clinico-para-revisao.docx
@@ -9673,7 +9673,7 @@
           <w:sz w:val="21"/>
           <w:szCs w:val="21"/>
         </w:rPr>
-        <w:t xml:space="preserve">Procure atendimento de emergência agora. Não espere para ver se melhora e não dirija até o hospital.</w:t>
+        <w:t xml:space="preserve">Falta de ar súbita, persistente ou diferente do habitual — principalmente com dor no peito, palpitações, tontura, desmaio, lábios arroxeados ou piora progressiva — pede atendimento de emergência agora. Não espere para ver se melhora e não dirija até o hospital.</w:t>
       </w:r>
     </w:p>
     <w:p>
@@ -9740,24 +9740,24 @@
           <w:sz w:val="21"/>
           <w:szCs w:val="21"/>
         </w:rPr>
-        <w:t xml:space="preserve">A causa mais comum é bem menos grave: o peito apertado pela prótese acomodando, ou a própria ansiedade do pós-operatório, que dá a mesma sensação de ar curto.</w:t>
-      </w:r>
-    </w:p>
-    <w:p>
-      <w:pPr>
-        <w:pStyle w:val="ListParagraph"/>
-        <w:numPr>
-          <w:ilvl w:val="0"/>
-          <w:numId w:val="2"/>
-        </w:numPr>
-        <w:spacing w:after="60"/>
-      </w:pPr>
-      <w:r>
-        <w:rPr>
-          <w:sz w:val="21"/>
-          <w:szCs w:val="21"/>
-        </w:rPr>
-        <w:t xml:space="preserve">Só que as duas se parecem por dentro, e o que separa uma da outra é o exame. Por isso a orientação é a mesma nos dois casos — e voltar do pronto-socorro sem nada é o desfecho esperado, não uma ida perdida.</w:t>
+        <w:t xml:space="preserve">Um aperto leve, que melhora ao sentar ou relaxar, costuma ser outra coisa — e tem orientação própria neste aplicativo. O que muda a conduta é a falta de ar que começa de repente, não passa ou vem acompanhada dos sinais acima.</w:t>
+      </w:r>
+    </w:p>
+    <w:p>
+      <w:pPr>
+        <w:pStyle w:val="ListParagraph"/>
+        <w:numPr>
+          <w:ilvl w:val="0"/>
+          <w:numId w:val="2"/>
+        </w:numPr>
+        <w:spacing w:after="60"/>
+      </w:pPr>
+      <w:r>
+        <w:rPr>
+          <w:sz w:val="21"/>
+          <w:szCs w:val="21"/>
+        </w:rPr>
+        <w:t xml:space="preserve">Nessa situação, quem distingue uma causa da outra é o exame. Voltar do pronto-socorro sem nada é o desfecho esperado, não uma ida perdida.</w:t>
       </w:r>
     </w:p>
     <w:p>
@@ -15204,7 +15204,7 @@
           <w:sz w:val="23"/>
           <w:szCs w:val="23"/>
         </w:rPr>
-        <w:t xml:space="preserve">Inchaço</w:t>
+        <w:t xml:space="preserve">Aperto no peito ou dificuldade de respirar fundo</w:t>
       </w:r>
     </w:p>
     <w:p>
@@ -15217,21 +15217,21 @@
           <w:sz w:val="19"/>
           <w:szCs w:val="19"/>
         </w:rPr>
-        <w:t xml:space="preserve">Quando: Pico entre o 2º e o 5º dia; melhora progressiva por meses  |  Aplica-se a: somente cirurgias</w:t>
-      </w:r>
-    </w:p>
-    <w:p>
-      <w:pPr>
-        <w:spacing w:after="100"/>
-      </w:pPr>
-      <w:r>
-        <w:rPr>
-          <w:b/>
-          <w:bCs/>
-          <w:sz w:val="21"/>
-          <w:szCs w:val="21"/>
-        </w:rPr>
-        <w:t xml:space="preserve">É a resposta natural do corpo ao trauma cirúrgico e o sintoma mais duradouro da recuperação.</w:t>
+        <w:t xml:space="preserve">Quando: Primeiras semanas  |  Aplica-se a: somente cirurgias</w:t>
+      </w:r>
+    </w:p>
+    <w:p>
+      <w:pPr>
+        <w:spacing w:after="100"/>
+      </w:pPr>
+      <w:r>
+        <w:rPr>
+          <w:b/>
+          <w:bCs/>
+          <w:sz w:val="21"/>
+          <w:szCs w:val="21"/>
+        </w:rPr>
+        <w:t xml:space="preserve">Uma sensação leve de aperto ou de não conseguir respirar fundo pode acontecer por dor, ansiedade ou pela compressão das peças pós-operatórias.</w:t>
       </w:r>
     </w:p>
     <w:p>
@@ -15264,41 +15264,58 @@
           <w:sz w:val="21"/>
           <w:szCs w:val="21"/>
         </w:rPr>
-        <w:t xml:space="preserve">O inchaço aumenta até o 3º dia, depois começa a ceder de forma lenta.</w:t>
-      </w:r>
-    </w:p>
-    <w:p>
-      <w:pPr>
-        <w:pStyle w:val="ListParagraph"/>
-        <w:numPr>
-          <w:ilvl w:val="0"/>
-          <w:numId w:val="2"/>
-        </w:numPr>
-        <w:spacing w:after="60"/>
-      </w:pPr>
-      <w:r>
-        <w:rPr>
-          <w:sz w:val="21"/>
-          <w:szCs w:val="21"/>
-        </w:rPr>
-        <w:t xml:space="preserve">Oscila durante o dia: melhor pela manhã, pior à noite e em dias quentes.</w:t>
-      </w:r>
-    </w:p>
-    <w:p>
-      <w:pPr>
-        <w:pStyle w:val="ListParagraph"/>
-        <w:numPr>
-          <w:ilvl w:val="0"/>
-          <w:numId w:val="2"/>
-        </w:numPr>
-        <w:spacing w:after="60"/>
-      </w:pPr>
-      <w:r>
-        <w:rPr>
-          <w:sz w:val="21"/>
-          <w:szCs w:val="21"/>
-        </w:rPr>
-        <w:t xml:space="preserve">Pode levar de 3 a 6 meses para desaparecer por completo.</w:t>
+        <w:t xml:space="preserve">A cinta, a malha ou o sutiã cirúrgico comprimem o tórax de propósito — e respirar fundo esbarra nessa compressão.</w:t>
+      </w:r>
+    </w:p>
+    <w:p>
+      <w:pPr>
+        <w:pStyle w:val="ListParagraph"/>
+        <w:numPr>
+          <w:ilvl w:val="0"/>
+          <w:numId w:val="2"/>
+        </w:numPr>
+        <w:spacing w:after="60"/>
+      </w:pPr>
+      <w:r>
+        <w:rPr>
+          <w:sz w:val="21"/>
+          <w:szCs w:val="21"/>
+        </w:rPr>
+        <w:t xml:space="preserve">A dor faz a respiração ficar curta por reflexo, para não puxar a área operada.</w:t>
+      </w:r>
+    </w:p>
+    <w:p>
+      <w:pPr>
+        <w:pStyle w:val="ListParagraph"/>
+        <w:numPr>
+          <w:ilvl w:val="0"/>
+          <w:numId w:val="2"/>
+        </w:numPr>
+        <w:spacing w:after="60"/>
+      </w:pPr>
+      <w:r>
+        <w:rPr>
+          <w:sz w:val="21"/>
+          <w:szCs w:val="21"/>
+        </w:rPr>
+        <w:t xml:space="preserve">A ansiedade do pós-operatório fecha o círculo: sentir o peito apertado assusta, e o susto encurta mais a respiração.</w:t>
+      </w:r>
+    </w:p>
+    <w:p>
+      <w:pPr>
+        <w:pStyle w:val="ListParagraph"/>
+        <w:numPr>
+          <w:ilvl w:val="0"/>
+          <w:numId w:val="2"/>
+        </w:numPr>
+        <w:spacing w:after="60"/>
+      </w:pPr>
+      <w:r>
+        <w:rPr>
+          <w:sz w:val="21"/>
+          <w:szCs w:val="21"/>
+        </w:rPr>
+        <w:t xml:space="preserve">Depois de prótese de mama há ainda o músculo que a acomoda, e que nas primeiras semanas ainda está contraído.</w:t>
       </w:r>
     </w:p>
     <w:p>
@@ -15331,58 +15348,58 @@
           <w:sz w:val="21"/>
           <w:szCs w:val="21"/>
         </w:rPr>
-        <w:t xml:space="preserve">Mantenha a compressão conforme orientado</w:t>
-      </w:r>
-    </w:p>
-    <w:p>
-      <w:pPr>
-        <w:pStyle w:val="ListParagraph"/>
-        <w:numPr>
-          <w:ilvl w:val="0"/>
-          <w:numId w:val="2"/>
-        </w:numPr>
-        <w:spacing w:after="60"/>
-      </w:pPr>
-      <w:r>
-        <w:rPr>
-          <w:sz w:val="21"/>
-          <w:szCs w:val="21"/>
-        </w:rPr>
-        <w:t xml:space="preserve">Faça a drenagem linfática na frequência indicada</w:t>
-      </w:r>
-    </w:p>
-    <w:p>
-      <w:pPr>
-        <w:pStyle w:val="ListParagraph"/>
-        <w:numPr>
-          <w:ilvl w:val="0"/>
-          <w:numId w:val="2"/>
-        </w:numPr>
-        <w:spacing w:after="60"/>
-      </w:pPr>
-      <w:r>
-        <w:rPr>
-          <w:sz w:val="21"/>
-          <w:szCs w:val="21"/>
-        </w:rPr>
-        <w:t xml:space="preserve">Reduza o sal e mantenha boa hidratação</w:t>
-      </w:r>
-    </w:p>
-    <w:p>
-      <w:pPr>
-        <w:pStyle w:val="ListParagraph"/>
-        <w:numPr>
-          <w:ilvl w:val="0"/>
-          <w:numId w:val="2"/>
-        </w:numPr>
-        <w:spacing w:after="60"/>
-      </w:pPr>
-      <w:r>
-        <w:rPr>
-          <w:sz w:val="21"/>
-          <w:szCs w:val="21"/>
-        </w:rPr>
-        <w:t xml:space="preserve">Descanse com a área operada elevada quando possível</w:t>
+        <w:t xml:space="preserve">Sente-se com as costas apoiadas e os ombros para trás, e respire devagar — inspirando pelo nariz, soltando pela boca</w:t>
+      </w:r>
+    </w:p>
+    <w:p>
+      <w:pPr>
+        <w:pStyle w:val="ListParagraph"/>
+        <w:numPr>
+          <w:ilvl w:val="0"/>
+          <w:numId w:val="2"/>
+        </w:numPr>
+        <w:spacing w:after="60"/>
+      </w:pPr>
+      <w:r>
+        <w:rPr>
+          <w:sz w:val="21"/>
+          <w:szCs w:val="21"/>
+        </w:rPr>
+        <w:t xml:space="preserve">Afrouxe a cinta ou o sutiã apenas dentro do que a equipe orientou</w:t>
+      </w:r>
+    </w:p>
+    <w:p>
+      <w:pPr>
+        <w:pStyle w:val="ListParagraph"/>
+        <w:numPr>
+          <w:ilvl w:val="0"/>
+          <w:numId w:val="2"/>
+        </w:numPr>
+        <w:spacing w:after="60"/>
+      </w:pPr>
+      <w:r>
+        <w:rPr>
+          <w:sz w:val="21"/>
+          <w:szCs w:val="21"/>
+        </w:rPr>
+        <w:t xml:space="preserve">Se melhorar ao sentar, relaxar ou afrouxar, avise a nossa equipe mesmo assim, para avaliação</w:t>
+      </w:r>
+    </w:p>
+    <w:p>
+      <w:pPr>
+        <w:pStyle w:val="ListParagraph"/>
+        <w:numPr>
+          <w:ilvl w:val="0"/>
+          <w:numId w:val="2"/>
+        </w:numPr>
+        <w:spacing w:after="60"/>
+      </w:pPr>
+      <w:r>
+        <w:rPr>
+          <w:sz w:val="21"/>
+          <w:szCs w:val="21"/>
+        </w:rPr>
+        <w:t xml:space="preserve">Se não melhorar rápido, se estiver piorando, ou se vier com dor no peito, palpitação, tontura ou lábios arroxeados, procure atendimento de emergência</w:t>
       </w:r>
     </w:p>
     <w:p>
@@ -15416,7 +15433,7 @@
           <w:sz w:val="23"/>
           <w:szCs w:val="23"/>
         </w:rPr>
-        <w:t xml:space="preserve">Roxos e manchas amareladas</w:t>
+        <w:t xml:space="preserve">Inchaço</w:t>
       </w:r>
     </w:p>
     <w:p>
@@ -15429,21 +15446,21 @@
           <w:sz w:val="19"/>
           <w:szCs w:val="19"/>
         </w:rPr>
-        <w:t xml:space="preserve">Quando: Do 2º ao 21º dia  |  Aplica-se a: somente cirurgias</w:t>
-      </w:r>
-    </w:p>
-    <w:p>
-      <w:pPr>
-        <w:spacing w:after="100"/>
-      </w:pPr>
-      <w:r>
-        <w:rPr>
-          <w:b/>
-          <w:bCs/>
-          <w:sz w:val="21"/>
-          <w:szCs w:val="21"/>
-        </w:rPr>
-        <w:t xml:space="preserve">As equimoses escurecem antes de clarear, passando por roxo, verde e amarelo até sumir.</w:t>
+        <w:t xml:space="preserve">Quando: Pico entre o 2º e o 5º dia; melhora progressiva por meses  |  Aplica-se a: somente cirurgias</w:t>
+      </w:r>
+    </w:p>
+    <w:p>
+      <w:pPr>
+        <w:spacing w:after="100"/>
+      </w:pPr>
+      <w:r>
+        <w:rPr>
+          <w:b/>
+          <w:bCs/>
+          <w:sz w:val="21"/>
+          <w:szCs w:val="21"/>
+        </w:rPr>
+        <w:t xml:space="preserve">É a resposta natural do corpo ao trauma cirúrgico e o sintoma mais duradouro da recuperação.</w:t>
       </w:r>
     </w:p>
     <w:p>
@@ -15476,24 +15493,41 @@
           <w:sz w:val="21"/>
           <w:szCs w:val="21"/>
         </w:rPr>
-        <w:t xml:space="preserve">É sangue que se espalhou pelos tecidos e está sendo reabsorvido pelo corpo.</w:t>
-      </w:r>
-    </w:p>
-    <w:p>
-      <w:pPr>
-        <w:pStyle w:val="ListParagraph"/>
-        <w:numPr>
-          <w:ilvl w:val="0"/>
-          <w:numId w:val="2"/>
-        </w:numPr>
-        <w:spacing w:after="60"/>
-      </w:pPr>
-      <w:r>
-        <w:rPr>
-          <w:sz w:val="21"/>
-          <w:szCs w:val="21"/>
-        </w:rPr>
-        <w:t xml:space="preserve">Podem migrar para baixo por efeito da gravidade — roxos que "descem" são esperados.</w:t>
+        <w:t xml:space="preserve">O inchaço aumenta até o 3º dia, depois começa a ceder de forma lenta.</w:t>
+      </w:r>
+    </w:p>
+    <w:p>
+      <w:pPr>
+        <w:pStyle w:val="ListParagraph"/>
+        <w:numPr>
+          <w:ilvl w:val="0"/>
+          <w:numId w:val="2"/>
+        </w:numPr>
+        <w:spacing w:after="60"/>
+      </w:pPr>
+      <w:r>
+        <w:rPr>
+          <w:sz w:val="21"/>
+          <w:szCs w:val="21"/>
+        </w:rPr>
+        <w:t xml:space="preserve">Oscila durante o dia: melhor pela manhã, pior à noite e em dias quentes.</w:t>
+      </w:r>
+    </w:p>
+    <w:p>
+      <w:pPr>
+        <w:pStyle w:val="ListParagraph"/>
+        <w:numPr>
+          <w:ilvl w:val="0"/>
+          <w:numId w:val="2"/>
+        </w:numPr>
+        <w:spacing w:after="60"/>
+      </w:pPr>
+      <w:r>
+        <w:rPr>
+          <w:sz w:val="21"/>
+          <w:szCs w:val="21"/>
+        </w:rPr>
+        <w:t xml:space="preserve">Pode levar de 3 a 6 meses para desaparecer por completo.</w:t>
       </w:r>
     </w:p>
     <w:p>
@@ -15526,41 +15560,58 @@
           <w:sz w:val="21"/>
           <w:szCs w:val="21"/>
         </w:rPr>
-        <w:t xml:space="preserve">Nenhuma medida especial é necessária</w:t>
-      </w:r>
-    </w:p>
-    <w:p>
-      <w:pPr>
-        <w:pStyle w:val="ListParagraph"/>
-        <w:numPr>
-          <w:ilvl w:val="0"/>
-          <w:numId w:val="2"/>
-        </w:numPr>
-        <w:spacing w:after="60"/>
-      </w:pPr>
-      <w:r>
-        <w:rPr>
-          <w:sz w:val="21"/>
-          <w:szCs w:val="21"/>
-        </w:rPr>
-        <w:t xml:space="preserve">Evite anti-inflamatórios por conta própria</w:t>
-      </w:r>
-    </w:p>
-    <w:p>
-      <w:pPr>
-        <w:pStyle w:val="ListParagraph"/>
-        <w:numPr>
-          <w:ilvl w:val="0"/>
-          <w:numId w:val="2"/>
-        </w:numPr>
-        <w:spacing w:after="60"/>
-      </w:pPr>
-      <w:r>
-        <w:rPr>
-          <w:sz w:val="21"/>
-          <w:szCs w:val="21"/>
-        </w:rPr>
-        <w:t xml:space="preserve">Comunique se aparecerem roxos novos após a 3ª semana</w:t>
+        <w:t xml:space="preserve">Mantenha a compressão conforme orientado</w:t>
+      </w:r>
+    </w:p>
+    <w:p>
+      <w:pPr>
+        <w:pStyle w:val="ListParagraph"/>
+        <w:numPr>
+          <w:ilvl w:val="0"/>
+          <w:numId w:val="2"/>
+        </w:numPr>
+        <w:spacing w:after="60"/>
+      </w:pPr>
+      <w:r>
+        <w:rPr>
+          <w:sz w:val="21"/>
+          <w:szCs w:val="21"/>
+        </w:rPr>
+        <w:t xml:space="preserve">Faça a drenagem linfática na frequência indicada</w:t>
+      </w:r>
+    </w:p>
+    <w:p>
+      <w:pPr>
+        <w:pStyle w:val="ListParagraph"/>
+        <w:numPr>
+          <w:ilvl w:val="0"/>
+          <w:numId w:val="2"/>
+        </w:numPr>
+        <w:spacing w:after="60"/>
+      </w:pPr>
+      <w:r>
+        <w:rPr>
+          <w:sz w:val="21"/>
+          <w:szCs w:val="21"/>
+        </w:rPr>
+        <w:t xml:space="preserve">Reduza o sal e mantenha boa hidratação</w:t>
+      </w:r>
+    </w:p>
+    <w:p>
+      <w:pPr>
+        <w:pStyle w:val="ListParagraph"/>
+        <w:numPr>
+          <w:ilvl w:val="0"/>
+          <w:numId w:val="2"/>
+        </w:numPr>
+        <w:spacing w:after="60"/>
+      </w:pPr>
+      <w:r>
+        <w:rPr>
+          <w:sz w:val="21"/>
+          <w:szCs w:val="21"/>
+        </w:rPr>
+        <w:t xml:space="preserve">Descanse com a área operada elevada quando possível</w:t>
       </w:r>
     </w:p>
     <w:p>
@@ -15594,7 +15645,7 @@
           <w:sz w:val="23"/>
           <w:szCs w:val="23"/>
         </w:rPr>
-        <w:t xml:space="preserve">Dormência na área operada</w:t>
+        <w:t xml:space="preserve">Roxos e manchas amareladas</w:t>
       </w:r>
     </w:p>
     <w:p>
@@ -15607,21 +15658,21 @@
           <w:sz w:val="19"/>
           <w:szCs w:val="19"/>
         </w:rPr>
-        <w:t xml:space="preserve">Quando: Desde o 1º dia, até 6 a 12 meses  |  Aplica-se a: somente cirurgias</w:t>
-      </w:r>
-    </w:p>
-    <w:p>
-      <w:pPr>
-        <w:spacing w:after="100"/>
-      </w:pPr>
-      <w:r>
-        <w:rPr>
-          <w:b/>
-          <w:bCs/>
-          <w:sz w:val="21"/>
-          <w:szCs w:val="21"/>
-        </w:rPr>
-        <w:t xml:space="preserve">Perda de sensibilidade ao redor das cicatrizes é esperada e recupera aos poucos.</w:t>
+        <w:t xml:space="preserve">Quando: Do 2º ao 21º dia  |  Aplica-se a: somente cirurgias</w:t>
+      </w:r>
+    </w:p>
+    <w:p>
+      <w:pPr>
+        <w:spacing w:after="100"/>
+      </w:pPr>
+      <w:r>
+        <w:rPr>
+          <w:b/>
+          <w:bCs/>
+          <w:sz w:val="21"/>
+          <w:szCs w:val="21"/>
+        </w:rPr>
+        <w:t xml:space="preserve">As equimoses escurecem antes de clarear, passando por roxo, verde e amarelo até sumir.</w:t>
       </w:r>
     </w:p>
     <w:p>
@@ -15654,24 +15705,24 @@
           <w:sz w:val="21"/>
           <w:szCs w:val="21"/>
         </w:rPr>
-        <w:t xml:space="preserve">Pequenos nervos da pele são atravessados durante a cirurgia e se regeneram lentamente.</w:t>
-      </w:r>
-    </w:p>
-    <w:p>
-      <w:pPr>
-        <w:pStyle w:val="ListParagraph"/>
-        <w:numPr>
-          <w:ilvl w:val="0"/>
-          <w:numId w:val="2"/>
-        </w:numPr>
-        <w:spacing w:after="60"/>
-      </w:pPr>
-      <w:r>
-        <w:rPr>
-          <w:sz w:val="21"/>
-          <w:szCs w:val="21"/>
-        </w:rPr>
-        <w:t xml:space="preserve">A volta da sensibilidade vem acompanhada de formigamento e fisgadas — é um bom sinal.</w:t>
+        <w:t xml:space="preserve">É sangue que se espalhou pelos tecidos e está sendo reabsorvido pelo corpo.</w:t>
+      </w:r>
+    </w:p>
+    <w:p>
+      <w:pPr>
+        <w:pStyle w:val="ListParagraph"/>
+        <w:numPr>
+          <w:ilvl w:val="0"/>
+          <w:numId w:val="2"/>
+        </w:numPr>
+        <w:spacing w:after="60"/>
+      </w:pPr>
+      <w:r>
+        <w:rPr>
+          <w:sz w:val="21"/>
+          <w:szCs w:val="21"/>
+        </w:rPr>
+        <w:t xml:space="preserve">Podem migrar para baixo por efeito da gravidade — roxos que "descem" são esperados.</w:t>
       </w:r>
     </w:p>
     <w:p>
@@ -15704,24 +15755,41 @@
           <w:sz w:val="21"/>
           <w:szCs w:val="21"/>
         </w:rPr>
-        <w:t xml:space="preserve">Tenha atenção redobrada com bolsa quente ou fria: a pele dormente queima sem avisar</w:t>
-      </w:r>
-    </w:p>
-    <w:p>
-      <w:pPr>
-        <w:pStyle w:val="ListParagraph"/>
-        <w:numPr>
-          <w:ilvl w:val="0"/>
-          <w:numId w:val="2"/>
-        </w:numPr>
-        <w:spacing w:after="60"/>
-      </w:pPr>
-      <w:r>
-        <w:rPr>
-          <w:sz w:val="21"/>
-          <w:szCs w:val="21"/>
-        </w:rPr>
-        <w:t xml:space="preserve">Aguarde a recuperação natural, que pode levar até um ano</w:t>
+        <w:t xml:space="preserve">Nenhuma medida especial é necessária</w:t>
+      </w:r>
+    </w:p>
+    <w:p>
+      <w:pPr>
+        <w:pStyle w:val="ListParagraph"/>
+        <w:numPr>
+          <w:ilvl w:val="0"/>
+          <w:numId w:val="2"/>
+        </w:numPr>
+        <w:spacing w:after="60"/>
+      </w:pPr>
+      <w:r>
+        <w:rPr>
+          <w:sz w:val="21"/>
+          <w:szCs w:val="21"/>
+        </w:rPr>
+        <w:t xml:space="preserve">Evite anti-inflamatórios por conta própria</w:t>
+      </w:r>
+    </w:p>
+    <w:p>
+      <w:pPr>
+        <w:pStyle w:val="ListParagraph"/>
+        <w:numPr>
+          <w:ilvl w:val="0"/>
+          <w:numId w:val="2"/>
+        </w:numPr>
+        <w:spacing w:after="60"/>
+      </w:pPr>
+      <w:r>
+        <w:rPr>
+          <w:sz w:val="21"/>
+          <w:szCs w:val="21"/>
+        </w:rPr>
+        <w:t xml:space="preserve">Comunique se aparecerem roxos novos após a 3ª semana</w:t>
       </w:r>
     </w:p>
     <w:p>
@@ -15755,7 +15823,7 @@
           <w:sz w:val="23"/>
           <w:szCs w:val="23"/>
         </w:rPr>
-        <w:t xml:space="preserve">Fisgadas, choques e agulhadas</w:t>
+        <w:t xml:space="preserve">Dormência na área operada</w:t>
       </w:r>
     </w:p>
     <w:p>
@@ -15768,21 +15836,21 @@
           <w:sz w:val="19"/>
           <w:szCs w:val="19"/>
         </w:rPr>
-        <w:t xml:space="preserve">Quando: Da 2ª semana ao 6º mês  |  Aplica-se a: somente cirurgias</w:t>
-      </w:r>
-    </w:p>
-    <w:p>
-      <w:pPr>
-        <w:spacing w:after="100"/>
-      </w:pPr>
-      <w:r>
-        <w:rPr>
-          <w:b/>
-          <w:bCs/>
-          <w:sz w:val="21"/>
-          <w:szCs w:val="21"/>
-        </w:rPr>
-        <w:t xml:space="preserve">São sinais da regeneração dos nervos. Costumam ser rápidas e passageiras.</w:t>
+        <w:t xml:space="preserve">Quando: Desde o 1º dia, até 6 a 12 meses  |  Aplica-se a: somente cirurgias</w:t>
+      </w:r>
+    </w:p>
+    <w:p>
+      <w:pPr>
+        <w:spacing w:after="100"/>
+      </w:pPr>
+      <w:r>
+        <w:rPr>
+          <w:b/>
+          <w:bCs/>
+          <w:sz w:val="21"/>
+          <w:szCs w:val="21"/>
+        </w:rPr>
+        <w:t xml:space="preserve">Perda de sensibilidade ao redor das cicatrizes é esperada e recupera aos poucos.</w:t>
       </w:r>
     </w:p>
     <w:p>
@@ -15815,24 +15883,24 @@
           <w:sz w:val="21"/>
           <w:szCs w:val="21"/>
         </w:rPr>
-        <w:t xml:space="preserve">Os nervos em recuperação disparam sensações momentâneas.</w:t>
-      </w:r>
-    </w:p>
-    <w:p>
-      <w:pPr>
-        <w:pStyle w:val="ListParagraph"/>
-        <w:numPr>
-          <w:ilvl w:val="0"/>
-          <w:numId w:val="2"/>
-        </w:numPr>
-        <w:spacing w:after="60"/>
-      </w:pPr>
-      <w:r>
-        <w:rPr>
-          <w:sz w:val="21"/>
-          <w:szCs w:val="21"/>
-        </w:rPr>
-        <w:t xml:space="preserve">Tendem a ficar mais frequentes por algumas semanas e depois diminuem.</w:t>
+        <w:t xml:space="preserve">Pequenos nervos da pele são atravessados durante a cirurgia e se regeneram lentamente.</w:t>
+      </w:r>
+    </w:p>
+    <w:p>
+      <w:pPr>
+        <w:pStyle w:val="ListParagraph"/>
+        <w:numPr>
+          <w:ilvl w:val="0"/>
+          <w:numId w:val="2"/>
+        </w:numPr>
+        <w:spacing w:after="60"/>
+      </w:pPr>
+      <w:r>
+        <w:rPr>
+          <w:sz w:val="21"/>
+          <w:szCs w:val="21"/>
+        </w:rPr>
+        <w:t xml:space="preserve">A volta da sensibilidade vem acompanhada de formigamento e fisgadas — é um bom sinal.</w:t>
       </w:r>
     </w:p>
     <w:p>
@@ -15865,24 +15933,24 @@
           <w:sz w:val="21"/>
           <w:szCs w:val="21"/>
         </w:rPr>
-        <w:t xml:space="preserve">Nenhuma medida específica é necessária</w:t>
-      </w:r>
-    </w:p>
-    <w:p>
-      <w:pPr>
-        <w:pStyle w:val="ListParagraph"/>
-        <w:numPr>
-          <w:ilvl w:val="0"/>
-          <w:numId w:val="2"/>
-        </w:numPr>
-        <w:spacing w:after="60"/>
-      </w:pPr>
-      <w:r>
-        <w:rPr>
-          <w:sz w:val="21"/>
-          <w:szCs w:val="21"/>
-        </w:rPr>
-        <w:t xml:space="preserve">Se forem intensas e constantes, comente no retorno</w:t>
+        <w:t xml:space="preserve">Tenha atenção redobrada com bolsa quente ou fria: a pele dormente queima sem avisar</w:t>
+      </w:r>
+    </w:p>
+    <w:p>
+      <w:pPr>
+        <w:pStyle w:val="ListParagraph"/>
+        <w:numPr>
+          <w:ilvl w:val="0"/>
+          <w:numId w:val="2"/>
+        </w:numPr>
+        <w:spacing w:after="60"/>
+      </w:pPr>
+      <w:r>
+        <w:rPr>
+          <w:sz w:val="21"/>
+          <w:szCs w:val="21"/>
+        </w:rPr>
+        <w:t xml:space="preserve">Aguarde a recuperação natural, que pode levar até um ano</w:t>
       </w:r>
     </w:p>
     <w:p>
@@ -15916,7 +15984,7 @@
           <w:sz w:val="23"/>
           <w:szCs w:val="23"/>
         </w:rPr>
-        <w:t xml:space="preserve">A área enxertada parece ter perdido volume</w:t>
+        <w:t xml:space="preserve">Fisgadas, choques e agulhadas</w:t>
       </w:r>
     </w:p>
     <w:p>
@@ -15929,21 +15997,21 @@
           <w:sz w:val="19"/>
           <w:szCs w:val="19"/>
         </w:rPr>
-        <w:t xml:space="preserve">Quando: Do 1º ao 6º mês  |  Aplica-se a: somente cirurgias · apenas: Lipo HD Concept, Lipoescultura, Face HD Concept</w:t>
-      </w:r>
-    </w:p>
-    <w:p>
-      <w:pPr>
-        <w:spacing w:after="100"/>
-      </w:pPr>
-      <w:r>
-        <w:rPr>
-          <w:b/>
-          <w:bCs/>
-          <w:sz w:val="21"/>
-          <w:szCs w:val="21"/>
-        </w:rPr>
-        <w:t xml:space="preserve">Parte da gordura enxertada é naturalmente reabsorvida pelo organismo nos primeiros meses. Isso é esperado e já entra no planejamento da cirurgia.</w:t>
+        <w:t xml:space="preserve">Quando: Da 2ª semana ao 6º mês  |  Aplica-se a: somente cirurgias</w:t>
+      </w:r>
+    </w:p>
+    <w:p>
+      <w:pPr>
+        <w:spacing w:after="100"/>
+      </w:pPr>
+      <w:r>
+        <w:rPr>
+          <w:b/>
+          <w:bCs/>
+          <w:sz w:val="21"/>
+          <w:szCs w:val="21"/>
+        </w:rPr>
+        <w:t xml:space="preserve">São sinais da regeneração dos nervos. Costumam ser rápidas e passageiras.</w:t>
       </w:r>
     </w:p>
     <w:p>
@@ -15976,41 +16044,24 @@
           <w:sz w:val="21"/>
           <w:szCs w:val="21"/>
         </w:rPr>
-        <w:t xml:space="preserve">Nem toda a gordura transferida se integra: o corpo reabsorve uma parte ao longo das primeiras semanas.</w:t>
-      </w:r>
-    </w:p>
-    <w:p>
-      <w:pPr>
-        <w:pStyle w:val="ListParagraph"/>
-        <w:numPr>
-          <w:ilvl w:val="0"/>
-          <w:numId w:val="2"/>
-        </w:numPr>
-        <w:spacing w:after="60"/>
-      </w:pPr>
-      <w:r>
-        <w:rPr>
-          <w:sz w:val="21"/>
-          <w:szCs w:val="21"/>
-        </w:rPr>
-        <w:t xml:space="preserve">O volume que permanece depois desse período tende a se manter.</w:t>
-      </w:r>
-    </w:p>
-    <w:p>
-      <w:pPr>
-        <w:pStyle w:val="ListParagraph"/>
-        <w:numPr>
-          <w:ilvl w:val="0"/>
-          <w:numId w:val="2"/>
-        </w:numPr>
-        <w:spacing w:after="60"/>
-      </w:pPr>
-      <w:r>
-        <w:rPr>
-          <w:sz w:val="21"/>
-          <w:szCs w:val="21"/>
-        </w:rPr>
-        <w:t xml:space="preserve">O inchaço inicial também dá a impressão de um volume maior do que o que vai ficar.</w:t>
+        <w:t xml:space="preserve">Os nervos em recuperação disparam sensações momentâneas.</w:t>
+      </w:r>
+    </w:p>
+    <w:p>
+      <w:pPr>
+        <w:pStyle w:val="ListParagraph"/>
+        <w:numPr>
+          <w:ilvl w:val="0"/>
+          <w:numId w:val="2"/>
+        </w:numPr>
+        <w:spacing w:after="60"/>
+      </w:pPr>
+      <w:r>
+        <w:rPr>
+          <w:sz w:val="21"/>
+          <w:szCs w:val="21"/>
+        </w:rPr>
+        <w:t xml:space="preserve">Tendem a ficar mais frequentes por algumas semanas e depois diminuem.</w:t>
       </w:r>
     </w:p>
     <w:p>
@@ -16043,58 +16094,24 @@
           <w:sz w:val="21"/>
           <w:szCs w:val="21"/>
         </w:rPr>
-        <w:t xml:space="preserve">Evite pressão sobre a área enxertada nas primeiras semanas</w:t>
-      </w:r>
-    </w:p>
-    <w:p>
-      <w:pPr>
-        <w:pStyle w:val="ListParagraph"/>
-        <w:numPr>
-          <w:ilvl w:val="0"/>
-          <w:numId w:val="2"/>
-        </w:numPr>
-        <w:spacing w:after="60"/>
-      </w:pPr>
-      <w:r>
-        <w:rPr>
-          <w:sz w:val="21"/>
-          <w:szCs w:val="21"/>
-        </w:rPr>
-        <w:t xml:space="preserve">Siga as orientações de posição para dormir e para sentar</w:t>
-      </w:r>
-    </w:p>
-    <w:p>
-      <w:pPr>
-        <w:pStyle w:val="ListParagraph"/>
-        <w:numPr>
-          <w:ilvl w:val="0"/>
-          <w:numId w:val="2"/>
-        </w:numPr>
-        <w:spacing w:after="60"/>
-      </w:pPr>
-      <w:r>
-        <w:rPr>
-          <w:sz w:val="21"/>
-          <w:szCs w:val="21"/>
-        </w:rPr>
-        <w:t xml:space="preserve">Não massageie a região enxertada sem orientação da equipe</w:t>
-      </w:r>
-    </w:p>
-    <w:p>
-      <w:pPr>
-        <w:pStyle w:val="ListParagraph"/>
-        <w:numPr>
-          <w:ilvl w:val="0"/>
-          <w:numId w:val="2"/>
-        </w:numPr>
-        <w:spacing w:after="60"/>
-      </w:pPr>
-      <w:r>
-        <w:rPr>
-          <w:sz w:val="21"/>
-          <w:szCs w:val="21"/>
-        </w:rPr>
-        <w:t xml:space="preserve">Avalie o resultado do enxerto entre 3 e 6 meses, no retorno</w:t>
+        <w:t xml:space="preserve">Nenhuma medida específica é necessária</w:t>
+      </w:r>
+    </w:p>
+    <w:p>
+      <w:pPr>
+        <w:pStyle w:val="ListParagraph"/>
+        <w:numPr>
+          <w:ilvl w:val="0"/>
+          <w:numId w:val="2"/>
+        </w:numPr>
+        <w:spacing w:after="60"/>
+      </w:pPr>
+      <w:r>
+        <w:rPr>
+          <w:sz w:val="21"/>
+          <w:szCs w:val="21"/>
+        </w:rPr>
+        <w:t xml:space="preserve">Se forem intensas e constantes, comente no retorno</w:t>
       </w:r>
     </w:p>
     <w:p>
@@ -16128,7 +16145,7 @@
           <w:sz w:val="23"/>
           <w:szCs w:val="23"/>
         </w:rPr>
-        <w:t xml:space="preserve">Endurecimento e nódulos sob a pele</w:t>
+        <w:t xml:space="preserve">A área enxertada parece ter perdido volume</w:t>
       </w:r>
     </w:p>
     <w:p>
@@ -16141,21 +16158,21 @@
           <w:sz w:val="19"/>
           <w:szCs w:val="19"/>
         </w:rPr>
-        <w:t xml:space="preserve">Quando: Da 3ª semana ao 3º mês  |  Aplica-se a: somente cirurgias</w:t>
-      </w:r>
-    </w:p>
-    <w:p>
-      <w:pPr>
-        <w:spacing w:after="100"/>
-      </w:pPr>
-      <w:r>
-        <w:rPr>
-          <w:b/>
-          <w:bCs/>
-          <w:sz w:val="21"/>
-          <w:szCs w:val="21"/>
-        </w:rPr>
-        <w:t xml:space="preserve">Áreas endurecidas, irregulares ou com pequenos caroços fazem parte da fase de fibrose e amolecem com o tempo.</w:t>
+        <w:t xml:space="preserve">Quando: Do 1º ao 6º mês  |  Aplica-se a: somente cirurgias · apenas: Lipo HD Concept, Lipoescultura, Face HD Concept</w:t>
+      </w:r>
+    </w:p>
+    <w:p>
+      <w:pPr>
+        <w:spacing w:after="100"/>
+      </w:pPr>
+      <w:r>
+        <w:rPr>
+          <w:b/>
+          <w:bCs/>
+          <w:sz w:val="21"/>
+          <w:szCs w:val="21"/>
+        </w:rPr>
+        <w:t xml:space="preserve">Parte da gordura enxertada é naturalmente reabsorvida pelo organismo nos primeiros meses. Isso é esperado e já entra no planejamento da cirurgia.</w:t>
       </w:r>
     </w:p>
     <w:p>
@@ -16188,24 +16205,41 @@
           <w:sz w:val="21"/>
           <w:szCs w:val="21"/>
         </w:rPr>
-        <w:t xml:space="preserve">O organismo forma tecido de reparo, que é firme no início e depois amolece.</w:t>
-      </w:r>
-    </w:p>
-    <w:p>
-      <w:pPr>
-        <w:pStyle w:val="ListParagraph"/>
-        <w:numPr>
-          <w:ilvl w:val="0"/>
-          <w:numId w:val="2"/>
-        </w:numPr>
-        <w:spacing w:after="60"/>
-      </w:pPr>
-      <w:r>
-        <w:rPr>
-          <w:sz w:val="21"/>
-          <w:szCs w:val="21"/>
-        </w:rPr>
-        <w:t xml:space="preserve">É especialmente comum após lipoaspiração.</w:t>
+        <w:t xml:space="preserve">Nem toda a gordura transferida se integra: o corpo reabsorve uma parte ao longo das primeiras semanas.</w:t>
+      </w:r>
+    </w:p>
+    <w:p>
+      <w:pPr>
+        <w:pStyle w:val="ListParagraph"/>
+        <w:numPr>
+          <w:ilvl w:val="0"/>
+          <w:numId w:val="2"/>
+        </w:numPr>
+        <w:spacing w:after="60"/>
+      </w:pPr>
+      <w:r>
+        <w:rPr>
+          <w:sz w:val="21"/>
+          <w:szCs w:val="21"/>
+        </w:rPr>
+        <w:t xml:space="preserve">O volume que permanece depois desse período tende a se manter.</w:t>
+      </w:r>
+    </w:p>
+    <w:p>
+      <w:pPr>
+        <w:pStyle w:val="ListParagraph"/>
+        <w:numPr>
+          <w:ilvl w:val="0"/>
+          <w:numId w:val="2"/>
+        </w:numPr>
+        <w:spacing w:after="60"/>
+      </w:pPr>
+      <w:r>
+        <w:rPr>
+          <w:sz w:val="21"/>
+          <w:szCs w:val="21"/>
+        </w:rPr>
+        <w:t xml:space="preserve">O inchaço inicial também dá a impressão de um volume maior do que o que vai ficar.</w:t>
       </w:r>
     </w:p>
     <w:p>
@@ -16238,41 +16272,58 @@
           <w:sz w:val="21"/>
           <w:szCs w:val="21"/>
         </w:rPr>
-        <w:t xml:space="preserve">Mantenha a drenagem linfática e a compressão</w:t>
-      </w:r>
-    </w:p>
-    <w:p>
-      <w:pPr>
-        <w:pStyle w:val="ListParagraph"/>
-        <w:numPr>
-          <w:ilvl w:val="0"/>
-          <w:numId w:val="2"/>
-        </w:numPr>
-        <w:spacing w:after="60"/>
-      </w:pPr>
-      <w:r>
-        <w:rPr>
-          <w:sz w:val="21"/>
-          <w:szCs w:val="21"/>
-        </w:rPr>
-        <w:t xml:space="preserve">Não massageie com força por conta própria</w:t>
-      </w:r>
-    </w:p>
-    <w:p>
-      <w:pPr>
-        <w:pStyle w:val="ListParagraph"/>
-        <w:numPr>
-          <w:ilvl w:val="0"/>
-          <w:numId w:val="2"/>
-        </w:numPr>
-        <w:spacing w:after="60"/>
-      </w:pPr>
-      <w:r>
-        <w:rPr>
-          <w:sz w:val="21"/>
-          <w:szCs w:val="21"/>
-        </w:rPr>
-        <w:t xml:space="preserve">Comente no retorno se um endurecimento crescer ou doer muito</w:t>
+        <w:t xml:space="preserve">Evite pressão sobre a área enxertada nas primeiras semanas</w:t>
+      </w:r>
+    </w:p>
+    <w:p>
+      <w:pPr>
+        <w:pStyle w:val="ListParagraph"/>
+        <w:numPr>
+          <w:ilvl w:val="0"/>
+          <w:numId w:val="2"/>
+        </w:numPr>
+        <w:spacing w:after="60"/>
+      </w:pPr>
+      <w:r>
+        <w:rPr>
+          <w:sz w:val="21"/>
+          <w:szCs w:val="21"/>
+        </w:rPr>
+        <w:t xml:space="preserve">Siga as orientações de posição para dormir e para sentar</w:t>
+      </w:r>
+    </w:p>
+    <w:p>
+      <w:pPr>
+        <w:pStyle w:val="ListParagraph"/>
+        <w:numPr>
+          <w:ilvl w:val="0"/>
+          <w:numId w:val="2"/>
+        </w:numPr>
+        <w:spacing w:after="60"/>
+      </w:pPr>
+      <w:r>
+        <w:rPr>
+          <w:sz w:val="21"/>
+          <w:szCs w:val="21"/>
+        </w:rPr>
+        <w:t xml:space="preserve">Não massageie a região enxertada sem orientação da equipe</w:t>
+      </w:r>
+    </w:p>
+    <w:p>
+      <w:pPr>
+        <w:pStyle w:val="ListParagraph"/>
+        <w:numPr>
+          <w:ilvl w:val="0"/>
+          <w:numId w:val="2"/>
+        </w:numPr>
+        <w:spacing w:after="60"/>
+      </w:pPr>
+      <w:r>
+        <w:rPr>
+          <w:sz w:val="21"/>
+          <w:szCs w:val="21"/>
+        </w:rPr>
+        <w:t xml:space="preserve">Avalie o resultado do enxerto entre 3 e 6 meses, no retorno</w:t>
       </w:r>
     </w:p>
     <w:p>
@@ -16306,7 +16357,7 @@
           <w:sz w:val="23"/>
           <w:szCs w:val="23"/>
         </w:rPr>
-        <w:t xml:space="preserve">Coceira na cicatriz</w:t>
+        <w:t xml:space="preserve">Endurecimento e nódulos sob a pele</w:t>
       </w:r>
     </w:p>
     <w:p>
@@ -16319,21 +16370,21 @@
           <w:sz w:val="19"/>
           <w:szCs w:val="19"/>
         </w:rPr>
-        <w:t xml:space="preserve">Quando: Da 2ª semana ao 3º mês  |  Aplica-se a: somente cirurgias</w:t>
-      </w:r>
-    </w:p>
-    <w:p>
-      <w:pPr>
-        <w:spacing w:after="100"/>
-      </w:pPr>
-      <w:r>
-        <w:rPr>
-          <w:b/>
-          <w:bCs/>
-          <w:sz w:val="21"/>
-          <w:szCs w:val="21"/>
-        </w:rPr>
-        <w:t xml:space="preserve">Coceira leve acompanha a cicatrização e costuma indicar que a pele está se reparando.</w:t>
+        <w:t xml:space="preserve">Quando: Da 3ª semana ao 3º mês  |  Aplica-se a: somente cirurgias</w:t>
+      </w:r>
+    </w:p>
+    <w:p>
+      <w:pPr>
+        <w:spacing w:after="100"/>
+      </w:pPr>
+      <w:r>
+        <w:rPr>
+          <w:b/>
+          <w:bCs/>
+          <w:sz w:val="21"/>
+          <w:szCs w:val="21"/>
+        </w:rPr>
+        <w:t xml:space="preserve">Áreas endurecidas, irregulares ou com pequenos caroços fazem parte da fase de fibrose e amolecem com o tempo.</w:t>
       </w:r>
     </w:p>
     <w:p>
@@ -16366,7 +16417,24 @@
           <w:sz w:val="21"/>
           <w:szCs w:val="21"/>
         </w:rPr>
-        <w:t xml:space="preserve">A liberação de histamina e a pele ressecada durante a cicatrização causam prurido.</w:t>
+        <w:t xml:space="preserve">O organismo forma tecido de reparo, que é firme no início e depois amolece.</w:t>
+      </w:r>
+    </w:p>
+    <w:p>
+      <w:pPr>
+        <w:pStyle w:val="ListParagraph"/>
+        <w:numPr>
+          <w:ilvl w:val="0"/>
+          <w:numId w:val="2"/>
+        </w:numPr>
+        <w:spacing w:after="60"/>
+      </w:pPr>
+      <w:r>
+        <w:rPr>
+          <w:sz w:val="21"/>
+          <w:szCs w:val="21"/>
+        </w:rPr>
+        <w:t xml:space="preserve">É especialmente comum após lipoaspiração.</w:t>
       </w:r>
     </w:p>
     <w:p>
@@ -16399,41 +16467,41 @@
           <w:sz w:val="21"/>
           <w:szCs w:val="21"/>
         </w:rPr>
-        <w:t xml:space="preserve">Hidrate a pele ao redor — nunca sobre pontos ainda fechados</w:t>
-      </w:r>
-    </w:p>
-    <w:p>
-      <w:pPr>
-        <w:pStyle w:val="ListParagraph"/>
-        <w:numPr>
-          <w:ilvl w:val="0"/>
-          <w:numId w:val="2"/>
-        </w:numPr>
-        <w:spacing w:after="60"/>
-      </w:pPr>
-      <w:r>
-        <w:rPr>
-          <w:sz w:val="21"/>
-          <w:szCs w:val="21"/>
-        </w:rPr>
-        <w:t xml:space="preserve">Não coce nem retire crostas</w:t>
-      </w:r>
-    </w:p>
-    <w:p>
-      <w:pPr>
-        <w:pStyle w:val="ListParagraph"/>
-        <w:numPr>
-          <w:ilvl w:val="0"/>
-          <w:numId w:val="2"/>
-        </w:numPr>
-        <w:spacing w:after="60"/>
-      </w:pPr>
-      <w:r>
-        <w:rPr>
-          <w:sz w:val="21"/>
-          <w:szCs w:val="21"/>
-        </w:rPr>
-        <w:t xml:space="preserve">Comunique se vier acompanhada de manchas vermelhas espalhadas</w:t>
+        <w:t xml:space="preserve">Mantenha a drenagem linfática e a compressão</w:t>
+      </w:r>
+    </w:p>
+    <w:p>
+      <w:pPr>
+        <w:pStyle w:val="ListParagraph"/>
+        <w:numPr>
+          <w:ilvl w:val="0"/>
+          <w:numId w:val="2"/>
+        </w:numPr>
+        <w:spacing w:after="60"/>
+      </w:pPr>
+      <w:r>
+        <w:rPr>
+          <w:sz w:val="21"/>
+          <w:szCs w:val="21"/>
+        </w:rPr>
+        <w:t xml:space="preserve">Não massageie com força por conta própria</w:t>
+      </w:r>
+    </w:p>
+    <w:p>
+      <w:pPr>
+        <w:pStyle w:val="ListParagraph"/>
+        <w:numPr>
+          <w:ilvl w:val="0"/>
+          <w:numId w:val="2"/>
+        </w:numPr>
+        <w:spacing w:after="60"/>
+      </w:pPr>
+      <w:r>
+        <w:rPr>
+          <w:sz w:val="21"/>
+          <w:szCs w:val="21"/>
+        </w:rPr>
+        <w:t xml:space="preserve">Comente no retorno se um endurecimento crescer ou doer muito</w:t>
       </w:r>
     </w:p>
     <w:p>
@@ -16467,7 +16535,7 @@
           <w:sz w:val="23"/>
           <w:szCs w:val="23"/>
         </w:rPr>
-        <w:t xml:space="preserve">Cicatriz vermelha e endurecida</w:t>
+        <w:t xml:space="preserve">Coceira na cicatriz</w:t>
       </w:r>
     </w:p>
     <w:p>
@@ -16480,21 +16548,21 @@
           <w:sz w:val="19"/>
           <w:szCs w:val="19"/>
         </w:rPr>
-        <w:t xml:space="preserve">Quando: Do 1º ao 3º mês  |  Aplica-se a: somente cirurgias</w:t>
-      </w:r>
-    </w:p>
-    <w:p>
-      <w:pPr>
-        <w:spacing w:after="100"/>
-      </w:pPr>
-      <w:r>
-        <w:rPr>
-          <w:b/>
-          <w:bCs/>
-          <w:sz w:val="21"/>
-          <w:szCs w:val="21"/>
-        </w:rPr>
-        <w:t xml:space="preserve">A cicatriz fica mais vermelha e elevada antes de clarear. Esse é o caminho normal da maturação.</w:t>
+        <w:t xml:space="preserve">Quando: Da 2ª semana ao 3º mês  |  Aplica-se a: somente cirurgias</w:t>
+      </w:r>
+    </w:p>
+    <w:p>
+      <w:pPr>
+        <w:spacing w:after="100"/>
+      </w:pPr>
+      <w:r>
+        <w:rPr>
+          <w:b/>
+          <w:bCs/>
+          <w:sz w:val="21"/>
+          <w:szCs w:val="21"/>
+        </w:rPr>
+        <w:t xml:space="preserve">Coceira leve acompanha a cicatrização e costuma indicar que a pele está se reparando.</w:t>
       </w:r>
     </w:p>
     <w:p>
@@ -16527,24 +16595,7 @@
           <w:sz w:val="21"/>
           <w:szCs w:val="21"/>
         </w:rPr>
-        <w:t xml:space="preserve">A fase inflamatória da cicatrização dura semanas e é seguida pela remodelação.</w:t>
-      </w:r>
-    </w:p>
-    <w:p>
-      <w:pPr>
-        <w:pStyle w:val="ListParagraph"/>
-        <w:numPr>
-          <w:ilvl w:val="0"/>
-          <w:numId w:val="2"/>
-        </w:numPr>
-        <w:spacing w:after="60"/>
-      </w:pPr>
-      <w:r>
-        <w:rPr>
-          <w:sz w:val="21"/>
-          <w:szCs w:val="21"/>
-        </w:rPr>
-        <w:t xml:space="preserve">O clareamento completo pode levar de 12 a 18 meses.</w:t>
+        <w:t xml:space="preserve">A liberação de histamina e a pele ressecada durante a cicatrização causam prurido.</w:t>
       </w:r>
     </w:p>
     <w:p>
@@ -16577,41 +16628,41 @@
           <w:sz w:val="21"/>
           <w:szCs w:val="21"/>
         </w:rPr>
-        <w:t xml:space="preserve">Protetor solar sobre a cicatriz sempre que houver exposição</w:t>
-      </w:r>
-    </w:p>
-    <w:p>
-      <w:pPr>
-        <w:pStyle w:val="ListParagraph"/>
-        <w:numPr>
-          <w:ilvl w:val="0"/>
-          <w:numId w:val="2"/>
-        </w:numPr>
-        <w:spacing w:after="60"/>
-      </w:pPr>
-      <w:r>
-        <w:rPr>
-          <w:sz w:val="21"/>
-          <w:szCs w:val="21"/>
-        </w:rPr>
-        <w:t xml:space="preserve">Siga o tratamento de cicatriz indicado</w:t>
-      </w:r>
-    </w:p>
-    <w:p>
-      <w:pPr>
-        <w:pStyle w:val="ListParagraph"/>
-        <w:numPr>
-          <w:ilvl w:val="0"/>
-          <w:numId w:val="2"/>
-        </w:numPr>
-        <w:spacing w:after="60"/>
-      </w:pPr>
-      <w:r>
-        <w:rPr>
-          <w:sz w:val="21"/>
-          <w:szCs w:val="21"/>
-        </w:rPr>
-        <w:t xml:space="preserve">Tenha paciência — julgar a cicatriz antes de 6 meses não faz sentido</w:t>
+        <w:t xml:space="preserve">Hidrate a pele ao redor — nunca sobre pontos ainda fechados</w:t>
+      </w:r>
+    </w:p>
+    <w:p>
+      <w:pPr>
+        <w:pStyle w:val="ListParagraph"/>
+        <w:numPr>
+          <w:ilvl w:val="0"/>
+          <w:numId w:val="2"/>
+        </w:numPr>
+        <w:spacing w:after="60"/>
+      </w:pPr>
+      <w:r>
+        <w:rPr>
+          <w:sz w:val="21"/>
+          <w:szCs w:val="21"/>
+        </w:rPr>
+        <w:t xml:space="preserve">Não coce nem retire crostas</w:t>
+      </w:r>
+    </w:p>
+    <w:p>
+      <w:pPr>
+        <w:pStyle w:val="ListParagraph"/>
+        <w:numPr>
+          <w:ilvl w:val="0"/>
+          <w:numId w:val="2"/>
+        </w:numPr>
+        <w:spacing w:after="60"/>
+      </w:pPr>
+      <w:r>
+        <w:rPr>
+          <w:sz w:val="21"/>
+          <w:szCs w:val="21"/>
+        </w:rPr>
+        <w:t xml:space="preserve">Comunique se vier acompanhada de manchas vermelhas espalhadas</w:t>
       </w:r>
     </w:p>
     <w:p>
@@ -16645,7 +16696,7 @@
           <w:sz w:val="23"/>
           <w:szCs w:val="23"/>
         </w:rPr>
-        <w:t xml:space="preserve">Cansaço e falta de energia</w:t>
+        <w:t xml:space="preserve">Cicatriz vermelha e endurecida</w:t>
       </w:r>
     </w:p>
     <w:p>
@@ -16658,21 +16709,21 @@
           <w:sz w:val="19"/>
           <w:szCs w:val="19"/>
         </w:rPr>
-        <w:t xml:space="preserve">Quando: Primeiras 2 a 4 semanas  |  Aplica-se a: somente cirurgias</w:t>
-      </w:r>
-    </w:p>
-    <w:p>
-      <w:pPr>
-        <w:spacing w:after="100"/>
-      </w:pPr>
-      <w:r>
-        <w:rPr>
-          <w:b/>
-          <w:bCs/>
-          <w:sz w:val="21"/>
-          <w:szCs w:val="21"/>
-        </w:rPr>
-        <w:t xml:space="preserve">O corpo está direcionando energia para a cicatrização. Cansar-se rápido é esperado.</w:t>
+        <w:t xml:space="preserve">Quando: Do 1º ao 3º mês  |  Aplica-se a: somente cirurgias</w:t>
+      </w:r>
+    </w:p>
+    <w:p>
+      <w:pPr>
+        <w:spacing w:after="100"/>
+      </w:pPr>
+      <w:r>
+        <w:rPr>
+          <w:b/>
+          <w:bCs/>
+          <w:sz w:val="21"/>
+          <w:szCs w:val="21"/>
+        </w:rPr>
+        <w:t xml:space="preserve">A cicatriz fica mais vermelha e elevada antes de clarear. Esse é o caminho normal da maturação.</w:t>
       </w:r>
     </w:p>
     <w:p>
@@ -16705,24 +16756,24 @@
           <w:sz w:val="21"/>
           <w:szCs w:val="21"/>
         </w:rPr>
-        <w:t xml:space="preserve">A cirurgia, a anestesia e a menor alimentação reduzem a disposição.</w:t>
-      </w:r>
-    </w:p>
-    <w:p>
-      <w:pPr>
-        <w:pStyle w:val="ListParagraph"/>
-        <w:numPr>
-          <w:ilvl w:val="0"/>
-          <w:numId w:val="2"/>
-        </w:numPr>
-        <w:spacing w:after="60"/>
-      </w:pPr>
-      <w:r>
-        <w:rPr>
-          <w:sz w:val="21"/>
-          <w:szCs w:val="21"/>
-        </w:rPr>
-        <w:t xml:space="preserve">A recuperação da energia é gradual e não linear: há dias melhores e piores.</w:t>
+        <w:t xml:space="preserve">A fase inflamatória da cicatrização dura semanas e é seguida pela remodelação.</w:t>
+      </w:r>
+    </w:p>
+    <w:p>
+      <w:pPr>
+        <w:pStyle w:val="ListParagraph"/>
+        <w:numPr>
+          <w:ilvl w:val="0"/>
+          <w:numId w:val="2"/>
+        </w:numPr>
+        <w:spacing w:after="60"/>
+      </w:pPr>
+      <w:r>
+        <w:rPr>
+          <w:sz w:val="21"/>
+          <w:szCs w:val="21"/>
+        </w:rPr>
+        <w:t xml:space="preserve">O clareamento completo pode levar de 12 a 18 meses.</w:t>
       </w:r>
     </w:p>
     <w:p>
@@ -16755,41 +16806,41 @@
           <w:sz w:val="21"/>
           <w:szCs w:val="21"/>
         </w:rPr>
-        <w:t xml:space="preserve">Respeite o descanso e evite comparar sua evolução com a de outras pacientes</w:t>
-      </w:r>
-    </w:p>
-    <w:p>
-      <w:pPr>
-        <w:pStyle w:val="ListParagraph"/>
-        <w:numPr>
-          <w:ilvl w:val="0"/>
-          <w:numId w:val="2"/>
-        </w:numPr>
-        <w:spacing w:after="60"/>
-      </w:pPr>
-      <w:r>
-        <w:rPr>
-          <w:sz w:val="21"/>
-          <w:szCs w:val="21"/>
-        </w:rPr>
-        <w:t xml:space="preserve">Mantenha alimentação rica em proteína</w:t>
-      </w:r>
-    </w:p>
-    <w:p>
-      <w:pPr>
-        <w:pStyle w:val="ListParagraph"/>
-        <w:numPr>
-          <w:ilvl w:val="0"/>
-          <w:numId w:val="2"/>
-        </w:numPr>
-        <w:spacing w:after="60"/>
-      </w:pPr>
-      <w:r>
-        <w:rPr>
-          <w:sz w:val="21"/>
-          <w:szCs w:val="21"/>
-        </w:rPr>
-        <w:t xml:space="preserve">Volte às atividades por etapas</w:t>
+        <w:t xml:space="preserve">Protetor solar sobre a cicatriz sempre que houver exposição</w:t>
+      </w:r>
+    </w:p>
+    <w:p>
+      <w:pPr>
+        <w:pStyle w:val="ListParagraph"/>
+        <w:numPr>
+          <w:ilvl w:val="0"/>
+          <w:numId w:val="2"/>
+        </w:numPr>
+        <w:spacing w:after="60"/>
+      </w:pPr>
+      <w:r>
+        <w:rPr>
+          <w:sz w:val="21"/>
+          <w:szCs w:val="21"/>
+        </w:rPr>
+        <w:t xml:space="preserve">Siga o tratamento de cicatriz indicado</w:t>
+      </w:r>
+    </w:p>
+    <w:p>
+      <w:pPr>
+        <w:pStyle w:val="ListParagraph"/>
+        <w:numPr>
+          <w:ilvl w:val="0"/>
+          <w:numId w:val="2"/>
+        </w:numPr>
+        <w:spacing w:after="60"/>
+      </w:pPr>
+      <w:r>
+        <w:rPr>
+          <w:sz w:val="21"/>
+          <w:szCs w:val="21"/>
+        </w:rPr>
+        <w:t xml:space="preserve">Tenha paciência — julgar a cicatriz antes de 6 meses não faz sentido</w:t>
       </w:r>
     </w:p>
     <w:p>
@@ -16823,7 +16874,7 @@
           <w:sz w:val="23"/>
           <w:szCs w:val="23"/>
         </w:rPr>
-        <w:t xml:space="preserve">Tristeza ou arrependimento nos primeiros dias</w:t>
+        <w:t xml:space="preserve">Cansaço e falta de energia</w:t>
       </w:r>
     </w:p>
     <w:p>
@@ -16836,21 +16887,21 @@
           <w:sz w:val="19"/>
           <w:szCs w:val="19"/>
         </w:rPr>
-        <w:t xml:space="preserve">Quando: Entre o 3º e o 10º dia  |  Aplica-se a: somente cirurgias</w:t>
-      </w:r>
-    </w:p>
-    <w:p>
-      <w:pPr>
-        <w:spacing w:after="100"/>
-      </w:pPr>
-      <w:r>
-        <w:rPr>
-          <w:b/>
-          <w:bCs/>
-          <w:sz w:val="21"/>
-          <w:szCs w:val="21"/>
-        </w:rPr>
-        <w:t xml:space="preserve">Muitas pacientes passam por uma fase de baixa emocional. É um fenômeno conhecido e passageiro.</w:t>
+        <w:t xml:space="preserve">Quando: Primeiras 2 a 4 semanas  |  Aplica-se a: somente cirurgias</w:t>
+      </w:r>
+    </w:p>
+    <w:p>
+      <w:pPr>
+        <w:spacing w:after="100"/>
+      </w:pPr>
+      <w:r>
+        <w:rPr>
+          <w:b/>
+          <w:bCs/>
+          <w:sz w:val="21"/>
+          <w:szCs w:val="21"/>
+        </w:rPr>
+        <w:t xml:space="preserve">O corpo está direcionando energia para a cicatrização. Cansar-se rápido é esperado.</w:t>
       </w:r>
     </w:p>
     <w:p>
@@ -16883,24 +16934,24 @@
           <w:sz w:val="21"/>
           <w:szCs w:val="21"/>
         </w:rPr>
-        <w:t xml:space="preserve">Cansaço, dor, inchaço, dependência de outras pessoas e o efeito das medicações se somam.</w:t>
-      </w:r>
-    </w:p>
-    <w:p>
-      <w:pPr>
-        <w:pStyle w:val="ListParagraph"/>
-        <w:numPr>
-          <w:ilvl w:val="0"/>
-          <w:numId w:val="2"/>
-        </w:numPr>
-        <w:spacing w:after="60"/>
-      </w:pPr>
-      <w:r>
-        <w:rPr>
-          <w:sz w:val="21"/>
-          <w:szCs w:val="21"/>
-        </w:rPr>
-        <w:t xml:space="preserve">Nessa fase o corpo ainda está inchado e o resultado não é visível — o que alimenta a insegurança.</w:t>
+        <w:t xml:space="preserve">A cirurgia, a anestesia e a menor alimentação reduzem a disposição.</w:t>
+      </w:r>
+    </w:p>
+    <w:p>
+      <w:pPr>
+        <w:pStyle w:val="ListParagraph"/>
+        <w:numPr>
+          <w:ilvl w:val="0"/>
+          <w:numId w:val="2"/>
+        </w:numPr>
+        <w:spacing w:after="60"/>
+      </w:pPr>
+      <w:r>
+        <w:rPr>
+          <w:sz w:val="21"/>
+          <w:szCs w:val="21"/>
+        </w:rPr>
+        <w:t xml:space="preserve">A recuperação da energia é gradual e não linear: há dias melhores e piores.</w:t>
       </w:r>
     </w:p>
     <w:p>
@@ -16933,41 +16984,41 @@
           <w:sz w:val="21"/>
           <w:szCs w:val="21"/>
         </w:rPr>
-        <w:t xml:space="preserve">Saiba que quase todas as pacientes passam por isso e melhora em poucos dias</w:t>
-      </w:r>
-    </w:p>
-    <w:p>
-      <w:pPr>
-        <w:pStyle w:val="ListParagraph"/>
-        <w:numPr>
-          <w:ilvl w:val="0"/>
-          <w:numId w:val="2"/>
-        </w:numPr>
-        <w:spacing w:after="60"/>
-      </w:pPr>
-      <w:r>
-        <w:rPr>
-          <w:sz w:val="21"/>
-          <w:szCs w:val="21"/>
-        </w:rPr>
-        <w:t xml:space="preserve">Converse com a equipe e com pessoas próximas</w:t>
-      </w:r>
-    </w:p>
-    <w:p>
-      <w:pPr>
-        <w:pStyle w:val="ListParagraph"/>
-        <w:numPr>
-          <w:ilvl w:val="0"/>
-          <w:numId w:val="2"/>
-        </w:numPr>
-        <w:spacing w:after="60"/>
-      </w:pPr>
-      <w:r>
-        <w:rPr>
-          <w:sz w:val="21"/>
-          <w:szCs w:val="21"/>
-        </w:rPr>
-        <w:t xml:space="preserve">Procure ajuda se a tristeza for intensa ou durar mais de 2 semanas</w:t>
+        <w:t xml:space="preserve">Respeite o descanso e evite comparar sua evolução com a de outras pacientes</w:t>
+      </w:r>
+    </w:p>
+    <w:p>
+      <w:pPr>
+        <w:pStyle w:val="ListParagraph"/>
+        <w:numPr>
+          <w:ilvl w:val="0"/>
+          <w:numId w:val="2"/>
+        </w:numPr>
+        <w:spacing w:after="60"/>
+      </w:pPr>
+      <w:r>
+        <w:rPr>
+          <w:sz w:val="21"/>
+          <w:szCs w:val="21"/>
+        </w:rPr>
+        <w:t xml:space="preserve">Mantenha alimentação rica em proteína</w:t>
+      </w:r>
+    </w:p>
+    <w:p>
+      <w:pPr>
+        <w:pStyle w:val="ListParagraph"/>
+        <w:numPr>
+          <w:ilvl w:val="0"/>
+          <w:numId w:val="2"/>
+        </w:numPr>
+        <w:spacing w:after="60"/>
+      </w:pPr>
+      <w:r>
+        <w:rPr>
+          <w:sz w:val="21"/>
+          <w:szCs w:val="21"/>
+        </w:rPr>
+        <w:t xml:space="preserve">Volte às atividades por etapas</w:t>
       </w:r>
     </w:p>
     <w:p>
@@ -17001,7 +17052,7 @@
           <w:sz w:val="23"/>
           <w:szCs w:val="23"/>
         </w:rPr>
-        <w:t xml:space="preserve">Dificuldade para dormir</w:t>
+        <w:t xml:space="preserve">Tristeza ou arrependimento nos primeiros dias</w:t>
       </w:r>
     </w:p>
     <w:p>
@@ -17014,21 +17065,21 @@
           <w:sz w:val="19"/>
           <w:szCs w:val="19"/>
         </w:rPr>
-        <w:t xml:space="preserve">Quando: Primeiras 3 semanas  |  Aplica-se a: somente cirurgias</w:t>
-      </w:r>
-    </w:p>
-    <w:p>
-      <w:pPr>
-        <w:spacing w:after="100"/>
-      </w:pPr>
-      <w:r>
-        <w:rPr>
-          <w:b/>
-          <w:bCs/>
-          <w:sz w:val="21"/>
-          <w:szCs w:val="21"/>
-        </w:rPr>
-        <w:t xml:space="preserve">Dormir numa posição diferente da habitual, com cinta e desconforto, atrapalha o sono no início.</w:t>
+        <w:t xml:space="preserve">Quando: Entre o 3º e o 10º dia  |  Aplica-se a: somente cirurgias</w:t>
+      </w:r>
+    </w:p>
+    <w:p>
+      <w:pPr>
+        <w:spacing w:after="100"/>
+      </w:pPr>
+      <w:r>
+        <w:rPr>
+          <w:b/>
+          <w:bCs/>
+          <w:sz w:val="21"/>
+          <w:szCs w:val="21"/>
+        </w:rPr>
+        <w:t xml:space="preserve">Muitas pacientes passam por uma fase de baixa emocional. É um fenômeno conhecido e passageiro.</w:t>
       </w:r>
     </w:p>
     <w:p>
@@ -17061,7 +17112,24 @@
           <w:sz w:val="21"/>
           <w:szCs w:val="21"/>
         </w:rPr>
-        <w:t xml:space="preserve">A posição imposta pela cirurgia e o próprio desconforto fragmentam o sono.</w:t>
+        <w:t xml:space="preserve">Cansaço, dor, inchaço, dependência de outras pessoas e o efeito das medicações se somam.</w:t>
+      </w:r>
+    </w:p>
+    <w:p>
+      <w:pPr>
+        <w:pStyle w:val="ListParagraph"/>
+        <w:numPr>
+          <w:ilvl w:val="0"/>
+          <w:numId w:val="2"/>
+        </w:numPr>
+        <w:spacing w:after="60"/>
+      </w:pPr>
+      <w:r>
+        <w:rPr>
+          <w:sz w:val="21"/>
+          <w:szCs w:val="21"/>
+        </w:rPr>
+        <w:t xml:space="preserve">Nessa fase o corpo ainda está inchado e o resultado não é visível — o que alimenta a insegurança.</w:t>
       </w:r>
     </w:p>
     <w:p>
@@ -17094,41 +17162,41 @@
           <w:sz w:val="21"/>
           <w:szCs w:val="21"/>
         </w:rPr>
-        <w:t xml:space="preserve">Use travesseiros de apoio para manter a posição orientada</w:t>
-      </w:r>
-    </w:p>
-    <w:p>
-      <w:pPr>
-        <w:pStyle w:val="ListParagraph"/>
-        <w:numPr>
-          <w:ilvl w:val="0"/>
-          <w:numId w:val="2"/>
-        </w:numPr>
-        <w:spacing w:after="60"/>
-      </w:pPr>
-      <w:r>
-        <w:rPr>
-          <w:sz w:val="21"/>
-          <w:szCs w:val="21"/>
-        </w:rPr>
-        <w:t xml:space="preserve">Evite cafeína no fim do dia</w:t>
-      </w:r>
-    </w:p>
-    <w:p>
-      <w:pPr>
-        <w:pStyle w:val="ListParagraph"/>
-        <w:numPr>
-          <w:ilvl w:val="0"/>
-          <w:numId w:val="2"/>
-        </w:numPr>
-        <w:spacing w:after="60"/>
-      </w:pPr>
-      <w:r>
-        <w:rPr>
-          <w:sz w:val="21"/>
-          <w:szCs w:val="21"/>
-        </w:rPr>
-        <w:t xml:space="preserve">Peça orientação à equipe antes de usar qualquer indutor de sono</w:t>
+        <w:t xml:space="preserve">Saiba que quase todas as pacientes passam por isso e melhora em poucos dias</w:t>
+      </w:r>
+    </w:p>
+    <w:p>
+      <w:pPr>
+        <w:pStyle w:val="ListParagraph"/>
+        <w:numPr>
+          <w:ilvl w:val="0"/>
+          <w:numId w:val="2"/>
+        </w:numPr>
+        <w:spacing w:after="60"/>
+      </w:pPr>
+      <w:r>
+        <w:rPr>
+          <w:sz w:val="21"/>
+          <w:szCs w:val="21"/>
+        </w:rPr>
+        <w:t xml:space="preserve">Converse com a equipe e com pessoas próximas</w:t>
+      </w:r>
+    </w:p>
+    <w:p>
+      <w:pPr>
+        <w:pStyle w:val="ListParagraph"/>
+        <w:numPr>
+          <w:ilvl w:val="0"/>
+          <w:numId w:val="2"/>
+        </w:numPr>
+        <w:spacing w:after="60"/>
+      </w:pPr>
+      <w:r>
+        <w:rPr>
+          <w:sz w:val="21"/>
+          <w:szCs w:val="21"/>
+        </w:rPr>
+        <w:t xml:space="preserve">Procure ajuda se a tristeza for intensa ou durar mais de 2 semanas</w:t>
       </w:r>
     </w:p>
     <w:p>
@@ -17162,7 +17230,7 @@
           <w:sz w:val="23"/>
           <w:szCs w:val="23"/>
         </w:rPr>
-        <w:t xml:space="preserve">Falta de apetite</w:t>
+        <w:t xml:space="preserve">Dificuldade para dormir</w:t>
       </w:r>
     </w:p>
     <w:p>
@@ -17175,21 +17243,21 @@
           <w:sz w:val="19"/>
           <w:szCs w:val="19"/>
         </w:rPr>
-        <w:t xml:space="preserve">Quando: Primeira semana  |  Aplica-se a: somente cirurgias</w:t>
-      </w:r>
-    </w:p>
-    <w:p>
-      <w:pPr>
-        <w:spacing w:after="100"/>
-      </w:pPr>
-      <w:r>
-        <w:rPr>
-          <w:b/>
-          <w:bCs/>
-          <w:sz w:val="21"/>
-          <w:szCs w:val="21"/>
-        </w:rPr>
-        <w:t xml:space="preserve">Comum nos primeiros dias. O importante é manter hidratação e proteína.</w:t>
+        <w:t xml:space="preserve">Quando: Primeiras 3 semanas  |  Aplica-se a: somente cirurgias</w:t>
+      </w:r>
+    </w:p>
+    <w:p>
+      <w:pPr>
+        <w:spacing w:after="100"/>
+      </w:pPr>
+      <w:r>
+        <w:rPr>
+          <w:b/>
+          <w:bCs/>
+          <w:sz w:val="21"/>
+          <w:szCs w:val="21"/>
+        </w:rPr>
+        <w:t xml:space="preserve">Dormir numa posição diferente da habitual, com cinta e desconforto, atrapalha o sono no início.</w:t>
       </w:r>
     </w:p>
     <w:p>
@@ -17222,7 +17290,7 @@
           <w:sz w:val="21"/>
           <w:szCs w:val="21"/>
         </w:rPr>
-        <w:t xml:space="preserve">Efeito residual da anestesia, das medicações e da menor atividade física.</w:t>
+        <w:t xml:space="preserve">A posição imposta pela cirurgia e o próprio desconforto fragmentam o sono.</w:t>
       </w:r>
     </w:p>
     <w:p>
@@ -17255,41 +17323,41 @@
           <w:sz w:val="21"/>
           <w:szCs w:val="21"/>
         </w:rPr>
-        <w:t xml:space="preserve">Prefira refeições pequenas e frequentes</w:t>
-      </w:r>
-    </w:p>
-    <w:p>
-      <w:pPr>
-        <w:pStyle w:val="ListParagraph"/>
-        <w:numPr>
-          <w:ilvl w:val="0"/>
-          <w:numId w:val="2"/>
-        </w:numPr>
-        <w:spacing w:after="60"/>
-      </w:pPr>
-      <w:r>
-        <w:rPr>
-          <w:sz w:val="21"/>
-          <w:szCs w:val="21"/>
-        </w:rPr>
-        <w:t xml:space="preserve">Priorize proteína: ovos, carnes magras, iogurte, leguminosas</w:t>
-      </w:r>
-    </w:p>
-    <w:p>
-      <w:pPr>
-        <w:pStyle w:val="ListParagraph"/>
-        <w:numPr>
-          <w:ilvl w:val="0"/>
-          <w:numId w:val="2"/>
-        </w:numPr>
-        <w:spacing w:after="60"/>
-      </w:pPr>
-      <w:r>
-        <w:rPr>
-          <w:sz w:val="21"/>
-          <w:szCs w:val="21"/>
-        </w:rPr>
-        <w:t xml:space="preserve">Beba água ao longo de todo o dia</w:t>
+        <w:t xml:space="preserve">Use travesseiros de apoio para manter a posição orientada</w:t>
+      </w:r>
+    </w:p>
+    <w:p>
+      <w:pPr>
+        <w:pStyle w:val="ListParagraph"/>
+        <w:numPr>
+          <w:ilvl w:val="0"/>
+          <w:numId w:val="2"/>
+        </w:numPr>
+        <w:spacing w:after="60"/>
+      </w:pPr>
+      <w:r>
+        <w:rPr>
+          <w:sz w:val="21"/>
+          <w:szCs w:val="21"/>
+        </w:rPr>
+        <w:t xml:space="preserve">Evite cafeína no fim do dia</w:t>
+      </w:r>
+    </w:p>
+    <w:p>
+      <w:pPr>
+        <w:pStyle w:val="ListParagraph"/>
+        <w:numPr>
+          <w:ilvl w:val="0"/>
+          <w:numId w:val="2"/>
+        </w:numPr>
+        <w:spacing w:after="60"/>
+      </w:pPr>
+      <w:r>
+        <w:rPr>
+          <w:sz w:val="21"/>
+          <w:szCs w:val="21"/>
+        </w:rPr>
+        <w:t xml:space="preserve">Peça orientação à equipe antes de usar qualquer indutor de sono</w:t>
       </w:r>
     </w:p>
     <w:p>
@@ -17323,7 +17391,7 @@
           <w:sz w:val="23"/>
           <w:szCs w:val="23"/>
         </w:rPr>
-        <w:t xml:space="preserve">Líquido rosado no curativo</w:t>
+        <w:t xml:space="preserve">Falta de apetite</w:t>
       </w:r>
     </w:p>
     <w:p>
@@ -17336,21 +17404,21 @@
           <w:sz w:val="19"/>
           <w:szCs w:val="19"/>
         </w:rPr>
-        <w:t xml:space="preserve">Quando: Primeiros 3 a 5 dias  |  Aplica-se a: somente cirurgias</w:t>
-      </w:r>
-    </w:p>
-    <w:p>
-      <w:pPr>
-        <w:spacing w:after="100"/>
-      </w:pPr>
-      <w:r>
-        <w:rPr>
-          <w:b/>
-          <w:bCs/>
-          <w:sz w:val="21"/>
-          <w:szCs w:val="21"/>
-        </w:rPr>
-        <w:t xml:space="preserve">Manchas rosadas ou avermelhadas claras no curativo são esperadas nos primeiros dias.</w:t>
+        <w:t xml:space="preserve">Quando: Primeira semana  |  Aplica-se a: somente cirurgias</w:t>
+      </w:r>
+    </w:p>
+    <w:p>
+      <w:pPr>
+        <w:spacing w:after="100"/>
+      </w:pPr>
+      <w:r>
+        <w:rPr>
+          <w:b/>
+          <w:bCs/>
+          <w:sz w:val="21"/>
+          <w:szCs w:val="21"/>
+        </w:rPr>
+        <w:t xml:space="preserve">Comum nos primeiros dias. O importante é manter hidratação e proteína.</w:t>
       </w:r>
     </w:p>
     <w:p>
@@ -17383,7 +17451,7 @@
           <w:sz w:val="21"/>
           <w:szCs w:val="21"/>
         </w:rPr>
-        <w:t xml:space="preserve">É a mistura de líquido da cicatrização com pequena quantidade de sangue.</w:t>
+        <w:t xml:space="preserve">Efeito residual da anestesia, das medicações e da menor atividade física.</w:t>
       </w:r>
     </w:p>
     <w:p>
@@ -17416,24 +17484,41 @@
           <w:sz w:val="21"/>
           <w:szCs w:val="21"/>
         </w:rPr>
-        <w:t xml:space="preserve">Troque o curativo conforme orientado</w:t>
-      </w:r>
-    </w:p>
-    <w:p>
-      <w:pPr>
-        <w:pStyle w:val="ListParagraph"/>
-        <w:numPr>
-          <w:ilvl w:val="0"/>
-          <w:numId w:val="2"/>
-        </w:numPr>
-        <w:spacing w:after="60"/>
-      </w:pPr>
-      <w:r>
-        <w:rPr>
-          <w:sz w:val="21"/>
-          <w:szCs w:val="21"/>
-        </w:rPr>
-        <w:t xml:space="preserve">Comunique se o volume aumentar ou se o líquido ficar espesso e com odor</w:t>
+        <w:t xml:space="preserve">Prefira refeições pequenas e frequentes</w:t>
+      </w:r>
+    </w:p>
+    <w:p>
+      <w:pPr>
+        <w:pStyle w:val="ListParagraph"/>
+        <w:numPr>
+          <w:ilvl w:val="0"/>
+          <w:numId w:val="2"/>
+        </w:numPr>
+        <w:spacing w:after="60"/>
+      </w:pPr>
+      <w:r>
+        <w:rPr>
+          <w:sz w:val="21"/>
+          <w:szCs w:val="21"/>
+        </w:rPr>
+        <w:t xml:space="preserve">Priorize proteína: ovos, carnes magras, iogurte, leguminosas</w:t>
+      </w:r>
+    </w:p>
+    <w:p>
+      <w:pPr>
+        <w:pStyle w:val="ListParagraph"/>
+        <w:numPr>
+          <w:ilvl w:val="0"/>
+          <w:numId w:val="2"/>
+        </w:numPr>
+        <w:spacing w:after="60"/>
+      </w:pPr>
+      <w:r>
+        <w:rPr>
+          <w:sz w:val="21"/>
+          <w:szCs w:val="21"/>
+        </w:rPr>
+        <w:t xml:space="preserve">Beba água ao longo de todo o dia</w:t>
       </w:r>
     </w:p>
     <w:p>
@@ -17467,7 +17552,7 @@
           <w:sz w:val="23"/>
           <w:szCs w:val="23"/>
         </w:rPr>
-        <w:t xml:space="preserve">Ganho de peso na balança</w:t>
+        <w:t xml:space="preserve">Líquido rosado no curativo</w:t>
       </w:r>
     </w:p>
     <w:p>
@@ -17480,21 +17565,21 @@
           <w:sz w:val="19"/>
           <w:szCs w:val="19"/>
         </w:rPr>
-        <w:t xml:space="preserve">Quando: Primeiras 3 semanas  |  Aplica-se a: somente cirurgias</w:t>
-      </w:r>
-    </w:p>
-    <w:p>
-      <w:pPr>
-        <w:spacing w:after="100"/>
-      </w:pPr>
-      <w:r>
-        <w:rPr>
-          <w:b/>
-          <w:bCs/>
-          <w:sz w:val="21"/>
-          <w:szCs w:val="21"/>
-        </w:rPr>
-        <w:t xml:space="preserve">É comum pesar mais depois da cirurgia. É retenção de líquido, não gordura.</w:t>
+        <w:t xml:space="preserve">Quando: Primeiros 3 a 5 dias  |  Aplica-se a: somente cirurgias</w:t>
+      </w:r>
+    </w:p>
+    <w:p>
+      <w:pPr>
+        <w:spacing w:after="100"/>
+      </w:pPr>
+      <w:r>
+        <w:rPr>
+          <w:b/>
+          <w:bCs/>
+          <w:sz w:val="21"/>
+          <w:szCs w:val="21"/>
+        </w:rPr>
+        <w:t xml:space="preserve">Manchas rosadas ou avermelhadas claras no curativo são esperadas nos primeiros dias.</w:t>
       </w:r>
     </w:p>
     <w:p>
@@ -17527,24 +17612,7 @@
           <w:sz w:val="21"/>
           <w:szCs w:val="21"/>
         </w:rPr>
-        <w:t xml:space="preserve">O organismo retém líquido como parte da resposta inflamatória.</w:t>
-      </w:r>
-    </w:p>
-    <w:p>
-      <w:pPr>
-        <w:pStyle w:val="ListParagraph"/>
-        <w:numPr>
-          <w:ilvl w:val="0"/>
-          <w:numId w:val="2"/>
-        </w:numPr>
-        <w:spacing w:after="60"/>
-      </w:pPr>
-      <w:r>
-        <w:rPr>
-          <w:sz w:val="21"/>
-          <w:szCs w:val="21"/>
-        </w:rPr>
-        <w:t xml:space="preserve">Esse peso se resolve conforme o inchaço cede.</w:t>
+        <w:t xml:space="preserve">É a mistura de líquido da cicatrização com pequena quantidade de sangue.</w:t>
       </w:r>
     </w:p>
     <w:p>
@@ -17577,24 +17645,24 @@
           <w:sz w:val="21"/>
           <w:szCs w:val="21"/>
         </w:rPr>
-        <w:t xml:space="preserve">Evite se pesar nas primeiras semanas</w:t>
-      </w:r>
-    </w:p>
-    <w:p>
-      <w:pPr>
-        <w:pStyle w:val="ListParagraph"/>
-        <w:numPr>
-          <w:ilvl w:val="0"/>
-          <w:numId w:val="2"/>
-        </w:numPr>
-        <w:spacing w:after="60"/>
-      </w:pPr>
-      <w:r>
-        <w:rPr>
-          <w:sz w:val="21"/>
-          <w:szCs w:val="21"/>
-        </w:rPr>
-        <w:t xml:space="preserve">Mantenha hidratação e reduza o sal</w:t>
+        <w:t xml:space="preserve">Troque o curativo conforme orientado</w:t>
+      </w:r>
+    </w:p>
+    <w:p>
+      <w:pPr>
+        <w:pStyle w:val="ListParagraph"/>
+        <w:numPr>
+          <w:ilvl w:val="0"/>
+          <w:numId w:val="2"/>
+        </w:numPr>
+        <w:spacing w:after="60"/>
+      </w:pPr>
+      <w:r>
+        <w:rPr>
+          <w:sz w:val="21"/>
+          <w:szCs w:val="21"/>
+        </w:rPr>
+        <w:t xml:space="preserve">Comunique se o volume aumentar ou se o líquido ficar espesso e com odor</w:t>
       </w:r>
     </w:p>
     <w:p>
@@ -17628,7 +17696,7 @@
           <w:sz w:val="23"/>
           <w:szCs w:val="23"/>
         </w:rPr>
-        <w:t xml:space="preserve">Alteração no ciclo menstrual</w:t>
+        <w:t xml:space="preserve">Ganho de peso na balança</w:t>
       </w:r>
     </w:p>
     <w:p>
@@ -17641,21 +17709,21 @@
           <w:sz w:val="19"/>
           <w:szCs w:val="19"/>
         </w:rPr>
-        <w:t xml:space="preserve">Quando: Primeiro e segundo ciclos após a cirurgia  |  Aplica-se a: somente cirurgias</w:t>
-      </w:r>
-    </w:p>
-    <w:p>
-      <w:pPr>
-        <w:spacing w:after="100"/>
-      </w:pPr>
-      <w:r>
-        <w:rPr>
-          <w:b/>
-          <w:bCs/>
-          <w:sz w:val="21"/>
-          <w:szCs w:val="21"/>
-        </w:rPr>
-        <w:t xml:space="preserve">Atraso ou adiantamento da menstruação após a cirurgia é frequente.</w:t>
+        <w:t xml:space="preserve">Quando: Primeiras 3 semanas  |  Aplica-se a: somente cirurgias</w:t>
+      </w:r>
+    </w:p>
+    <w:p>
+      <w:pPr>
+        <w:spacing w:after="100"/>
+      </w:pPr>
+      <w:r>
+        <w:rPr>
+          <w:b/>
+          <w:bCs/>
+          <w:sz w:val="21"/>
+          <w:szCs w:val="21"/>
+        </w:rPr>
+        <w:t xml:space="preserve">É comum pesar mais depois da cirurgia. É retenção de líquido, não gordura.</w:t>
       </w:r>
     </w:p>
     <w:p>
@@ -17688,7 +17756,24 @@
           <w:sz w:val="21"/>
           <w:szCs w:val="21"/>
         </w:rPr>
-        <w:t xml:space="preserve">Estresse cirúrgico e medicações podem alterar temporariamente o ciclo.</w:t>
+        <w:t xml:space="preserve">O organismo retém líquido como parte da resposta inflamatória.</w:t>
+      </w:r>
+    </w:p>
+    <w:p>
+      <w:pPr>
+        <w:pStyle w:val="ListParagraph"/>
+        <w:numPr>
+          <w:ilvl w:val="0"/>
+          <w:numId w:val="2"/>
+        </w:numPr>
+        <w:spacing w:after="60"/>
+      </w:pPr>
+      <w:r>
+        <w:rPr>
+          <w:sz w:val="21"/>
+          <w:szCs w:val="21"/>
+        </w:rPr>
+        <w:t xml:space="preserve">Esse peso se resolve conforme o inchaço cede.</w:t>
       </w:r>
     </w:p>
     <w:p>
@@ -17721,24 +17806,24 @@
           <w:sz w:val="21"/>
           <w:szCs w:val="21"/>
         </w:rPr>
-        <w:t xml:space="preserve">Nenhuma medida necessária — costuma normalizar no ciclo seguinte</w:t>
-      </w:r>
-    </w:p>
-    <w:p>
-      <w:pPr>
-        <w:pStyle w:val="ListParagraph"/>
-        <w:numPr>
-          <w:ilvl w:val="0"/>
-          <w:numId w:val="2"/>
-        </w:numPr>
-        <w:spacing w:after="60"/>
-      </w:pPr>
-      <w:r>
-        <w:rPr>
-          <w:sz w:val="21"/>
-          <w:szCs w:val="21"/>
-        </w:rPr>
-        <w:t xml:space="preserve">Comente no retorno se persistir por mais de dois ciclos</w:t>
+        <w:t xml:space="preserve">Evite se pesar nas primeiras semanas</w:t>
+      </w:r>
+    </w:p>
+    <w:p>
+      <w:pPr>
+        <w:pStyle w:val="ListParagraph"/>
+        <w:numPr>
+          <w:ilvl w:val="0"/>
+          <w:numId w:val="2"/>
+        </w:numPr>
+        <w:spacing w:after="60"/>
+      </w:pPr>
+      <w:r>
+        <w:rPr>
+          <w:sz w:val="21"/>
+          <w:szCs w:val="21"/>
+        </w:rPr>
+        <w:t xml:space="preserve">Mantenha hidratação e reduza o sal</w:t>
       </w:r>
     </w:p>
     <w:p>
@@ -17772,7 +17857,7 @@
           <w:sz w:val="23"/>
           <w:szCs w:val="23"/>
         </w:rPr>
-        <w:t xml:space="preserve">Mamas altas, duras e com formato estranho</w:t>
+        <w:t xml:space="preserve">Alteração no ciclo menstrual</w:t>
       </w:r>
     </w:p>
     <w:p>
@@ -17785,21 +17870,21 @@
           <w:sz w:val="19"/>
           <w:szCs w:val="19"/>
         </w:rPr>
-        <w:t xml:space="preserve">Quando: Primeiras 4 a 8 semanas  |  Aplica-se a: apenas: Mamoplastia de aumento, Mastopexia</w:t>
-      </w:r>
-    </w:p>
-    <w:p>
-      <w:pPr>
-        <w:spacing w:after="100"/>
-      </w:pPr>
-      <w:r>
-        <w:rPr>
-          <w:b/>
-          <w:bCs/>
-          <w:sz w:val="21"/>
-          <w:szCs w:val="21"/>
-        </w:rPr>
-        <w:t xml:space="preserve">No começo as mamas ficam altas e firmes. Elas descem e naturalizam com o tempo — o processo é gradual.</w:t>
+        <w:t xml:space="preserve">Quando: Primeiro e segundo ciclos após a cirurgia  |  Aplica-se a: somente cirurgias</w:t>
+      </w:r>
+    </w:p>
+    <w:p>
+      <w:pPr>
+        <w:spacing w:after="100"/>
+      </w:pPr>
+      <w:r>
+        <w:rPr>
+          <w:b/>
+          <w:bCs/>
+          <w:sz w:val="21"/>
+          <w:szCs w:val="21"/>
+        </w:rPr>
+        <w:t xml:space="preserve">Atraso ou adiantamento da menstruação após a cirurgia é frequente.</w:t>
       </w:r>
     </w:p>
     <w:p>
@@ -17832,24 +17917,7 @@
           <w:sz w:val="21"/>
           <w:szCs w:val="21"/>
         </w:rPr>
-        <w:t xml:space="preserve">O músculo e os tecidos ainda estão contraídos e a prótese precisa acomodar.</w:t>
-      </w:r>
-    </w:p>
-    <w:p>
-      <w:pPr>
-        <w:pStyle w:val="ListParagraph"/>
-        <w:numPr>
-          <w:ilvl w:val="0"/>
-          <w:numId w:val="2"/>
-        </w:numPr>
-        <w:spacing w:after="60"/>
-      </w:pPr>
-      <w:r>
-        <w:rPr>
-          <w:sz w:val="21"/>
-          <w:szCs w:val="21"/>
-        </w:rPr>
-        <w:t xml:space="preserve">O formato só se define por volta do 3º mês.</w:t>
+        <w:t xml:space="preserve">Estresse cirúrgico e medicações podem alterar temporariamente o ciclo.</w:t>
       </w:r>
     </w:p>
     <w:p>
@@ -17882,24 +17950,24 @@
           <w:sz w:val="21"/>
           <w:szCs w:val="21"/>
         </w:rPr>
-        <w:t xml:space="preserve">Use o sutiã cirúrgico conforme orientado</w:t>
-      </w:r>
-    </w:p>
-    <w:p>
-      <w:pPr>
-        <w:pStyle w:val="ListParagraph"/>
-        <w:numPr>
-          <w:ilvl w:val="0"/>
-          <w:numId w:val="2"/>
-        </w:numPr>
-        <w:spacing w:after="60"/>
-      </w:pPr>
-      <w:r>
-        <w:rPr>
-          <w:sz w:val="21"/>
-          <w:szCs w:val="21"/>
-        </w:rPr>
-        <w:t xml:space="preserve">Não julgue o resultado antes de 3 meses</w:t>
+        <w:t xml:space="preserve">Nenhuma medida necessária — costuma normalizar no ciclo seguinte</w:t>
+      </w:r>
+    </w:p>
+    <w:p>
+      <w:pPr>
+        <w:pStyle w:val="ListParagraph"/>
+        <w:numPr>
+          <w:ilvl w:val="0"/>
+          <w:numId w:val="2"/>
+        </w:numPr>
+        <w:spacing w:after="60"/>
+      </w:pPr>
+      <w:r>
+        <w:rPr>
+          <w:sz w:val="21"/>
+          <w:szCs w:val="21"/>
+        </w:rPr>
+        <w:t xml:space="preserve">Comente no retorno se persistir por mais de dois ciclos</w:t>
       </w:r>
     </w:p>
     <w:p>
@@ -17933,7 +18001,7 @@
           <w:sz w:val="23"/>
           <w:szCs w:val="23"/>
         </w:rPr>
-        <w:t xml:space="preserve">Peito apertado e respiração curta com a prótese</w:t>
+        <w:t xml:space="preserve">Mamas altas, duras e com formato estranho</w:t>
       </w:r>
     </w:p>
     <w:p>
@@ -17946,21 +18014,21 @@
           <w:sz w:val="19"/>
           <w:szCs w:val="19"/>
         </w:rPr>
-        <w:t xml:space="preserve">Quando: Primeiras 2 a 4 semanas  |  Aplica-se a: apenas: Mamoplastia de aumento, Mastopexia</w:t>
-      </w:r>
-    </w:p>
-    <w:p>
-      <w:pPr>
-        <w:spacing w:after="100"/>
-      </w:pPr>
-      <w:r>
-        <w:rPr>
-          <w:b/>
-          <w:bCs/>
-          <w:sz w:val="21"/>
-          <w:szCs w:val="21"/>
-        </w:rPr>
-        <w:t xml:space="preserve">A sensação de peso e aperto no peito, que encurta a respiração, é comum nas primeiras semanas e melhora sozinha.</w:t>
+        <w:t xml:space="preserve">Quando: Primeiras 4 a 8 semanas  |  Aplica-se a: apenas: Mamoplastia de aumento, Mastopexia</w:t>
+      </w:r>
+    </w:p>
+    <w:p>
+      <w:pPr>
+        <w:spacing w:after="100"/>
+      </w:pPr>
+      <w:r>
+        <w:rPr>
+          <w:b/>
+          <w:bCs/>
+          <w:sz w:val="21"/>
+          <w:szCs w:val="21"/>
+        </w:rPr>
+        <w:t xml:space="preserve">No começo as mamas ficam altas e firmes. Elas descem e naturalizam com o tempo — o processo é gradual.</w:t>
       </w:r>
     </w:p>
     <w:p>
@@ -17993,41 +18061,24 @@
           <w:sz w:val="21"/>
           <w:szCs w:val="21"/>
         </w:rPr>
-        <w:t xml:space="preserve">A prótese fica sob um músculo que ainda não a acomodou, e o sutiã cirúrgico soma a própria compressão.</w:t>
-      </w:r>
-    </w:p>
-    <w:p>
-      <w:pPr>
-        <w:pStyle w:val="ListParagraph"/>
-        <w:numPr>
-          <w:ilvl w:val="0"/>
-          <w:numId w:val="2"/>
-        </w:numPr>
-        <w:spacing w:after="60"/>
-      </w:pPr>
-      <w:r>
-        <w:rPr>
-          <w:sz w:val="21"/>
-          <w:szCs w:val="21"/>
-        </w:rPr>
-        <w:t xml:space="preserve">Respirar fundo puxa exatamente essa musculatura — daí a sensação de que o ar não entra todo.</w:t>
-      </w:r>
-    </w:p>
-    <w:p>
-      <w:pPr>
-        <w:pStyle w:val="ListParagraph"/>
-        <w:numPr>
-          <w:ilvl w:val="0"/>
-          <w:numId w:val="2"/>
-        </w:numPr>
-        <w:spacing w:after="60"/>
-      </w:pPr>
-      <w:r>
-        <w:rPr>
-          <w:sz w:val="21"/>
-          <w:szCs w:val="21"/>
-        </w:rPr>
-        <w:t xml:space="preserve">A ansiedade do pós-operatório fecha o círculo: sentir o peito apertado assusta, o susto encurta mais a respiração.</w:t>
+        <w:t xml:space="preserve">O músculo e os tecidos ainda estão contraídos e a prótese precisa acomodar.</w:t>
+      </w:r>
+    </w:p>
+    <w:p>
+      <w:pPr>
+        <w:pStyle w:val="ListParagraph"/>
+        <w:numPr>
+          <w:ilvl w:val="0"/>
+          <w:numId w:val="2"/>
+        </w:numPr>
+        <w:spacing w:after="60"/>
+      </w:pPr>
+      <w:r>
+        <w:rPr>
+          <w:sz w:val="21"/>
+          <w:szCs w:val="21"/>
+        </w:rPr>
+        <w:t xml:space="preserve">O formato só se define por volta do 3º mês.</w:t>
       </w:r>
     </w:p>
     <w:p>
@@ -18060,58 +18111,24 @@
           <w:sz w:val="21"/>
           <w:szCs w:val="21"/>
         </w:rPr>
-        <w:t xml:space="preserve">Respire devagar, inspirando pelo nariz e soltando pela boca, algumas vezes ao dia</w:t>
-      </w:r>
-    </w:p>
-    <w:p>
-      <w:pPr>
-        <w:pStyle w:val="ListParagraph"/>
-        <w:numPr>
-          <w:ilvl w:val="0"/>
-          <w:numId w:val="2"/>
-        </w:numPr>
-        <w:spacing w:after="60"/>
-      </w:pPr>
-      <w:r>
-        <w:rPr>
-          <w:sz w:val="21"/>
-          <w:szCs w:val="21"/>
-        </w:rPr>
-        <w:t xml:space="preserve">Sente-se com as costas apoiadas e os ombros para trás — encolhida, a sensação piora</w:t>
-      </w:r>
-    </w:p>
-    <w:p>
-      <w:pPr>
-        <w:pStyle w:val="ListParagraph"/>
-        <w:numPr>
-          <w:ilvl w:val="0"/>
-          <w:numId w:val="2"/>
-        </w:numPr>
-        <w:spacing w:after="60"/>
-      </w:pPr>
-      <w:r>
-        <w:rPr>
-          <w:sz w:val="21"/>
-          <w:szCs w:val="21"/>
-        </w:rPr>
-        <w:t xml:space="preserve">Mantenha o sutiã cirúrgico, mas confirme com a equipe se ele não está apertado demais</w:t>
-      </w:r>
-    </w:p>
-    <w:p>
-      <w:pPr>
-        <w:pStyle w:val="ListParagraph"/>
-        <w:numPr>
-          <w:ilvl w:val="0"/>
-          <w:numId w:val="2"/>
-        </w:numPr>
-        <w:spacing w:after="60"/>
-      </w:pPr>
-      <w:r>
-        <w:rPr>
-          <w:sz w:val="21"/>
-          <w:szCs w:val="21"/>
-        </w:rPr>
-        <w:t xml:space="preserve">Procure atendimento de emergência se a falta de ar começar de repente, vier com dor no peito ou coração disparado, ou piorar ao andar — isso não é o aperto da prótese</w:t>
+        <w:t xml:space="preserve">Use o sutiã cirúrgico conforme orientado</w:t>
+      </w:r>
+    </w:p>
+    <w:p>
+      <w:pPr>
+        <w:pStyle w:val="ListParagraph"/>
+        <w:numPr>
+          <w:ilvl w:val="0"/>
+          <w:numId w:val="2"/>
+        </w:numPr>
+        <w:spacing w:after="60"/>
+      </w:pPr>
+      <w:r>
+        <w:rPr>
+          <w:sz w:val="21"/>
+          <w:szCs w:val="21"/>
+        </w:rPr>
+        <w:t xml:space="preserve">Não julgue o resultado antes de 3 meses</w:t>
       </w:r>
     </w:p>
     <w:p>

</xml_diff>

<commit_message>
Manda caminhar com todas as letras, em toda cirurgia
Caminhar era a segunda linha do guia de repouso e uma tarefa a partir do
terceiro dia. É pouco para a orientação que mais previne trombose: "repouso" a
paciente traduz como cama, e ficar parada é exatamente o que forma o coágulo.

Passa a ser a primeira coisa da rotina depois do remédio, desde o primeiro
dia, e com o que faltava para virar ação — quantas vezes, onde, e que escada
está liberada. Sem esses detalhes cada paciente inventa o próprio limite, e
inventa sempre para menos.

O guia de repouso ganha seção própria de caminhada, com o porquê e o modo
seguro de levantar da cama.

Co-Authored-By: Claude Opus 5 <noreply@anthropic.com>
Claude-Session: https://claude.ai/code/session_01RXsuhQQ6qNiyuBJF5nJZKq
</commit_message>
<xml_diff>
--- a/docs/conteudo-clinico-para-revisao.docx
+++ b/docs/conteudo-clinico-para-revisao.docx
@@ -62,7 +62,7 @@
           <w:sz w:val="19"/>
           <w:szCs w:val="19"/>
         </w:rPr>
-        <w:t xml:space="preserve">Gerado a partir do aplicativo em 20/08/2026</w:t>
+        <w:t xml:space="preserve">Gerado a partir do aplicativo em 21/08/2026</w:t>
       </w:r>
     </w:p>
     <w:p>
@@ -3358,24 +3358,41 @@
           <w:sz w:val="21"/>
           <w:szCs w:val="21"/>
         </w:rPr>
-        <w:t xml:space="preserve">Levantar da cama apenas acompanhada, devagar e em duas etapas</w:t>
-      </w:r>
-    </w:p>
-    <w:p>
-      <w:pPr>
-        <w:pStyle w:val="ListParagraph"/>
-        <w:numPr>
-          <w:ilvl w:val="0"/>
-          <w:numId w:val="2"/>
-        </w:numPr>
-        <w:spacing w:after="60"/>
-      </w:pPr>
-      <w:r>
-        <w:rPr>
-          <w:sz w:val="21"/>
-          <w:szCs w:val="21"/>
-        </w:rPr>
-        <w:t xml:space="preserve">Movimentar os pés e as pernas na cama de hora em hora</w:t>
+        <w:t xml:space="preserve">Caminhar dentro de casa várias vezes ao dia, desde o primeiro dia — pode subir escadas</w:t>
+      </w:r>
+    </w:p>
+    <w:p>
+      <w:pPr>
+        <w:pStyle w:val="ListParagraph"/>
+        <w:numPr>
+          <w:ilvl w:val="0"/>
+          <w:numId w:val="2"/>
+        </w:numPr>
+        <w:spacing w:after="60"/>
+      </w:pPr>
+      <w:r>
+        <w:rPr>
+          <w:sz w:val="21"/>
+          <w:szCs w:val="21"/>
+        </w:rPr>
+        <w:t xml:space="preserve">Levantar da cama apenas acompanhada nas primeiras vezes, devagar e em duas etapas</w:t>
+      </w:r>
+    </w:p>
+    <w:p>
+      <w:pPr>
+        <w:pStyle w:val="ListParagraph"/>
+        <w:numPr>
+          <w:ilvl w:val="0"/>
+          <w:numId w:val="2"/>
+        </w:numPr>
+        <w:spacing w:after="60"/>
+      </w:pPr>
+      <w:r>
+        <w:rPr>
+          <w:sz w:val="21"/>
+          <w:szCs w:val="21"/>
+        </w:rPr>
+        <w:t xml:space="preserve">Movimentar os pés e as pernas na cama de hora em hora, entre uma caminhada e outra</w:t>
       </w:r>
     </w:p>
     <w:p>
@@ -3791,7 +3808,7 @@
           <w:sz w:val="21"/>
           <w:szCs w:val="21"/>
         </w:rPr>
-        <w:t xml:space="preserve">Caminhar dentro de casa, várias vezes ao dia e por poucos minutos</w:t>
+        <w:t xml:space="preserve">Caminhar dentro de casa várias vezes ao dia, aumentando aos poucos — subir escadas está liberado</w:t>
       </w:r>
     </w:p>
     <w:p>
@@ -4127,6 +4144,23 @@
           <w:szCs w:val="17"/>
         </w:rPr>
         <w:t xml:space="preserve">O QUE FAZER</w:t>
+      </w:r>
+    </w:p>
+    <w:p>
+      <w:pPr>
+        <w:pStyle w:val="ListParagraph"/>
+        <w:numPr>
+          <w:ilvl w:val="0"/>
+          <w:numId w:val="2"/>
+        </w:numPr>
+        <w:spacing w:after="60"/>
+      </w:pPr>
+      <w:r>
+        <w:rPr>
+          <w:sz w:val="21"/>
+          <w:szCs w:val="21"/>
+        </w:rPr>
+        <w:t xml:space="preserve">Manter as caminhadas, aumentando a distância aos poucos</w:t>
       </w:r>
     </w:p>
     <w:p>
@@ -24145,58 +24179,104 @@
           <w:sz w:val="17"/>
           <w:szCs w:val="17"/>
         </w:rPr>
-        <w:t xml:space="preserve">MOVIMENTO DESDE O PRIMEIRO DIA</w:t>
-      </w:r>
-    </w:p>
-    <w:p>
-      <w:pPr>
-        <w:pStyle w:val="ListParagraph"/>
-        <w:numPr>
-          <w:ilvl w:val="0"/>
-          <w:numId w:val="2"/>
-        </w:numPr>
-        <w:spacing w:after="60"/>
-      </w:pPr>
-      <w:r>
-        <w:rPr>
-          <w:sz w:val="21"/>
-          <w:szCs w:val="21"/>
-        </w:rPr>
-        <w:t xml:space="preserve">Movimente pés e pernas na cama a cada hora enquanto estiver acordada</w:t>
-      </w:r>
-    </w:p>
-    <w:p>
-      <w:pPr>
-        <w:pStyle w:val="ListParagraph"/>
-        <w:numPr>
-          <w:ilvl w:val="0"/>
-          <w:numId w:val="2"/>
-        </w:numPr>
-        <w:spacing w:after="60"/>
-      </w:pPr>
-      <w:r>
-        <w:rPr>
-          <w:sz w:val="21"/>
-          <w:szCs w:val="21"/>
-        </w:rPr>
-        <w:t xml:space="preserve">Caminhe dentro de casa por poucos minutos, várias vezes ao dia</w:t>
-      </w:r>
-    </w:p>
-    <w:p>
-      <w:pPr>
-        <w:pStyle w:val="ListParagraph"/>
-        <w:numPr>
-          <w:ilvl w:val="0"/>
-          <w:numId w:val="2"/>
-        </w:numPr>
-        <w:spacing w:after="60"/>
-      </w:pPr>
-      <w:r>
-        <w:rPr>
-          <w:sz w:val="21"/>
-          <w:szCs w:val="21"/>
-        </w:rPr>
-        <w:t xml:space="preserve">A movimentação precoce é a principal prevenção de trombose</w:t>
+        <w:t xml:space="preserve">CAMINHAR DESDE O PRIMEIRO DIA</w:t>
+      </w:r>
+    </w:p>
+    <w:p>
+      <w:pPr>
+        <w:spacing w:after="100"/>
+      </w:pPr>
+      <w:r>
+        <w:rPr>
+          <w:sz w:val="21"/>
+          <w:szCs w:val="21"/>
+        </w:rPr>
+        <w:t xml:space="preserve">Caminhar é a orientação mais importante desta fase — mais do que qualquer pomada ou curativo. É o que mantém o sangue circulando nas pernas, e é a principal prevenção de trombose.</w:t>
+      </w:r>
+    </w:p>
+    <w:p>
+      <w:pPr>
+        <w:pStyle w:val="ListParagraph"/>
+        <w:numPr>
+          <w:ilvl w:val="0"/>
+          <w:numId w:val="2"/>
+        </w:numPr>
+        <w:spacing w:after="60"/>
+      </w:pPr>
+      <w:r>
+        <w:rPr>
+          <w:sz w:val="21"/>
+          <w:szCs w:val="21"/>
+        </w:rPr>
+        <w:t xml:space="preserve">Caminhe dentro de casa várias vezes ao dia, desde o primeiro dia</w:t>
+      </w:r>
+    </w:p>
+    <w:p>
+      <w:pPr>
+        <w:pStyle w:val="ListParagraph"/>
+        <w:numPr>
+          <w:ilvl w:val="0"/>
+          <w:numId w:val="2"/>
+        </w:numPr>
+        <w:spacing w:after="60"/>
+      </w:pPr>
+      <w:r>
+        <w:rPr>
+          <w:sz w:val="21"/>
+          <w:szCs w:val="21"/>
+        </w:rPr>
+        <w:t xml:space="preserve">Poucos minutos de cada vez, aumentando aos poucos conforme você se sentir</w:t>
+      </w:r>
+    </w:p>
+    <w:p>
+      <w:pPr>
+        <w:pStyle w:val="ListParagraph"/>
+        <w:numPr>
+          <w:ilvl w:val="0"/>
+          <w:numId w:val="2"/>
+        </w:numPr>
+        <w:spacing w:after="60"/>
+      </w:pPr>
+      <w:r>
+        <w:rPr>
+          <w:sz w:val="21"/>
+          <w:szCs w:val="21"/>
+        </w:rPr>
+        <w:t xml:space="preserve">Subir escadas está liberado — vá devagar e apoiada no corrimão</w:t>
+      </w:r>
+    </w:p>
+    <w:p>
+      <w:pPr>
+        <w:pStyle w:val="ListParagraph"/>
+        <w:numPr>
+          <w:ilvl w:val="0"/>
+          <w:numId w:val="2"/>
+        </w:numPr>
+        <w:spacing w:after="60"/>
+      </w:pPr>
+      <w:r>
+        <w:rPr>
+          <w:sz w:val="21"/>
+          <w:szCs w:val="21"/>
+        </w:rPr>
+        <w:t xml:space="preserve">Nas primeiras vezes, levante da cama acompanhada: sente-se na beirada, espere passar a tontura e só então fique de pé</w:t>
+      </w:r>
+    </w:p>
+    <w:p>
+      <w:pPr>
+        <w:pStyle w:val="ListParagraph"/>
+        <w:numPr>
+          <w:ilvl w:val="0"/>
+          <w:numId w:val="2"/>
+        </w:numPr>
+        <w:spacing w:after="60"/>
+      </w:pPr>
+      <w:r>
+        <w:rPr>
+          <w:sz w:val="21"/>
+          <w:szCs w:val="21"/>
+        </w:rPr>
+        <w:t xml:space="preserve">Entre uma caminhada e outra, movimente os pés e as pernas na cama a cada hora</w:t>
       </w:r>
     </w:p>
     <w:p>

</xml_diff>

<commit_message>
Leva o formato final da prótese para um ano
Dizer que aos 90 dias o formato está próximo do final entrega à paciente a
régua errada: ela julga o resultado no meio da acomodação e cobra do que ainda
vai mudar sozinho. O marco dos 90 dias passa a descrever o que de fato
acontece ali — mamas bem mais naturais, ainda acomodando — e entra um marco de
um ano para o formato final.

O cartão das mamas altas dizia a mesma coisa e foi corrigido junto: não
adiantaria a linha do tempo prometer um ano e o sintoma prometer três meses.

Co-Authored-By: Claude Opus 5 <noreply@anthropic.com>
Claude-Session: https://claude.ai/code/session_01RXsuhQQ6qNiyuBJF5nJZKq
</commit_message>
<xml_diff>
--- a/docs/conteudo-clinico-para-revisao.docx
+++ b/docs/conteudo-clinico-para-revisao.docx
@@ -6762,7 +6762,39 @@
                 <w:sz w:val="20"/>
                 <w:szCs w:val="20"/>
               </w:rPr>
-              <w:t xml:space="preserve">Formato próximo do final na maioria das pacientes</w:t>
+              <w:t xml:space="preserve">Mamas bem mais naturais, mas ainda acomodando</w:t>
+            </w:r>
+          </w:p>
+        </w:tc>
+      </w:tr>
+      <w:tr>
+        <w:tc>
+          <w:tcPr>
+            <w:tcW w:type="dxa" w:w="1100"/>
+          </w:tcPr>
+          <w:p>
+            <w:r>
+              <w:rPr>
+                <w:b/>
+                <w:bCs/>
+                <w:sz w:val="20"/>
+                <w:szCs w:val="20"/>
+              </w:rPr>
+              <w:t xml:space="preserve">D365</w:t>
+            </w:r>
+          </w:p>
+        </w:tc>
+        <w:tc>
+          <w:tcPr>
+            <w:tcW w:type="dxa" w:w="7900"/>
+          </w:tcPr>
+          <w:p>
+            <w:r>
+              <w:rPr>
+                <w:sz w:val="20"/>
+                <w:szCs w:val="20"/>
+              </w:rPr>
+              <w:t xml:space="preserve">Formato final — a acomodação completa leva cerca de um ano</w:t>
             </w:r>
           </w:p>
         </w:tc>
@@ -18112,7 +18144,7 @@
           <w:sz w:val="21"/>
           <w:szCs w:val="21"/>
         </w:rPr>
-        <w:t xml:space="preserve">O formato só se define por volta do 3º mês.</w:t>
+        <w:t xml:space="preserve">Aos 3 meses as mamas já estão bem mais naturais, mas continuam acomodando: o formato final leva cerca de um ano.</w:t>
       </w:r>
     </w:p>
     <w:p>
@@ -18162,7 +18194,7 @@
           <w:sz w:val="21"/>
           <w:szCs w:val="21"/>
         </w:rPr>
-        <w:t xml:space="preserve">Não julgue o resultado antes de 3 meses</w:t>
+        <w:t xml:space="preserve">Não julgue o resultado nos primeiros meses — ele ainda vai mudar sozinho</w:t>
       </w:r>
     </w:p>
     <w:p>

</xml_diff>

<commit_message>
Diz que a rua está liberada, e não só a casa
O app repetia "dentro de casa" em três lugares e nunca mencionava a rua. Uma
repetição dessas não é lida como omissão, é lida como proibição — e a paciente
que poderia caminhar no quarteirão fica dando voltas na sala.

Entra com as condições que a tornam segura: trajeto curto e plano, acompanhada
nas primeiras vezes, com moderação.

Co-Authored-By: Claude Opus 5 <noreply@anthropic.com>
Claude-Session: https://claude.ai/code/session_01RXsuhQQ6qNiyuBJF5nJZKq
</commit_message>
<xml_diff>
--- a/docs/conteudo-clinico-para-revisao.docx
+++ b/docs/conteudo-clinico-para-revisao.docx
@@ -4160,7 +4160,7 @@
           <w:sz w:val="21"/>
           <w:szCs w:val="21"/>
         </w:rPr>
-        <w:t xml:space="preserve">Manter as caminhadas, aumentando a distância aos poucos</w:t>
+        <w:t xml:space="preserve">Manter as caminhadas, aumentando a distância aos poucos — na rua também, com moderação</w:t>
       </w:r>
     </w:p>
     <w:p>
@@ -24291,6 +24291,23 @@
           <w:sz w:val="21"/>
           <w:szCs w:val="21"/>
         </w:rPr>
+        <w:t xml:space="preserve">Caminhar na rua também está liberado, com moderação — comece por trajetos curtos e planos, e sempre acompanhada nas primeiras vezes</w:t>
+      </w:r>
+    </w:p>
+    <w:p>
+      <w:pPr>
+        <w:pStyle w:val="ListParagraph"/>
+        <w:numPr>
+          <w:ilvl w:val="0"/>
+          <w:numId w:val="2"/>
+        </w:numPr>
+        <w:spacing w:after="60"/>
+      </w:pPr>
+      <w:r>
+        <w:rPr>
+          <w:sz w:val="21"/>
+          <w:szCs w:val="21"/>
+        </w:rPr>
         <w:t xml:space="preserve">Nas primeiras vezes, levante da cama acompanhada: sente-se na beirada, espere passar a tontura e só então fique de pé</w:t>
       </w:r>
     </w:p>

</xml_diff>

<commit_message>
Explica microfat e nanofat a quem fez enxertia
Texto do Dr. Henrique Reis, para lipoescultura, Lipo HD Concept e Face HD
Concept.

Guia próprio, e não uma seção dentro do das tecnologias: uma coisa trata a
pele por fora e a outra devolve o que foi tirado de dentro. A paciente que fez
enxertia procura pelo nome que ouviu na consulta, e é esse nome que precisa
estar na lista.

Co-Authored-By: Claude Opus 5 <noreply@anthropic.com>
Claude-Session: https://claude.ai/code/session_01RXsuhQQ6qNiyuBJF5nJZKq
</commit_message>
<xml_diff>
--- a/docs/conteudo-clinico-para-revisao.docx
+++ b/docs/conteudo-clinico-para-revisao.docx
@@ -62,7 +62,7 @@
           <w:sz w:val="19"/>
           <w:szCs w:val="19"/>
         </w:rPr>
-        <w:t xml:space="preserve">Gerado a partir do aplicativo em 21/08/2026</w:t>
+        <w:t xml:space="preserve">Gerado a partir do aplicativo em 24/08/2026</w:t>
       </w:r>
     </w:p>
     <w:p>
@@ -76,7 +76,7 @@
           <w:sz w:val="19"/>
           <w:szCs w:val="19"/>
         </w:rPr>
-        <w:t xml:space="preserve">18 procedimentos · 64 orientações de sintomas · 21 guias de cuidados</w:t>
+        <w:t xml:space="preserve">18 procedimentos · 64 orientações de sintomas · 22 guias de cuidados</w:t>
       </w:r>
     </w:p>
     <w:p>
@@ -22657,6 +22657,420 @@
           <w:sz w:val="23"/>
           <w:szCs w:val="23"/>
         </w:rPr>
+        <w:t xml:space="preserve">Microfat e Nanofat</w:t>
+      </w:r>
+    </w:p>
+    <w:p>
+      <w:pPr>
+        <w:spacing w:after="100"/>
+      </w:pPr>
+      <w:r>
+        <w:rPr>
+          <w:color w:val="6B6B6B"/>
+          <w:sz w:val="19"/>
+          <w:szCs w:val="19"/>
+        </w:rPr>
+        <w:t xml:space="preserve">"Qual é a diferença?"  |  Aplica-se a: somente cirurgias · apenas: Lipoescultura, Lipo HD Concept, Face HD Concept</w:t>
+      </w:r>
+    </w:p>
+    <w:p>
+      <w:pPr>
+        <w:spacing w:after="80" w:before="240"/>
+      </w:pPr>
+      <w:r>
+        <w:rPr>
+          <w:b/>
+          <w:bCs/>
+          <w:color w:val="067F7B"/>
+          <w:spacing w:val="30"/>
+          <w:sz w:val="17"/>
+          <w:szCs w:val="17"/>
+        </w:rPr>
+        <w:t xml:space="preserve">O QUE SÃO</w:t>
+      </w:r>
+    </w:p>
+    <w:p>
+      <w:pPr>
+        <w:spacing w:after="100"/>
+      </w:pPr>
+      <w:r>
+        <w:rPr>
+          <w:sz w:val="21"/>
+          <w:szCs w:val="21"/>
+        </w:rPr>
+        <w:t xml:space="preserve">Em algumas cirurgias, uma pequena quantidade de gordura pode ser retirada do próprio corpo, cuidadosamente preparada e utilizada em outras regiões. Dependendo da forma como essa gordura é processada, ela pode ser transformada em microfat ou nanofat.</w:t>
+      </w:r>
+    </w:p>
+    <w:p>
+      <w:pPr>
+        <w:spacing w:after="80" w:before="240"/>
+      </w:pPr>
+      <w:r>
+        <w:rPr>
+          <w:b/>
+          <w:bCs/>
+          <w:color w:val="067F7B"/>
+          <w:spacing w:val="30"/>
+          <w:sz w:val="17"/>
+          <w:szCs w:val="17"/>
+        </w:rPr>
+        <w:t xml:space="preserve">MICROFAT</w:t>
+      </w:r>
+    </w:p>
+    <w:p>
+      <w:pPr>
+        <w:spacing w:after="100"/>
+      </w:pPr>
+      <w:r>
+        <w:rPr>
+          <w:sz w:val="21"/>
+          <w:szCs w:val="21"/>
+        </w:rPr>
+        <w:t xml:space="preserve">O microfat preserva pequenas partículas de gordura e é utilizado principalmente para devolver volumes sutis, suavizar depressões e melhorar a transição entre diferentes áreas.</w:t>
+      </w:r>
+    </w:p>
+    <w:p>
+      <w:pPr>
+        <w:spacing w:after="100"/>
+      </w:pPr>
+      <w:r>
+        <w:rPr>
+          <w:sz w:val="21"/>
+          <w:szCs w:val="21"/>
+        </w:rPr>
+        <w:t xml:space="preserve">Por ser um enxerto do próprio paciente, parte da gordura transferida precisa se integrar ao novo local. Uma parcela pode ser naturalmente reabsorvida pelo organismo, por isso o resultado definitivo não deve ser avaliado nas primeiras semanas.</w:t>
+      </w:r>
+    </w:p>
+    <w:p>
+      <w:pPr>
+        <w:spacing w:after="80" w:before="240"/>
+      </w:pPr>
+      <w:r>
+        <w:rPr>
+          <w:b/>
+          <w:bCs/>
+          <w:color w:val="067F7B"/>
+          <w:spacing w:val="30"/>
+          <w:sz w:val="17"/>
+          <w:szCs w:val="17"/>
+        </w:rPr>
+        <w:t xml:space="preserve">NANOFAT</w:t>
+      </w:r>
+    </w:p>
+    <w:p>
+      <w:pPr>
+        <w:spacing w:after="100"/>
+      </w:pPr>
+      <w:r>
+        <w:rPr>
+          <w:sz w:val="21"/>
+          <w:szCs w:val="21"/>
+        </w:rPr>
+        <w:t xml:space="preserve">O nanofat passa por um processamento ainda mais delicado, tornando-se uma solução muito fina e praticamente sem função de preenchimento.</w:t>
+      </w:r>
+    </w:p>
+    <w:p>
+      <w:pPr>
+        <w:spacing w:after="100"/>
+      </w:pPr>
+      <w:r>
+        <w:rPr>
+          <w:sz w:val="21"/>
+          <w:szCs w:val="21"/>
+        </w:rPr>
+        <w:t xml:space="preserve">Seu objetivo principal é favorecer a qualidade dos tecidos. Ele pode ser indicado para áreas de pele fina, pequenas irregularidades, cicatrizes e sinais de envelhecimento, contribuindo gradualmente para uma pele com aparência mais uniforme e saudável.</w:t>
+      </w:r>
+    </w:p>
+    <w:p>
+      <w:pPr>
+        <w:spacing w:after="80" w:before="240"/>
+      </w:pPr>
+      <w:r>
+        <w:rPr>
+          <w:b/>
+          <w:bCs/>
+          <w:color w:val="067F7B"/>
+          <w:spacing w:val="30"/>
+          <w:sz w:val="17"/>
+          <w:szCs w:val="17"/>
+        </w:rPr>
+        <w:t xml:space="preserve">POR QUE ELES PODEM SER UTILIZADOS JUNTOS</w:t>
+      </w:r>
+    </w:p>
+    <w:p>
+      <w:pPr>
+        <w:spacing w:after="100"/>
+      </w:pPr>
+      <w:r>
+        <w:rPr>
+          <w:sz w:val="21"/>
+          <w:szCs w:val="21"/>
+        </w:rPr>
+        <w:t xml:space="preserve">As duas técnicas atuam de maneiras diferentes e complementares:</w:t>
+      </w:r>
+    </w:p>
+    <w:p>
+      <w:pPr>
+        <w:pStyle w:val="ListParagraph"/>
+        <w:numPr>
+          <w:ilvl w:val="0"/>
+          <w:numId w:val="2"/>
+        </w:numPr>
+        <w:spacing w:after="60"/>
+      </w:pPr>
+      <w:r>
+        <w:rPr>
+          <w:sz w:val="21"/>
+          <w:szCs w:val="21"/>
+        </w:rPr>
+        <w:t xml:space="preserve">O microfat ajuda a restaurar estrutura e volume</w:t>
+      </w:r>
+    </w:p>
+    <w:p>
+      <w:pPr>
+        <w:pStyle w:val="ListParagraph"/>
+        <w:numPr>
+          <w:ilvl w:val="0"/>
+          <w:numId w:val="2"/>
+        </w:numPr>
+        <w:spacing w:after="60"/>
+      </w:pPr>
+      <w:r>
+        <w:rPr>
+          <w:sz w:val="21"/>
+          <w:szCs w:val="21"/>
+        </w:rPr>
+        <w:t xml:space="preserve">O nanofat atua principalmente na qualidade da pele e dos tecidos</w:t>
+      </w:r>
+    </w:p>
+    <w:p>
+      <w:pPr>
+        <w:spacing w:after="80" w:before="240"/>
+      </w:pPr>
+      <w:r>
+        <w:rPr>
+          <w:b/>
+          <w:bCs/>
+          <w:color w:val="067F7B"/>
+          <w:spacing w:val="30"/>
+          <w:sz w:val="17"/>
+          <w:szCs w:val="17"/>
+        </w:rPr>
+        <w:t xml:space="preserve">A INDICAÇÃO</w:t>
+      </w:r>
+    </w:p>
+    <w:p>
+      <w:pPr>
+        <w:spacing w:after="100"/>
+      </w:pPr>
+      <w:r>
+        <w:rPr>
+          <w:sz w:val="21"/>
+          <w:szCs w:val="21"/>
+        </w:rPr>
+        <w:t xml:space="preserve">Depende da região tratada, das características da pele e dos objetivos definidos durante a avaliação médica.</w:t>
+      </w:r>
+    </w:p>
+    <w:p>
+      <w:pPr>
+        <w:spacing w:after="80" w:before="240"/>
+      </w:pPr>
+      <w:r>
+        <w:rPr>
+          <w:b/>
+          <w:bCs/>
+          <w:color w:val="067F7B"/>
+          <w:spacing w:val="30"/>
+          <w:sz w:val="17"/>
+          <w:szCs w:val="17"/>
+        </w:rPr>
+        <w:t xml:space="preserve">O QUE ESPERAR APÓS O PROCEDIMENTO</w:t>
+      </w:r>
+    </w:p>
+    <w:p>
+      <w:pPr>
+        <w:spacing w:after="100"/>
+      </w:pPr>
+      <w:r>
+        <w:rPr>
+          <w:sz w:val="21"/>
+          <w:szCs w:val="21"/>
+        </w:rPr>
+        <w:t xml:space="preserve">Nos primeiros dias, é comum apresentar inchaço, sensibilidade e algumas equimoses tanto na região tratada quanto no local de retirada da gordura. Pequenas assimetrias também podem ocorrer enquanto o edema estiver presente.</w:t>
+      </w:r>
+    </w:p>
+    <w:p>
+      <w:pPr>
+        <w:spacing w:after="100"/>
+      </w:pPr>
+      <w:r>
+        <w:rPr>
+          <w:sz w:val="21"/>
+          <w:szCs w:val="21"/>
+        </w:rPr>
+        <w:t xml:space="preserve">O resultado se torna mais natural à medida que o inchaço diminui e os tecidos se acomodam. A integração do microfat e os efeitos do nanofat acontecem gradualmente, ao longo dos meses.</w:t>
+      </w:r>
+    </w:p>
+    <w:p>
+      <w:pPr>
+        <w:spacing w:after="80" w:before="240"/>
+      </w:pPr>
+      <w:r>
+        <w:rPr>
+          <w:b/>
+          <w:bCs/>
+          <w:color w:val="067F7B"/>
+          <w:spacing w:val="30"/>
+          <w:sz w:val="17"/>
+          <w:szCs w:val="17"/>
+        </w:rPr>
+        <w:t xml:space="preserve">CUIDADOS IMPORTANTES</w:t>
+      </w:r>
+    </w:p>
+    <w:p>
+      <w:pPr>
+        <w:pStyle w:val="ListParagraph"/>
+        <w:numPr>
+          <w:ilvl w:val="0"/>
+          <w:numId w:val="2"/>
+        </w:numPr>
+        <w:spacing w:after="60"/>
+      </w:pPr>
+      <w:r>
+        <w:rPr>
+          <w:sz w:val="21"/>
+          <w:szCs w:val="21"/>
+        </w:rPr>
+        <w:t xml:space="preserve">Não massageie nem pressione a região enxertada sem autorização da equipe</w:t>
+      </w:r>
+    </w:p>
+    <w:p>
+      <w:pPr>
+        <w:pStyle w:val="ListParagraph"/>
+        <w:numPr>
+          <w:ilvl w:val="0"/>
+          <w:numId w:val="2"/>
+        </w:numPr>
+        <w:spacing w:after="60"/>
+      </w:pPr>
+      <w:r>
+        <w:rPr>
+          <w:sz w:val="21"/>
+          <w:szCs w:val="21"/>
+        </w:rPr>
+        <w:t xml:space="preserve">Evite exposição solar enquanto houver equimoses</w:t>
+      </w:r>
+    </w:p>
+    <w:p>
+      <w:pPr>
+        <w:pStyle w:val="ListParagraph"/>
+        <w:numPr>
+          <w:ilvl w:val="0"/>
+          <w:numId w:val="2"/>
+        </w:numPr>
+        <w:spacing w:after="60"/>
+      </w:pPr>
+      <w:r>
+        <w:rPr>
+          <w:sz w:val="21"/>
+          <w:szCs w:val="21"/>
+        </w:rPr>
+        <w:t xml:space="preserve">Utilize somente os produtos e medicamentos recomendados</w:t>
+      </w:r>
+    </w:p>
+    <w:p>
+      <w:pPr>
+        <w:pStyle w:val="ListParagraph"/>
+        <w:numPr>
+          <w:ilvl w:val="0"/>
+          <w:numId w:val="2"/>
+        </w:numPr>
+        <w:spacing w:after="60"/>
+      </w:pPr>
+      <w:r>
+        <w:rPr>
+          <w:sz w:val="21"/>
+          <w:szCs w:val="21"/>
+        </w:rPr>
+        <w:t xml:space="preserve">Não fume, pois o cigarro prejudica a circulação e a integração da gordura</w:t>
+      </w:r>
+    </w:p>
+    <w:p>
+      <w:pPr>
+        <w:pStyle w:val="ListParagraph"/>
+        <w:numPr>
+          <w:ilvl w:val="0"/>
+          <w:numId w:val="2"/>
+        </w:numPr>
+        <w:spacing w:after="60"/>
+      </w:pPr>
+      <w:r>
+        <w:rPr>
+          <w:sz w:val="21"/>
+          <w:szCs w:val="21"/>
+        </w:rPr>
+        <w:t xml:space="preserve">Compareça aos retornos programados para acompanhamento da evolução</w:t>
+      </w:r>
+    </w:p>
+    <w:p>
+      <w:pPr>
+        <w:spacing w:after="80" w:before="240"/>
+      </w:pPr>
+      <w:r>
+        <w:rPr>
+          <w:b/>
+          <w:bCs/>
+          <w:color w:val="067F7B"/>
+          <w:spacing w:val="30"/>
+          <w:sz w:val="17"/>
+          <w:szCs w:val="17"/>
+        </w:rPr>
+        <w:t xml:space="preserve">QUANDO FALAR COM A EQUIPE</w:t>
+      </w:r>
+    </w:p>
+    <w:p>
+      <w:pPr>
+        <w:spacing w:after="100"/>
+      </w:pPr>
+      <w:r>
+        <w:rPr>
+          <w:sz w:val="21"/>
+          <w:szCs w:val="21"/>
+        </w:rPr>
+        <w:t xml:space="preserve">Caso perceba dor crescente, vermelhidão intensa, calor local, secreção, febre ou uma alteração repentina na região tratada, entre em contato com a nossa equipe.</w:t>
+      </w:r>
+    </w:p>
+    <w:p>
+      <w:pPr>
+        <w:pBdr>
+          <w:bottom w:val="dotted" w:color="C8C8C8" w:sz="4" w:space="4"/>
+        </w:pBdr>
+        <w:spacing w:after="240" w:before="100"/>
+      </w:pPr>
+      <w:r>
+        <w:rPr>
+          <w:i/>
+          <w:iCs/>
+          <w:color w:val="AAAAAA"/>
+          <w:sz w:val="17"/>
+          <w:szCs w:val="17"/>
+        </w:rPr>
+        <w:t xml:space="preserve">Correção: </w:t>
+      </w:r>
+    </w:p>
+    <w:p>
+      <w:pPr>
+        <w:pStyle w:val="Heading3"/>
+        <w:spacing w:after="100" w:before="280"/>
+      </w:pPr>
+      <w:r>
+        <w:rPr>
+          <w:b/>
+          <w:bCs/>
+          <w:color w:val="111111"/>
+          <w:sz w:val="23"/>
+          <w:szCs w:val="23"/>
+        </w:rPr>
         <w:t xml:space="preserve">Cinta, malha e sutiã cirúrgico</w:t>
       </w:r>
     </w:p>

</xml_diff>

<commit_message>
Tira a assimetria da lista de "atenção"
"Assimetria que persiste após 3 meses" marcava o 90º dia como a data em que a
diferença entre os lados vira problema. Não é informação: a paciente não tem o
que fazer com essa data, e ela transforma cada olhada no espelho a partir dali
numa checagem ansiosa — por algo que ainda vai mudar sozinho.

Passa a "Um lado diferente do outro", esperado, durante todo o primeiro ano.
Diz o que ela precisa saber: nenhum corpo é simétrico, o inchaço não cede por
igual, e o resultado se avalia com um ano.

O marco de 90 dias da lipoescultura dizia "contorno já definido" e foi
corrigido junto, com o marco de um ano que faltava — não adiantaria o sintoma
prometer um ano e a linha do tempo prometer três meses.

Co-Authored-By: Claude Opus 5 <noreply@anthropic.com>
Claude-Session: https://claude.ai/code/session_01RXsuhQQ6qNiyuBJF5nJZKq
</commit_message>
<xml_diff>
--- a/docs/conteudo-clinico-para-revisao.docx
+++ b/docs/conteudo-clinico-para-revisao.docx
@@ -7645,7 +7645,39 @@
                 <w:sz w:val="20"/>
                 <w:szCs w:val="20"/>
               </w:rPr>
-              <w:t xml:space="preserve">Contorno já definido na maioria das pacientes, com inchaço residual</w:t>
+              <w:t xml:space="preserve">Contorno bem mais próximo, ainda com inchaço residual</w:t>
+            </w:r>
+          </w:p>
+        </w:tc>
+      </w:tr>
+      <w:tr>
+        <w:tc>
+          <w:tcPr>
+            <w:tcW w:type="dxa" w:w="1100"/>
+          </w:tcPr>
+          <w:p>
+            <w:r>
+              <w:rPr>
+                <w:b/>
+                <w:bCs/>
+                <w:sz w:val="20"/>
+                <w:szCs w:val="20"/>
+              </w:rPr>
+              <w:t xml:space="preserve">D365</w:t>
+            </w:r>
+          </w:p>
+        </w:tc>
+        <w:tc>
+          <w:tcPr>
+            <w:tcW w:type="dxa" w:w="7900"/>
+          </w:tcPr>
+          <w:p>
+            <w:r>
+              <w:rPr>
+                <w:sz w:val="20"/>
+                <w:szCs w:val="20"/>
+              </w:rPr>
+              <w:t xml:space="preserve">Resultado final do contorno — entre 6 e 12 meses, conforme cada paciente</w:t>
             </w:r>
           </w:p>
         </w:tc>
@@ -12526,7 +12558,7 @@
           <w:sz w:val="26"/>
           <w:szCs w:val="26"/>
         </w:rPr>
-        <w:t xml:space="preserve">ATENÇÃO — 16 orientações</w:t>
+        <w:t xml:space="preserve">ATENÇÃO — 15 orientações</w:t>
       </w:r>
     </w:p>
     <w:p>
@@ -13737,7 +13769,7 @@
           <w:sz w:val="23"/>
           <w:szCs w:val="23"/>
         </w:rPr>
-        <w:t xml:space="preserve">Assimetria que persiste após 3 meses</w:t>
+        <w:t xml:space="preserve">Mama endurecendo e mudando de formato</w:t>
       </w:r>
     </w:p>
     <w:p>
@@ -13750,21 +13782,21 @@
           <w:sz w:val="19"/>
           <w:szCs w:val="19"/>
         </w:rPr>
-        <w:t xml:space="preserve">Quando: A partir do 3º mês  |  Aplica-se a: somente cirurgias</w:t>
-      </w:r>
-    </w:p>
-    <w:p>
-      <w:pPr>
-        <w:spacing w:after="100"/>
-      </w:pPr>
-      <w:r>
-        <w:rPr>
-          <w:b/>
-          <w:bCs/>
-          <w:sz w:val="21"/>
-          <w:szCs w:val="21"/>
-        </w:rPr>
-        <w:t xml:space="preserve">Pequenas diferenças entre os lados são normais e definitivas em qualquer corpo. Diferença marcante após 3 meses deve ser conversada no retorno.</w:t>
+        <w:t xml:space="preserve">Quando: A partir do 3º mês  |  Aplica-se a: apenas: Mamoplastia de aumento, Mastopexia</w:t>
+      </w:r>
+    </w:p>
+    <w:p>
+      <w:pPr>
+        <w:spacing w:after="100"/>
+      </w:pPr>
+      <w:r>
+        <w:rPr>
+          <w:b/>
+          <w:bCs/>
+          <w:sz w:val="21"/>
+          <w:szCs w:val="21"/>
+        </w:rPr>
+        <w:t xml:space="preserve">Endurecimento progressivo, com a mama subindo ou ficando mais redonda e dolorida, deve ser avaliado.</w:t>
       </w:r>
     </w:p>
     <w:p>
@@ -13797,24 +13829,24 @@
           <w:sz w:val="21"/>
           <w:szCs w:val="21"/>
         </w:rPr>
-        <w:t xml:space="preserve">Nas primeiras semanas a assimetria quase sempre é apenas inchaço desigual.</w:t>
-      </w:r>
-    </w:p>
-    <w:p>
-      <w:pPr>
-        <w:pStyle w:val="ListParagraph"/>
-        <w:numPr>
-          <w:ilvl w:val="0"/>
-          <w:numId w:val="2"/>
-        </w:numPr>
-        <w:spacing w:after="60"/>
-      </w:pPr>
-      <w:r>
-        <w:rPr>
-          <w:sz w:val="21"/>
-          <w:szCs w:val="21"/>
-        </w:rPr>
-        <w:t xml:space="preserve">Após a estabilização, o que persiste pode ser avaliado com calma.</w:t>
+        <w:t xml:space="preserve">Pode ser contratura capsular, uma reação da cápsula que o corpo forma ao redor da prótese.</w:t>
+      </w:r>
+    </w:p>
+    <w:p>
+      <w:pPr>
+        <w:pStyle w:val="ListParagraph"/>
+        <w:numPr>
+          <w:ilvl w:val="0"/>
+          <w:numId w:val="2"/>
+        </w:numPr>
+        <w:spacing w:after="60"/>
+      </w:pPr>
+      <w:r>
+        <w:rPr>
+          <w:sz w:val="21"/>
+          <w:szCs w:val="21"/>
+        </w:rPr>
+        <w:t xml:space="preserve">É pouco frequente e tem tratamento.</w:t>
       </w:r>
     </w:p>
     <w:p>
@@ -13847,24 +13879,24 @@
           <w:sz w:val="21"/>
           <w:szCs w:val="21"/>
         </w:rPr>
-        <w:t xml:space="preserve">Leve suas dúvidas e fotos ao retorno</w:t>
-      </w:r>
-    </w:p>
-    <w:p>
-      <w:pPr>
-        <w:pStyle w:val="ListParagraph"/>
-        <w:numPr>
-          <w:ilvl w:val="0"/>
-          <w:numId w:val="2"/>
-        </w:numPr>
-        <w:spacing w:after="60"/>
-      </w:pPr>
-      <w:r>
-        <w:rPr>
-          <w:sz w:val="21"/>
-          <w:szCs w:val="21"/>
-        </w:rPr>
-        <w:t xml:space="preserve">Evite conclusões antes de 3 a 6 meses</w:t>
+        <w:t xml:space="preserve">Agende avaliação</w:t>
+      </w:r>
+    </w:p>
+    <w:p>
+      <w:pPr>
+        <w:pStyle w:val="ListParagraph"/>
+        <w:numPr>
+          <w:ilvl w:val="0"/>
+          <w:numId w:val="2"/>
+        </w:numPr>
+        <w:spacing w:after="60"/>
+      </w:pPr>
+      <w:r>
+        <w:rPr>
+          <w:sz w:val="21"/>
+          <w:szCs w:val="21"/>
+        </w:rPr>
+        <w:t xml:space="preserve">Compare com fotos de meses anteriores</w:t>
       </w:r>
     </w:p>
     <w:p>
@@ -13898,7 +13930,7 @@
           <w:sz w:val="23"/>
           <w:szCs w:val="23"/>
         </w:rPr>
-        <w:t xml:space="preserve">Mama endurecendo e mudando de formato</w:t>
+        <w:t xml:space="preserve">Formigamento ou dormência causados pela cinta</w:t>
       </w:r>
     </w:p>
     <w:p>
@@ -13911,21 +13943,21 @@
           <w:sz w:val="19"/>
           <w:szCs w:val="19"/>
         </w:rPr>
-        <w:t xml:space="preserve">Quando: A partir do 3º mês  |  Aplica-se a: apenas: Mamoplastia de aumento, Mastopexia</w:t>
-      </w:r>
-    </w:p>
-    <w:p>
-      <w:pPr>
-        <w:spacing w:after="100"/>
-      </w:pPr>
-      <w:r>
-        <w:rPr>
-          <w:b/>
-          <w:bCs/>
-          <w:sz w:val="21"/>
-          <w:szCs w:val="21"/>
-        </w:rPr>
-        <w:t xml:space="preserve">Endurecimento progressivo, com a mama subindo ou ficando mais redonda e dolorida, deve ser avaliado.</w:t>
+        <w:t xml:space="preserve">Quando: Enquanto usar a compressão  |  Aplica-se a: somente cirurgias</w:t>
+      </w:r>
+    </w:p>
+    <w:p>
+      <w:pPr>
+        <w:spacing w:after="100"/>
+      </w:pPr>
+      <w:r>
+        <w:rPr>
+          <w:b/>
+          <w:bCs/>
+          <w:sz w:val="21"/>
+          <w:szCs w:val="21"/>
+        </w:rPr>
+        <w:t xml:space="preserve">Cinta ou malha apertada demais pode comprimir nervos e prejudicar a circulação. Ela deve comprimir, não sufocar.</w:t>
       </w:r>
     </w:p>
     <w:p>
@@ -13958,24 +13990,7 @@
           <w:sz w:val="21"/>
           <w:szCs w:val="21"/>
         </w:rPr>
-        <w:t xml:space="preserve">Pode ser contratura capsular, uma reação da cápsula que o corpo forma ao redor da prótese.</w:t>
-      </w:r>
-    </w:p>
-    <w:p>
-      <w:pPr>
-        <w:pStyle w:val="ListParagraph"/>
-        <w:numPr>
-          <w:ilvl w:val="0"/>
-          <w:numId w:val="2"/>
-        </w:numPr>
-        <w:spacing w:after="60"/>
-      </w:pPr>
-      <w:r>
-        <w:rPr>
-          <w:sz w:val="21"/>
-          <w:szCs w:val="21"/>
-        </w:rPr>
-        <w:t xml:space="preserve">É pouco frequente e tem tratamento.</w:t>
+        <w:t xml:space="preserve">A compressão certa é firme e confortável — você deve conseguir passar dois dedos entre a cinta e a pele.</w:t>
       </w:r>
     </w:p>
     <w:p>
@@ -14008,24 +14023,41 @@
           <w:sz w:val="21"/>
           <w:szCs w:val="21"/>
         </w:rPr>
-        <w:t xml:space="preserve">Agende avaliação</w:t>
-      </w:r>
-    </w:p>
-    <w:p>
-      <w:pPr>
-        <w:pStyle w:val="ListParagraph"/>
-        <w:numPr>
-          <w:ilvl w:val="0"/>
-          <w:numId w:val="2"/>
-        </w:numPr>
-        <w:spacing w:after="60"/>
-      </w:pPr>
-      <w:r>
-        <w:rPr>
-          <w:sz w:val="21"/>
-          <w:szCs w:val="21"/>
-        </w:rPr>
-        <w:t xml:space="preserve">Compare com fotos de meses anteriores</w:t>
+        <w:t xml:space="preserve">Afrouxe ou troque para o tamanho adequado</w:t>
+      </w:r>
+    </w:p>
+    <w:p>
+      <w:pPr>
+        <w:pStyle w:val="ListParagraph"/>
+        <w:numPr>
+          <w:ilvl w:val="0"/>
+          <w:numId w:val="2"/>
+        </w:numPr>
+        <w:spacing w:after="60"/>
+      </w:pPr>
+      <w:r>
+        <w:rPr>
+          <w:sz w:val="21"/>
+          <w:szCs w:val="21"/>
+        </w:rPr>
+        <w:t xml:space="preserve">Comunique a equipe se o sintoma persistir sem a cinta</w:t>
+      </w:r>
+    </w:p>
+    <w:p>
+      <w:pPr>
+        <w:pStyle w:val="ListParagraph"/>
+        <w:numPr>
+          <w:ilvl w:val="0"/>
+          <w:numId w:val="2"/>
+        </w:numPr>
+        <w:spacing w:after="60"/>
+      </w:pPr>
+      <w:r>
+        <w:rPr>
+          <w:sz w:val="21"/>
+          <w:szCs w:val="21"/>
+        </w:rPr>
+        <w:t xml:space="preserve">Procure atendimento se a pele ficar pálida, fria ou roxa</w:t>
       </w:r>
     </w:p>
     <w:p>
@@ -14059,7 +14091,7 @@
           <w:sz w:val="23"/>
           <w:szCs w:val="23"/>
         </w:rPr>
-        <w:t xml:space="preserve">Formigamento ou dormência causados pela cinta</w:t>
+        <w:t xml:space="preserve">Pálpebra ou sobrancelha caída</w:t>
       </w:r>
     </w:p>
     <w:p>
@@ -14072,21 +14104,21 @@
           <w:sz w:val="19"/>
           <w:szCs w:val="19"/>
         </w:rPr>
-        <w:t xml:space="preserve">Quando: Enquanto usar a compressão  |  Aplica-se a: somente cirurgias</w:t>
-      </w:r>
-    </w:p>
-    <w:p>
-      <w:pPr>
-        <w:spacing w:after="100"/>
-      </w:pPr>
-      <w:r>
-        <w:rPr>
-          <w:b/>
-          <w:bCs/>
-          <w:sz w:val="21"/>
-          <w:szCs w:val="21"/>
-        </w:rPr>
-        <w:t xml:space="preserve">Cinta ou malha apertada demais pode comprimir nervos e prejudicar a circulação. Ela deve comprimir, não sufocar.</w:t>
+        <w:t xml:space="preserve">Quando: Entre o 3º e o 15º dia  |  Aplica-se a: somente procedimentos de consultório · apenas: Toxina botulínica</w:t>
+      </w:r>
+    </w:p>
+    <w:p>
+      <w:pPr>
+        <w:spacing w:after="100"/>
+      </w:pPr>
+      <w:r>
+        <w:rPr>
+          <w:b/>
+          <w:bCs/>
+          <w:sz w:val="21"/>
+          <w:szCs w:val="21"/>
+        </w:rPr>
+        <w:t xml:space="preserve">É incomum, temporário e reversível. Comunique a equipe: em muitos casos há um colírio que ameniza enquanto passa.</w:t>
       </w:r>
     </w:p>
     <w:p>
@@ -14119,7 +14151,24 @@
           <w:sz w:val="21"/>
           <w:szCs w:val="21"/>
         </w:rPr>
-        <w:t xml:space="preserve">A compressão certa é firme e confortável — você deve conseguir passar dois dedos entre a cinta e a pele.</w:t>
+        <w:t xml:space="preserve">A toxina pode atingir levemente um músculo vizinho ao tratado.</w:t>
+      </w:r>
+    </w:p>
+    <w:p>
+      <w:pPr>
+        <w:pStyle w:val="ListParagraph"/>
+        <w:numPr>
+          <w:ilvl w:val="0"/>
+          <w:numId w:val="2"/>
+        </w:numPr>
+        <w:spacing w:after="60"/>
+      </w:pPr>
+      <w:r>
+        <w:rPr>
+          <w:sz w:val="21"/>
+          <w:szCs w:val="21"/>
+        </w:rPr>
+        <w:t xml:space="preserve">O efeito é sempre passageiro e melhora ao longo de algumas semanas.</w:t>
       </w:r>
     </w:p>
     <w:p>
@@ -14152,41 +14201,41 @@
           <w:sz w:val="21"/>
           <w:szCs w:val="21"/>
         </w:rPr>
-        <w:t xml:space="preserve">Afrouxe ou troque para o tamanho adequado</w:t>
-      </w:r>
-    </w:p>
-    <w:p>
-      <w:pPr>
-        <w:pStyle w:val="ListParagraph"/>
-        <w:numPr>
-          <w:ilvl w:val="0"/>
-          <w:numId w:val="2"/>
-        </w:numPr>
-        <w:spacing w:after="60"/>
-      </w:pPr>
-      <w:r>
-        <w:rPr>
-          <w:sz w:val="21"/>
-          <w:szCs w:val="21"/>
-        </w:rPr>
-        <w:t xml:space="preserve">Comunique a equipe se o sintoma persistir sem a cinta</w:t>
-      </w:r>
-    </w:p>
-    <w:p>
-      <w:pPr>
-        <w:pStyle w:val="ListParagraph"/>
-        <w:numPr>
-          <w:ilvl w:val="0"/>
-          <w:numId w:val="2"/>
-        </w:numPr>
-        <w:spacing w:after="60"/>
-      </w:pPr>
-      <w:r>
-        <w:rPr>
-          <w:sz w:val="21"/>
-          <w:szCs w:val="21"/>
-        </w:rPr>
-        <w:t xml:space="preserve">Procure atendimento se a pele ficar pálida, fria ou roxa</w:t>
+        <w:t xml:space="preserve">Envie uma foto de frente com o rosto relaxado e outra levantando a sobrancelha</w:t>
+      </w:r>
+    </w:p>
+    <w:p>
+      <w:pPr>
+        <w:pStyle w:val="ListParagraph"/>
+        <w:numPr>
+          <w:ilvl w:val="0"/>
+          <w:numId w:val="2"/>
+        </w:numPr>
+        <w:spacing w:after="60"/>
+      </w:pPr>
+      <w:r>
+        <w:rPr>
+          <w:sz w:val="21"/>
+          <w:szCs w:val="21"/>
+        </w:rPr>
+        <w:t xml:space="preserve">Agende avaliação com a equipe</w:t>
+      </w:r>
+    </w:p>
+    <w:p>
+      <w:pPr>
+        <w:pStyle w:val="ListParagraph"/>
+        <w:numPr>
+          <w:ilvl w:val="0"/>
+          <w:numId w:val="2"/>
+        </w:numPr>
+        <w:spacing w:after="60"/>
+      </w:pPr>
+      <w:r>
+        <w:rPr>
+          <w:sz w:val="21"/>
+          <w:szCs w:val="21"/>
+        </w:rPr>
+        <w:t xml:space="preserve">Evite massagear a região</w:t>
       </w:r>
     </w:p>
     <w:p>
@@ -14220,7 +14269,7 @@
           <w:sz w:val="23"/>
           <w:szCs w:val="23"/>
         </w:rPr>
-        <w:t xml:space="preserve">Pálpebra ou sobrancelha caída</w:t>
+        <w:t xml:space="preserve">Um lado ficou diferente do outro</w:t>
       </w:r>
     </w:p>
     <w:p>
@@ -14233,21 +14282,21 @@
           <w:sz w:val="19"/>
           <w:szCs w:val="19"/>
         </w:rPr>
-        <w:t xml:space="preserve">Quando: Entre o 3º e o 15º dia  |  Aplica-se a: somente procedimentos de consultório · apenas: Toxina botulínica</w:t>
-      </w:r>
-    </w:p>
-    <w:p>
-      <w:pPr>
-        <w:spacing w:after="100"/>
-      </w:pPr>
-      <w:r>
-        <w:rPr>
-          <w:b/>
-          <w:bCs/>
-          <w:sz w:val="21"/>
-          <w:szCs w:val="21"/>
-        </w:rPr>
-        <w:t xml:space="preserve">É incomum, temporário e reversível. Comunique a equipe: em muitos casos há um colírio que ameniza enquanto passa.</w:t>
+        <w:t xml:space="preserve">Quando: A partir do 15º dia  |  Aplica-se a: somente procedimentos de consultório · apenas: Toxina botulínica, Preenchimento</w:t>
+      </w:r>
+    </w:p>
+    <w:p>
+      <w:pPr>
+        <w:spacing w:after="100"/>
+      </w:pPr>
+      <w:r>
+        <w:rPr>
+          <w:b/>
+          <w:bCs/>
+          <w:sz w:val="21"/>
+          <w:szCs w:val="21"/>
+        </w:rPr>
+        <w:t xml:space="preserve">Antes de 15 dias o efeito ainda está se completando e a diferença costuma se resolver sozinha. Depois disso, o ajuste é simples.</w:t>
       </w:r>
     </w:p>
     <w:p>
@@ -14280,24 +14329,24 @@
           <w:sz w:val="21"/>
           <w:szCs w:val="21"/>
         </w:rPr>
-        <w:t xml:space="preserve">A toxina pode atingir levemente um músculo vizinho ao tratado.</w:t>
-      </w:r>
-    </w:p>
-    <w:p>
-      <w:pPr>
-        <w:pStyle w:val="ListParagraph"/>
-        <w:numPr>
-          <w:ilvl w:val="0"/>
-          <w:numId w:val="2"/>
-        </w:numPr>
-        <w:spacing w:after="60"/>
-      </w:pPr>
-      <w:r>
-        <w:rPr>
-          <w:sz w:val="21"/>
-          <w:szCs w:val="21"/>
-        </w:rPr>
-        <w:t xml:space="preserve">O efeito é sempre passageiro e melhora ao longo de algumas semanas.</w:t>
+        <w:t xml:space="preserve">A musculatura dos dois lados do rosto raramente é idêntica, e nem sempre responde igual.</w:t>
+      </w:r>
+    </w:p>
+    <w:p>
+      <w:pPr>
+        <w:pStyle w:val="ListParagraph"/>
+        <w:numPr>
+          <w:ilvl w:val="0"/>
+          <w:numId w:val="2"/>
+        </w:numPr>
+        <w:spacing w:after="60"/>
+      </w:pPr>
+      <w:r>
+        <w:rPr>
+          <w:sz w:val="21"/>
+          <w:szCs w:val="21"/>
+        </w:rPr>
+        <w:t xml:space="preserve">Pequenos retoques fazem parte do tratamento e costumam ser feitos na avaliação de retorno.</w:t>
       </w:r>
     </w:p>
     <w:p>
@@ -14330,41 +14379,24 @@
           <w:sz w:val="21"/>
           <w:szCs w:val="21"/>
         </w:rPr>
-        <w:t xml:space="preserve">Envie uma foto de frente com o rosto relaxado e outra levantando a sobrancelha</w:t>
-      </w:r>
-    </w:p>
-    <w:p>
-      <w:pPr>
-        <w:pStyle w:val="ListParagraph"/>
-        <w:numPr>
-          <w:ilvl w:val="0"/>
-          <w:numId w:val="2"/>
-        </w:numPr>
-        <w:spacing w:after="60"/>
-      </w:pPr>
-      <w:r>
-        <w:rPr>
-          <w:sz w:val="21"/>
-          <w:szCs w:val="21"/>
-        </w:rPr>
-        <w:t xml:space="preserve">Agende avaliação com a equipe</w:t>
-      </w:r>
-    </w:p>
-    <w:p>
-      <w:pPr>
-        <w:pStyle w:val="ListParagraph"/>
-        <w:numPr>
-          <w:ilvl w:val="0"/>
-          <w:numId w:val="2"/>
-        </w:numPr>
-        <w:spacing w:after="60"/>
-      </w:pPr>
-      <w:r>
-        <w:rPr>
-          <w:sz w:val="21"/>
-          <w:szCs w:val="21"/>
-        </w:rPr>
-        <w:t xml:space="preserve">Evite massagear a região</w:t>
+        <w:t xml:space="preserve">Aguarde completar 15 dias antes de avaliar</w:t>
+      </w:r>
+    </w:p>
+    <w:p>
+      <w:pPr>
+        <w:pStyle w:val="ListParagraph"/>
+        <w:numPr>
+          <w:ilvl w:val="0"/>
+          <w:numId w:val="2"/>
+        </w:numPr>
+        <w:spacing w:after="60"/>
+      </w:pPr>
+      <w:r>
+        <w:rPr>
+          <w:sz w:val="21"/>
+          <w:szCs w:val="21"/>
+        </w:rPr>
+        <w:t xml:space="preserve">Leve fotos ao retorno, com a expressão em repouso e em movimento</w:t>
       </w:r>
     </w:p>
     <w:p>
@@ -14398,7 +14430,7 @@
           <w:sz w:val="23"/>
           <w:szCs w:val="23"/>
         </w:rPr>
-        <w:t xml:space="preserve">Um lado ficou diferente do outro</w:t>
+        <w:t xml:space="preserve">Caroço que persiste ou aparece semanas depois</w:t>
       </w:r>
     </w:p>
     <w:p>
@@ -14411,21 +14443,21 @@
           <w:sz w:val="19"/>
           <w:szCs w:val="19"/>
         </w:rPr>
-        <w:t xml:space="preserve">Quando: A partir do 15º dia  |  Aplica-se a: somente procedimentos de consultório · apenas: Toxina botulínica, Preenchimento</w:t>
-      </w:r>
-    </w:p>
-    <w:p>
-      <w:pPr>
-        <w:spacing w:after="100"/>
-      </w:pPr>
-      <w:r>
-        <w:rPr>
-          <w:b/>
-          <w:bCs/>
-          <w:sz w:val="21"/>
-          <w:szCs w:val="21"/>
-        </w:rPr>
-        <w:t xml:space="preserve">Antes de 15 dias o efeito ainda está se completando e a diferença costuma se resolver sozinha. Depois disso, o ajuste é simples.</w:t>
+        <w:t xml:space="preserve">Quando: Da 3ª semana em diante  |  Aplica-se a: somente procedimentos de consultório · apenas: Bioestimulador de colágeno, Preenchimento</w:t>
+      </w:r>
+    </w:p>
+    <w:p>
+      <w:pPr>
+        <w:spacing w:after="100"/>
+      </w:pPr>
+      <w:r>
+        <w:rPr>
+          <w:b/>
+          <w:bCs/>
+          <w:sz w:val="21"/>
+          <w:szCs w:val="21"/>
+        </w:rPr>
+        <w:t xml:space="preserve">Nódulos palpáveis devem ser mostrados à equipe. Costumam ter tratamento, e quanto antes avaliados, mais simples a conduta.</w:t>
       </w:r>
     </w:p>
     <w:p>
@@ -14458,24 +14490,24 @@
           <w:sz w:val="21"/>
           <w:szCs w:val="21"/>
         </w:rPr>
-        <w:t xml:space="preserve">A musculatura dos dois lados do rosto raramente é idêntica, e nem sempre responde igual.</w:t>
-      </w:r>
-    </w:p>
-    <w:p>
-      <w:pPr>
-        <w:pStyle w:val="ListParagraph"/>
-        <w:numPr>
-          <w:ilvl w:val="0"/>
-          <w:numId w:val="2"/>
-        </w:numPr>
-        <w:spacing w:after="60"/>
-      </w:pPr>
-      <w:r>
-        <w:rPr>
-          <w:sz w:val="21"/>
-          <w:szCs w:val="21"/>
-        </w:rPr>
-        <w:t xml:space="preserve">Pequenos retoques fazem parte do tratamento e costumam ser feitos na avaliação de retorno.</w:t>
+        <w:t xml:space="preserve">Nos primeiros dias, irregularidades ao toque são esperadas e somem sozinhas.</w:t>
+      </w:r>
+    </w:p>
+    <w:p>
+      <w:pPr>
+        <w:pStyle w:val="ListParagraph"/>
+        <w:numPr>
+          <w:ilvl w:val="0"/>
+          <w:numId w:val="2"/>
+        </w:numPr>
+        <w:spacing w:after="60"/>
+      </w:pPr>
+      <w:r>
+        <w:rPr>
+          <w:sz w:val="21"/>
+          <w:szCs w:val="21"/>
+        </w:rPr>
+        <w:t xml:space="preserve">Nódulos que persistem ou surgem semanas ou meses depois — às vezes após uma infecção ou vacina — têm conduta própria.</w:t>
       </w:r>
     </w:p>
     <w:p>
@@ -14508,24 +14540,41 @@
           <w:sz w:val="21"/>
           <w:szCs w:val="21"/>
         </w:rPr>
-        <w:t xml:space="preserve">Aguarde completar 15 dias antes de avaliar</w:t>
-      </w:r>
-    </w:p>
-    <w:p>
-      <w:pPr>
-        <w:pStyle w:val="ListParagraph"/>
-        <w:numPr>
-          <w:ilvl w:val="0"/>
-          <w:numId w:val="2"/>
-        </w:numPr>
-        <w:spacing w:after="60"/>
-      </w:pPr>
-      <w:r>
-        <w:rPr>
-          <w:sz w:val="21"/>
-          <w:szCs w:val="21"/>
-        </w:rPr>
-        <w:t xml:space="preserve">Leve fotos ao retorno, com a expressão em repouso e em movimento</w:t>
+        <w:t xml:space="preserve">Marque avaliação e mostre exatamente onde está</w:t>
+      </w:r>
+    </w:p>
+    <w:p>
+      <w:pPr>
+        <w:pStyle w:val="ListParagraph"/>
+        <w:numPr>
+          <w:ilvl w:val="0"/>
+          <w:numId w:val="2"/>
+        </w:numPr>
+        <w:spacing w:after="60"/>
+      </w:pPr>
+      <w:r>
+        <w:rPr>
+          <w:sz w:val="21"/>
+          <w:szCs w:val="21"/>
+        </w:rPr>
+        <w:t xml:space="preserve">Não tente desfazer o nódulo apertando por conta própria</w:t>
+      </w:r>
+    </w:p>
+    <w:p>
+      <w:pPr>
+        <w:pStyle w:val="ListParagraph"/>
+        <w:numPr>
+          <w:ilvl w:val="0"/>
+          <w:numId w:val="2"/>
+        </w:numPr>
+        <w:spacing w:after="60"/>
+      </w:pPr>
+      <w:r>
+        <w:rPr>
+          <w:sz w:val="21"/>
+          <w:szCs w:val="21"/>
+        </w:rPr>
+        <w:t xml:space="preserve">Avise se houve infecção recente, gripe ou vacinação</w:t>
       </w:r>
     </w:p>
     <w:p>
@@ -14559,7 +14608,7 @@
           <w:sz w:val="23"/>
           <w:szCs w:val="23"/>
         </w:rPr>
-        <w:t xml:space="preserve">Caroço que persiste ou aparece semanas depois</w:t>
+        <w:t xml:space="preserve">Bolhinhas agrupadas com ardência</w:t>
       </w:r>
     </w:p>
     <w:p>
@@ -14572,21 +14621,21 @@
           <w:sz w:val="19"/>
           <w:szCs w:val="19"/>
         </w:rPr>
-        <w:t xml:space="preserve">Quando: Da 3ª semana em diante  |  Aplica-se a: somente procedimentos de consultório · apenas: Bioestimulador de colágeno, Preenchimento</w:t>
-      </w:r>
-    </w:p>
-    <w:p>
-      <w:pPr>
-        <w:spacing w:after="100"/>
-      </w:pPr>
-      <w:r>
-        <w:rPr>
-          <w:b/>
-          <w:bCs/>
-          <w:sz w:val="21"/>
-          <w:szCs w:val="21"/>
-        </w:rPr>
-        <w:t xml:space="preserve">Nódulos palpáveis devem ser mostrados à equipe. Costumam ter tratamento, e quanto antes avaliados, mais simples a conduta.</w:t>
+        <w:t xml:space="preserve">Quando: Do 2º ao 7º dia  |  Aplica-se a: somente procedimentos de consultório · apenas: Laser de CO₂, Morpheus, Preenchimento</w:t>
+      </w:r>
+    </w:p>
+    <w:p>
+      <w:pPr>
+        <w:spacing w:after="100"/>
+      </w:pPr>
+      <w:r>
+        <w:rPr>
+          <w:b/>
+          <w:bCs/>
+          <w:sz w:val="21"/>
+          <w:szCs w:val="21"/>
+        </w:rPr>
+        <w:t xml:space="preserve">Pode ser herpes reativado pelo procedimento. Precisa de medicação logo no início — avise a equipe hoje.</w:t>
       </w:r>
     </w:p>
     <w:p>
@@ -14619,24 +14668,24 @@
           <w:sz w:val="21"/>
           <w:szCs w:val="21"/>
         </w:rPr>
-        <w:t xml:space="preserve">Nos primeiros dias, irregularidades ao toque são esperadas e somem sozinhas.</w:t>
-      </w:r>
-    </w:p>
-    <w:p>
-      <w:pPr>
-        <w:pStyle w:val="ListParagraph"/>
-        <w:numPr>
-          <w:ilvl w:val="0"/>
-          <w:numId w:val="2"/>
-        </w:numPr>
-        <w:spacing w:after="60"/>
-      </w:pPr>
-      <w:r>
-        <w:rPr>
-          <w:sz w:val="21"/>
-          <w:szCs w:val="21"/>
-        </w:rPr>
-        <w:t xml:space="preserve">Nódulos que persistem ou surgem semanas ou meses depois — às vezes após uma infecção ou vacina — têm conduta própria.</w:t>
+        <w:t xml:space="preserve">Quem já teve herpes labial pode reativá-lo após laser ou aplicação na região da boca.</w:t>
+      </w:r>
+    </w:p>
+    <w:p>
+      <w:pPr>
+        <w:pStyle w:val="ListParagraph"/>
+        <w:numPr>
+          <w:ilvl w:val="0"/>
+          <w:numId w:val="2"/>
+        </w:numPr>
+        <w:spacing w:after="60"/>
+      </w:pPr>
+      <w:r>
+        <w:rPr>
+          <w:sz w:val="21"/>
+          <w:szCs w:val="21"/>
+        </w:rPr>
+        <w:t xml:space="preserve">O tratamento iniciado nas primeiras horas costuma encurtar o quadro e reduzir o risco de marca.</w:t>
       </w:r>
     </w:p>
     <w:p>
@@ -14669,41 +14718,41 @@
           <w:sz w:val="21"/>
           <w:szCs w:val="21"/>
         </w:rPr>
-        <w:t xml:space="preserve">Marque avaliação e mostre exatamente onde está</w:t>
-      </w:r>
-    </w:p>
-    <w:p>
-      <w:pPr>
-        <w:pStyle w:val="ListParagraph"/>
-        <w:numPr>
-          <w:ilvl w:val="0"/>
-          <w:numId w:val="2"/>
-        </w:numPr>
-        <w:spacing w:after="60"/>
-      </w:pPr>
-      <w:r>
-        <w:rPr>
-          <w:sz w:val="21"/>
-          <w:szCs w:val="21"/>
-        </w:rPr>
-        <w:t xml:space="preserve">Não tente desfazer o nódulo apertando por conta própria</w:t>
-      </w:r>
-    </w:p>
-    <w:p>
-      <w:pPr>
-        <w:pStyle w:val="ListParagraph"/>
-        <w:numPr>
-          <w:ilvl w:val="0"/>
-          <w:numId w:val="2"/>
-        </w:numPr>
-        <w:spacing w:after="60"/>
-      </w:pPr>
-      <w:r>
-        <w:rPr>
-          <w:sz w:val="21"/>
-          <w:szCs w:val="21"/>
-        </w:rPr>
-        <w:t xml:space="preserve">Avise se houve infecção recente, gripe ou vacinação</w:t>
+        <w:t xml:space="preserve">Fotografe e envie para a equipe no mesmo dia</w:t>
+      </w:r>
+    </w:p>
+    <w:p>
+      <w:pPr>
+        <w:pStyle w:val="ListParagraph"/>
+        <w:numPr>
+          <w:ilvl w:val="0"/>
+          <w:numId w:val="2"/>
+        </w:numPr>
+        <w:spacing w:after="60"/>
+      </w:pPr>
+      <w:r>
+        <w:rPr>
+          <w:sz w:val="21"/>
+          <w:szCs w:val="21"/>
+        </w:rPr>
+        <w:t xml:space="preserve">Não estoure as bolhinhas</w:t>
+      </w:r>
+    </w:p>
+    <w:p>
+      <w:pPr>
+        <w:pStyle w:val="ListParagraph"/>
+        <w:numPr>
+          <w:ilvl w:val="0"/>
+          <w:numId w:val="2"/>
+        </w:numPr>
+        <w:spacing w:after="60"/>
+      </w:pPr>
+      <w:r>
+        <w:rPr>
+          <w:sz w:val="21"/>
+          <w:szCs w:val="21"/>
+        </w:rPr>
+        <w:t xml:space="preserve">Avise sempre, em procedimentos futuros, que já teve herpes</w:t>
       </w:r>
     </w:p>
     <w:p>
@@ -14737,7 +14786,7 @@
           <w:sz w:val="23"/>
           <w:szCs w:val="23"/>
         </w:rPr>
-        <w:t xml:space="preserve">Bolhinhas agrupadas com ardência</w:t>
+        <w:t xml:space="preserve">Manchas escuras aparecendo depois</w:t>
       </w:r>
     </w:p>
     <w:p>
@@ -14750,21 +14799,21 @@
           <w:sz w:val="19"/>
           <w:szCs w:val="19"/>
         </w:rPr>
-        <w:t xml:space="preserve">Quando: Do 2º ao 7º dia  |  Aplica-se a: somente procedimentos de consultório · apenas: Laser de CO₂, Morpheus, Preenchimento</w:t>
-      </w:r>
-    </w:p>
-    <w:p>
-      <w:pPr>
-        <w:spacing w:after="100"/>
-      </w:pPr>
-      <w:r>
-        <w:rPr>
-          <w:b/>
-          <w:bCs/>
-          <w:sz w:val="21"/>
-          <w:szCs w:val="21"/>
-        </w:rPr>
-        <w:t xml:space="preserve">Pode ser herpes reativado pelo procedimento. Precisa de medicação logo no início — avise a equipe hoje.</w:t>
+        <w:t xml:space="preserve">Quando: Da 2ª semana ao 3º mês  |  Aplica-se a: somente procedimentos de consultório · apenas: Laser de CO₂, Morpheus</w:t>
+      </w:r>
+    </w:p>
+    <w:p>
+      <w:pPr>
+        <w:spacing w:after="100"/>
+      </w:pPr>
+      <w:r>
+        <w:rPr>
+          <w:b/>
+          <w:bCs/>
+          <w:sz w:val="21"/>
+          <w:szCs w:val="21"/>
+        </w:rPr>
+        <w:t xml:space="preserve">Escurecimento da pele tratada costuma estar ligado à exposição solar e tem tratamento. Comunique no retorno.</w:t>
       </w:r>
     </w:p>
     <w:p>
@@ -14797,24 +14846,24 @@
           <w:sz w:val="21"/>
           <w:szCs w:val="21"/>
         </w:rPr>
-        <w:t xml:space="preserve">Quem já teve herpes labial pode reativá-lo após laser ou aplicação na região da boca.</w:t>
-      </w:r>
-    </w:p>
-    <w:p>
-      <w:pPr>
-        <w:pStyle w:val="ListParagraph"/>
-        <w:numPr>
-          <w:ilvl w:val="0"/>
-          <w:numId w:val="2"/>
-        </w:numPr>
-        <w:spacing w:after="60"/>
-      </w:pPr>
-      <w:r>
-        <w:rPr>
-          <w:sz w:val="21"/>
-          <w:szCs w:val="21"/>
-        </w:rPr>
-        <w:t xml:space="preserve">O tratamento iniciado nas primeiras horas costuma encurtar o quadro e reduzir o risco de marca.</w:t>
+        <w:t xml:space="preserve">A pele recém-tratada reage ao sol produzindo mais pigmento.</w:t>
+      </w:r>
+    </w:p>
+    <w:p>
+      <w:pPr>
+        <w:pStyle w:val="ListParagraph"/>
+        <w:numPr>
+          <w:ilvl w:val="0"/>
+          <w:numId w:val="2"/>
+        </w:numPr>
+        <w:spacing w:after="60"/>
+      </w:pPr>
+      <w:r>
+        <w:rPr>
+          <w:sz w:val="21"/>
+          <w:szCs w:val="21"/>
+        </w:rPr>
+        <w:t xml:space="preserve">É mais frequente em peles mais morenas e quando a proteção solar falha.</w:t>
       </w:r>
     </w:p>
     <w:p>
@@ -14847,41 +14896,41 @@
           <w:sz w:val="21"/>
           <w:szCs w:val="21"/>
         </w:rPr>
-        <w:t xml:space="preserve">Fotografe e envie para a equipe no mesmo dia</w:t>
-      </w:r>
-    </w:p>
-    <w:p>
-      <w:pPr>
-        <w:pStyle w:val="ListParagraph"/>
-        <w:numPr>
-          <w:ilvl w:val="0"/>
-          <w:numId w:val="2"/>
-        </w:numPr>
-        <w:spacing w:after="60"/>
-      </w:pPr>
-      <w:r>
-        <w:rPr>
-          <w:sz w:val="21"/>
-          <w:szCs w:val="21"/>
-        </w:rPr>
-        <w:t xml:space="preserve">Não estoure as bolhinhas</w:t>
-      </w:r>
-    </w:p>
-    <w:p>
-      <w:pPr>
-        <w:pStyle w:val="ListParagraph"/>
-        <w:numPr>
-          <w:ilvl w:val="0"/>
-          <w:numId w:val="2"/>
-        </w:numPr>
-        <w:spacing w:after="60"/>
-      </w:pPr>
-      <w:r>
-        <w:rPr>
-          <w:sz w:val="21"/>
-          <w:szCs w:val="21"/>
-        </w:rPr>
-        <w:t xml:space="preserve">Avise sempre, em procedimentos futuros, que já teve herpes</w:t>
+        <w:t xml:space="preserve">Reforce o protetor solar e reaplique ao longo do dia</w:t>
+      </w:r>
+    </w:p>
+    <w:p>
+      <w:pPr>
+        <w:pStyle w:val="ListParagraph"/>
+        <w:numPr>
+          <w:ilvl w:val="0"/>
+          <w:numId w:val="2"/>
+        </w:numPr>
+        <w:spacing w:after="60"/>
+      </w:pPr>
+      <w:r>
+        <w:rPr>
+          <w:sz w:val="21"/>
+          <w:szCs w:val="21"/>
+        </w:rPr>
+        <w:t xml:space="preserve">Comunique a equipe para avaliar tratamento clareador</w:t>
+      </w:r>
+    </w:p>
+    <w:p>
+      <w:pPr>
+        <w:pStyle w:val="ListParagraph"/>
+        <w:numPr>
+          <w:ilvl w:val="0"/>
+          <w:numId w:val="2"/>
+        </w:numPr>
+        <w:spacing w:after="60"/>
+      </w:pPr>
+      <w:r>
+        <w:rPr>
+          <w:sz w:val="21"/>
+          <w:szCs w:val="21"/>
+        </w:rPr>
+        <w:t xml:space="preserve">Evite exposição solar direta até a avaliação</w:t>
       </w:r>
     </w:p>
     <w:p>
@@ -14915,7 +14964,7 @@
           <w:sz w:val="23"/>
           <w:szCs w:val="23"/>
         </w:rPr>
-        <w:t xml:space="preserve">Manchas escuras aparecendo depois</w:t>
+        <w:t xml:space="preserve">Espinhas ou bolinhas brancas após o tratamento</w:t>
       </w:r>
     </w:p>
     <w:p>
@@ -14928,21 +14977,21 @@
           <w:sz w:val="19"/>
           <w:szCs w:val="19"/>
         </w:rPr>
-        <w:t xml:space="preserve">Quando: Da 2ª semana ao 3º mês  |  Aplica-se a: somente procedimentos de consultório · apenas: Laser de CO₂, Morpheus</w:t>
-      </w:r>
-    </w:p>
-    <w:p>
-      <w:pPr>
-        <w:spacing w:after="100"/>
-      </w:pPr>
-      <w:r>
-        <w:rPr>
-          <w:b/>
-          <w:bCs/>
-          <w:sz w:val="21"/>
-          <w:szCs w:val="21"/>
-        </w:rPr>
-        <w:t xml:space="preserve">Escurecimento da pele tratada costuma estar ligado à exposição solar e tem tratamento. Comunique no retorno.</w:t>
+        <w:t xml:space="preserve">Quando: Da 2ª à 4ª semana  |  Aplica-se a: somente procedimentos de consultório · apenas: Laser de CO₂, Morpheus</w:t>
+      </w:r>
+    </w:p>
+    <w:p>
+      <w:pPr>
+        <w:spacing w:after="100"/>
+      </w:pPr>
+      <w:r>
+        <w:rPr>
+          <w:b/>
+          <w:bCs/>
+          <w:sz w:val="21"/>
+          <w:szCs w:val="21"/>
+        </w:rPr>
+        <w:t xml:space="preserve">Acontece com alguma frequência, geralmente ligado aos cremes da recuperação. Comente no retorno para ajustar os produtos.</w:t>
       </w:r>
     </w:p>
     <w:p>
@@ -14975,24 +15024,24 @@
           <w:sz w:val="21"/>
           <w:szCs w:val="21"/>
         </w:rPr>
-        <w:t xml:space="preserve">A pele recém-tratada reage ao sol produzindo mais pigmento.</w:t>
-      </w:r>
-    </w:p>
-    <w:p>
-      <w:pPr>
-        <w:pStyle w:val="ListParagraph"/>
-        <w:numPr>
-          <w:ilvl w:val="0"/>
-          <w:numId w:val="2"/>
-        </w:numPr>
-        <w:spacing w:after="60"/>
-      </w:pPr>
-      <w:r>
-        <w:rPr>
-          <w:sz w:val="21"/>
-          <w:szCs w:val="21"/>
-        </w:rPr>
-        <w:t xml:space="preserve">É mais frequente em peles mais morenas e quando a proteção solar falha.</w:t>
+        <w:t xml:space="preserve">Cremes muito oclusivos usados na cicatrização podem obstruir os poros.</w:t>
+      </w:r>
+    </w:p>
+    <w:p>
+      <w:pPr>
+        <w:pStyle w:val="ListParagraph"/>
+        <w:numPr>
+          <w:ilvl w:val="0"/>
+          <w:numId w:val="2"/>
+        </w:numPr>
+        <w:spacing w:after="60"/>
+      </w:pPr>
+      <w:r>
+        <w:rPr>
+          <w:sz w:val="21"/>
+          <w:szCs w:val="21"/>
+        </w:rPr>
+        <w:t xml:space="preserve">A renovação acelerada da pele também favorece pequenos cistos superficiais.</w:t>
       </w:r>
     </w:p>
     <w:p>
@@ -15025,41 +15074,24 @@
           <w:sz w:val="21"/>
           <w:szCs w:val="21"/>
         </w:rPr>
-        <w:t xml:space="preserve">Reforce o protetor solar e reaplique ao longo do dia</w:t>
-      </w:r>
-    </w:p>
-    <w:p>
-      <w:pPr>
-        <w:pStyle w:val="ListParagraph"/>
-        <w:numPr>
-          <w:ilvl w:val="0"/>
-          <w:numId w:val="2"/>
-        </w:numPr>
-        <w:spacing w:after="60"/>
-      </w:pPr>
-      <w:r>
-        <w:rPr>
-          <w:sz w:val="21"/>
-          <w:szCs w:val="21"/>
-        </w:rPr>
-        <w:t xml:space="preserve">Comunique a equipe para avaliar tratamento clareador</w:t>
-      </w:r>
-    </w:p>
-    <w:p>
-      <w:pPr>
-        <w:pStyle w:val="ListParagraph"/>
-        <w:numPr>
-          <w:ilvl w:val="0"/>
-          <w:numId w:val="2"/>
-        </w:numPr>
-        <w:spacing w:after="60"/>
-      </w:pPr>
-      <w:r>
-        <w:rPr>
-          <w:sz w:val="21"/>
-          <w:szCs w:val="21"/>
-        </w:rPr>
-        <w:t xml:space="preserve">Evite exposição solar direta até a avaliação</w:t>
+        <w:t xml:space="preserve">Não espreme nem cutuca</w:t>
+      </w:r>
+    </w:p>
+    <w:p>
+      <w:pPr>
+        <w:pStyle w:val="ListParagraph"/>
+        <w:numPr>
+          <w:ilvl w:val="0"/>
+          <w:numId w:val="2"/>
+        </w:numPr>
+        <w:spacing w:after="60"/>
+      </w:pPr>
+      <w:r>
+        <w:rPr>
+          <w:sz w:val="21"/>
+          <w:szCs w:val="21"/>
+        </w:rPr>
+        <w:t xml:space="preserve">Leve ao retorno a lista dos produtos que está usando</w:t>
       </w:r>
     </w:p>
     <w:p>
@@ -15082,6 +15114,22 @@
     </w:p>
     <w:p>
       <w:pPr>
+        <w:pStyle w:val="Heading2"/>
+        <w:spacing w:after="140" w:before="360"/>
+      </w:pPr>
+      <w:r>
+        <w:rPr>
+          <w:b/>
+          <w:bCs/>
+          <w:color w:val="111111"/>
+          <w:sz w:val="26"/>
+          <w:szCs w:val="26"/>
+        </w:rPr>
+        <w:t xml:space="preserve">ESPERADO — 33 orientações</w:t>
+      </w:r>
+    </w:p>
+    <w:p>
+      <w:pPr>
         <w:pStyle w:val="Heading3"/>
         <w:spacing w:after="100" w:before="280"/>
       </w:pPr>
@@ -15089,11 +15137,11 @@
         <w:rPr>
           <w:b/>
           <w:bCs/>
-          <w:color w:val="9A6209"/>
+          <w:color w:val="067F7B"/>
           <w:sz w:val="23"/>
           <w:szCs w:val="23"/>
         </w:rPr>
-        <w:t xml:space="preserve">Espinhas ou bolinhas brancas após o tratamento</w:t>
+        <w:t xml:space="preserve">Um lado diferente do outro</w:t>
       </w:r>
     </w:p>
     <w:p>
@@ -15106,21 +15154,21 @@
           <w:sz w:val="19"/>
           <w:szCs w:val="19"/>
         </w:rPr>
-        <w:t xml:space="preserve">Quando: Da 2ª à 4ª semana  |  Aplica-se a: somente procedimentos de consultório · apenas: Laser de CO₂, Morpheus</w:t>
-      </w:r>
-    </w:p>
-    <w:p>
-      <w:pPr>
-        <w:spacing w:after="100"/>
-      </w:pPr>
-      <w:r>
-        <w:rPr>
-          <w:b/>
-          <w:bCs/>
-          <w:sz w:val="21"/>
-          <w:szCs w:val="21"/>
-        </w:rPr>
-        <w:t xml:space="preserve">Acontece com alguma frequência, geralmente ligado aos cremes da recuperação. Comente no retorno para ajustar os produtos.</w:t>
+        <w:t xml:space="preserve">Quando: Durante todo o primeiro ano  |  Aplica-se a: somente cirurgias</w:t>
+      </w:r>
+    </w:p>
+    <w:p>
+      <w:pPr>
+        <w:spacing w:after="100"/>
+      </w:pPr>
+      <w:r>
+        <w:rPr>
+          <w:b/>
+          <w:bCs/>
+          <w:sz w:val="21"/>
+          <w:szCs w:val="21"/>
+        </w:rPr>
+        <w:t xml:space="preserve">Diferença entre os lados acompanha a recuperação inteira: o inchaço não cede no mesmo ritmo dos dois lados. O resultado da cirurgia se avalia com um ano.</w:t>
       </w:r>
     </w:p>
     <w:p>
@@ -15153,24 +15201,41 @@
           <w:sz w:val="21"/>
           <w:szCs w:val="21"/>
         </w:rPr>
-        <w:t xml:space="preserve">Cremes muito oclusivos usados na cicatrização podem obstruir os poros.</w:t>
-      </w:r>
-    </w:p>
-    <w:p>
-      <w:pPr>
-        <w:pStyle w:val="ListParagraph"/>
-        <w:numPr>
-          <w:ilvl w:val="0"/>
-          <w:numId w:val="2"/>
-        </w:numPr>
-        <w:spacing w:after="60"/>
-      </w:pPr>
-      <w:r>
-        <w:rPr>
-          <w:sz w:val="21"/>
-          <w:szCs w:val="21"/>
-        </w:rPr>
-        <w:t xml:space="preserve">A renovação acelerada da pele também favorece pequenos cistos superficiais.</w:t>
+        <w:t xml:space="preserve">Nenhum corpo é simétrico antes da cirurgia, e não passa a ser depois — pequenas diferenças entre os lados existem em todo mundo.</w:t>
+      </w:r>
+    </w:p>
+    <w:p>
+      <w:pPr>
+        <w:pStyle w:val="ListParagraph"/>
+        <w:numPr>
+          <w:ilvl w:val="0"/>
+          <w:numId w:val="2"/>
+        </w:numPr>
+        <w:spacing w:after="60"/>
+      </w:pPr>
+      <w:r>
+        <w:rPr>
+          <w:sz w:val="21"/>
+          <w:szCs w:val="21"/>
+        </w:rPr>
+        <w:t xml:space="preserve">Nos primeiros meses o que você vê é sobretudo inchaço, e ele quase nunca desincha por igual dos dois lados.</w:t>
+      </w:r>
+    </w:p>
+    <w:p>
+      <w:pPr>
+        <w:pStyle w:val="ListParagraph"/>
+        <w:numPr>
+          <w:ilvl w:val="0"/>
+          <w:numId w:val="2"/>
+        </w:numPr>
+        <w:spacing w:after="60"/>
+      </w:pPr>
+      <w:r>
+        <w:rPr>
+          <w:sz w:val="21"/>
+          <w:szCs w:val="21"/>
+        </w:rPr>
+        <w:t xml:space="preserve">O contorno continua se acomodando ao longo de todo o primeiro ano.</w:t>
       </w:r>
     </w:p>
     <w:p>
@@ -15203,24 +15268,41 @@
           <w:sz w:val="21"/>
           <w:szCs w:val="21"/>
         </w:rPr>
-        <w:t xml:space="preserve">Não espreme nem cutuca</w:t>
-      </w:r>
-    </w:p>
-    <w:p>
-      <w:pPr>
-        <w:pStyle w:val="ListParagraph"/>
-        <w:numPr>
-          <w:ilvl w:val="0"/>
-          <w:numId w:val="2"/>
-        </w:numPr>
-        <w:spacing w:after="60"/>
-      </w:pPr>
-      <w:r>
-        <w:rPr>
-          <w:sz w:val="21"/>
-          <w:szCs w:val="21"/>
-        </w:rPr>
-        <w:t xml:space="preserve">Leve ao retorno a lista dos produtos que está usando</w:t>
+        <w:t xml:space="preserve">Evite comparar os lados no espelho todos os dias — a diferença oscila com o inchaço</w:t>
+      </w:r>
+    </w:p>
+    <w:p>
+      <w:pPr>
+        <w:pStyle w:val="ListParagraph"/>
+        <w:numPr>
+          <w:ilvl w:val="0"/>
+          <w:numId w:val="2"/>
+        </w:numPr>
+        <w:spacing w:after="60"/>
+      </w:pPr>
+      <w:r>
+        <w:rPr>
+          <w:sz w:val="21"/>
+          <w:szCs w:val="21"/>
+        </w:rPr>
+        <w:t xml:space="preserve">Registre fotos de vez em quando, sempre na mesma luz e posição, para comparar com calma</w:t>
+      </w:r>
+    </w:p>
+    <w:p>
+      <w:pPr>
+        <w:pStyle w:val="ListParagraph"/>
+        <w:numPr>
+          <w:ilvl w:val="0"/>
+          <w:numId w:val="2"/>
+        </w:numPr>
+        <w:spacing w:after="60"/>
+      </w:pPr>
+      <w:r>
+        <w:rPr>
+          <w:sz w:val="21"/>
+          <w:szCs w:val="21"/>
+        </w:rPr>
+        <w:t xml:space="preserve">Leve as fotos e as suas dúvidas ao retorno — quem avalia a sua evolução é a equipe</w:t>
       </w:r>
     </w:p>
     <w:p>
@@ -15239,22 +15321,6 @@
           <w:szCs w:val="17"/>
         </w:rPr>
         <w:t xml:space="preserve">Correção: </w:t>
-      </w:r>
-    </w:p>
-    <w:p>
-      <w:pPr>
-        <w:pStyle w:val="Heading2"/>
-        <w:spacing w:after="140" w:before="360"/>
-      </w:pPr>
-      <w:r>
-        <w:rPr>
-          <w:b/>
-          <w:bCs/>
-          <w:color w:val="111111"/>
-          <w:sz w:val="26"/>
-          <w:szCs w:val="26"/>
-        </w:rPr>
-        <w:t xml:space="preserve">ESPERADO — 32 orientações</w:t>
       </w:r>
     </w:p>
     <w:p>

</xml_diff>

<commit_message>
Torna o BodyTite um procedimento escolhível
Quem fez só a radiofrequência não tinha onde se cadastrar: escolhia
lipoescultura e recebia orientações sobre áreas lipoaspiradas que não tem.
Agora é escolha própria, com nota que evita a confusão inversa — quem fez os
dois marca os dois, e a cirurgia combinada resolve.

Herda o que é dele: o guia das tecnologias, os dois vídeos do BodyTite, a
cinta, a drenagem, o taping e os convites de retorno das cirurgias. Não herda
o que não é: nada sobre enxertia de gordura.

Os marcos são próprios, e o de nove meses é o que importa — a retração da pele
continua evoluindo até lá, e sem esse número a paciente conclui aos três meses
que o resultado é o que ela está vendo.

Fica sem prescrição padrão: o app não inventa receita, e a do corpo é de
lipoaspiração. Enquanto não houver uma, a paciente cadastra a dela.

Co-Authored-By: Claude Opus 5 <noreply@anthropic.com>
Claude-Session: https://claude.ai/code/session_01RXsuhQQ6qNiyuBJF5nJZKq
</commit_message>
<xml_diff>
--- a/docs/conteudo-clinico-para-revisao.docx
+++ b/docs/conteudo-clinico-para-revisao.docx
@@ -76,7 +76,7 @@
           <w:sz w:val="19"/>
           <w:szCs w:val="19"/>
         </w:rPr>
-        <w:t xml:space="preserve">18 procedimentos · 64 orientações de sintomas · 22 guias de cuidados</w:t>
+        <w:t xml:space="preserve">19 procedimentos · 64 orientações de sintomas · 22 guias de cuidados</w:t>
       </w:r>
     </w:p>
     <w:p>
@@ -1220,6 +1220,133 @@
           <w:sz w:val="23"/>
           <w:szCs w:val="23"/>
         </w:rPr>
+        <w:t xml:space="preserve">BodyTite®</w:t>
+      </w:r>
+    </w:p>
+    <w:p>
+      <w:pPr>
+        <w:spacing w:after="100"/>
+      </w:pPr>
+      <w:r>
+        <w:rPr>
+          <w:color w:val="6B6B6B"/>
+          <w:sz w:val="19"/>
+          <w:szCs w:val="19"/>
+        </w:rPr>
+        <w:t xml:space="preserve">Descrição na seleção: "Radiofrequência para retração de pele"</w:t>
+      </w:r>
+    </w:p>
+    <w:p>
+      <w:pPr>
+        <w:spacing w:after="100"/>
+      </w:pPr>
+      <w:r>
+        <w:rPr>
+          <w:color w:val="6B6B6B"/>
+          <w:sz w:val="19"/>
+          <w:szCs w:val="19"/>
+        </w:rPr>
+        <w:t xml:space="preserve">Recuperação estimada exibida: 4 semanas</w:t>
+      </w:r>
+    </w:p>
+    <w:p>
+      <w:pPr>
+        <w:spacing w:after="80" w:before="240"/>
+      </w:pPr>
+      <w:r>
+        <w:rPr>
+          <w:b/>
+          <w:bCs/>
+          <w:color w:val="067F7B"/>
+          <w:spacing w:val="30"/>
+          <w:sz w:val="17"/>
+          <w:szCs w:val="17"/>
+        </w:rPr>
+        <w:t xml:space="preserve">ATENÇÃO ESPECIAL MOSTRADA NA TELA INICIAL</w:t>
+      </w:r>
+    </w:p>
+    <w:p>
+      <w:pPr>
+        <w:pStyle w:val="ListParagraph"/>
+        <w:numPr>
+          <w:ilvl w:val="0"/>
+          <w:numId w:val="2"/>
+        </w:numPr>
+        <w:spacing w:after="60"/>
+      </w:pPr>
+      <w:r>
+        <w:rPr>
+          <w:sz w:val="21"/>
+          <w:szCs w:val="21"/>
+        </w:rPr>
+        <w:t xml:space="preserve">Cinta compressiva pelo período orientado pela equipe</w:t>
+      </w:r>
+    </w:p>
+    <w:p>
+      <w:pPr>
+        <w:pStyle w:val="ListParagraph"/>
+        <w:numPr>
+          <w:ilvl w:val="0"/>
+          <w:numId w:val="2"/>
+        </w:numPr>
+        <w:spacing w:after="60"/>
+      </w:pPr>
+      <w:r>
+        <w:rPr>
+          <w:sz w:val="21"/>
+          <w:szCs w:val="21"/>
+        </w:rPr>
+        <w:t xml:space="preserve">Inchaço e áreas endurecidas nas primeiras semanas são esperados</w:t>
+      </w:r>
+    </w:p>
+    <w:p>
+      <w:pPr>
+        <w:pStyle w:val="ListParagraph"/>
+        <w:numPr>
+          <w:ilvl w:val="0"/>
+          <w:numId w:val="2"/>
+        </w:numPr>
+        <w:spacing w:after="60"/>
+      </w:pPr>
+      <w:r>
+        <w:rPr>
+          <w:sz w:val="21"/>
+          <w:szCs w:val="21"/>
+        </w:rPr>
+        <w:t xml:space="preserve">A retração da pele é gradual e continua evoluindo por meses</w:t>
+      </w:r>
+    </w:p>
+    <w:p>
+      <w:pPr>
+        <w:pBdr>
+          <w:bottom w:val="dotted" w:color="C8C8C8" w:sz="4" w:space="4"/>
+        </w:pBdr>
+        <w:spacing w:after="240" w:before="100"/>
+      </w:pPr>
+      <w:r>
+        <w:rPr>
+          <w:i/>
+          <w:iCs/>
+          <w:color w:val="AAAAAA"/>
+          <w:sz w:val="17"/>
+          <w:szCs w:val="17"/>
+        </w:rPr>
+        <w:t xml:space="preserve">Correção: </w:t>
+      </w:r>
+    </w:p>
+    <w:p>
+      <w:pPr>
+        <w:pStyle w:val="Heading3"/>
+        <w:spacing w:after="100" w:before="280"/>
+      </w:pPr>
+      <w:r>
+        <w:rPr>
+          <w:b/>
+          <w:bCs/>
+          <w:color w:val="111111"/>
+          <w:sz w:val="23"/>
+          <w:szCs w:val="23"/>
+        </w:rPr>
         <w:t xml:space="preserve">Rinoplastia</w:t>
       </w:r>
     </w:p>
@@ -3835,7 +3962,7 @@
           <w:sz w:val="19"/>
           <w:szCs w:val="19"/>
         </w:rPr>
-        <w:t xml:space="preserve"> — só para: Lipoescultura, Lipo HD Concept, Abdominoplastia, Correção de ginecomastia, Cirurgia pós-bariátrica</w:t>
+        <w:t xml:space="preserve"> — só para: Lipoescultura, Lipo HD Concept, BodyTite®, Abdominoplastia, Correção de ginecomastia, Cirurgia pós-bariátrica</w:t>
       </w:r>
     </w:p>
     <w:p>
@@ -4110,7 +4237,7 @@
           <w:sz w:val="19"/>
           <w:szCs w:val="19"/>
         </w:rPr>
-        <w:t xml:space="preserve"> — só para: Lipoescultura, Lipo HD Concept, Abdominoplastia, Correção de ginecomastia, Cirurgia pós-bariátrica</w:t>
+        <w:t xml:space="preserve"> — só para: Lipoescultura, Lipo HD Concept, BodyTite®, Abdominoplastia, Correção de ginecomastia, Cirurgia pós-bariátrica</w:t>
       </w:r>
     </w:p>
     <w:p>
@@ -4231,7 +4358,7 @@
           <w:sz w:val="19"/>
           <w:szCs w:val="19"/>
         </w:rPr>
-        <w:t xml:space="preserve"> — só para: Lipoescultura, Lipo HD Concept, Abdominoplastia, Correção de ginecomastia, Cirurgia pós-bariátrica</w:t>
+        <w:t xml:space="preserve"> — só para: Lipoescultura, Lipo HD Concept, BodyTite®, Abdominoplastia, Correção de ginecomastia, Cirurgia pós-bariátrica</w:t>
       </w:r>
     </w:p>
     <w:p>
@@ -7678,6 +7805,189 @@
                 <w:szCs w:val="20"/>
               </w:rPr>
               <w:t xml:space="preserve">Resultado final do contorno — entre 6 e 12 meses, conforme cada paciente</w:t>
+            </w:r>
+          </w:p>
+        </w:tc>
+      </w:tr>
+    </w:tbl>
+    <w:p>
+      <w:pPr>
+        <w:pBdr>
+          <w:bottom w:val="dotted" w:color="C8C8C8" w:sz="4" w:space="4"/>
+        </w:pBdr>
+        <w:spacing w:after="240" w:before="100"/>
+      </w:pPr>
+      <w:r>
+        <w:rPr>
+          <w:i/>
+          <w:iCs/>
+          <w:color w:val="AAAAAA"/>
+          <w:sz w:val="17"/>
+          <w:szCs w:val="17"/>
+        </w:rPr>
+        <w:t xml:space="preserve">Correção: </w:t>
+      </w:r>
+    </w:p>
+    <w:p>
+      <w:pPr>
+        <w:pStyle w:val="Heading3"/>
+        <w:spacing w:after="100" w:before="280"/>
+      </w:pPr>
+      <w:r>
+        <w:rPr>
+          <w:b/>
+          <w:bCs/>
+          <w:color w:val="111111"/>
+          <w:sz w:val="23"/>
+          <w:szCs w:val="23"/>
+        </w:rPr>
+        <w:t xml:space="preserve">BodyTite®</w:t>
+      </w:r>
+    </w:p>
+    <w:tbl>
+      <w:tblPr>
+        <w:tblW w:type="dxa" w:w="9000"/>
+        <w:tblBorders>
+          <w:top w:val="single" w:color="auto" w:sz="4"/>
+          <w:left w:val="single" w:color="auto" w:sz="4"/>
+          <w:bottom w:val="single" w:color="auto" w:sz="4"/>
+          <w:right w:val="single" w:color="auto" w:sz="4"/>
+          <w:insideH w:val="single" w:color="auto" w:sz="4"/>
+          <w:insideV w:val="single" w:color="auto" w:sz="4"/>
+        </w:tblBorders>
+      </w:tblPr>
+      <w:tblGrid>
+        <w:gridCol w:w="1100"/>
+        <w:gridCol w:w="7900"/>
+      </w:tblGrid>
+      <w:tr>
+        <w:tc>
+          <w:tcPr>
+            <w:tcW w:type="dxa" w:w="1100"/>
+            <w:shd w:fill="EFEFEF" w:val="clear"/>
+          </w:tcPr>
+          <w:p>
+            <w:r>
+              <w:rPr>
+                <w:b/>
+                <w:bCs/>
+                <w:sz w:val="19"/>
+                <w:szCs w:val="19"/>
+              </w:rPr>
+              <w:t xml:space="preserve">Dia</w:t>
+            </w:r>
+          </w:p>
+        </w:tc>
+        <w:tc>
+          <w:tcPr>
+            <w:tcW w:type="dxa" w:w="7900"/>
+            <w:shd w:fill="EFEFEF" w:val="clear"/>
+          </w:tcPr>
+          <w:p>
+            <w:r>
+              <w:rPr>
+                <w:b/>
+                <w:bCs/>
+                <w:sz w:val="19"/>
+                <w:szCs w:val="19"/>
+              </w:rPr>
+              <w:t xml:space="preserve">O que a paciente lê</w:t>
+            </w:r>
+          </w:p>
+        </w:tc>
+      </w:tr>
+      <w:tr>
+        <w:tc>
+          <w:tcPr>
+            <w:tcW w:type="dxa" w:w="1100"/>
+          </w:tcPr>
+          <w:p>
+            <w:r>
+              <w:rPr>
+                <w:b/>
+                <w:bCs/>
+                <w:sz w:val="20"/>
+                <w:szCs w:val="20"/>
+              </w:rPr>
+              <w:t xml:space="preserve">D21</w:t>
+            </w:r>
+          </w:p>
+        </w:tc>
+        <w:tc>
+          <w:tcPr>
+            <w:tcW w:type="dxa" w:w="7900"/>
+          </w:tcPr>
+          <w:p>
+            <w:r>
+              <w:rPr>
+                <w:sz w:val="20"/>
+                <w:szCs w:val="20"/>
+              </w:rPr>
+              <w:t xml:space="preserve">Fase de maior endurecimento — a drenagem faz diferença aqui</w:t>
+            </w:r>
+          </w:p>
+        </w:tc>
+      </w:tr>
+      <w:tr>
+        <w:tc>
+          <w:tcPr>
+            <w:tcW w:type="dxa" w:w="1100"/>
+          </w:tcPr>
+          <w:p>
+            <w:r>
+              <w:rPr>
+                <w:b/>
+                <w:bCs/>
+                <w:sz w:val="20"/>
+                <w:szCs w:val="20"/>
+              </w:rPr>
+              <w:t xml:space="preserve">D90</w:t>
+            </w:r>
+          </w:p>
+        </w:tc>
+        <w:tc>
+          <w:tcPr>
+            <w:tcW w:type="dxa" w:w="7900"/>
+          </w:tcPr>
+          <w:p>
+            <w:r>
+              <w:rPr>
+                <w:sz w:val="20"/>
+                <w:szCs w:val="20"/>
+              </w:rPr>
+              <w:t xml:space="preserve">Inchaço bem reduzido; a retração da pele segue acontecendo</w:t>
+            </w:r>
+          </w:p>
+        </w:tc>
+      </w:tr>
+      <w:tr>
+        <w:tc>
+          <w:tcPr>
+            <w:tcW w:type="dxa" w:w="1100"/>
+          </w:tcPr>
+          <w:p>
+            <w:r>
+              <w:rPr>
+                <w:b/>
+                <w:bCs/>
+                <w:sz w:val="20"/>
+                <w:szCs w:val="20"/>
+              </w:rPr>
+              <w:t xml:space="preserve">D270</w:t>
+            </w:r>
+          </w:p>
+        </w:tc>
+        <w:tc>
+          <w:tcPr>
+            <w:tcW w:type="dxa" w:w="7900"/>
+          </w:tcPr>
+          <w:p>
+            <w:r>
+              <w:rPr>
+                <w:sz w:val="20"/>
+                <w:szCs w:val="20"/>
+              </w:rPr>
+              <w:t xml:space="preserve">Retração da pele completa — ela evolui até cerca de nove meses</w:t>
             </w:r>
           </w:p>
         </w:tc>
@@ -22261,7 +22571,7 @@
           <w:sz w:val="19"/>
           <w:szCs w:val="19"/>
         </w:rPr>
-        <w:t xml:space="preserve">"Radiofrequência para o contorno e a flacidez — usados juntos ou separados, conforme o seu caso"  |  Aplica-se a: somente cirurgias · apenas: Lipo HD Concept, Lipoescultura</w:t>
+        <w:t xml:space="preserve">"Radiofrequência para o contorno e a flacidez — usados juntos ou separados, conforme o seu caso"  |  Aplica-se a: somente cirurgias · apenas: Lipo HD Concept, Lipoescultura, BodyTite®</w:t>
       </w:r>
     </w:p>
     <w:p>
@@ -23427,7 +23737,7 @@
           <w:sz w:val="19"/>
           <w:szCs w:val="19"/>
         </w:rPr>
-        <w:t xml:space="preserve">"A bandagem elástica aplicada pela fisioterapeuta, e como cuidar dela"  |  Aplica-se a: somente cirurgias · apenas: Face HD Concept, Lipoescultura, Lipo HD Concept, Abdominoplastia, Correção de ginecomastia, Cirurgia pós-bariátrica</w:t>
+        <w:t xml:space="preserve">"A bandagem elástica aplicada pela fisioterapeuta, e como cuidar dela"  |  Aplica-se a: somente cirurgias · apenas: Face HD Concept, Lipoescultura, Lipo HD Concept, BodyTite®, Abdominoplastia, Correção de ginecomastia, Cirurgia pós-bariátrica</w:t>
       </w:r>
     </w:p>
     <w:p>

</xml_diff>